<commit_message>
Add: add in main report frist module and add new supmodule
</commit_message>
<xml_diff>
--- a/Documentation/титул мамшева.docx
+++ b/Documentation/титул мамшева.docx
@@ -873,6 +873,87 @@
     </w:p>
     <w:p>
       <w:pPr>
+        <w:pStyle w:val="3"/>
+        <w:numPr>
+          <w:ilvl w:val="2"/>
+          <w:numId w:val="30"/>
+        </w:numPr>
+        <w:ind w:left="0" w:firstLine="698"/>
+        <w:rPr>
+          <w:lang w:eastAsia="ru-RU"/>
+        </w:rPr>
+      </w:pPr>
+      <w:r>
+        <w:rPr>
+          <w:lang w:eastAsia="ru-RU"/>
+        </w:rPr>
+        <w:t>Выбор идеи проекта</w:t>
+      </w:r>
+    </w:p>
+    <w:p>
+      <w:pPr>
+        <w:pStyle w:val="a9"/>
+        <w:rPr>
+          <w:lang w:eastAsia="ru-RU"/>
+        </w:rPr>
+      </w:pPr>
+      <w:r>
+        <w:rPr>
+          <w:lang w:eastAsia="ru-RU"/>
+        </w:rPr>
+        <w:t>Основная идея проекта: создание мобильной игры, которая имеет жанр: детектив.</w:t>
+      </w:r>
+    </w:p>
+    <w:p>
+      <w:pPr>
+        <w:pStyle w:val="a9"/>
+        <w:rPr>
+          <w:lang w:eastAsia="ru-RU"/>
+        </w:rPr>
+      </w:pPr>
+      <w:r>
+        <w:rPr>
+          <w:lang w:eastAsia="ru-RU"/>
+        </w:rPr>
+        <w:t>Пользователь авторизуется в приложении и после этого может начинать игру, а именно: дается описание истории и цель расследования. После этого игрок, решая различные головоломки, задачки, мини игры и общаясь с виртуальными персонажами, собирает улики, на основе которых может сделать выводы о том, кто является преступником.</w:t>
+      </w:r>
+    </w:p>
+    <w:p>
+      <w:pPr>
+        <w:pStyle w:val="a9"/>
+        <w:rPr>
+          <w:lang w:eastAsia="ru-RU"/>
+        </w:rPr>
+      </w:pPr>
+      <w:r>
+        <w:rPr>
+          <w:lang w:eastAsia="ru-RU"/>
+        </w:rPr>
+        <w:t>Основная целевая аудитория: молодые люди (18-25 лет) и подростки, так как такого типа игры часто привлекают более молодую аудиторию.</w:t>
+      </w:r>
+    </w:p>
+    <w:p>
+      <w:pPr>
+        <w:pStyle w:val="3"/>
+        <w:numPr>
+          <w:ilvl w:val="2"/>
+          <w:numId w:val="30"/>
+        </w:numPr>
+        <w:ind w:left="0" w:firstLine="698"/>
+        <w:rPr>
+          <w:rFonts w:eastAsia="Times New Roman"/>
+          <w:lang w:eastAsia="ru-RU"/>
+        </w:rPr>
+      </w:pPr>
+      <w:r>
+        <w:rPr>
+          <w:lang w:eastAsia="ru-RU"/>
+        </w:rPr>
+        <w:t>Анализ аналогов и выявление преимуществ и недостатков</w:t>
+      </w:r>
+    </w:p>
+    <w:p>
+      <w:pPr>
         <w:pStyle w:val="a9"/>
         <w:rPr>
           <w:lang w:eastAsia="ru-RU"/>
@@ -880,6 +961,30 @@
       </w:pPr>
       <w:bookmarkStart w:id="1" w:name="_GoBack"/>
       <w:bookmarkEnd w:id="1"/>
+    </w:p>
+    <w:p>
+      <w:pPr>
+        <w:pStyle w:val="a9"/>
+        <w:rPr>
+          <w:lang w:eastAsia="ru-RU"/>
+        </w:rPr>
+      </w:pPr>
+    </w:p>
+    <w:p>
+      <w:pPr>
+        <w:pStyle w:val="a9"/>
+        <w:rPr>
+          <w:lang w:eastAsia="ru-RU"/>
+        </w:rPr>
+      </w:pPr>
+    </w:p>
+    <w:p>
+      <w:pPr>
+        <w:pStyle w:val="a9"/>
+        <w:rPr>
+          <w:lang w:eastAsia="ru-RU"/>
+        </w:rPr>
+      </w:pPr>
     </w:p>
     <w:p>
       <w:pPr>
@@ -4509,6 +4614,30 @@
       <w:szCs w:val="26"/>
     </w:rPr>
   </w:style>
+  <w:style w:type="paragraph" w:styleId="3">
+    <w:name w:val="heading 3"/>
+    <w:basedOn w:val="a"/>
+    <w:next w:val="a"/>
+    <w:link w:val="30"/>
+    <w:uiPriority w:val="9"/>
+    <w:unhideWhenUsed/>
+    <w:qFormat/>
+    <w:rsid w:val="003432CC"/>
+    <w:pPr>
+      <w:keepNext/>
+      <w:keepLines/>
+      <w:spacing w:after="0" w:line="360" w:lineRule="auto"/>
+      <w:ind w:firstLine="709"/>
+      <w:contextualSpacing/>
+      <w:jc w:val="both"/>
+      <w:outlineLvl w:val="2"/>
+    </w:pPr>
+    <w:rPr>
+      <w:rFonts w:ascii="Times New Roman" w:eastAsiaTheme="majorEastAsia" w:hAnsi="Times New Roman" w:cstheme="majorBidi"/>
+      <w:sz w:val="28"/>
+      <w:szCs w:val="24"/>
+    </w:rPr>
+  </w:style>
   <w:style w:type="character" w:default="1" w:styleId="a0">
     <w:name w:val="Default Paragraph Font"/>
     <w:uiPriority w:val="1"/>
@@ -4741,6 +4870,18 @@
     <w:pPr>
       <w:spacing w:after="100"/>
     </w:pPr>
+  </w:style>
+  <w:style w:type="character" w:customStyle="1" w:styleId="30">
+    <w:name w:val="Заголовок 3 Знак"/>
+    <w:basedOn w:val="a0"/>
+    <w:link w:val="3"/>
+    <w:uiPriority w:val="9"/>
+    <w:rsid w:val="003432CC"/>
+    <w:rPr>
+      <w:rFonts w:ascii="Times New Roman" w:eastAsiaTheme="majorEastAsia" w:hAnsi="Times New Roman" w:cstheme="majorBidi"/>
+      <w:sz w:val="28"/>
+      <w:szCs w:val="24"/>
+    </w:rPr>
   </w:style>
 </w:styles>
 </file>
@@ -5045,7 +5186,7 @@
 </file>
 
 <file path=customXml/itemProps1.xml><?xml version="1.0" encoding="utf-8"?>
-<ds:datastoreItem xmlns:ds="http://schemas.openxmlformats.org/officeDocument/2006/customXml" ds:itemID="{7106B5F1-6961-48FC-B370-F3755142EF3D}">
+<ds:datastoreItem xmlns:ds="http://schemas.openxmlformats.org/officeDocument/2006/customXml" ds:itemID="{9376940B-8EB5-46F4-BBFE-917E9C60690D}">
   <ds:schemaRefs>
     <ds:schemaRef ds:uri="http://schemas.openxmlformats.org/officeDocument/2006/bibliography"/>
   </ds:schemaRefs>

</xml_diff>

<commit_message>
Add: add new subsection in first point
</commit_message>
<xml_diff>
--- a/Documentation/титул мамшева.docx
+++ b/Documentation/титул мамшева.docx
@@ -699,7 +699,7 @@
           <w:lang w:eastAsia="ru-RU"/>
         </w:rPr>
       </w:pPr>
-      <w:bookmarkStart w:id="0" w:name="_Toc243033841"/>
+      <w:bookmarkStart w:id="0" w:name="_Toc243247174"/>
       <w:r>
         <w:rPr>
           <w:rFonts w:eastAsia="Times New Roman"/>
@@ -717,7 +717,9 @@
           <w:tab w:val="right" w:leader="dot" w:pos="9345"/>
         </w:tabs>
         <w:rPr>
+          <w:rFonts w:eastAsiaTheme="minorEastAsia"/>
           <w:noProof/>
+          <w:lang w:eastAsia="ru-RU"/>
         </w:rPr>
       </w:pPr>
       <w:r>
@@ -738,7 +740,7 @@
         </w:rPr>
         <w:fldChar w:fldCharType="separate"/>
       </w:r>
-      <w:hyperlink w:anchor="_Toc243033841" w:history="1">
+      <w:hyperlink w:anchor="_Toc243247174" w:history="1">
         <w:r>
           <w:rPr>
             <w:rStyle w:val="a6"/>
@@ -767,7 +769,7 @@
             <w:noProof/>
             <w:webHidden/>
           </w:rPr>
-          <w:instrText xml:space="preserve"> PAGEREF _Toc243033841 \h </w:instrText>
+          <w:instrText xml:space="preserve"> PAGEREF _Toc243247174 \h </w:instrText>
         </w:r>
         <w:r>
           <w:rPr>
@@ -800,28 +802,354 @@
     </w:p>
     <w:p>
       <w:pPr>
-        <w:pStyle w:val="a9"/>
-        <w:rPr>
-          <w:lang w:eastAsia="ru-RU"/>
-        </w:rPr>
-      </w:pPr>
-      <w:r>
-        <w:rPr>
-          <w:lang w:eastAsia="ru-RU"/>
-        </w:rPr>
-        <w:fldChar w:fldCharType="end"/>
-      </w:r>
+        <w:pStyle w:val="11"/>
+        <w:tabs>
+          <w:tab w:val="right" w:leader="dot" w:pos="9345"/>
+        </w:tabs>
+        <w:rPr>
+          <w:rFonts w:eastAsiaTheme="minorEastAsia"/>
+          <w:noProof/>
+          <w:lang w:eastAsia="ru-RU"/>
+        </w:rPr>
+      </w:pPr>
+      <w:hyperlink w:anchor="_Toc243247175" w:history="1">
+        <w:r>
+          <w:rPr>
+            <w:rStyle w:val="a6"/>
+            <w:noProof/>
+            <w:lang w:eastAsia="ru-RU"/>
+          </w:rPr>
+          <w:t>Анализ предметной области</w:t>
+        </w:r>
+        <w:r>
+          <w:rPr>
+            <w:noProof/>
+            <w:webHidden/>
+          </w:rPr>
+          <w:tab/>
+        </w:r>
+        <w:r>
+          <w:rPr>
+            <w:noProof/>
+            <w:webHidden/>
+          </w:rPr>
+          <w:fldChar w:fldCharType="begin"/>
+        </w:r>
+        <w:r>
+          <w:rPr>
+            <w:noProof/>
+            <w:webHidden/>
+          </w:rPr>
+          <w:instrText xml:space="preserve"> PAGEREF _Toc243247175 \h </w:instrText>
+        </w:r>
+        <w:r>
+          <w:rPr>
+            <w:noProof/>
+            <w:webHidden/>
+          </w:rPr>
+        </w:r>
+        <w:r>
+          <w:rPr>
+            <w:noProof/>
+            <w:webHidden/>
+          </w:rPr>
+          <w:fldChar w:fldCharType="separate"/>
+        </w:r>
+        <w:r>
+          <w:rPr>
+            <w:noProof/>
+            <w:webHidden/>
+          </w:rPr>
+          <w:t>3</w:t>
+        </w:r>
+        <w:r>
+          <w:rPr>
+            <w:noProof/>
+            <w:webHidden/>
+          </w:rPr>
+          <w:fldChar w:fldCharType="end"/>
+        </w:r>
+      </w:hyperlink>
     </w:p>
     <w:p>
       <w:pPr>
-        <w:pStyle w:val="a9"/>
-        <w:rPr>
-          <w:lang w:eastAsia="ru-RU"/>
-        </w:rPr>
-      </w:pPr>
+        <w:pStyle w:val="21"/>
+        <w:tabs>
+          <w:tab w:val="left" w:pos="880"/>
+          <w:tab w:val="right" w:leader="dot" w:pos="9345"/>
+        </w:tabs>
+        <w:rPr>
+          <w:noProof/>
+        </w:rPr>
+      </w:pPr>
+      <w:hyperlink w:anchor="_Toc243247176" w:history="1">
+        <w:r>
+          <w:rPr>
+            <w:rStyle w:val="a6"/>
+            <w:rFonts w:eastAsia="Times New Roman"/>
+            <w:noProof/>
+            <w:lang w:eastAsia="ru-RU"/>
+          </w:rPr>
+          <w:t>1.1.</w:t>
+        </w:r>
+        <w:r>
+          <w:rPr>
+            <w:noProof/>
+          </w:rPr>
+          <w:tab/>
+        </w:r>
+        <w:r>
+          <w:rPr>
+            <w:rStyle w:val="a6"/>
+            <w:rFonts w:eastAsia="Times New Roman"/>
+            <w:noProof/>
+            <w:lang w:eastAsia="ru-RU"/>
+          </w:rPr>
+          <w:t>Анализ идеи и выявление потребностей.</w:t>
+        </w:r>
+        <w:r>
+          <w:rPr>
+            <w:noProof/>
+            <w:webHidden/>
+          </w:rPr>
+          <w:tab/>
+        </w:r>
+        <w:r>
+          <w:rPr>
+            <w:noProof/>
+            <w:webHidden/>
+          </w:rPr>
+          <w:fldChar w:fldCharType="begin"/>
+        </w:r>
+        <w:r>
+          <w:rPr>
+            <w:noProof/>
+            <w:webHidden/>
+          </w:rPr>
+          <w:instrText xml:space="preserve"> PAGEREF _Toc243247176 \h </w:instrText>
+        </w:r>
+        <w:r>
+          <w:rPr>
+            <w:noProof/>
+            <w:webHidden/>
+          </w:rPr>
+        </w:r>
+        <w:r>
+          <w:rPr>
+            <w:noProof/>
+            <w:webHidden/>
+          </w:rPr>
+          <w:fldChar w:fldCharType="separate"/>
+        </w:r>
+        <w:r>
+          <w:rPr>
+            <w:noProof/>
+            <w:webHidden/>
+          </w:rPr>
+          <w:t>3</w:t>
+        </w:r>
+        <w:r>
+          <w:rPr>
+            <w:noProof/>
+            <w:webHidden/>
+          </w:rPr>
+          <w:fldChar w:fldCharType="end"/>
+        </w:r>
+      </w:hyperlink>
     </w:p>
     <w:p>
       <w:pPr>
+        <w:pStyle w:val="31"/>
+        <w:tabs>
+          <w:tab w:val="left" w:pos="1320"/>
+          <w:tab w:val="right" w:leader="dot" w:pos="9345"/>
+        </w:tabs>
+        <w:rPr>
+          <w:noProof/>
+        </w:rPr>
+      </w:pPr>
+      <w:hyperlink w:anchor="_Toc243247177" w:history="1">
+        <w:r>
+          <w:rPr>
+            <w:rStyle w:val="a6"/>
+            <w:noProof/>
+            <w:lang w:eastAsia="ru-RU"/>
+          </w:rPr>
+          <w:t>1.1.1.</w:t>
+        </w:r>
+        <w:r>
+          <w:rPr>
+            <w:noProof/>
+          </w:rPr>
+          <w:tab/>
+        </w:r>
+        <w:r>
+          <w:rPr>
+            <w:rStyle w:val="a6"/>
+            <w:noProof/>
+            <w:lang w:eastAsia="ru-RU"/>
+          </w:rPr>
+          <w:t>Выбор идеи проекта</w:t>
+        </w:r>
+        <w:r>
+          <w:rPr>
+            <w:noProof/>
+            <w:webHidden/>
+          </w:rPr>
+          <w:tab/>
+        </w:r>
+        <w:r>
+          <w:rPr>
+            <w:noProof/>
+            <w:webHidden/>
+          </w:rPr>
+          <w:fldChar w:fldCharType="begin"/>
+        </w:r>
+        <w:r>
+          <w:rPr>
+            <w:noProof/>
+            <w:webHidden/>
+          </w:rPr>
+          <w:instrText xml:space="preserve"> PAGEREF _Toc243247177 \h </w:instrText>
+        </w:r>
+        <w:r>
+          <w:rPr>
+            <w:noProof/>
+            <w:webHidden/>
+          </w:rPr>
+        </w:r>
+        <w:r>
+          <w:rPr>
+            <w:noProof/>
+            <w:webHidden/>
+          </w:rPr>
+          <w:fldChar w:fldCharType="separate"/>
+        </w:r>
+        <w:r>
+          <w:rPr>
+            <w:noProof/>
+            <w:webHidden/>
+          </w:rPr>
+          <w:t>3</w:t>
+        </w:r>
+        <w:r>
+          <w:rPr>
+            <w:noProof/>
+            <w:webHidden/>
+          </w:rPr>
+          <w:fldChar w:fldCharType="end"/>
+        </w:r>
+      </w:hyperlink>
+    </w:p>
+    <w:p>
+      <w:pPr>
+        <w:pStyle w:val="31"/>
+        <w:tabs>
+          <w:tab w:val="left" w:pos="1320"/>
+          <w:tab w:val="right" w:leader="dot" w:pos="9345"/>
+        </w:tabs>
+        <w:rPr>
+          <w:noProof/>
+        </w:rPr>
+      </w:pPr>
+      <w:hyperlink w:anchor="_Toc243247178" w:history="1">
+        <w:r>
+          <w:rPr>
+            <w:rStyle w:val="a6"/>
+            <w:rFonts w:eastAsia="Times New Roman"/>
+            <w:noProof/>
+            <w:lang w:eastAsia="ru-RU"/>
+          </w:rPr>
+          <w:t>1.1.2.</w:t>
+        </w:r>
+        <w:r>
+          <w:rPr>
+            <w:noProof/>
+          </w:rPr>
+          <w:tab/>
+        </w:r>
+        <w:r>
+          <w:rPr>
+            <w:rStyle w:val="a6"/>
+            <w:noProof/>
+            <w:lang w:eastAsia="ru-RU"/>
+          </w:rPr>
+          <w:t>Анализ аналогов и выявление преимуществ и недостатков</w:t>
+        </w:r>
+        <w:r>
+          <w:rPr>
+            <w:noProof/>
+            <w:webHidden/>
+          </w:rPr>
+          <w:tab/>
+        </w:r>
+        <w:r>
+          <w:rPr>
+            <w:noProof/>
+            <w:webHidden/>
+          </w:rPr>
+          <w:fldChar w:fldCharType="begin"/>
+        </w:r>
+        <w:r>
+          <w:rPr>
+            <w:noProof/>
+            <w:webHidden/>
+          </w:rPr>
+          <w:instrText xml:space="preserve"> PAGEREF _Toc243247178 \h </w:instrText>
+        </w:r>
+        <w:r>
+          <w:rPr>
+            <w:noProof/>
+            <w:webHidden/>
+          </w:rPr>
+        </w:r>
+        <w:r>
+          <w:rPr>
+            <w:noProof/>
+            <w:webHidden/>
+          </w:rPr>
+          <w:fldChar w:fldCharType="separate"/>
+        </w:r>
+        <w:r>
+          <w:rPr>
+            <w:noProof/>
+            <w:webHidden/>
+          </w:rPr>
+          <w:t>3</w:t>
+        </w:r>
+        <w:r>
+          <w:rPr>
+            <w:noProof/>
+            <w:webHidden/>
+          </w:rPr>
+          <w:fldChar w:fldCharType="end"/>
+        </w:r>
+      </w:hyperlink>
+    </w:p>
+    <w:p>
+      <w:pPr>
+        <w:pStyle w:val="a9"/>
+        <w:rPr>
+          <w:lang w:eastAsia="ru-RU"/>
+        </w:rPr>
+      </w:pPr>
+      <w:r>
+        <w:rPr>
+          <w:lang w:eastAsia="ru-RU"/>
+        </w:rPr>
+        <w:fldChar w:fldCharType="end"/>
+      </w:r>
+    </w:p>
+    <w:p>
+      <w:pPr>
+        <w:pStyle w:val="a9"/>
+        <w:rPr>
+          <w:lang w:eastAsia="ru-RU"/>
+        </w:rPr>
+      </w:pPr>
+    </w:p>
+    <w:p>
+      <w:pPr>
         <w:spacing w:after="160" w:line="259" w:lineRule="auto"/>
         <w:rPr>
           <w:rFonts w:ascii="Times New Roman" w:hAnsi="Times New Roman"/>
@@ -843,6 +1171,7 @@
           <w:lang w:eastAsia="ru-RU"/>
         </w:rPr>
       </w:pPr>
+      <w:bookmarkStart w:id="1" w:name="_Toc243247175"/>
       <w:r>
         <w:rPr>
           <w:lang w:eastAsia="ru-RU"/>
@@ -850,6 +1179,7 @@
         <w:lastRenderedPageBreak/>
         <w:t>Анализ предметной области</w:t>
       </w:r>
+      <w:bookmarkEnd w:id="1"/>
     </w:p>
     <w:p>
       <w:pPr>
@@ -863,6 +1193,7 @@
           <w:lang w:eastAsia="ru-RU"/>
         </w:rPr>
       </w:pPr>
+      <w:bookmarkStart w:id="2" w:name="_Toc243247176"/>
       <w:r>
         <w:rPr>
           <w:rFonts w:eastAsia="Times New Roman"/>
@@ -870,6 +1201,7 @@
         </w:rPr>
         <w:t>Анализ идеи и выявление потребностей.</w:t>
       </w:r>
+      <w:bookmarkEnd w:id="2"/>
     </w:p>
     <w:p>
       <w:pPr>
@@ -883,12 +1215,20 @@
           <w:lang w:eastAsia="ru-RU"/>
         </w:rPr>
       </w:pPr>
-      <w:r>
-        <w:rPr>
-          <w:lang w:eastAsia="ru-RU"/>
-        </w:rPr>
-        <w:t>Выбор идеи проекта</w:t>
-      </w:r>
+      <w:bookmarkStart w:id="3" w:name="_Toc243247177"/>
+      <w:r>
+        <w:rPr>
+          <w:lang w:eastAsia="ru-RU"/>
+        </w:rPr>
+        <w:t xml:space="preserve">Концепция </w:t>
+      </w:r>
+      <w:r>
+        <w:rPr>
+          <w:lang w:eastAsia="ru-RU"/>
+        </w:rPr>
+        <w:t>проекта</w:t>
+      </w:r>
+      <w:bookmarkEnd w:id="3"/>
     </w:p>
     <w:p>
       <w:pPr>
@@ -901,7 +1241,27 @@
         <w:rPr>
           <w:lang w:eastAsia="ru-RU"/>
         </w:rPr>
-        <w:t>Основная идея проекта: создание мобильной игры, которая имеет жанр: детектив.</w:t>
+        <w:t xml:space="preserve">Проект представляет собой мобильную игру в жанре детектив для платформы </w:t>
+      </w:r>
+      <w:proofErr w:type="spellStart"/>
+      <w:r>
+        <w:rPr>
+          <w:lang w:eastAsia="ru-RU"/>
+        </w:rPr>
+        <w:t>Android</w:t>
+      </w:r>
+      <w:proofErr w:type="spellEnd"/>
+      <w:r>
+        <w:rPr>
+          <w:lang w:eastAsia="ru-RU"/>
+        </w:rPr>
+        <w:t>. Пользователь авторизуется в приложении, после чего получает описание истории и цель расследования. В ходе игры он решает головоломки, выполняет мини-игры и общается с виртуальными персонажами, собирает улики и на их основе делает выводы о том, кто является преступн</w:t>
+      </w:r>
+      <w:r>
+        <w:rPr>
+          <w:lang w:eastAsia="ru-RU"/>
+        </w:rPr>
+        <w:t>иком.</w:t>
       </w:r>
     </w:p>
     <w:p>
@@ -915,21 +1275,19 @@
         <w:rPr>
           <w:lang w:eastAsia="ru-RU"/>
         </w:rPr>
-        <w:t>Пользователь авторизуется в приложении и после этого может начинать игру, а именно: дается описание истории и цель расследования. После этого игрок, решая различные головоломки, задачки, мини игры и общаясь с виртуальными персонажами, собирает улики, на основе которых может сделать выводы о том, кто является преступником.</w:t>
-      </w:r>
-    </w:p>
-    <w:p>
-      <w:pPr>
-        <w:pStyle w:val="a9"/>
-        <w:rPr>
-          <w:lang w:eastAsia="ru-RU"/>
-        </w:rPr>
-      </w:pPr>
-      <w:r>
-        <w:rPr>
-          <w:lang w:eastAsia="ru-RU"/>
-        </w:rPr>
-        <w:t>Основная целевая аудитория: молодые люди (18-25 лет) и подростки, так как такого типа игры часто привлекают более молодую аудиторию.</w:t>
+        <w:t xml:space="preserve">Ключевое отличие от классических детективных игр состоит в двух технологических решениях. Во-первых, диалоги с персонажами генерируются языковой моделью: подозреваемые не отвечают по заранее заготовленному сценарию, а ведут себя как живые люди </w:t>
+      </w:r>
+      <w:r>
+        <w:rPr>
+          <w:lang w:eastAsia="ru-RU"/>
+        </w:rPr>
+        <w:t>-</w:t>
+      </w:r>
+      <w:r>
+        <w:rPr>
+          <w:lang w:eastAsia="ru-RU"/>
+        </w:rPr>
+        <w:t xml:space="preserve"> могут врать, путаться, менять показания под давлением и запоминать, что игрок спрашивал ранее. Во-вторых, поиск улик происходит не на экране, а в реальном пространстве: игрок включает камеру, поворачивается на 360 градусов и находит улики, привязанные к сторонам света, после чего должен физически подойти к ним и сфотографировать.</w:t>
       </w:r>
     </w:p>
     <w:p>
@@ -949,7 +1307,7 @@
         <w:rPr>
           <w:lang w:eastAsia="ru-RU"/>
         </w:rPr>
-        <w:t>Анализ аналогов и выявление преимуществ и недостатков</w:t>
+        <w:t>Проблематика и ценность для пользователя</w:t>
       </w:r>
     </w:p>
     <w:p>
@@ -959,8 +1317,1289 @@
           <w:lang w:eastAsia="ru-RU"/>
         </w:rPr>
       </w:pPr>
-      <w:bookmarkStart w:id="1" w:name="_GoBack"/>
-      <w:bookmarkEnd w:id="1"/>
+      <w:r>
+        <w:rPr>
+          <w:lang w:eastAsia="ru-RU"/>
+        </w:rPr>
+        <w:t xml:space="preserve">Современные мобильные детективы часто линейны, а их диалоги скриптовы. Игроку предлагают выбор из 3–4 готовых реплик, из-за чего невозможно задать свой вопрос или поймать персонажа на лжи. </w:t>
+      </w:r>
+      <w:r>
+        <w:rPr>
+          <w:lang w:eastAsia="ru-RU"/>
+        </w:rPr>
+        <w:t>Игра не заставляет думать пользователя, а просто ведет по заранее подготовленному пути.</w:t>
+      </w:r>
+    </w:p>
+    <w:p>
+      <w:pPr>
+        <w:pStyle w:val="a9"/>
+        <w:rPr>
+          <w:lang w:eastAsia="ru-RU"/>
+        </w:rPr>
+      </w:pPr>
+      <w:r>
+        <w:rPr>
+          <w:lang w:eastAsia="ru-RU"/>
+        </w:rPr>
+        <w:t xml:space="preserve">Так же такие игры не используют ничего более, чем стандартные игровые механики (где-то на картинке найти улику, сделать правильный выбор в диалоге и </w:t>
+      </w:r>
+      <w:proofErr w:type="spellStart"/>
+      <w:r>
+        <w:rPr>
+          <w:lang w:eastAsia="ru-RU"/>
+        </w:rPr>
+        <w:t>тд</w:t>
+      </w:r>
+      <w:proofErr w:type="spellEnd"/>
+      <w:r>
+        <w:rPr>
+          <w:lang w:eastAsia="ru-RU"/>
+        </w:rPr>
+        <w:t>.).</w:t>
+      </w:r>
+    </w:p>
+    <w:p>
+      <w:pPr>
+        <w:pStyle w:val="a9"/>
+        <w:rPr>
+          <w:lang w:eastAsia="ru-RU"/>
+        </w:rPr>
+      </w:pPr>
+      <w:r>
+        <w:rPr>
+          <w:lang w:eastAsia="ru-RU"/>
+        </w:rPr>
+        <w:t>Разрабатываемый проект</w:t>
+      </w:r>
+      <w:r>
+        <w:rPr>
+          <w:lang w:eastAsia="ru-RU"/>
+        </w:rPr>
+        <w:t xml:space="preserve"> решает </w:t>
+      </w:r>
+      <w:r>
+        <w:rPr>
+          <w:lang w:eastAsia="ru-RU"/>
+        </w:rPr>
+        <w:t>данные</w:t>
+      </w:r>
+      <w:r>
+        <w:rPr>
+          <w:lang w:eastAsia="ru-RU"/>
+        </w:rPr>
+        <w:t xml:space="preserve"> проблемы. Ценность для пользо</w:t>
+      </w:r>
+      <w:r>
+        <w:rPr>
+          <w:lang w:eastAsia="ru-RU"/>
+        </w:rPr>
+        <w:t>вателя заключается в следующем:</w:t>
+      </w:r>
+    </w:p>
+    <w:p>
+      <w:pPr>
+        <w:pStyle w:val="a9"/>
+        <w:numPr>
+          <w:ilvl w:val="0"/>
+          <w:numId w:val="31"/>
+        </w:numPr>
+        <w:ind w:left="0" w:firstLine="709"/>
+        <w:rPr>
+          <w:lang w:eastAsia="ru-RU"/>
+        </w:rPr>
+      </w:pPr>
+      <w:r>
+        <w:rPr>
+          <w:lang w:eastAsia="ru-RU"/>
+        </w:rPr>
+        <w:lastRenderedPageBreak/>
+        <w:t>Допрос ощущается как настоящий. Можно спросить что угодно, поймать на противо</w:t>
+      </w:r>
+      <w:r>
+        <w:rPr>
+          <w:lang w:eastAsia="ru-RU"/>
+        </w:rPr>
+        <w:t>речии, надавить уликой.</w:t>
+      </w:r>
+    </w:p>
+    <w:p>
+      <w:pPr>
+        <w:pStyle w:val="a9"/>
+        <w:numPr>
+          <w:ilvl w:val="0"/>
+          <w:numId w:val="31"/>
+        </w:numPr>
+        <w:ind w:left="0" w:firstLine="709"/>
+        <w:rPr>
+          <w:lang w:eastAsia="ru-RU"/>
+        </w:rPr>
+      </w:pPr>
+      <w:r>
+        <w:rPr>
+          <w:lang w:eastAsia="ru-RU"/>
+        </w:rPr>
+        <w:t>Детектив нужно именно «расследовать». Игра выходит за экран: нужно вставать, поворачиваться, подходить к предмет</w:t>
+      </w:r>
+      <w:r>
+        <w:rPr>
+          <w:lang w:eastAsia="ru-RU"/>
+        </w:rPr>
+        <w:t>ам и ощущать вибрацию телефона.</w:t>
+      </w:r>
+    </w:p>
+    <w:p>
+      <w:pPr>
+        <w:pStyle w:val="a9"/>
+        <w:rPr>
+          <w:lang w:eastAsia="ru-RU"/>
+        </w:rPr>
+      </w:pPr>
+      <w:r>
+        <w:rPr>
+          <w:lang w:eastAsia="ru-RU"/>
+        </w:rPr>
+        <w:t>Так же, проанализировав проблемы современных игры, было выявлено, что основная аудитория игр в данном жанре молодые люди 18-25 лет.</w:t>
+      </w:r>
+    </w:p>
+    <w:p>
+      <w:pPr>
+        <w:pStyle w:val="a9"/>
+        <w:rPr>
+          <w:lang w:eastAsia="ru-RU"/>
+        </w:rPr>
+      </w:pPr>
+      <w:r>
+        <w:rPr>
+          <w:lang w:eastAsia="ru-RU"/>
+        </w:rPr>
+        <w:t>Основные преимущества для данной аудитории:</w:t>
+      </w:r>
+    </w:p>
+    <w:p>
+      <w:pPr>
+        <w:pStyle w:val="a9"/>
+        <w:numPr>
+          <w:ilvl w:val="0"/>
+          <w:numId w:val="31"/>
+        </w:numPr>
+        <w:ind w:left="0" w:firstLine="709"/>
+        <w:rPr>
+          <w:lang w:eastAsia="ru-RU"/>
+        </w:rPr>
+      </w:pPr>
+      <w:r>
+        <w:rPr>
+          <w:lang w:eastAsia="ru-RU"/>
+        </w:rPr>
+        <w:t>Развитие критического мышления</w:t>
+      </w:r>
+    </w:p>
+    <w:p>
+      <w:pPr>
+        <w:pStyle w:val="a9"/>
+        <w:numPr>
+          <w:ilvl w:val="0"/>
+          <w:numId w:val="31"/>
+        </w:numPr>
+        <w:ind w:left="0" w:firstLine="709"/>
+        <w:rPr>
+          <w:lang w:eastAsia="ru-RU"/>
+        </w:rPr>
+      </w:pPr>
+      <w:r>
+        <w:rPr>
+          <w:lang w:eastAsia="ru-RU"/>
+        </w:rPr>
+        <w:t>Повышения уровня внимательности, сосредоточенности и усидчивости</w:t>
+      </w:r>
+    </w:p>
+    <w:p>
+      <w:pPr>
+        <w:pStyle w:val="a9"/>
+        <w:numPr>
+          <w:ilvl w:val="0"/>
+          <w:numId w:val="31"/>
+        </w:numPr>
+        <w:ind w:left="0" w:firstLine="709"/>
+        <w:rPr>
+          <w:lang w:eastAsia="ru-RU"/>
+        </w:rPr>
+      </w:pPr>
+      <w:r>
+        <w:rPr>
+          <w:lang w:eastAsia="ru-RU"/>
+        </w:rPr>
+        <w:t>Интересное взаимодействие с «живыми» персонажами, который реагируют на игрока не по шаблону</w:t>
+      </w:r>
+    </w:p>
+    <w:p>
+      <w:pPr>
+        <w:pStyle w:val="a9"/>
+        <w:rPr>
+          <w:lang w:eastAsia="ru-RU"/>
+        </w:rPr>
+      </w:pPr>
+    </w:p>
+    <w:p>
+      <w:pPr>
+        <w:pStyle w:val="a9"/>
+        <w:rPr>
+          <w:lang w:eastAsia="ru-RU"/>
+        </w:rPr>
+      </w:pPr>
+      <w:r>
+        <w:rPr>
+          <w:lang w:eastAsia="ru-RU"/>
+        </w:rPr>
+        <w:t>Сценарий использования: Короткие сессии по 10–20 минут, дома и на улице.</w:t>
+      </w:r>
+    </w:p>
+    <w:p>
+      <w:pPr>
+        <w:pStyle w:val="3"/>
+        <w:numPr>
+          <w:ilvl w:val="2"/>
+          <w:numId w:val="30"/>
+        </w:numPr>
+        <w:ind w:left="0" w:firstLine="709"/>
+        <w:rPr>
+          <w:lang w:eastAsia="ru-RU"/>
+        </w:rPr>
+      </w:pPr>
+      <w:r>
+        <w:rPr>
+          <w:lang w:eastAsia="ru-RU"/>
+        </w:rPr>
+        <w:t>Сравнительный анализ аналогов</w:t>
+      </w:r>
+    </w:p>
+    <w:p>
+      <w:pPr>
+        <w:pStyle w:val="a9"/>
+        <w:rPr>
+          <w:lang w:eastAsia="ru-RU"/>
+        </w:rPr>
+      </w:pPr>
+      <w:r>
+        <w:rPr>
+          <w:lang w:eastAsia="ru-RU"/>
+        </w:rPr>
+        <w:t>Основные мобильные аналоги:</w:t>
+      </w:r>
+    </w:p>
+    <w:p>
+      <w:pPr>
+        <w:pStyle w:val="a9"/>
+        <w:rPr>
+          <w:lang w:eastAsia="ru-RU"/>
+        </w:rPr>
+      </w:pPr>
+      <w:proofErr w:type="spellStart"/>
+      <w:r>
+        <w:rPr>
+          <w:lang w:eastAsia="ru-RU"/>
+        </w:rPr>
+        <w:t>Criminal</w:t>
+      </w:r>
+      <w:proofErr w:type="spellEnd"/>
+      <w:r>
+        <w:rPr>
+          <w:lang w:eastAsia="ru-RU"/>
+        </w:rPr>
+        <w:t xml:space="preserve"> </w:t>
+      </w:r>
+      <w:proofErr w:type="spellStart"/>
+      <w:r>
+        <w:rPr>
+          <w:lang w:eastAsia="ru-RU"/>
+        </w:rPr>
+        <w:t>Case</w:t>
+      </w:r>
+      <w:proofErr w:type="spellEnd"/>
+      <w:r>
+        <w:rPr>
+          <w:lang w:eastAsia="ru-RU"/>
+        </w:rPr>
+        <w:t xml:space="preserve"> -</w:t>
+      </w:r>
+      <w:r>
+        <w:rPr>
+          <w:lang w:eastAsia="ru-RU"/>
+        </w:rPr>
+        <w:t xml:space="preserve"> классическая мобильная игра в жанре «поиск предметов». Игрок исследует сцены преступлений и допрашивает подозреваемых. Игра имеет огромную аудиторию, но её ключевой недостаток </w:t>
+      </w:r>
+      <w:r>
+        <w:rPr>
+          <w:lang w:eastAsia="ru-RU"/>
+        </w:rPr>
+        <w:t>-</w:t>
+      </w:r>
+      <w:r>
+        <w:rPr>
+          <w:lang w:eastAsia="ru-RU"/>
+        </w:rPr>
+        <w:t xml:space="preserve"> полностью скриптовые </w:t>
+      </w:r>
+      <w:r>
+        <w:rPr>
+          <w:lang w:eastAsia="ru-RU"/>
+        </w:rPr>
+        <w:t>диалоги и линейное прохождение.</w:t>
+      </w:r>
+    </w:p>
+    <w:p>
+      <w:pPr>
+        <w:pStyle w:val="a9"/>
+        <w:rPr>
+          <w:lang w:eastAsia="ru-RU"/>
+        </w:rPr>
+      </w:pPr>
+      <w:proofErr w:type="spellStart"/>
+      <w:r>
+        <w:rPr>
+          <w:lang w:eastAsia="ru-RU"/>
+        </w:rPr>
+        <w:t>Duskwood</w:t>
+      </w:r>
+      <w:proofErr w:type="spellEnd"/>
+      <w:r>
+        <w:rPr>
+          <w:lang w:eastAsia="ru-RU"/>
+        </w:rPr>
+        <w:t xml:space="preserve"> -</w:t>
+      </w:r>
+      <w:r>
+        <w:rPr>
+          <w:lang w:eastAsia="ru-RU"/>
+        </w:rPr>
+        <w:t xml:space="preserve"> популярный сюжетный детектив, где игрок общается с персонажами через </w:t>
+      </w:r>
+      <w:proofErr w:type="spellStart"/>
+      <w:r>
+        <w:rPr>
+          <w:lang w:eastAsia="ru-RU"/>
+        </w:rPr>
+        <w:t>фейковый</w:t>
+      </w:r>
+      <w:proofErr w:type="spellEnd"/>
+      <w:r>
+        <w:rPr>
+          <w:lang w:eastAsia="ru-RU"/>
+        </w:rPr>
+        <w:t xml:space="preserve"> мессенджер. </w:t>
+      </w:r>
+      <w:r>
+        <w:rPr>
+          <w:lang w:eastAsia="ru-RU"/>
+        </w:rPr>
+        <w:t xml:space="preserve">Диалоги </w:t>
+      </w:r>
+      <w:r>
+        <w:rPr>
+          <w:lang w:eastAsia="ru-RU"/>
+        </w:rPr>
+        <w:t>здесь представляют собой выбор из готовых вариантов ответа</w:t>
+      </w:r>
+      <w:r>
+        <w:rPr>
+          <w:lang w:eastAsia="ru-RU"/>
+        </w:rPr>
+        <w:t>.</w:t>
+      </w:r>
+    </w:p>
+    <w:p>
+      <w:pPr>
+        <w:pStyle w:val="a9"/>
+        <w:rPr>
+          <w:lang w:eastAsia="ru-RU"/>
+        </w:rPr>
+      </w:pPr>
+      <w:proofErr w:type="spellStart"/>
+      <w:r>
+        <w:rPr>
+          <w:lang w:eastAsia="ru-RU"/>
+        </w:rPr>
+        <w:t>Detective</w:t>
+      </w:r>
+      <w:proofErr w:type="spellEnd"/>
+      <w:r>
+        <w:rPr>
+          <w:lang w:eastAsia="ru-RU"/>
+        </w:rPr>
+        <w:t xml:space="preserve"> </w:t>
+      </w:r>
+      <w:proofErr w:type="spellStart"/>
+      <w:r>
+        <w:rPr>
+          <w:lang w:eastAsia="ru-RU"/>
+        </w:rPr>
+        <w:t>Protocol</w:t>
+      </w:r>
+      <w:proofErr w:type="spellEnd"/>
+      <w:r>
+        <w:rPr>
+          <w:lang w:eastAsia="ru-RU"/>
+        </w:rPr>
+        <w:t xml:space="preserve">: </w:t>
+      </w:r>
+      <w:proofErr w:type="spellStart"/>
+      <w:r>
+        <w:rPr>
+          <w:lang w:eastAsia="ru-RU"/>
+        </w:rPr>
+        <w:t>Crime</w:t>
+      </w:r>
+      <w:proofErr w:type="spellEnd"/>
+      <w:r>
+        <w:rPr>
+          <w:lang w:eastAsia="ru-RU"/>
+        </w:rPr>
+        <w:t xml:space="preserve"> </w:t>
+      </w:r>
+      <w:proofErr w:type="spellStart"/>
+      <w:r>
+        <w:rPr>
+          <w:lang w:eastAsia="ru-RU"/>
+        </w:rPr>
+        <w:t>Sim</w:t>
+      </w:r>
+      <w:proofErr w:type="spellEnd"/>
+      <w:r>
+        <w:rPr>
+          <w:lang w:eastAsia="ru-RU"/>
+        </w:rPr>
+        <w:t xml:space="preserve"> </w:t>
+      </w:r>
+      <w:r>
+        <w:rPr>
+          <w:lang w:eastAsia="ru-RU"/>
+        </w:rPr>
+        <w:t>-</w:t>
+      </w:r>
+      <w:r>
+        <w:rPr>
+          <w:lang w:eastAsia="ru-RU"/>
+        </w:rPr>
+        <w:t xml:space="preserve"> </w:t>
+      </w:r>
+      <w:r>
+        <w:rPr>
+          <w:lang w:eastAsia="ru-RU"/>
+        </w:rPr>
+        <w:t>современный проект, который использует в своей работе ИИ. Игра предлагает не «шаблонных</w:t>
+      </w:r>
+      <w:r>
+        <w:rPr>
+          <w:lang w:eastAsia="ru-RU"/>
+        </w:rPr>
+        <w:t>» ИИ-подозреваемых, которых можно допрашивать свободным текс</w:t>
+      </w:r>
+      <w:r>
+        <w:rPr>
+          <w:lang w:eastAsia="ru-RU"/>
+        </w:rPr>
+        <w:t>том. Персонажи лгут и ломаются</w:t>
+      </w:r>
+      <w:r>
+        <w:rPr>
+          <w:lang w:eastAsia="ru-RU"/>
+        </w:rPr>
+        <w:t xml:space="preserve"> под давлением. О</w:t>
+      </w:r>
+    </w:p>
+    <w:p>
+      <w:pPr>
+        <w:pStyle w:val="a9"/>
+        <w:rPr>
+          <w:lang w:eastAsia="ru-RU"/>
+        </w:rPr>
+      </w:pPr>
+      <w:r>
+        <w:rPr>
+          <w:lang w:eastAsia="ru-RU"/>
+        </w:rPr>
+        <w:lastRenderedPageBreak/>
+        <w:t xml:space="preserve">На основе проведенного анализа </w:t>
+      </w:r>
+      <w:r>
+        <w:rPr>
+          <w:lang w:eastAsia="ru-RU"/>
+        </w:rPr>
+        <w:t>и выявления основных преимуществ и недостатков аналогов, была составлена сравнительная таблица.</w:t>
+      </w:r>
+    </w:p>
+    <w:p>
+      <w:pPr>
+        <w:pStyle w:val="a9"/>
+        <w:spacing w:before="120"/>
+        <w:ind w:firstLine="0"/>
+        <w:contextualSpacing w:val="0"/>
+        <w:rPr>
+          <w:lang w:eastAsia="ru-RU"/>
+        </w:rPr>
+      </w:pPr>
+      <w:r>
+        <w:rPr>
+          <w:lang w:eastAsia="ru-RU"/>
+        </w:rPr>
+        <w:t>Таблица 1 – Сравнительный анализ аналогов.</w:t>
+      </w:r>
+    </w:p>
+    <w:tbl>
+      <w:tblPr>
+        <w:tblStyle w:val="a5"/>
+        <w:tblW w:w="0" w:type="auto"/>
+        <w:tblLayout w:type="fixed"/>
+        <w:tblLook w:val="04A0" w:firstRow="1" w:lastRow="0" w:firstColumn="1" w:lastColumn="0" w:noHBand="0" w:noVBand="1"/>
+      </w:tblPr>
+      <w:tblGrid>
+        <w:gridCol w:w="2547"/>
+        <w:gridCol w:w="1843"/>
+        <w:gridCol w:w="1701"/>
+        <w:gridCol w:w="1701"/>
+        <w:gridCol w:w="1553"/>
+      </w:tblGrid>
+      <w:tr>
+        <w:tc>
+          <w:tcPr>
+            <w:tcW w:w="2547" w:type="dxa"/>
+          </w:tcPr>
+          <w:p>
+            <w:pPr>
+              <w:pStyle w:val="a9"/>
+              <w:ind w:firstLine="0"/>
+              <w:rPr>
+                <w:lang w:eastAsia="ru-RU"/>
+              </w:rPr>
+            </w:pPr>
+            <w:r>
+              <w:rPr>
+                <w:lang w:eastAsia="ru-RU"/>
+              </w:rPr>
+              <w:t>Критерии</w:t>
+            </w:r>
+          </w:p>
+        </w:tc>
+        <w:tc>
+          <w:tcPr>
+            <w:tcW w:w="1843" w:type="dxa"/>
+          </w:tcPr>
+          <w:p>
+            <w:pPr>
+              <w:pStyle w:val="a9"/>
+              <w:ind w:firstLine="0"/>
+              <w:rPr>
+                <w:lang w:eastAsia="ru-RU"/>
+              </w:rPr>
+            </w:pPr>
+            <w:proofErr w:type="spellStart"/>
+            <w:r>
+              <w:rPr>
+                <w:lang w:eastAsia="ru-RU"/>
+              </w:rPr>
+              <w:t>Criminal</w:t>
+            </w:r>
+            <w:proofErr w:type="spellEnd"/>
+            <w:r>
+              <w:rPr>
+                <w:lang w:eastAsia="ru-RU"/>
+              </w:rPr>
+              <w:t xml:space="preserve"> </w:t>
+            </w:r>
+            <w:proofErr w:type="spellStart"/>
+            <w:r>
+              <w:rPr>
+                <w:lang w:eastAsia="ru-RU"/>
+              </w:rPr>
+              <w:t>Case</w:t>
+            </w:r>
+            <w:proofErr w:type="spellEnd"/>
+          </w:p>
+        </w:tc>
+        <w:tc>
+          <w:tcPr>
+            <w:tcW w:w="1701" w:type="dxa"/>
+          </w:tcPr>
+          <w:p>
+            <w:pPr>
+              <w:pStyle w:val="a9"/>
+              <w:ind w:firstLine="0"/>
+              <w:rPr>
+                <w:lang w:eastAsia="ru-RU"/>
+              </w:rPr>
+            </w:pPr>
+            <w:proofErr w:type="spellStart"/>
+            <w:r>
+              <w:rPr>
+                <w:lang w:eastAsia="ru-RU"/>
+              </w:rPr>
+              <w:t>Duskwood</w:t>
+            </w:r>
+            <w:proofErr w:type="spellEnd"/>
+          </w:p>
+        </w:tc>
+        <w:tc>
+          <w:tcPr>
+            <w:tcW w:w="1701" w:type="dxa"/>
+          </w:tcPr>
+          <w:p>
+            <w:pPr>
+              <w:pStyle w:val="a9"/>
+              <w:ind w:firstLine="0"/>
+              <w:rPr>
+                <w:lang w:eastAsia="ru-RU"/>
+              </w:rPr>
+            </w:pPr>
+            <w:proofErr w:type="spellStart"/>
+            <w:r>
+              <w:rPr>
+                <w:lang w:eastAsia="ru-RU"/>
+              </w:rPr>
+              <w:t>Detective</w:t>
+            </w:r>
+            <w:proofErr w:type="spellEnd"/>
+            <w:r>
+              <w:rPr>
+                <w:lang w:eastAsia="ru-RU"/>
+              </w:rPr>
+              <w:t xml:space="preserve"> </w:t>
+            </w:r>
+            <w:proofErr w:type="spellStart"/>
+            <w:r>
+              <w:rPr>
+                <w:lang w:eastAsia="ru-RU"/>
+              </w:rPr>
+              <w:t>Protocol</w:t>
+            </w:r>
+            <w:proofErr w:type="spellEnd"/>
+          </w:p>
+        </w:tc>
+        <w:tc>
+          <w:tcPr>
+            <w:tcW w:w="1553" w:type="dxa"/>
+          </w:tcPr>
+          <w:p>
+            <w:pPr>
+              <w:pStyle w:val="a9"/>
+              <w:ind w:firstLine="0"/>
+              <w:rPr>
+                <w:lang w:eastAsia="ru-RU"/>
+              </w:rPr>
+            </w:pPr>
+          </w:p>
+        </w:tc>
+      </w:tr>
+      <w:tr>
+        <w:tc>
+          <w:tcPr>
+            <w:tcW w:w="2547" w:type="dxa"/>
+          </w:tcPr>
+          <w:p>
+            <w:pPr>
+              <w:pStyle w:val="a9"/>
+              <w:ind w:firstLine="0"/>
+              <w:rPr>
+                <w:lang w:eastAsia="ru-RU"/>
+              </w:rPr>
+            </w:pPr>
+            <w:r>
+              <w:rPr>
+                <w:lang w:eastAsia="ru-RU"/>
+              </w:rPr>
+              <w:t>Формат</w:t>
+            </w:r>
+          </w:p>
+        </w:tc>
+        <w:tc>
+          <w:tcPr>
+            <w:tcW w:w="1843" w:type="dxa"/>
+          </w:tcPr>
+          <w:p>
+            <w:pPr>
+              <w:pStyle w:val="a9"/>
+              <w:ind w:firstLine="0"/>
+              <w:rPr>
+                <w:lang w:eastAsia="ru-RU"/>
+              </w:rPr>
+            </w:pPr>
+            <w:r>
+              <w:t>Поиск предметов,</w:t>
+            </w:r>
+            <w:r>
+              <w:t xml:space="preserve"> скриптовые допросы</w:t>
+            </w:r>
+          </w:p>
+        </w:tc>
+        <w:tc>
+          <w:tcPr>
+            <w:tcW w:w="1701" w:type="dxa"/>
+          </w:tcPr>
+          <w:p>
+            <w:pPr>
+              <w:pStyle w:val="a9"/>
+              <w:ind w:firstLine="0"/>
+              <w:rPr>
+                <w:lang w:eastAsia="ru-RU"/>
+              </w:rPr>
+            </w:pPr>
+            <w:r>
+              <w:t>Сюжетный детектив через мессенджер</w:t>
+            </w:r>
+          </w:p>
+        </w:tc>
+        <w:tc>
+          <w:tcPr>
+            <w:tcW w:w="1701" w:type="dxa"/>
+          </w:tcPr>
+          <w:p>
+            <w:pPr>
+              <w:pStyle w:val="a9"/>
+              <w:ind w:firstLine="0"/>
+              <w:rPr>
+                <w:lang w:eastAsia="ru-RU"/>
+              </w:rPr>
+            </w:pPr>
+            <w:r>
+              <w:t>Симулятор ИИ-</w:t>
+            </w:r>
+            <w:r>
+              <w:t>допроса</w:t>
+            </w:r>
+          </w:p>
+        </w:tc>
+        <w:tc>
+          <w:tcPr>
+            <w:tcW w:w="1553" w:type="dxa"/>
+          </w:tcPr>
+          <w:p>
+            <w:pPr>
+              <w:pStyle w:val="a9"/>
+              <w:ind w:firstLine="0"/>
+              <w:rPr>
+                <w:lang w:eastAsia="ru-RU"/>
+              </w:rPr>
+            </w:pPr>
+            <w:r>
+              <w:t>Сюжетный детектив с использованием ИИ технологий</w:t>
+            </w:r>
+          </w:p>
+        </w:tc>
+      </w:tr>
+      <w:tr>
+        <w:tc>
+          <w:tcPr>
+            <w:tcW w:w="2547" w:type="dxa"/>
+          </w:tcPr>
+          <w:p>
+            <w:pPr>
+              <w:pStyle w:val="a9"/>
+              <w:ind w:firstLine="0"/>
+              <w:rPr>
+                <w:lang w:eastAsia="ru-RU"/>
+              </w:rPr>
+            </w:pPr>
+            <w:r>
+              <w:rPr>
+                <w:lang w:eastAsia="ru-RU"/>
+              </w:rPr>
+              <w:t>Свобода диалога</w:t>
+            </w:r>
+          </w:p>
+        </w:tc>
+        <w:tc>
+          <w:tcPr>
+            <w:tcW w:w="1843" w:type="dxa"/>
+          </w:tcPr>
+          <w:p>
+            <w:pPr>
+              <w:pStyle w:val="a9"/>
+              <w:ind w:firstLine="0"/>
+              <w:rPr>
+                <w:lang w:eastAsia="ru-RU"/>
+              </w:rPr>
+            </w:pPr>
+            <w:r>
+              <w:t>Выбор из готовых фраз</w:t>
+            </w:r>
+          </w:p>
+        </w:tc>
+        <w:tc>
+          <w:tcPr>
+            <w:tcW w:w="1701" w:type="dxa"/>
+          </w:tcPr>
+          <w:p>
+            <w:pPr>
+              <w:pStyle w:val="a9"/>
+              <w:ind w:firstLine="0"/>
+              <w:rPr>
+                <w:lang w:eastAsia="ru-RU"/>
+              </w:rPr>
+            </w:pPr>
+            <w:r>
+              <w:t>Выбор из готовых фраз</w:t>
+            </w:r>
+          </w:p>
+        </w:tc>
+        <w:tc>
+          <w:tcPr>
+            <w:tcW w:w="1701" w:type="dxa"/>
+          </w:tcPr>
+          <w:p>
+            <w:pPr>
+              <w:pStyle w:val="a9"/>
+              <w:ind w:firstLine="0"/>
+              <w:rPr>
+                <w:lang w:eastAsia="ru-RU"/>
+              </w:rPr>
+            </w:pPr>
+            <w:r>
+              <w:t>Свободный текстовый ввод</w:t>
+            </w:r>
+          </w:p>
+        </w:tc>
+        <w:tc>
+          <w:tcPr>
+            <w:tcW w:w="1553" w:type="dxa"/>
+          </w:tcPr>
+          <w:p>
+            <w:pPr>
+              <w:pStyle w:val="a9"/>
+              <w:ind w:firstLine="0"/>
+              <w:rPr>
+                <w:lang w:eastAsia="ru-RU"/>
+              </w:rPr>
+            </w:pPr>
+            <w:r>
+              <w:t xml:space="preserve">Свободный ввод </w:t>
+            </w:r>
+          </w:p>
+        </w:tc>
+      </w:tr>
+      <w:tr>
+        <w:tc>
+          <w:tcPr>
+            <w:tcW w:w="2547" w:type="dxa"/>
+          </w:tcPr>
+          <w:p>
+            <w:pPr>
+              <w:pStyle w:val="a9"/>
+              <w:ind w:firstLine="0"/>
+              <w:rPr>
+                <w:lang w:eastAsia="ru-RU"/>
+              </w:rPr>
+            </w:pPr>
+            <w:r>
+              <w:rPr>
+                <w:lang w:eastAsia="ru-RU"/>
+              </w:rPr>
+              <w:t>Ложь и давление</w:t>
+            </w:r>
+          </w:p>
+        </w:tc>
+        <w:tc>
+          <w:tcPr>
+            <w:tcW w:w="1843" w:type="dxa"/>
+          </w:tcPr>
+          <w:p>
+            <w:pPr>
+              <w:pStyle w:val="a9"/>
+              <w:ind w:firstLine="0"/>
+              <w:rPr>
+                <w:lang w:eastAsia="ru-RU"/>
+              </w:rPr>
+            </w:pPr>
+            <w:r>
+              <w:rPr>
+                <w:lang w:eastAsia="ru-RU"/>
+              </w:rPr>
+              <w:t>Персонажи следуют заранее заготовленному сценарию</w:t>
+            </w:r>
+          </w:p>
+        </w:tc>
+        <w:tc>
+          <w:tcPr>
+            <w:tcW w:w="1701" w:type="dxa"/>
+          </w:tcPr>
+          <w:p>
+            <w:pPr>
+              <w:pStyle w:val="a9"/>
+              <w:ind w:firstLine="0"/>
+              <w:rPr>
+                <w:lang w:eastAsia="ru-RU"/>
+              </w:rPr>
+            </w:pPr>
+            <w:r>
+              <w:rPr>
+                <w:lang w:eastAsia="ru-RU"/>
+              </w:rPr>
+              <w:t>Персонажи следуют заранее заготовленному сценарию</w:t>
+            </w:r>
+          </w:p>
+        </w:tc>
+        <w:tc>
+          <w:tcPr>
+            <w:tcW w:w="1701" w:type="dxa"/>
+          </w:tcPr>
+          <w:p>
+            <w:pPr>
+              <w:pStyle w:val="a9"/>
+              <w:ind w:firstLine="0"/>
+              <w:rPr>
+                <w:lang w:eastAsia="ru-RU"/>
+              </w:rPr>
+            </w:pPr>
+            <w:r>
+              <w:rPr>
+                <w:lang w:eastAsia="ru-RU"/>
+              </w:rPr>
+              <w:t>Подозреваемые умеют лгать и реагируют на давление</w:t>
+            </w:r>
+          </w:p>
+        </w:tc>
+        <w:tc>
+          <w:tcPr>
+            <w:tcW w:w="1553" w:type="dxa"/>
+          </w:tcPr>
+          <w:p>
+            <w:pPr>
+              <w:pStyle w:val="a9"/>
+              <w:ind w:firstLine="0"/>
+              <w:rPr>
+                <w:lang w:eastAsia="ru-RU"/>
+              </w:rPr>
+            </w:pPr>
+            <w:r>
+              <w:rPr>
+                <w:lang w:eastAsia="ru-RU"/>
+              </w:rPr>
+              <w:t>Подозреваемые умеют лгать и реагируют на давление</w:t>
+            </w:r>
+            <w:r>
+              <w:rPr>
+                <w:lang w:eastAsia="ru-RU"/>
+              </w:rPr>
+              <w:t>, а так же имеют уровень стресса</w:t>
+            </w:r>
+          </w:p>
+        </w:tc>
+      </w:tr>
+      <w:tr>
+        <w:tc>
+          <w:tcPr>
+            <w:tcW w:w="2547" w:type="dxa"/>
+          </w:tcPr>
+          <w:p>
+            <w:pPr>
+              <w:pStyle w:val="a9"/>
+              <w:ind w:firstLine="0"/>
+              <w:rPr>
+                <w:lang w:eastAsia="ru-RU"/>
+              </w:rPr>
+            </w:pPr>
+            <w:r>
+              <w:rPr>
+                <w:lang w:eastAsia="ru-RU"/>
+              </w:rPr>
+              <w:t>Использование аппаратной части</w:t>
+            </w:r>
+          </w:p>
+        </w:tc>
+        <w:tc>
+          <w:tcPr>
+            <w:tcW w:w="1843" w:type="dxa"/>
+          </w:tcPr>
+          <w:p>
+            <w:pPr>
+              <w:pStyle w:val="a9"/>
+              <w:ind w:firstLine="0"/>
+              <w:rPr>
+                <w:lang w:eastAsia="ru-RU"/>
+              </w:rPr>
+            </w:pPr>
+            <w:r>
+              <w:rPr>
+                <w:lang w:eastAsia="ru-RU"/>
+              </w:rPr>
+              <w:t>Экран</w:t>
+            </w:r>
+          </w:p>
+        </w:tc>
+        <w:tc>
+          <w:tcPr>
+            <w:tcW w:w="1701" w:type="dxa"/>
+          </w:tcPr>
+          <w:p>
+            <w:pPr>
+              <w:pStyle w:val="a9"/>
+              <w:ind w:firstLine="0"/>
+              <w:rPr>
+                <w:lang w:eastAsia="ru-RU"/>
+              </w:rPr>
+            </w:pPr>
+            <w:r>
+              <w:rPr>
+                <w:lang w:eastAsia="ru-RU"/>
+              </w:rPr>
+              <w:t>Экран</w:t>
+            </w:r>
+          </w:p>
+        </w:tc>
+        <w:tc>
+          <w:tcPr>
+            <w:tcW w:w="1701" w:type="dxa"/>
+          </w:tcPr>
+          <w:p>
+            <w:pPr>
+              <w:pStyle w:val="a9"/>
+              <w:ind w:firstLine="0"/>
+              <w:rPr>
+                <w:lang w:eastAsia="ru-RU"/>
+              </w:rPr>
+            </w:pPr>
+            <w:r>
+              <w:rPr>
+                <w:lang w:eastAsia="ru-RU"/>
+              </w:rPr>
+              <w:t>Экран</w:t>
+            </w:r>
+          </w:p>
+        </w:tc>
+        <w:tc>
+          <w:tcPr>
+            <w:tcW w:w="1553" w:type="dxa"/>
+          </w:tcPr>
+          <w:p>
+            <w:pPr>
+              <w:pStyle w:val="a9"/>
+              <w:ind w:firstLine="0"/>
+              <w:rPr>
+                <w:lang w:eastAsia="ru-RU"/>
+              </w:rPr>
+            </w:pPr>
+            <w:r>
+              <w:rPr>
+                <w:lang w:eastAsia="ru-RU"/>
+              </w:rPr>
+              <w:t>Экран, камера, вибрация, компас</w:t>
+            </w:r>
+          </w:p>
+        </w:tc>
+      </w:tr>
+      <w:tr>
+        <w:tc>
+          <w:tcPr>
+            <w:tcW w:w="2547" w:type="dxa"/>
+          </w:tcPr>
+          <w:p>
+            <w:pPr>
+              <w:pStyle w:val="a9"/>
+              <w:ind w:firstLine="0"/>
+              <w:rPr>
+                <w:lang w:eastAsia="ru-RU"/>
+              </w:rPr>
+            </w:pPr>
+            <w:r>
+              <w:rPr>
+                <w:lang w:eastAsia="ru-RU"/>
+              </w:rPr>
+              <w:lastRenderedPageBreak/>
+              <w:t>Мини-игры</w:t>
+            </w:r>
+          </w:p>
+        </w:tc>
+        <w:tc>
+          <w:tcPr>
+            <w:tcW w:w="1843" w:type="dxa"/>
+          </w:tcPr>
+          <w:p>
+            <w:pPr>
+              <w:pStyle w:val="a9"/>
+              <w:ind w:firstLine="0"/>
+              <w:rPr>
+                <w:lang w:eastAsia="ru-RU"/>
+              </w:rPr>
+            </w:pPr>
+            <w:r>
+              <w:rPr>
+                <w:lang w:eastAsia="ru-RU"/>
+              </w:rPr>
+              <w:t>Поиск предметов</w:t>
+            </w:r>
+          </w:p>
+        </w:tc>
+        <w:tc>
+          <w:tcPr>
+            <w:tcW w:w="1701" w:type="dxa"/>
+          </w:tcPr>
+          <w:p>
+            <w:pPr>
+              <w:pStyle w:val="a9"/>
+              <w:ind w:firstLine="0"/>
+              <w:rPr>
+                <w:lang w:eastAsia="ru-RU"/>
+              </w:rPr>
+            </w:pPr>
+            <w:r>
+              <w:rPr>
+                <w:lang w:eastAsia="ru-RU"/>
+              </w:rPr>
+              <w:t>-</w:t>
+            </w:r>
+          </w:p>
+        </w:tc>
+        <w:tc>
+          <w:tcPr>
+            <w:tcW w:w="1701" w:type="dxa"/>
+          </w:tcPr>
+          <w:p>
+            <w:pPr>
+              <w:pStyle w:val="a9"/>
+              <w:ind w:firstLine="0"/>
+              <w:rPr>
+                <w:lang w:eastAsia="ru-RU"/>
+              </w:rPr>
+            </w:pPr>
+            <w:r>
+              <w:rPr>
+                <w:lang w:eastAsia="ru-RU"/>
+              </w:rPr>
+              <w:t>Допросы</w:t>
+            </w:r>
+          </w:p>
+        </w:tc>
+        <w:tc>
+          <w:tcPr>
+            <w:tcW w:w="1553" w:type="dxa"/>
+          </w:tcPr>
+          <w:p>
+            <w:pPr>
+              <w:pStyle w:val="a9"/>
+              <w:ind w:firstLine="0"/>
+              <w:rPr>
+                <w:lang w:eastAsia="ru-RU"/>
+              </w:rPr>
+            </w:pPr>
+            <w:r>
+              <w:rPr>
+                <w:lang w:eastAsia="ru-RU"/>
+              </w:rPr>
+              <w:t>Головоломки, Морзе, поиск улик через камеру, отпечатки</w:t>
+            </w:r>
+          </w:p>
+        </w:tc>
+      </w:tr>
+      <w:tr>
+        <w:tc>
+          <w:tcPr>
+            <w:tcW w:w="2547" w:type="dxa"/>
+          </w:tcPr>
+          <w:p>
+            <w:pPr>
+              <w:pStyle w:val="a9"/>
+              <w:ind w:firstLine="0"/>
+              <w:rPr>
+                <w:lang w:eastAsia="ru-RU"/>
+              </w:rPr>
+            </w:pPr>
+            <w:r>
+              <w:rPr>
+                <w:lang w:eastAsia="ru-RU"/>
+              </w:rPr>
+              <w:t>Возможность переигрывания</w:t>
+            </w:r>
+          </w:p>
+        </w:tc>
+        <w:tc>
+          <w:tcPr>
+            <w:tcW w:w="1843" w:type="dxa"/>
+          </w:tcPr>
+          <w:p>
+            <w:pPr>
+              <w:pStyle w:val="a9"/>
+              <w:ind w:firstLine="0"/>
+              <w:rPr>
+                <w:lang w:eastAsia="ru-RU"/>
+              </w:rPr>
+            </w:pPr>
+            <w:r>
+              <w:rPr>
+                <w:lang w:eastAsia="ru-RU"/>
+              </w:rPr>
+              <w:t>Появление новых уровней</w:t>
+            </w:r>
+          </w:p>
+        </w:tc>
+        <w:tc>
+          <w:tcPr>
+            <w:tcW w:w="1701" w:type="dxa"/>
+          </w:tcPr>
+          <w:p>
+            <w:pPr>
+              <w:pStyle w:val="a9"/>
+              <w:ind w:firstLine="0"/>
+              <w:rPr>
+                <w:lang w:eastAsia="ru-RU"/>
+              </w:rPr>
+            </w:pPr>
+            <w:r>
+              <w:rPr>
+                <w:lang w:eastAsia="ru-RU"/>
+              </w:rPr>
+              <w:t>Сюжет фиксирован</w:t>
+            </w:r>
+          </w:p>
+        </w:tc>
+        <w:tc>
+          <w:tcPr>
+            <w:tcW w:w="1701" w:type="dxa"/>
+          </w:tcPr>
+          <w:p>
+            <w:pPr>
+              <w:pStyle w:val="a9"/>
+              <w:ind w:firstLine="0"/>
+              <w:rPr>
+                <w:lang w:eastAsia="ru-RU"/>
+              </w:rPr>
+            </w:pPr>
+            <w:r>
+              <w:rPr>
+                <w:lang w:eastAsia="ru-RU"/>
+              </w:rPr>
+              <w:t>Генерируются новые дела</w:t>
+            </w:r>
+          </w:p>
+        </w:tc>
+        <w:tc>
+          <w:tcPr>
+            <w:tcW w:w="1553" w:type="dxa"/>
+          </w:tcPr>
+          <w:p>
+            <w:pPr>
+              <w:pStyle w:val="a9"/>
+              <w:ind w:firstLine="0"/>
+              <w:rPr>
+                <w:lang w:eastAsia="ru-RU"/>
+              </w:rPr>
+            </w:pPr>
+            <w:r>
+              <w:rPr>
+                <w:lang w:eastAsia="ru-RU"/>
+              </w:rPr>
+              <w:t>Вариативные ответвления</w:t>
+            </w:r>
+          </w:p>
+        </w:tc>
+      </w:tr>
+    </w:tbl>
+    <w:p>
+      <w:pPr>
+        <w:pStyle w:val="a9"/>
+        <w:rPr>
+          <w:lang w:eastAsia="ru-RU"/>
+        </w:rPr>
+      </w:pPr>
+      <w:bookmarkStart w:id="4" w:name="_GoBack"/>
+      <w:bookmarkEnd w:id="4"/>
     </w:p>
     <w:p>
       <w:pPr>
@@ -1629,6 +3268,119 @@
     </w:lvl>
   </w:abstractNum>
   <w:abstractNum w:abstractNumId="6" w15:restartNumberingAfterBreak="0">
+    <w:nsid w:val="17AA1874"/>
+    <w:multiLevelType w:val="hybridMultilevel"/>
+    <w:tmpl w:val="5366FA26"/>
+    <w:lvl w:ilvl="0" w:tplc="7F6028E6">
+      <w:start w:val="1"/>
+      <w:numFmt w:val="bullet"/>
+      <w:lvlText w:val=""/>
+      <w:lvlJc w:val="left"/>
+      <w:pPr>
+        <w:ind w:left="1429" w:hanging="360"/>
+      </w:pPr>
+      <w:rPr>
+        <w:rFonts w:ascii="Symbol" w:hAnsi="Symbol" w:hint="default"/>
+      </w:rPr>
+    </w:lvl>
+    <w:lvl w:ilvl="1" w:tplc="04190003" w:tentative="1">
+      <w:start w:val="1"/>
+      <w:numFmt w:val="bullet"/>
+      <w:lvlText w:val="o"/>
+      <w:lvlJc w:val="left"/>
+      <w:pPr>
+        <w:ind w:left="2149" w:hanging="360"/>
+      </w:pPr>
+      <w:rPr>
+        <w:rFonts w:ascii="Courier New" w:hAnsi="Courier New" w:cs="Courier New" w:hint="default"/>
+      </w:rPr>
+    </w:lvl>
+    <w:lvl w:ilvl="2" w:tplc="04190005" w:tentative="1">
+      <w:start w:val="1"/>
+      <w:numFmt w:val="bullet"/>
+      <w:lvlText w:val=""/>
+      <w:lvlJc w:val="left"/>
+      <w:pPr>
+        <w:ind w:left="2869" w:hanging="360"/>
+      </w:pPr>
+      <w:rPr>
+        <w:rFonts w:ascii="Wingdings" w:hAnsi="Wingdings" w:hint="default"/>
+      </w:rPr>
+    </w:lvl>
+    <w:lvl w:ilvl="3" w:tplc="04190001" w:tentative="1">
+      <w:start w:val="1"/>
+      <w:numFmt w:val="bullet"/>
+      <w:lvlText w:val=""/>
+      <w:lvlJc w:val="left"/>
+      <w:pPr>
+        <w:ind w:left="3589" w:hanging="360"/>
+      </w:pPr>
+      <w:rPr>
+        <w:rFonts w:ascii="Symbol" w:hAnsi="Symbol" w:hint="default"/>
+      </w:rPr>
+    </w:lvl>
+    <w:lvl w:ilvl="4" w:tplc="04190003" w:tentative="1">
+      <w:start w:val="1"/>
+      <w:numFmt w:val="bullet"/>
+      <w:lvlText w:val="o"/>
+      <w:lvlJc w:val="left"/>
+      <w:pPr>
+        <w:ind w:left="4309" w:hanging="360"/>
+      </w:pPr>
+      <w:rPr>
+        <w:rFonts w:ascii="Courier New" w:hAnsi="Courier New" w:cs="Courier New" w:hint="default"/>
+      </w:rPr>
+    </w:lvl>
+    <w:lvl w:ilvl="5" w:tplc="04190005" w:tentative="1">
+      <w:start w:val="1"/>
+      <w:numFmt w:val="bullet"/>
+      <w:lvlText w:val=""/>
+      <w:lvlJc w:val="left"/>
+      <w:pPr>
+        <w:ind w:left="5029" w:hanging="360"/>
+      </w:pPr>
+      <w:rPr>
+        <w:rFonts w:ascii="Wingdings" w:hAnsi="Wingdings" w:hint="default"/>
+      </w:rPr>
+    </w:lvl>
+    <w:lvl w:ilvl="6" w:tplc="04190001" w:tentative="1">
+      <w:start w:val="1"/>
+      <w:numFmt w:val="bullet"/>
+      <w:lvlText w:val=""/>
+      <w:lvlJc w:val="left"/>
+      <w:pPr>
+        <w:ind w:left="5749" w:hanging="360"/>
+      </w:pPr>
+      <w:rPr>
+        <w:rFonts w:ascii="Symbol" w:hAnsi="Symbol" w:hint="default"/>
+      </w:rPr>
+    </w:lvl>
+    <w:lvl w:ilvl="7" w:tplc="04190003" w:tentative="1">
+      <w:start w:val="1"/>
+      <w:numFmt w:val="bullet"/>
+      <w:lvlText w:val="o"/>
+      <w:lvlJc w:val="left"/>
+      <w:pPr>
+        <w:ind w:left="6469" w:hanging="360"/>
+      </w:pPr>
+      <w:rPr>
+        <w:rFonts w:ascii="Courier New" w:hAnsi="Courier New" w:cs="Courier New" w:hint="default"/>
+      </w:rPr>
+    </w:lvl>
+    <w:lvl w:ilvl="8" w:tplc="04190005" w:tentative="1">
+      <w:start w:val="1"/>
+      <w:numFmt w:val="bullet"/>
+      <w:lvlText w:val=""/>
+      <w:lvlJc w:val="left"/>
+      <w:pPr>
+        <w:ind w:left="7189" w:hanging="360"/>
+      </w:pPr>
+      <w:rPr>
+        <w:rFonts w:ascii="Wingdings" w:hAnsi="Wingdings" w:hint="default"/>
+      </w:rPr>
+    </w:lvl>
+  </w:abstractNum>
+  <w:abstractNum w:abstractNumId="7" w15:restartNumberingAfterBreak="0">
     <w:nsid w:val="1BC46186"/>
     <w:multiLevelType w:val="hybridMultilevel"/>
     <w:tmpl w:val="567C6E24"/>
@@ -1741,7 +3493,7 @@
       </w:rPr>
     </w:lvl>
   </w:abstractNum>
-  <w:abstractNum w:abstractNumId="7" w15:restartNumberingAfterBreak="0">
+  <w:abstractNum w:abstractNumId="8" w15:restartNumberingAfterBreak="0">
     <w:nsid w:val="1F5703E2"/>
     <w:multiLevelType w:val="hybridMultilevel"/>
     <w:tmpl w:val="8A14B6F0"/>
@@ -1830,7 +3582,7 @@
       </w:pPr>
     </w:lvl>
   </w:abstractNum>
-  <w:abstractNum w:abstractNumId="8" w15:restartNumberingAfterBreak="0">
+  <w:abstractNum w:abstractNumId="9" w15:restartNumberingAfterBreak="0">
     <w:nsid w:val="244B1859"/>
     <w:multiLevelType w:val="hybridMultilevel"/>
     <w:tmpl w:val="5120B764"/>
@@ -1943,7 +3695,7 @@
       </w:rPr>
     </w:lvl>
   </w:abstractNum>
-  <w:abstractNum w:abstractNumId="9" w15:restartNumberingAfterBreak="0">
+  <w:abstractNum w:abstractNumId="10" w15:restartNumberingAfterBreak="0">
     <w:nsid w:val="24825868"/>
     <w:multiLevelType w:val="hybridMultilevel"/>
     <w:tmpl w:val="90F8E2D4"/>
@@ -2056,7 +3808,7 @@
       </w:rPr>
     </w:lvl>
   </w:abstractNum>
-  <w:abstractNum w:abstractNumId="10" w15:restartNumberingAfterBreak="0">
+  <w:abstractNum w:abstractNumId="11" w15:restartNumberingAfterBreak="0">
     <w:nsid w:val="2BFB6CF4"/>
     <w:multiLevelType w:val="hybridMultilevel"/>
     <w:tmpl w:val="213A2ABE"/>
@@ -2169,7 +3921,7 @@
       </w:rPr>
     </w:lvl>
   </w:abstractNum>
-  <w:abstractNum w:abstractNumId="11" w15:restartNumberingAfterBreak="0">
+  <w:abstractNum w:abstractNumId="12" w15:restartNumberingAfterBreak="0">
     <w:nsid w:val="2E896BDD"/>
     <w:multiLevelType w:val="hybridMultilevel"/>
     <w:tmpl w:val="B3AA244A"/>
@@ -2258,7 +4010,7 @@
       </w:pPr>
     </w:lvl>
   </w:abstractNum>
-  <w:abstractNum w:abstractNumId="12" w15:restartNumberingAfterBreak="0">
+  <w:abstractNum w:abstractNumId="13" w15:restartNumberingAfterBreak="0">
     <w:nsid w:val="311A70D7"/>
     <w:multiLevelType w:val="hybridMultilevel"/>
     <w:tmpl w:val="2FF88FFA"/>
@@ -2371,7 +4123,7 @@
       </w:rPr>
     </w:lvl>
   </w:abstractNum>
-  <w:abstractNum w:abstractNumId="13" w15:restartNumberingAfterBreak="0">
+  <w:abstractNum w:abstractNumId="14" w15:restartNumberingAfterBreak="0">
     <w:nsid w:val="385A11DC"/>
     <w:multiLevelType w:val="hybridMultilevel"/>
     <w:tmpl w:val="85B85062"/>
@@ -2460,7 +4212,7 @@
       </w:pPr>
     </w:lvl>
   </w:abstractNum>
-  <w:abstractNum w:abstractNumId="14" w15:restartNumberingAfterBreak="0">
+  <w:abstractNum w:abstractNumId="15" w15:restartNumberingAfterBreak="0">
     <w:nsid w:val="3B4801BB"/>
     <w:multiLevelType w:val="hybridMultilevel"/>
     <w:tmpl w:val="5672B1AA"/>
@@ -2549,7 +4301,7 @@
       </w:pPr>
     </w:lvl>
   </w:abstractNum>
-  <w:abstractNum w:abstractNumId="15" w15:restartNumberingAfterBreak="0">
+  <w:abstractNum w:abstractNumId="16" w15:restartNumberingAfterBreak="0">
     <w:nsid w:val="3D57064D"/>
     <w:multiLevelType w:val="hybridMultilevel"/>
     <w:tmpl w:val="DADE03B4"/>
@@ -2662,7 +4414,7 @@
       </w:rPr>
     </w:lvl>
   </w:abstractNum>
-  <w:abstractNum w:abstractNumId="16" w15:restartNumberingAfterBreak="0">
+  <w:abstractNum w:abstractNumId="17" w15:restartNumberingAfterBreak="0">
     <w:nsid w:val="3FF1551E"/>
     <w:multiLevelType w:val="hybridMultilevel"/>
     <w:tmpl w:val="7174EA8A"/>
@@ -2775,7 +4527,7 @@
       </w:rPr>
     </w:lvl>
   </w:abstractNum>
-  <w:abstractNum w:abstractNumId="17" w15:restartNumberingAfterBreak="0">
+  <w:abstractNum w:abstractNumId="18" w15:restartNumberingAfterBreak="0">
     <w:nsid w:val="3FFF562D"/>
     <w:multiLevelType w:val="multilevel"/>
     <w:tmpl w:val="9822CC4A"/>
@@ -2888,7 +4640,7 @@
       </w:rPr>
     </w:lvl>
   </w:abstractNum>
-  <w:abstractNum w:abstractNumId="18" w15:restartNumberingAfterBreak="0">
+  <w:abstractNum w:abstractNumId="19" w15:restartNumberingAfterBreak="0">
     <w:nsid w:val="4566225B"/>
     <w:multiLevelType w:val="hybridMultilevel"/>
     <w:tmpl w:val="8C62F07A"/>
@@ -3001,7 +4753,7 @@
       </w:rPr>
     </w:lvl>
   </w:abstractNum>
-  <w:abstractNum w:abstractNumId="19" w15:restartNumberingAfterBreak="0">
+  <w:abstractNum w:abstractNumId="20" w15:restartNumberingAfterBreak="0">
     <w:nsid w:val="4BF24ABC"/>
     <w:multiLevelType w:val="hybridMultilevel"/>
     <w:tmpl w:val="D3AE741A"/>
@@ -3090,7 +4842,7 @@
       </w:pPr>
     </w:lvl>
   </w:abstractNum>
-  <w:abstractNum w:abstractNumId="20" w15:restartNumberingAfterBreak="0">
+  <w:abstractNum w:abstractNumId="21" w15:restartNumberingAfterBreak="0">
     <w:nsid w:val="52E4322B"/>
     <w:multiLevelType w:val="hybridMultilevel"/>
     <w:tmpl w:val="03263EB0"/>
@@ -3179,7 +4931,7 @@
       </w:pPr>
     </w:lvl>
   </w:abstractNum>
-  <w:abstractNum w:abstractNumId="21" w15:restartNumberingAfterBreak="0">
+  <w:abstractNum w:abstractNumId="22" w15:restartNumberingAfterBreak="0">
     <w:nsid w:val="53A80F61"/>
     <w:multiLevelType w:val="hybridMultilevel"/>
     <w:tmpl w:val="67580E76"/>
@@ -3292,7 +5044,7 @@
       </w:rPr>
     </w:lvl>
   </w:abstractNum>
-  <w:abstractNum w:abstractNumId="22" w15:restartNumberingAfterBreak="0">
+  <w:abstractNum w:abstractNumId="23" w15:restartNumberingAfterBreak="0">
     <w:nsid w:val="5F5D38FF"/>
     <w:multiLevelType w:val="hybridMultilevel"/>
     <w:tmpl w:val="9B2C67EA"/>
@@ -3378,7 +5130,7 @@
       </w:pPr>
     </w:lvl>
   </w:abstractNum>
-  <w:abstractNum w:abstractNumId="23" w15:restartNumberingAfterBreak="0">
+  <w:abstractNum w:abstractNumId="24" w15:restartNumberingAfterBreak="0">
     <w:nsid w:val="682A50F5"/>
     <w:multiLevelType w:val="hybridMultilevel"/>
     <w:tmpl w:val="FBF6B7AE"/>
@@ -3491,7 +5243,7 @@
       </w:rPr>
     </w:lvl>
   </w:abstractNum>
-  <w:abstractNum w:abstractNumId="24" w15:restartNumberingAfterBreak="0">
+  <w:abstractNum w:abstractNumId="25" w15:restartNumberingAfterBreak="0">
     <w:nsid w:val="68420323"/>
     <w:multiLevelType w:val="hybridMultilevel"/>
     <w:tmpl w:val="5C56B8B0"/>
@@ -3582,7 +5334,7 @@
       </w:pPr>
     </w:lvl>
   </w:abstractNum>
-  <w:abstractNum w:abstractNumId="25" w15:restartNumberingAfterBreak="0">
+  <w:abstractNum w:abstractNumId="26" w15:restartNumberingAfterBreak="0">
     <w:nsid w:val="6CB6520D"/>
     <w:multiLevelType w:val="hybridMultilevel"/>
     <w:tmpl w:val="28300484"/>
@@ -3695,7 +5447,7 @@
       </w:rPr>
     </w:lvl>
   </w:abstractNum>
-  <w:abstractNum w:abstractNumId="26" w15:restartNumberingAfterBreak="0">
+  <w:abstractNum w:abstractNumId="27" w15:restartNumberingAfterBreak="0">
     <w:nsid w:val="702F11CF"/>
     <w:multiLevelType w:val="hybridMultilevel"/>
     <w:tmpl w:val="498AAC82"/>
@@ -3784,7 +5536,7 @@
       </w:pPr>
     </w:lvl>
   </w:abstractNum>
-  <w:abstractNum w:abstractNumId="27" w15:restartNumberingAfterBreak="0">
+  <w:abstractNum w:abstractNumId="28" w15:restartNumberingAfterBreak="0">
     <w:nsid w:val="77DD3182"/>
     <w:multiLevelType w:val="hybridMultilevel"/>
     <w:tmpl w:val="1DFA873A"/>
@@ -3897,7 +5649,7 @@
       </w:rPr>
     </w:lvl>
   </w:abstractNum>
-  <w:abstractNum w:abstractNumId="28" w15:restartNumberingAfterBreak="0">
+  <w:abstractNum w:abstractNumId="29" w15:restartNumberingAfterBreak="0">
     <w:nsid w:val="7E3D4818"/>
     <w:multiLevelType w:val="hybridMultilevel"/>
     <w:tmpl w:val="D3AE741A"/>
@@ -3986,7 +5738,7 @@
       </w:pPr>
     </w:lvl>
   </w:abstractNum>
-  <w:abstractNum w:abstractNumId="29" w15:restartNumberingAfterBreak="0">
+  <w:abstractNum w:abstractNumId="30" w15:restartNumberingAfterBreak="0">
     <w:nsid w:val="7F5E120E"/>
     <w:multiLevelType w:val="hybridMultilevel"/>
     <w:tmpl w:val="3A6C99E6"/>
@@ -4077,46 +5829,46 @@
     </w:lvl>
   </w:abstractNum>
   <w:num w:numId="1">
-    <w:abstractNumId w:val="7"/>
+    <w:abstractNumId w:val="8"/>
   </w:num>
   <w:num w:numId="2">
-    <w:abstractNumId w:val="24"/>
+    <w:abstractNumId w:val="25"/>
   </w:num>
   <w:num w:numId="3">
     <w:abstractNumId w:val="5"/>
   </w:num>
   <w:num w:numId="4">
-    <w:abstractNumId w:val="15"/>
+    <w:abstractNumId w:val="16"/>
   </w:num>
   <w:num w:numId="5">
+    <w:abstractNumId w:val="22"/>
+  </w:num>
+  <w:num w:numId="6">
+    <w:abstractNumId w:val="7"/>
+  </w:num>
+  <w:num w:numId="7">
+    <w:abstractNumId w:val="28"/>
+  </w:num>
+  <w:num w:numId="8">
+    <w:abstractNumId w:val="11"/>
+  </w:num>
+  <w:num w:numId="9">
+    <w:abstractNumId w:val="17"/>
+  </w:num>
+  <w:num w:numId="10">
+    <w:abstractNumId w:val="26"/>
+  </w:num>
+  <w:num w:numId="11">
+    <w:abstractNumId w:val="24"/>
+  </w:num>
+  <w:num w:numId="12">
+    <w:abstractNumId w:val="12"/>
+  </w:num>
+  <w:num w:numId="13">
     <w:abstractNumId w:val="21"/>
   </w:num>
-  <w:num w:numId="6">
-    <w:abstractNumId w:val="6"/>
-  </w:num>
-  <w:num w:numId="7">
-    <w:abstractNumId w:val="27"/>
-  </w:num>
-  <w:num w:numId="8">
+  <w:num w:numId="14">
     <w:abstractNumId w:val="10"/>
-  </w:num>
-  <w:num w:numId="9">
-    <w:abstractNumId w:val="16"/>
-  </w:num>
-  <w:num w:numId="10">
-    <w:abstractNumId w:val="25"/>
-  </w:num>
-  <w:num w:numId="11">
-    <w:abstractNumId w:val="23"/>
-  </w:num>
-  <w:num w:numId="12">
-    <w:abstractNumId w:val="11"/>
-  </w:num>
-  <w:num w:numId="13">
-    <w:abstractNumId w:val="20"/>
-  </w:num>
-  <w:num w:numId="14">
-    <w:abstractNumId w:val="9"/>
   </w:num>
   <w:num w:numId="15">
     <w:abstractNumId w:val="1"/>
@@ -4125,16 +5877,16 @@
     <w:abstractNumId w:val="0"/>
   </w:num>
   <w:num w:numId="17">
-    <w:abstractNumId w:val="26"/>
+    <w:abstractNumId w:val="27"/>
   </w:num>
   <w:num w:numId="18">
     <w:abstractNumId w:val="3"/>
   </w:num>
   <w:num w:numId="19">
-    <w:abstractNumId w:val="22"/>
+    <w:abstractNumId w:val="23"/>
   </w:num>
   <w:num w:numId="20">
-    <w:abstractNumId w:val="29"/>
+    <w:abstractNumId w:val="30"/>
   </w:num>
   <w:num w:numId="21">
     <w:abstractNumId w:val="4"/>
@@ -4143,28 +5895,31 @@
     <w:abstractNumId w:val="2"/>
   </w:num>
   <w:num w:numId="23">
+    <w:abstractNumId w:val="15"/>
+  </w:num>
+  <w:num w:numId="24">
+    <w:abstractNumId w:val="20"/>
+  </w:num>
+  <w:num w:numId="25">
+    <w:abstractNumId w:val="29"/>
+  </w:num>
+  <w:num w:numId="26">
+    <w:abstractNumId w:val="19"/>
+  </w:num>
+  <w:num w:numId="27">
     <w:abstractNumId w:val="14"/>
   </w:num>
-  <w:num w:numId="24">
-    <w:abstractNumId w:val="19"/>
+  <w:num w:numId="28">
+    <w:abstractNumId w:val="9"/>
   </w:num>
-  <w:num w:numId="25">
-    <w:abstractNumId w:val="28"/>
+  <w:num w:numId="29">
+    <w:abstractNumId w:val="13"/>
   </w:num>
-  <w:num w:numId="26">
+  <w:num w:numId="30">
     <w:abstractNumId w:val="18"/>
   </w:num>
-  <w:num w:numId="27">
-    <w:abstractNumId w:val="13"/>
-  </w:num>
-  <w:num w:numId="28">
-    <w:abstractNumId w:val="8"/>
-  </w:num>
-  <w:num w:numId="29">
-    <w:abstractNumId w:val="12"/>
-  </w:num>
-  <w:num w:numId="30">
-    <w:abstractNumId w:val="17"/>
+  <w:num w:numId="31">
+    <w:abstractNumId w:val="6"/>
   </w:num>
 </w:numbering>
 </file>
@@ -4622,13 +6377,12 @@
     <w:uiPriority w:val="9"/>
     <w:unhideWhenUsed/>
     <w:qFormat/>
-    <w:rsid w:val="003432CC"/>
+    <w:rsid w:val="009F5E3C"/>
     <w:pPr>
       <w:keepNext/>
       <w:keepLines/>
-      <w:spacing w:after="0" w:line="360" w:lineRule="auto"/>
+      <w:spacing w:before="120" w:after="120" w:line="360" w:lineRule="auto"/>
       <w:ind w:firstLine="709"/>
-      <w:contextualSpacing/>
       <w:jc w:val="both"/>
       <w:outlineLvl w:val="2"/>
     </w:pPr>
@@ -4876,12 +6630,38 @@
     <w:basedOn w:val="a0"/>
     <w:link w:val="3"/>
     <w:uiPriority w:val="9"/>
-    <w:rsid w:val="003432CC"/>
+    <w:rsid w:val="009F5E3C"/>
     <w:rPr>
       <w:rFonts w:ascii="Times New Roman" w:eastAsiaTheme="majorEastAsia" w:hAnsi="Times New Roman" w:cstheme="majorBidi"/>
       <w:sz w:val="28"/>
       <w:szCs w:val="24"/>
     </w:rPr>
+  </w:style>
+  <w:style w:type="paragraph" w:styleId="21">
+    <w:name w:val="toc 2"/>
+    <w:basedOn w:val="a"/>
+    <w:next w:val="a"/>
+    <w:autoRedefine/>
+    <w:uiPriority w:val="39"/>
+    <w:unhideWhenUsed/>
+    <w:rsid w:val="009A281F"/>
+    <w:pPr>
+      <w:spacing w:after="100"/>
+      <w:ind w:left="220"/>
+    </w:pPr>
+  </w:style>
+  <w:style w:type="paragraph" w:styleId="31">
+    <w:name w:val="toc 3"/>
+    <w:basedOn w:val="a"/>
+    <w:next w:val="a"/>
+    <w:autoRedefine/>
+    <w:uiPriority w:val="39"/>
+    <w:unhideWhenUsed/>
+    <w:rsid w:val="009A281F"/>
+    <w:pPr>
+      <w:spacing w:after="100"/>
+      <w:ind w:left="440"/>
+    </w:pPr>
   </w:style>
 </w:styles>
 </file>
@@ -5186,7 +6966,7 @@
 </file>
 
 <file path=customXml/itemProps1.xml><?xml version="1.0" encoding="utf-8"?>
-<ds:datastoreItem xmlns:ds="http://schemas.openxmlformats.org/officeDocument/2006/customXml" ds:itemID="{9376940B-8EB5-46F4-BBFE-917E9C60690D}">
+<ds:datastoreItem xmlns:ds="http://schemas.openxmlformats.org/officeDocument/2006/customXml" ds:itemID="{2572676C-7A9B-4039-9926-244A1976C956}">
   <ds:schemaRefs>
     <ds:schemaRef ds:uri="http://schemas.openxmlformats.org/officeDocument/2006/bibliography"/>
   </ds:schemaRefs>

</xml_diff>

<commit_message>
Add: add new section 1.2 and subsections in this section
</commit_message>
<xml_diff>
--- a/Documentation/титул мамшева.docx
+++ b/Documentation/титул мамшева.docx
@@ -1535,23 +1535,20 @@
     <w:p>
       <w:pPr>
         <w:pStyle w:val="a9"/>
-        <w:rPr>
-          <w:lang w:eastAsia="ru-RU"/>
-        </w:rPr>
-      </w:pPr>
-    </w:p>
-    <w:p>
-      <w:pPr>
-        <w:pStyle w:val="a9"/>
-        <w:rPr>
-          <w:lang w:eastAsia="ru-RU"/>
-        </w:rPr>
-      </w:pPr>
-      <w:r>
-        <w:rPr>
-          <w:lang w:eastAsia="ru-RU"/>
-        </w:rPr>
-        <w:t>Сценарий использования: Короткие сессии по 10–20 минут, дома и на улице.</w:t>
+        <w:numPr>
+          <w:ilvl w:val="0"/>
+          <w:numId w:val="31"/>
+        </w:numPr>
+        <w:ind w:left="0" w:firstLine="709"/>
+        <w:rPr>
+          <w:lang w:eastAsia="ru-RU"/>
+        </w:rPr>
+      </w:pPr>
+      <w:r>
+        <w:rPr>
+          <w:lang w:eastAsia="ru-RU"/>
+        </w:rPr>
+        <w:t>Удобный формат мобильного приложения, доступ в любое время</w:t>
       </w:r>
     </w:p>
     <w:p>
@@ -1818,7 +1815,6 @@
         <w:rPr>
           <w:lang w:eastAsia="ru-RU"/>
         </w:rPr>
-        <w:lastRenderedPageBreak/>
         <w:t xml:space="preserve">На основе проведенного анализа </w:t>
       </w:r>
       <w:r>
@@ -1842,6 +1838,7 @@
         <w:rPr>
           <w:lang w:eastAsia="ru-RU"/>
         </w:rPr>
+        <w:lastRenderedPageBreak/>
         <w:t>Таблица 1 – Сравнительный анализ аналогов.</w:t>
       </w:r>
     </w:p>
@@ -1869,11 +1866,15 @@
               <w:pStyle w:val="a9"/>
               <w:ind w:firstLine="0"/>
               <w:rPr>
+                <w:sz w:val="24"/>
+                <w:szCs w:val="24"/>
                 <w:lang w:eastAsia="ru-RU"/>
               </w:rPr>
             </w:pPr>
             <w:r>
               <w:rPr>
+                <w:sz w:val="24"/>
+                <w:szCs w:val="24"/>
                 <w:lang w:eastAsia="ru-RU"/>
               </w:rPr>
               <w:t>Критерии</w:t>
@@ -1889,12 +1890,16 @@
               <w:pStyle w:val="a9"/>
               <w:ind w:firstLine="0"/>
               <w:rPr>
+                <w:sz w:val="24"/>
+                <w:szCs w:val="24"/>
                 <w:lang w:eastAsia="ru-RU"/>
               </w:rPr>
             </w:pPr>
             <w:proofErr w:type="spellStart"/>
             <w:r>
               <w:rPr>
+                <w:sz w:val="24"/>
+                <w:szCs w:val="24"/>
                 <w:lang w:eastAsia="ru-RU"/>
               </w:rPr>
               <w:t>Criminal</w:t>
@@ -1902,6 +1907,8 @@
             <w:proofErr w:type="spellEnd"/>
             <w:r>
               <w:rPr>
+                <w:sz w:val="24"/>
+                <w:szCs w:val="24"/>
                 <w:lang w:eastAsia="ru-RU"/>
               </w:rPr>
               <w:t xml:space="preserve"> </w:t>
@@ -1909,6 +1916,8 @@
             <w:proofErr w:type="spellStart"/>
             <w:r>
               <w:rPr>
+                <w:sz w:val="24"/>
+                <w:szCs w:val="24"/>
                 <w:lang w:eastAsia="ru-RU"/>
               </w:rPr>
               <w:t>Case</w:t>
@@ -1925,12 +1934,16 @@
               <w:pStyle w:val="a9"/>
               <w:ind w:firstLine="0"/>
               <w:rPr>
+                <w:sz w:val="24"/>
+                <w:szCs w:val="24"/>
                 <w:lang w:eastAsia="ru-RU"/>
               </w:rPr>
             </w:pPr>
             <w:proofErr w:type="spellStart"/>
             <w:r>
               <w:rPr>
+                <w:sz w:val="24"/>
+                <w:szCs w:val="24"/>
                 <w:lang w:eastAsia="ru-RU"/>
               </w:rPr>
               <w:t>Duskwood</w:t>
@@ -1947,12 +1960,16 @@
               <w:pStyle w:val="a9"/>
               <w:ind w:firstLine="0"/>
               <w:rPr>
+                <w:sz w:val="24"/>
+                <w:szCs w:val="24"/>
                 <w:lang w:eastAsia="ru-RU"/>
               </w:rPr>
             </w:pPr>
             <w:proofErr w:type="spellStart"/>
             <w:r>
               <w:rPr>
+                <w:sz w:val="24"/>
+                <w:szCs w:val="24"/>
                 <w:lang w:eastAsia="ru-RU"/>
               </w:rPr>
               <w:t>Detective</w:t>
@@ -1960,6 +1977,8 @@
             <w:proofErr w:type="spellEnd"/>
             <w:r>
               <w:rPr>
+                <w:sz w:val="24"/>
+                <w:szCs w:val="24"/>
                 <w:lang w:eastAsia="ru-RU"/>
               </w:rPr>
               <w:t xml:space="preserve"> </w:t>
@@ -1967,6 +1986,8 @@
             <w:proofErr w:type="spellStart"/>
             <w:r>
               <w:rPr>
+                <w:sz w:val="24"/>
+                <w:szCs w:val="24"/>
                 <w:lang w:eastAsia="ru-RU"/>
               </w:rPr>
               <w:t>Protocol</w:t>
@@ -1983,6 +2004,8 @@
               <w:pStyle w:val="a9"/>
               <w:ind w:firstLine="0"/>
               <w:rPr>
+                <w:sz w:val="24"/>
+                <w:szCs w:val="24"/>
                 <w:lang w:eastAsia="ru-RU"/>
               </w:rPr>
             </w:pPr>
@@ -1999,11 +2022,15 @@
               <w:pStyle w:val="a9"/>
               <w:ind w:firstLine="0"/>
               <w:rPr>
+                <w:sz w:val="24"/>
+                <w:szCs w:val="24"/>
                 <w:lang w:eastAsia="ru-RU"/>
               </w:rPr>
             </w:pPr>
             <w:r>
               <w:rPr>
+                <w:sz w:val="24"/>
+                <w:szCs w:val="24"/>
                 <w:lang w:eastAsia="ru-RU"/>
               </w:rPr>
               <w:t>Формат</w:t>
@@ -2019,13 +2046,23 @@
               <w:pStyle w:val="a9"/>
               <w:ind w:firstLine="0"/>
               <w:rPr>
+                <w:sz w:val="24"/>
+                <w:szCs w:val="24"/>
                 <w:lang w:eastAsia="ru-RU"/>
               </w:rPr>
             </w:pPr>
             <w:r>
+              <w:rPr>
+                <w:sz w:val="24"/>
+                <w:szCs w:val="24"/>
+              </w:rPr>
               <w:t>Поиск предметов,</w:t>
             </w:r>
             <w:r>
+              <w:rPr>
+                <w:sz w:val="24"/>
+                <w:szCs w:val="24"/>
+              </w:rPr>
               <w:t xml:space="preserve"> скриптовые допросы</w:t>
             </w:r>
           </w:p>
@@ -2039,10 +2076,16 @@
               <w:pStyle w:val="a9"/>
               <w:ind w:firstLine="0"/>
               <w:rPr>
+                <w:sz w:val="24"/>
+                <w:szCs w:val="24"/>
                 <w:lang w:eastAsia="ru-RU"/>
               </w:rPr>
             </w:pPr>
             <w:r>
+              <w:rPr>
+                <w:sz w:val="24"/>
+                <w:szCs w:val="24"/>
+              </w:rPr>
               <w:t>Сюжетный детектив через мессенджер</w:t>
             </w:r>
           </w:p>
@@ -2056,13 +2099,23 @@
               <w:pStyle w:val="a9"/>
               <w:ind w:firstLine="0"/>
               <w:rPr>
+                <w:sz w:val="24"/>
+                <w:szCs w:val="24"/>
                 <w:lang w:eastAsia="ru-RU"/>
               </w:rPr>
             </w:pPr>
             <w:r>
+              <w:rPr>
+                <w:sz w:val="24"/>
+                <w:szCs w:val="24"/>
+              </w:rPr>
               <w:t>Симулятор ИИ-</w:t>
             </w:r>
             <w:r>
+              <w:rPr>
+                <w:sz w:val="24"/>
+                <w:szCs w:val="24"/>
+              </w:rPr>
               <w:t>допроса</w:t>
             </w:r>
           </w:p>
@@ -2076,10 +2129,16 @@
               <w:pStyle w:val="a9"/>
               <w:ind w:firstLine="0"/>
               <w:rPr>
+                <w:sz w:val="24"/>
+                <w:szCs w:val="24"/>
                 <w:lang w:eastAsia="ru-RU"/>
               </w:rPr>
             </w:pPr>
             <w:r>
+              <w:rPr>
+                <w:sz w:val="24"/>
+                <w:szCs w:val="24"/>
+              </w:rPr>
               <w:t>Сюжетный детектив с использованием ИИ технологий</w:t>
             </w:r>
           </w:p>
@@ -2095,11 +2154,15 @@
               <w:pStyle w:val="a9"/>
               <w:ind w:firstLine="0"/>
               <w:rPr>
+                <w:sz w:val="24"/>
+                <w:szCs w:val="24"/>
                 <w:lang w:eastAsia="ru-RU"/>
               </w:rPr>
             </w:pPr>
             <w:r>
               <w:rPr>
+                <w:sz w:val="24"/>
+                <w:szCs w:val="24"/>
                 <w:lang w:eastAsia="ru-RU"/>
               </w:rPr>
               <w:t>Свобода диалога</w:t>
@@ -2115,10 +2178,16 @@
               <w:pStyle w:val="a9"/>
               <w:ind w:firstLine="0"/>
               <w:rPr>
+                <w:sz w:val="24"/>
+                <w:szCs w:val="24"/>
                 <w:lang w:eastAsia="ru-RU"/>
               </w:rPr>
             </w:pPr>
             <w:r>
+              <w:rPr>
+                <w:sz w:val="24"/>
+                <w:szCs w:val="24"/>
+              </w:rPr>
               <w:t>Выбор из готовых фраз</w:t>
             </w:r>
           </w:p>
@@ -2132,10 +2201,16 @@
               <w:pStyle w:val="a9"/>
               <w:ind w:firstLine="0"/>
               <w:rPr>
+                <w:sz w:val="24"/>
+                <w:szCs w:val="24"/>
                 <w:lang w:eastAsia="ru-RU"/>
               </w:rPr>
             </w:pPr>
             <w:r>
+              <w:rPr>
+                <w:sz w:val="24"/>
+                <w:szCs w:val="24"/>
+              </w:rPr>
               <w:t>Выбор из готовых фраз</w:t>
             </w:r>
           </w:p>
@@ -2149,10 +2224,16 @@
               <w:pStyle w:val="a9"/>
               <w:ind w:firstLine="0"/>
               <w:rPr>
+                <w:sz w:val="24"/>
+                <w:szCs w:val="24"/>
                 <w:lang w:eastAsia="ru-RU"/>
               </w:rPr>
             </w:pPr>
             <w:r>
+              <w:rPr>
+                <w:sz w:val="24"/>
+                <w:szCs w:val="24"/>
+              </w:rPr>
               <w:t>Свободный текстовый ввод</w:t>
             </w:r>
           </w:p>
@@ -2166,10 +2247,16 @@
               <w:pStyle w:val="a9"/>
               <w:ind w:firstLine="0"/>
               <w:rPr>
+                <w:sz w:val="24"/>
+                <w:szCs w:val="24"/>
                 <w:lang w:eastAsia="ru-RU"/>
               </w:rPr>
             </w:pPr>
             <w:r>
+              <w:rPr>
+                <w:sz w:val="24"/>
+                <w:szCs w:val="24"/>
+              </w:rPr>
               <w:t xml:space="preserve">Свободный ввод </w:t>
             </w:r>
           </w:p>
@@ -2185,11 +2272,15 @@
               <w:pStyle w:val="a9"/>
               <w:ind w:firstLine="0"/>
               <w:rPr>
+                <w:sz w:val="24"/>
+                <w:szCs w:val="24"/>
                 <w:lang w:eastAsia="ru-RU"/>
               </w:rPr>
             </w:pPr>
             <w:r>
               <w:rPr>
+                <w:sz w:val="24"/>
+                <w:szCs w:val="24"/>
                 <w:lang w:eastAsia="ru-RU"/>
               </w:rPr>
               <w:t>Ложь и давление</w:t>
@@ -2205,11 +2296,15 @@
               <w:pStyle w:val="a9"/>
               <w:ind w:firstLine="0"/>
               <w:rPr>
+                <w:sz w:val="24"/>
+                <w:szCs w:val="24"/>
                 <w:lang w:eastAsia="ru-RU"/>
               </w:rPr>
             </w:pPr>
             <w:r>
               <w:rPr>
+                <w:sz w:val="24"/>
+                <w:szCs w:val="24"/>
                 <w:lang w:eastAsia="ru-RU"/>
               </w:rPr>
               <w:t>Персонажи следуют заранее заготовленному сценарию</w:t>
@@ -2225,11 +2320,15 @@
               <w:pStyle w:val="a9"/>
               <w:ind w:firstLine="0"/>
               <w:rPr>
+                <w:sz w:val="24"/>
+                <w:szCs w:val="24"/>
                 <w:lang w:eastAsia="ru-RU"/>
               </w:rPr>
             </w:pPr>
             <w:r>
               <w:rPr>
+                <w:sz w:val="24"/>
+                <w:szCs w:val="24"/>
                 <w:lang w:eastAsia="ru-RU"/>
               </w:rPr>
               <w:t>Персонажи следуют заранее заготовленному сценарию</w:t>
@@ -2245,11 +2344,15 @@
               <w:pStyle w:val="a9"/>
               <w:ind w:firstLine="0"/>
               <w:rPr>
+                <w:sz w:val="24"/>
+                <w:szCs w:val="24"/>
                 <w:lang w:eastAsia="ru-RU"/>
               </w:rPr>
             </w:pPr>
             <w:r>
               <w:rPr>
+                <w:sz w:val="24"/>
+                <w:szCs w:val="24"/>
                 <w:lang w:eastAsia="ru-RU"/>
               </w:rPr>
               <w:t>Подозреваемые умеют лгать и реагируют на давление</w:t>
@@ -2265,17 +2368,23 @@
               <w:pStyle w:val="a9"/>
               <w:ind w:firstLine="0"/>
               <w:rPr>
+                <w:sz w:val="24"/>
+                <w:szCs w:val="24"/>
                 <w:lang w:eastAsia="ru-RU"/>
               </w:rPr>
             </w:pPr>
             <w:r>
               <w:rPr>
+                <w:sz w:val="24"/>
+                <w:szCs w:val="24"/>
                 <w:lang w:eastAsia="ru-RU"/>
               </w:rPr>
               <w:t>Подозреваемые умеют лгать и реагируют на давление</w:t>
             </w:r>
             <w:r>
               <w:rPr>
+                <w:sz w:val="24"/>
+                <w:szCs w:val="24"/>
                 <w:lang w:eastAsia="ru-RU"/>
               </w:rPr>
               <w:t>, а так же имеют уровень стресса</w:t>
@@ -2293,11 +2402,15 @@
               <w:pStyle w:val="a9"/>
               <w:ind w:firstLine="0"/>
               <w:rPr>
+                <w:sz w:val="24"/>
+                <w:szCs w:val="24"/>
                 <w:lang w:eastAsia="ru-RU"/>
               </w:rPr>
             </w:pPr>
             <w:r>
               <w:rPr>
+                <w:sz w:val="24"/>
+                <w:szCs w:val="24"/>
                 <w:lang w:eastAsia="ru-RU"/>
               </w:rPr>
               <w:t>Использование аппаратной части</w:t>
@@ -2313,11 +2426,15 @@
               <w:pStyle w:val="a9"/>
               <w:ind w:firstLine="0"/>
               <w:rPr>
+                <w:sz w:val="24"/>
+                <w:szCs w:val="24"/>
                 <w:lang w:eastAsia="ru-RU"/>
               </w:rPr>
             </w:pPr>
             <w:r>
               <w:rPr>
+                <w:sz w:val="24"/>
+                <w:szCs w:val="24"/>
                 <w:lang w:eastAsia="ru-RU"/>
               </w:rPr>
               <w:t>Экран</w:t>
@@ -2333,11 +2450,15 @@
               <w:pStyle w:val="a9"/>
               <w:ind w:firstLine="0"/>
               <w:rPr>
+                <w:sz w:val="24"/>
+                <w:szCs w:val="24"/>
                 <w:lang w:eastAsia="ru-RU"/>
               </w:rPr>
             </w:pPr>
             <w:r>
               <w:rPr>
+                <w:sz w:val="24"/>
+                <w:szCs w:val="24"/>
                 <w:lang w:eastAsia="ru-RU"/>
               </w:rPr>
               <w:t>Экран</w:t>
@@ -2353,11 +2474,15 @@
               <w:pStyle w:val="a9"/>
               <w:ind w:firstLine="0"/>
               <w:rPr>
+                <w:sz w:val="24"/>
+                <w:szCs w:val="24"/>
                 <w:lang w:eastAsia="ru-RU"/>
               </w:rPr>
             </w:pPr>
             <w:r>
               <w:rPr>
+                <w:sz w:val="24"/>
+                <w:szCs w:val="24"/>
                 <w:lang w:eastAsia="ru-RU"/>
               </w:rPr>
               <w:t>Экран</w:t>
@@ -2373,11 +2498,15 @@
               <w:pStyle w:val="a9"/>
               <w:ind w:firstLine="0"/>
               <w:rPr>
+                <w:sz w:val="24"/>
+                <w:szCs w:val="24"/>
                 <w:lang w:eastAsia="ru-RU"/>
               </w:rPr>
             </w:pPr>
             <w:r>
               <w:rPr>
+                <w:sz w:val="24"/>
+                <w:szCs w:val="24"/>
                 <w:lang w:eastAsia="ru-RU"/>
               </w:rPr>
               <w:t>Экран, камера, вибрация, компас</w:t>
@@ -2395,14 +2524,17 @@
               <w:pStyle w:val="a9"/>
               <w:ind w:firstLine="0"/>
               <w:rPr>
+                <w:sz w:val="24"/>
+                <w:szCs w:val="24"/>
                 <w:lang w:eastAsia="ru-RU"/>
               </w:rPr>
             </w:pPr>
             <w:r>
               <w:rPr>
-                <w:lang w:eastAsia="ru-RU"/>
-              </w:rPr>
-              <w:lastRenderedPageBreak/>
+                <w:sz w:val="24"/>
+                <w:szCs w:val="24"/>
+                <w:lang w:eastAsia="ru-RU"/>
+              </w:rPr>
               <w:t>Мини-игры</w:t>
             </w:r>
           </w:p>
@@ -2416,11 +2548,15 @@
               <w:pStyle w:val="a9"/>
               <w:ind w:firstLine="0"/>
               <w:rPr>
+                <w:sz w:val="24"/>
+                <w:szCs w:val="24"/>
                 <w:lang w:eastAsia="ru-RU"/>
               </w:rPr>
             </w:pPr>
             <w:r>
               <w:rPr>
+                <w:sz w:val="24"/>
+                <w:szCs w:val="24"/>
                 <w:lang w:eastAsia="ru-RU"/>
               </w:rPr>
               <w:t>Поиск предметов</w:t>
@@ -2436,11 +2572,15 @@
               <w:pStyle w:val="a9"/>
               <w:ind w:firstLine="0"/>
               <w:rPr>
+                <w:sz w:val="24"/>
+                <w:szCs w:val="24"/>
                 <w:lang w:eastAsia="ru-RU"/>
               </w:rPr>
             </w:pPr>
             <w:r>
               <w:rPr>
+                <w:sz w:val="24"/>
+                <w:szCs w:val="24"/>
                 <w:lang w:eastAsia="ru-RU"/>
               </w:rPr>
               <w:t>-</w:t>
@@ -2456,11 +2596,15 @@
               <w:pStyle w:val="a9"/>
               <w:ind w:firstLine="0"/>
               <w:rPr>
+                <w:sz w:val="24"/>
+                <w:szCs w:val="24"/>
                 <w:lang w:eastAsia="ru-RU"/>
               </w:rPr>
             </w:pPr>
             <w:r>
               <w:rPr>
+                <w:sz w:val="24"/>
+                <w:szCs w:val="24"/>
                 <w:lang w:eastAsia="ru-RU"/>
               </w:rPr>
               <w:t>Допросы</w:t>
@@ -2476,11 +2620,15 @@
               <w:pStyle w:val="a9"/>
               <w:ind w:firstLine="0"/>
               <w:rPr>
+                <w:sz w:val="24"/>
+                <w:szCs w:val="24"/>
                 <w:lang w:eastAsia="ru-RU"/>
               </w:rPr>
             </w:pPr>
             <w:r>
               <w:rPr>
+                <w:sz w:val="24"/>
+                <w:szCs w:val="24"/>
                 <w:lang w:eastAsia="ru-RU"/>
               </w:rPr>
               <w:t>Головоломки, Морзе, поиск улик через камеру, отпечатки</w:t>
@@ -2498,11 +2646,15 @@
               <w:pStyle w:val="a9"/>
               <w:ind w:firstLine="0"/>
               <w:rPr>
+                <w:sz w:val="24"/>
+                <w:szCs w:val="24"/>
                 <w:lang w:eastAsia="ru-RU"/>
               </w:rPr>
             </w:pPr>
             <w:r>
               <w:rPr>
+                <w:sz w:val="24"/>
+                <w:szCs w:val="24"/>
                 <w:lang w:eastAsia="ru-RU"/>
               </w:rPr>
               <w:t>Возможность переигрывания</w:t>
@@ -2518,11 +2670,15 @@
               <w:pStyle w:val="a9"/>
               <w:ind w:firstLine="0"/>
               <w:rPr>
+                <w:sz w:val="24"/>
+                <w:szCs w:val="24"/>
                 <w:lang w:eastAsia="ru-RU"/>
               </w:rPr>
             </w:pPr>
             <w:r>
               <w:rPr>
+                <w:sz w:val="24"/>
+                <w:szCs w:val="24"/>
                 <w:lang w:eastAsia="ru-RU"/>
               </w:rPr>
               <w:t>Появление новых уровней</w:t>
@@ -2538,11 +2694,15 @@
               <w:pStyle w:val="a9"/>
               <w:ind w:firstLine="0"/>
               <w:rPr>
+                <w:sz w:val="24"/>
+                <w:szCs w:val="24"/>
                 <w:lang w:eastAsia="ru-RU"/>
               </w:rPr>
             </w:pPr>
             <w:r>
               <w:rPr>
+                <w:sz w:val="24"/>
+                <w:szCs w:val="24"/>
                 <w:lang w:eastAsia="ru-RU"/>
               </w:rPr>
               <w:t>Сюжет фиксирован</w:t>
@@ -2558,11 +2718,15 @@
               <w:pStyle w:val="a9"/>
               <w:ind w:firstLine="0"/>
               <w:rPr>
+                <w:sz w:val="24"/>
+                <w:szCs w:val="24"/>
                 <w:lang w:eastAsia="ru-RU"/>
               </w:rPr>
             </w:pPr>
             <w:r>
               <w:rPr>
+                <w:sz w:val="24"/>
+                <w:szCs w:val="24"/>
                 <w:lang w:eastAsia="ru-RU"/>
               </w:rPr>
               <w:t>Генерируются новые дела</w:t>
@@ -2578,11 +2742,15 @@
               <w:pStyle w:val="a9"/>
               <w:ind w:firstLine="0"/>
               <w:rPr>
+                <w:sz w:val="24"/>
+                <w:szCs w:val="24"/>
                 <w:lang w:eastAsia="ru-RU"/>
               </w:rPr>
             </w:pPr>
             <w:r>
               <w:rPr>
+                <w:sz w:val="24"/>
+                <w:szCs w:val="24"/>
                 <w:lang w:eastAsia="ru-RU"/>
               </w:rPr>
               <w:t>Вариативные ответвления</w:t>
@@ -2595,35 +2763,1446 @@
       <w:pPr>
         <w:pStyle w:val="a9"/>
         <w:rPr>
-          <w:lang w:eastAsia="ru-RU"/>
-        </w:rPr>
-      </w:pPr>
+          <w:lang w:val="en-US" w:eastAsia="ru-RU"/>
+        </w:rPr>
+      </w:pPr>
+    </w:p>
+    <w:p>
+      <w:pPr>
+        <w:pStyle w:val="2"/>
+        <w:numPr>
+          <w:ilvl w:val="1"/>
+          <w:numId w:val="30"/>
+        </w:numPr>
+        <w:rPr>
+          <w:lang w:eastAsia="ru-RU"/>
+        </w:rPr>
+      </w:pPr>
+      <w:r>
+        <w:rPr>
+          <w:lang w:eastAsia="ru-RU"/>
+        </w:rPr>
+        <w:lastRenderedPageBreak/>
+        <w:t>Составление технического задания</w:t>
+      </w:r>
+    </w:p>
+    <w:p>
+      <w:pPr>
+        <w:pStyle w:val="3"/>
+        <w:numPr>
+          <w:ilvl w:val="2"/>
+          <w:numId w:val="30"/>
+        </w:numPr>
+        <w:ind w:left="0" w:firstLine="709"/>
+        <w:rPr>
+          <w:lang w:eastAsia="ru-RU"/>
+        </w:rPr>
+      </w:pPr>
+      <w:r>
+        <w:rPr>
+          <w:lang w:eastAsia="ru-RU"/>
+        </w:rPr>
+        <w:t>Цели проекта</w:t>
+      </w:r>
+    </w:p>
+    <w:p>
+      <w:pPr>
+        <w:pStyle w:val="a9"/>
+        <w:rPr>
+          <w:lang w:eastAsia="ru-RU"/>
+        </w:rPr>
+      </w:pPr>
+      <w:r>
+        <w:rPr>
+          <w:lang w:eastAsia="ru-RU"/>
+        </w:rPr>
+        <w:t>Основной целью реализации данного проекта является: создание мобильной игры</w:t>
+      </w:r>
+      <w:r>
+        <w:rPr>
+          <w:lang w:eastAsia="ru-RU"/>
+        </w:rPr>
+        <w:t>-детектив</w:t>
+      </w:r>
+      <w:r>
+        <w:rPr>
+          <w:lang w:eastAsia="ru-RU"/>
+        </w:rPr>
+        <w:t>а</w:t>
+      </w:r>
+      <w:r>
+        <w:rPr>
+          <w:lang w:eastAsia="ru-RU"/>
+        </w:rPr>
+        <w:t xml:space="preserve"> для </w:t>
+      </w:r>
+      <w:proofErr w:type="spellStart"/>
+      <w:r>
+        <w:rPr>
+          <w:lang w:eastAsia="ru-RU"/>
+        </w:rPr>
+        <w:t>Android</w:t>
+      </w:r>
+      <w:proofErr w:type="spellEnd"/>
+      <w:r>
+        <w:rPr>
+          <w:lang w:eastAsia="ru-RU"/>
+        </w:rPr>
+        <w:t>, в которой игрок сам ведет расследование: допрашивает «живых» персонажей, ищет улики</w:t>
+      </w:r>
+      <w:r>
+        <w:rPr>
+          <w:lang w:eastAsia="ru-RU"/>
+        </w:rPr>
+        <w:t>, выполняет интерактивные задания</w:t>
+      </w:r>
+      <w:r>
+        <w:rPr>
+          <w:lang w:eastAsia="ru-RU"/>
+        </w:rPr>
+        <w:t xml:space="preserve"> и делает выводы о том, кто преступник.</w:t>
+      </w:r>
+    </w:p>
+    <w:p>
+      <w:pPr>
+        <w:pStyle w:val="a9"/>
+        <w:rPr>
+          <w:lang w:eastAsia="ru-RU"/>
+        </w:rPr>
+      </w:pPr>
+      <w:r>
+        <w:rPr>
+          <w:lang w:eastAsia="ru-RU"/>
+        </w:rPr>
+        <w:t>Основные цели продукта:</w:t>
+      </w:r>
+    </w:p>
+    <w:p>
+      <w:pPr>
+        <w:pStyle w:val="a9"/>
+        <w:numPr>
+          <w:ilvl w:val="0"/>
+          <w:numId w:val="32"/>
+        </w:numPr>
+        <w:ind w:left="0" w:firstLine="709"/>
+        <w:rPr>
+          <w:lang w:eastAsia="ru-RU"/>
+        </w:rPr>
+      </w:pPr>
+      <w:r>
+        <w:rPr>
+          <w:lang w:eastAsia="ru-RU"/>
+        </w:rPr>
+        <w:t>Сделать детектив нелинейным. Игрок должен сам анализировать улики и показания, а не п</w:t>
+      </w:r>
+      <w:r>
+        <w:rPr>
+          <w:lang w:eastAsia="ru-RU"/>
+        </w:rPr>
+        <w:t>роходить заранее заданный путь.</w:t>
+      </w:r>
+    </w:p>
+    <w:p>
+      <w:pPr>
+        <w:pStyle w:val="a9"/>
+        <w:numPr>
+          <w:ilvl w:val="0"/>
+          <w:numId w:val="32"/>
+        </w:numPr>
+        <w:ind w:left="0" w:firstLine="709"/>
+        <w:rPr>
+          <w:lang w:eastAsia="ru-RU"/>
+        </w:rPr>
+      </w:pPr>
+      <w:r>
+        <w:rPr>
+          <w:lang w:eastAsia="ru-RU"/>
+        </w:rPr>
+        <w:t>Вывести игру за пределы экрана. Использовать возможности смартфона, чтобы расследование происходило в реальном пространст</w:t>
+      </w:r>
+      <w:r>
+        <w:rPr>
+          <w:lang w:eastAsia="ru-RU"/>
+        </w:rPr>
+        <w:t xml:space="preserve">ве: поиск улик с помощью камеры, </w:t>
+      </w:r>
+      <w:r>
+        <w:rPr>
+          <w:lang w:eastAsia="ru-RU"/>
+        </w:rPr>
+        <w:t>расшифровка азбуки Морзе по вибрации</w:t>
+      </w:r>
+      <w:r>
+        <w:rPr>
+          <w:lang w:eastAsia="ru-RU"/>
+        </w:rPr>
+        <w:t xml:space="preserve"> и другое</w:t>
+      </w:r>
+      <w:r>
+        <w:rPr>
+          <w:lang w:eastAsia="ru-RU"/>
+        </w:rPr>
+        <w:t>.</w:t>
+      </w:r>
+    </w:p>
+    <w:p>
+      <w:pPr>
+        <w:pStyle w:val="a9"/>
+        <w:numPr>
+          <w:ilvl w:val="0"/>
+          <w:numId w:val="32"/>
+        </w:numPr>
+        <w:ind w:left="0" w:firstLine="709"/>
+        <w:rPr>
+          <w:lang w:eastAsia="ru-RU"/>
+        </w:rPr>
+      </w:pPr>
+      <w:r>
+        <w:rPr>
+          <w:lang w:eastAsia="ru-RU"/>
+        </w:rPr>
+        <w:t>Разнообразить игровой процесс. Дополнить диалоги короткими мини-играми: осмотр места происшествия, сопоста</w:t>
+      </w:r>
+      <w:r>
+        <w:rPr>
+          <w:lang w:eastAsia="ru-RU"/>
+        </w:rPr>
+        <w:t>вление отпечатков, головоломки.</w:t>
+      </w:r>
+    </w:p>
+    <w:p>
+      <w:pPr>
+        <w:pStyle w:val="a9"/>
+        <w:numPr>
+          <w:ilvl w:val="0"/>
+          <w:numId w:val="32"/>
+        </w:numPr>
+        <w:ind w:left="0" w:firstLine="709"/>
+        <w:rPr>
+          <w:lang w:eastAsia="ru-RU"/>
+        </w:rPr>
+      </w:pPr>
+      <w:r>
+        <w:rPr>
+          <w:lang w:eastAsia="ru-RU"/>
+        </w:rPr>
+        <w:t>Развитие критического мышления. Игрок не получает готовых ответов, а сопоставляет показания и улики, замечает противоречия, проверяет версии и делает обоснованный вывод.</w:t>
+      </w:r>
+    </w:p>
+    <w:p>
+      <w:pPr>
+        <w:pStyle w:val="a9"/>
+        <w:numPr>
+          <w:ilvl w:val="0"/>
+          <w:numId w:val="32"/>
+        </w:numPr>
+        <w:ind w:left="0" w:firstLine="709"/>
+        <w:rPr>
+          <w:lang w:eastAsia="ru-RU"/>
+        </w:rPr>
+      </w:pPr>
+      <w:r>
+        <w:rPr>
+          <w:lang w:eastAsia="ru-RU"/>
+        </w:rPr>
+        <w:t>Трен</w:t>
+      </w:r>
+      <w:r>
+        <w:rPr>
+          <w:lang w:eastAsia="ru-RU"/>
+        </w:rPr>
+        <w:t>ировка внимательности и логики.</w:t>
+      </w:r>
+    </w:p>
+    <w:p>
+      <w:pPr>
+        <w:pStyle w:val="a9"/>
+        <w:numPr>
+          <w:ilvl w:val="0"/>
+          <w:numId w:val="32"/>
+        </w:numPr>
+        <w:ind w:left="0" w:firstLine="709"/>
+        <w:rPr>
+          <w:lang w:eastAsia="ru-RU"/>
+        </w:rPr>
+      </w:pPr>
+      <w:r>
+        <w:rPr>
+          <w:lang w:eastAsia="ru-RU"/>
+        </w:rPr>
+        <w:t>Развитие навыков коммуникации и ведения допроса. Свободный диалог с ИИ-персонажем учит формулировать вопросы, уточнять ответы и добиваться нужной информации.</w:t>
+      </w:r>
+    </w:p>
+    <w:p>
+      <w:pPr>
+        <w:pStyle w:val="3"/>
+        <w:numPr>
+          <w:ilvl w:val="2"/>
+          <w:numId w:val="30"/>
+        </w:numPr>
+        <w:ind w:left="0" w:firstLine="709"/>
+        <w:rPr>
+          <w:lang w:eastAsia="ru-RU"/>
+        </w:rPr>
+      </w:pPr>
+      <w:r>
+        <w:rPr>
+          <w:lang w:eastAsia="ru-RU"/>
+        </w:rPr>
+        <w:t>Функциональные требования</w:t>
+      </w:r>
+    </w:p>
+    <w:p>
+      <w:pPr>
+        <w:pStyle w:val="a9"/>
+        <w:rPr>
+          <w:lang w:eastAsia="ru-RU"/>
+        </w:rPr>
+      </w:pPr>
+      <w:r>
+        <w:rPr>
+          <w:lang w:eastAsia="ru-RU"/>
+        </w:rPr>
+        <w:t xml:space="preserve">Для </w:t>
+      </w:r>
+      <w:r>
+        <w:rPr>
+          <w:lang w:eastAsia="ru-RU"/>
+        </w:rPr>
+        <w:t>продукта было разработано 15</w:t>
+      </w:r>
+      <w:r>
+        <w:rPr>
+          <w:lang w:eastAsia="ru-RU"/>
+        </w:rPr>
+        <w:t xml:space="preserve"> функциональных требований и представлено в виде таблицы.</w:t>
+      </w:r>
+    </w:p>
+    <w:p>
+      <w:pPr>
+        <w:pStyle w:val="a9"/>
+        <w:rPr>
+          <w:lang w:eastAsia="ru-RU"/>
+        </w:rPr>
+      </w:pPr>
+    </w:p>
+    <w:p>
+      <w:pPr>
+        <w:pStyle w:val="a9"/>
+        <w:rPr>
+          <w:lang w:eastAsia="ru-RU"/>
+        </w:rPr>
+      </w:pPr>
+    </w:p>
+    <w:p>
+      <w:pPr>
+        <w:pStyle w:val="a9"/>
+        <w:rPr>
+          <w:lang w:eastAsia="ru-RU"/>
+        </w:rPr>
+      </w:pPr>
+    </w:p>
+    <w:p>
+      <w:pPr>
+        <w:pStyle w:val="a9"/>
+        <w:spacing w:before="240"/>
+        <w:ind w:firstLine="0"/>
+        <w:contextualSpacing w:val="0"/>
+        <w:rPr>
+          <w:lang w:eastAsia="ru-RU"/>
+        </w:rPr>
+      </w:pPr>
+      <w:r>
+        <w:rPr>
+          <w:lang w:eastAsia="ru-RU"/>
+        </w:rPr>
+        <w:lastRenderedPageBreak/>
+        <w:t>Таблица 2 – Функциональные требования.</w:t>
+      </w:r>
+    </w:p>
+    <w:tbl>
+      <w:tblPr>
+        <w:tblStyle w:val="a5"/>
+        <w:tblW w:w="0" w:type="auto"/>
+        <w:tblLook w:val="04A0" w:firstRow="1" w:lastRow="0" w:firstColumn="1" w:lastColumn="0" w:noHBand="0" w:noVBand="1"/>
+      </w:tblPr>
+      <w:tblGrid>
+        <w:gridCol w:w="704"/>
+        <w:gridCol w:w="8641"/>
+      </w:tblGrid>
+      <w:tr>
+        <w:tc>
+          <w:tcPr>
+            <w:tcW w:w="704" w:type="dxa"/>
+          </w:tcPr>
+          <w:p>
+            <w:pPr>
+              <w:pStyle w:val="a9"/>
+              <w:ind w:firstLine="0"/>
+              <w:rPr>
+                <w:lang w:eastAsia="ru-RU"/>
+              </w:rPr>
+            </w:pPr>
+            <w:r>
+              <w:rPr>
+                <w:lang w:eastAsia="ru-RU"/>
+              </w:rPr>
+              <w:t>№</w:t>
+            </w:r>
+          </w:p>
+        </w:tc>
+        <w:tc>
+          <w:tcPr>
+            <w:tcW w:w="8641" w:type="dxa"/>
+          </w:tcPr>
+          <w:p>
+            <w:pPr>
+              <w:pStyle w:val="a9"/>
+              <w:ind w:firstLine="0"/>
+              <w:rPr>
+                <w:lang w:eastAsia="ru-RU"/>
+              </w:rPr>
+            </w:pPr>
+            <w:r>
+              <w:rPr>
+                <w:lang w:eastAsia="ru-RU"/>
+              </w:rPr>
+              <w:t>Требование</w:t>
+            </w:r>
+          </w:p>
+        </w:tc>
+      </w:tr>
+      <w:tr>
+        <w:tc>
+          <w:tcPr>
+            <w:tcW w:w="704" w:type="dxa"/>
+          </w:tcPr>
+          <w:p>
+            <w:pPr>
+              <w:pStyle w:val="a9"/>
+              <w:ind w:firstLine="0"/>
+              <w:rPr>
+                <w:lang w:eastAsia="ru-RU"/>
+              </w:rPr>
+            </w:pPr>
+            <w:r>
+              <w:rPr>
+                <w:lang w:eastAsia="ru-RU"/>
+              </w:rPr>
+              <w:t>1</w:t>
+            </w:r>
+          </w:p>
+        </w:tc>
+        <w:tc>
+          <w:tcPr>
+            <w:tcW w:w="8641" w:type="dxa"/>
+          </w:tcPr>
+          <w:p>
+            <w:pPr>
+              <w:pStyle w:val="a9"/>
+              <w:tabs>
+                <w:tab w:val="left" w:pos="2955"/>
+              </w:tabs>
+              <w:ind w:firstLine="0"/>
+              <w:rPr>
+                <w:lang w:eastAsia="ru-RU"/>
+              </w:rPr>
+            </w:pPr>
+            <w:r>
+              <w:rPr>
+                <w:lang w:eastAsia="ru-RU"/>
+              </w:rPr>
+              <w:t>Приложение позволяет зарегистрироваться и войти по e-</w:t>
+            </w:r>
+            <w:proofErr w:type="spellStart"/>
+            <w:r>
+              <w:rPr>
+                <w:lang w:eastAsia="ru-RU"/>
+              </w:rPr>
+              <w:t>mail</w:t>
+            </w:r>
+            <w:proofErr w:type="spellEnd"/>
+            <w:r>
+              <w:rPr>
+                <w:lang w:eastAsia="ru-RU"/>
+              </w:rPr>
+              <w:t xml:space="preserve"> и паролю</w:t>
+            </w:r>
+          </w:p>
+        </w:tc>
+      </w:tr>
+      <w:tr>
+        <w:tc>
+          <w:tcPr>
+            <w:tcW w:w="704" w:type="dxa"/>
+          </w:tcPr>
+          <w:p>
+            <w:pPr>
+              <w:pStyle w:val="a9"/>
+              <w:ind w:firstLine="0"/>
+              <w:rPr>
+                <w:lang w:eastAsia="ru-RU"/>
+              </w:rPr>
+            </w:pPr>
+            <w:r>
+              <w:rPr>
+                <w:lang w:eastAsia="ru-RU"/>
+              </w:rPr>
+              <w:t>2</w:t>
+            </w:r>
+          </w:p>
+        </w:tc>
+        <w:tc>
+          <w:tcPr>
+            <w:tcW w:w="8641" w:type="dxa"/>
+          </w:tcPr>
+          <w:p>
+            <w:pPr>
+              <w:pStyle w:val="a9"/>
+              <w:ind w:firstLine="0"/>
+              <w:rPr>
+                <w:lang w:eastAsia="ru-RU"/>
+              </w:rPr>
+            </w:pPr>
+            <w:r>
+              <w:rPr>
+                <w:lang w:eastAsia="ru-RU"/>
+              </w:rPr>
+              <w:t>Приложение показывает список дел и открывает выбранное дело: вступление, цель расследования, список персонажей</w:t>
+            </w:r>
+            <w:r>
+              <w:rPr>
+                <w:lang w:eastAsia="ru-RU"/>
+              </w:rPr>
+              <w:t>, общее описание дела и что уже известно</w:t>
+            </w:r>
+          </w:p>
+        </w:tc>
+      </w:tr>
+      <w:tr>
+        <w:tc>
+          <w:tcPr>
+            <w:tcW w:w="704" w:type="dxa"/>
+          </w:tcPr>
+          <w:p>
+            <w:pPr>
+              <w:pStyle w:val="a9"/>
+              <w:ind w:firstLine="0"/>
+              <w:rPr>
+                <w:lang w:eastAsia="ru-RU"/>
+              </w:rPr>
+            </w:pPr>
+            <w:r>
+              <w:rPr>
+                <w:lang w:eastAsia="ru-RU"/>
+              </w:rPr>
+              <w:t>3</w:t>
+            </w:r>
+          </w:p>
+        </w:tc>
+        <w:tc>
+          <w:tcPr>
+            <w:tcW w:w="8641" w:type="dxa"/>
+          </w:tcPr>
+          <w:p>
+            <w:pPr>
+              <w:pStyle w:val="a9"/>
+              <w:ind w:firstLine="0"/>
+              <w:rPr>
+                <w:lang w:eastAsia="ru-RU"/>
+              </w:rPr>
+            </w:pPr>
+            <w:r>
+              <w:rPr>
+                <w:lang w:eastAsia="ru-RU"/>
+              </w:rPr>
+              <w:t>Игрок ведёт свободный текстовый диалог с персонажем; ответы генерирует языковая модель с учётом роли, характера и секрета персонажа</w:t>
+            </w:r>
+          </w:p>
+        </w:tc>
+      </w:tr>
+      <w:tr>
+        <w:tc>
+          <w:tcPr>
+            <w:tcW w:w="704" w:type="dxa"/>
+          </w:tcPr>
+          <w:p>
+            <w:pPr>
+              <w:pStyle w:val="a9"/>
+              <w:ind w:firstLine="0"/>
+              <w:rPr>
+                <w:lang w:eastAsia="ru-RU"/>
+              </w:rPr>
+            </w:pPr>
+            <w:r>
+              <w:rPr>
+                <w:lang w:eastAsia="ru-RU"/>
+              </w:rPr>
+              <w:t>4</w:t>
+            </w:r>
+          </w:p>
+        </w:tc>
+        <w:tc>
+          <w:tcPr>
+            <w:tcW w:w="8641" w:type="dxa"/>
+          </w:tcPr>
+          <w:p>
+            <w:pPr>
+              <w:pStyle w:val="a9"/>
+              <w:ind w:firstLine="0"/>
+              <w:rPr>
+                <w:lang w:eastAsia="ru-RU"/>
+              </w:rPr>
+            </w:pPr>
+            <w:r>
+              <w:rPr>
+                <w:lang w:eastAsia="ru-RU"/>
+              </w:rPr>
+              <w:t>Система запоминает историю диалога с каждым персонажем и ключевые факты; персонаж учитывает ранее заданные вопросы</w:t>
+            </w:r>
+          </w:p>
+        </w:tc>
+      </w:tr>
+      <w:tr>
+        <w:tc>
+          <w:tcPr>
+            <w:tcW w:w="704" w:type="dxa"/>
+          </w:tcPr>
+          <w:p>
+            <w:pPr>
+              <w:pStyle w:val="a9"/>
+              <w:ind w:firstLine="0"/>
+              <w:rPr>
+                <w:lang w:eastAsia="ru-RU"/>
+              </w:rPr>
+            </w:pPr>
+            <w:r>
+              <w:rPr>
+                <w:lang w:eastAsia="ru-RU"/>
+              </w:rPr>
+              <w:t>5</w:t>
+            </w:r>
+          </w:p>
+        </w:tc>
+        <w:tc>
+          <w:tcPr>
+            <w:tcW w:w="8641" w:type="dxa"/>
+          </w:tcPr>
+          <w:p>
+            <w:pPr>
+              <w:pStyle w:val="a9"/>
+              <w:ind w:firstLine="0"/>
+              <w:rPr>
+                <w:lang w:eastAsia="ru-RU"/>
+              </w:rPr>
+            </w:pPr>
+            <w:r>
+              <w:rPr>
+                <w:lang w:eastAsia="ru-RU"/>
+              </w:rPr>
+              <w:t>У каждого персонажа есть уровень «стресса»; давление, предъявленные улики и противоречия повышают его и меняют поведение: персонаж лжет, путается, меняет показания или признает часть правды</w:t>
+            </w:r>
+          </w:p>
+        </w:tc>
+      </w:tr>
+      <w:tr>
+        <w:tc>
+          <w:tcPr>
+            <w:tcW w:w="704" w:type="dxa"/>
+          </w:tcPr>
+          <w:p>
+            <w:pPr>
+              <w:pStyle w:val="a9"/>
+              <w:ind w:firstLine="0"/>
+              <w:rPr>
+                <w:lang w:eastAsia="ru-RU"/>
+              </w:rPr>
+            </w:pPr>
+            <w:r>
+              <w:rPr>
+                <w:lang w:eastAsia="ru-RU"/>
+              </w:rPr>
+              <w:t>6</w:t>
+            </w:r>
+          </w:p>
+        </w:tc>
+        <w:tc>
+          <w:tcPr>
+            <w:tcW w:w="8641" w:type="dxa"/>
+          </w:tcPr>
+          <w:p>
+            <w:pPr>
+              <w:pStyle w:val="a9"/>
+              <w:ind w:firstLine="0"/>
+              <w:rPr>
+                <w:lang w:eastAsia="ru-RU"/>
+              </w:rPr>
+            </w:pPr>
+            <w:r>
+              <w:rPr>
+                <w:lang w:eastAsia="ru-RU"/>
+              </w:rPr>
+              <w:t>Игрок может предъявить персонажу улику из инвентаря, и персонаж отреагирует на нее</w:t>
+            </w:r>
+          </w:p>
+        </w:tc>
+      </w:tr>
+      <w:tr>
+        <w:tc>
+          <w:tcPr>
+            <w:tcW w:w="704" w:type="dxa"/>
+          </w:tcPr>
+          <w:p>
+            <w:pPr>
+              <w:pStyle w:val="a9"/>
+              <w:ind w:firstLine="0"/>
+              <w:rPr>
+                <w:lang w:eastAsia="ru-RU"/>
+              </w:rPr>
+            </w:pPr>
+            <w:r>
+              <w:rPr>
+                <w:lang w:eastAsia="ru-RU"/>
+              </w:rPr>
+              <w:t>7</w:t>
+            </w:r>
+          </w:p>
+        </w:tc>
+        <w:tc>
+          <w:tcPr>
+            <w:tcW w:w="8641" w:type="dxa"/>
+          </w:tcPr>
+          <w:p>
+            <w:pPr>
+              <w:pStyle w:val="a9"/>
+              <w:ind w:firstLine="0"/>
+              <w:rPr>
+                <w:lang w:eastAsia="ru-RU"/>
+              </w:rPr>
+            </w:pPr>
+            <w:r>
+              <w:rPr>
+                <w:lang w:eastAsia="ru-RU"/>
+              </w:rPr>
+              <w:t>Режим поиска улик камерой (360 градусов</w:t>
+            </w:r>
+            <w:r>
+              <w:rPr>
+                <w:lang w:eastAsia="ru-RU"/>
+              </w:rPr>
+              <w:t xml:space="preserve">): камера и компас, улики привязаны к сторонам света, при наведении отображается </w:t>
+            </w:r>
+            <w:r>
+              <w:rPr>
+                <w:lang w:eastAsia="ru-RU"/>
+              </w:rPr>
+              <w:t>сама улика в пространстве</w:t>
+            </w:r>
+          </w:p>
+        </w:tc>
+      </w:tr>
+      <w:tr>
+        <w:tc>
+          <w:tcPr>
+            <w:tcW w:w="704" w:type="dxa"/>
+          </w:tcPr>
+          <w:p>
+            <w:pPr>
+              <w:pStyle w:val="a9"/>
+              <w:ind w:firstLine="0"/>
+              <w:rPr>
+                <w:lang w:eastAsia="ru-RU"/>
+              </w:rPr>
+            </w:pPr>
+            <w:r>
+              <w:rPr>
+                <w:lang w:eastAsia="ru-RU"/>
+              </w:rPr>
+              <w:t>8</w:t>
+            </w:r>
+          </w:p>
+        </w:tc>
+        <w:tc>
+          <w:tcPr>
+            <w:tcW w:w="8641" w:type="dxa"/>
+          </w:tcPr>
+          <w:p>
+            <w:pPr>
+              <w:pStyle w:val="a9"/>
+              <w:ind w:firstLine="0"/>
+              <w:rPr>
+                <w:lang w:eastAsia="ru-RU"/>
+              </w:rPr>
+            </w:pPr>
+            <w:r>
+              <w:rPr>
+                <w:lang w:eastAsia="ru-RU"/>
+              </w:rPr>
+              <w:t xml:space="preserve">Мини-игра «Расшифровка Морзе»: </w:t>
+            </w:r>
+            <w:proofErr w:type="spellStart"/>
+            <w:r>
+              <w:rPr>
+                <w:lang w:eastAsia="ru-RU"/>
+              </w:rPr>
+              <w:t>вибромотор</w:t>
+            </w:r>
+            <w:proofErr w:type="spellEnd"/>
+            <w:r>
+              <w:rPr>
+                <w:lang w:eastAsia="ru-RU"/>
+              </w:rPr>
+              <w:t xml:space="preserve"> передаёт точки и тире, игрок вводит расшифровку</w:t>
+            </w:r>
+          </w:p>
+        </w:tc>
+      </w:tr>
+      <w:tr>
+        <w:tc>
+          <w:tcPr>
+            <w:tcW w:w="704" w:type="dxa"/>
+          </w:tcPr>
+          <w:p>
+            <w:pPr>
+              <w:pStyle w:val="a9"/>
+              <w:ind w:firstLine="0"/>
+              <w:rPr>
+                <w:lang w:eastAsia="ru-RU"/>
+              </w:rPr>
+            </w:pPr>
+            <w:r>
+              <w:rPr>
+                <w:lang w:eastAsia="ru-RU"/>
+              </w:rPr>
+              <w:t>9</w:t>
+            </w:r>
+          </w:p>
+        </w:tc>
+        <w:tc>
+          <w:tcPr>
+            <w:tcW w:w="8641" w:type="dxa"/>
+          </w:tcPr>
+          <w:p>
+            <w:pPr>
+              <w:pStyle w:val="a9"/>
+              <w:ind w:firstLine="0"/>
+              <w:rPr>
+                <w:lang w:eastAsia="ru-RU"/>
+              </w:rPr>
+            </w:pPr>
+            <w:r>
+              <w:rPr>
+                <w:lang w:eastAsia="ru-RU"/>
+              </w:rPr>
+              <w:t>Головоломки не менее двух типов (кодовый замок, шифр, сопоставление)</w:t>
+            </w:r>
+          </w:p>
+        </w:tc>
+      </w:tr>
+      <w:tr>
+        <w:tc>
+          <w:tcPr>
+            <w:tcW w:w="704" w:type="dxa"/>
+          </w:tcPr>
+          <w:p>
+            <w:pPr>
+              <w:pStyle w:val="a9"/>
+              <w:ind w:firstLine="0"/>
+              <w:rPr>
+                <w:lang w:eastAsia="ru-RU"/>
+              </w:rPr>
+            </w:pPr>
+            <w:r>
+              <w:rPr>
+                <w:lang w:eastAsia="ru-RU"/>
+              </w:rPr>
+              <w:t>10</w:t>
+            </w:r>
+          </w:p>
+        </w:tc>
+        <w:tc>
+          <w:tcPr>
+            <w:tcW w:w="8641" w:type="dxa"/>
+          </w:tcPr>
+          <w:p>
+            <w:pPr>
+              <w:pStyle w:val="a9"/>
+              <w:ind w:firstLine="0"/>
+              <w:rPr>
+                <w:lang w:eastAsia="ru-RU"/>
+              </w:rPr>
+            </w:pPr>
+            <w:r>
+              <w:rPr>
+                <w:lang w:eastAsia="ru-RU"/>
+              </w:rPr>
+              <w:t>Блокнот: показания персонажей, заметок игрового персонажа</w:t>
+            </w:r>
+          </w:p>
+        </w:tc>
+      </w:tr>
+      <w:tr>
+        <w:tc>
+          <w:tcPr>
+            <w:tcW w:w="704" w:type="dxa"/>
+          </w:tcPr>
+          <w:p>
+            <w:pPr>
+              <w:pStyle w:val="a9"/>
+              <w:ind w:firstLine="0"/>
+              <w:rPr>
+                <w:lang w:eastAsia="ru-RU"/>
+              </w:rPr>
+            </w:pPr>
+            <w:r>
+              <w:rPr>
+                <w:lang w:eastAsia="ru-RU"/>
+              </w:rPr>
+              <w:t>11</w:t>
+            </w:r>
+          </w:p>
+        </w:tc>
+        <w:tc>
+          <w:tcPr>
+            <w:tcW w:w="8641" w:type="dxa"/>
+          </w:tcPr>
+          <w:p>
+            <w:pPr>
+              <w:pStyle w:val="a9"/>
+              <w:ind w:firstLine="0"/>
+              <w:rPr>
+                <w:lang w:eastAsia="ru-RU"/>
+              </w:rPr>
+            </w:pPr>
+            <w:r>
+              <w:rPr>
+                <w:lang w:eastAsia="ru-RU"/>
+              </w:rPr>
+              <w:t>Обвинение персонажа, а именно</w:t>
+            </w:r>
+            <w:r>
+              <w:rPr>
+                <w:lang w:eastAsia="ru-RU"/>
+              </w:rPr>
+              <w:t xml:space="preserve"> игрок выбирает подозреваемого и улики из инвентаря; проверка выполняется на сервере</w:t>
+            </w:r>
+          </w:p>
+        </w:tc>
+      </w:tr>
+      <w:tr>
+        <w:tc>
+          <w:tcPr>
+            <w:tcW w:w="704" w:type="dxa"/>
+          </w:tcPr>
+          <w:p>
+            <w:pPr>
+              <w:pStyle w:val="a9"/>
+              <w:ind w:firstLine="0"/>
+              <w:rPr>
+                <w:lang w:eastAsia="ru-RU"/>
+              </w:rPr>
+            </w:pPr>
+            <w:r>
+              <w:rPr>
+                <w:lang w:eastAsia="ru-RU"/>
+              </w:rPr>
+              <w:lastRenderedPageBreak/>
+              <w:t>12</w:t>
+            </w:r>
+          </w:p>
+        </w:tc>
+        <w:tc>
+          <w:tcPr>
+            <w:tcW w:w="8641" w:type="dxa"/>
+          </w:tcPr>
+          <w:p>
+            <w:pPr>
+              <w:pStyle w:val="a9"/>
+              <w:ind w:firstLine="0"/>
+              <w:rPr>
+                <w:lang w:eastAsia="ru-RU"/>
+              </w:rPr>
+            </w:pPr>
+            <w:r>
+              <w:rPr>
+                <w:lang w:eastAsia="ru-RU"/>
+              </w:rPr>
+              <w:t>Прогресс (найденные улики, диалоги, решённые мини-игры) сохраняется</w:t>
+            </w:r>
+            <w:r>
+              <w:rPr>
+                <w:lang w:eastAsia="ru-RU"/>
+              </w:rPr>
+              <w:t xml:space="preserve"> сначала в локальном </w:t>
+            </w:r>
+            <w:r>
+              <w:rPr>
+                <w:lang w:eastAsia="ru-RU"/>
+              </w:rPr>
+              <w:t>хранилище</w:t>
+            </w:r>
+            <w:r>
+              <w:rPr>
+                <w:lang w:eastAsia="ru-RU"/>
+              </w:rPr>
+              <w:t xml:space="preserve"> и далее отправляется и фиксируется на сервере</w:t>
+            </w:r>
+          </w:p>
+        </w:tc>
+      </w:tr>
+      <w:tr>
+        <w:tc>
+          <w:tcPr>
+            <w:tcW w:w="704" w:type="dxa"/>
+          </w:tcPr>
+          <w:p>
+            <w:pPr>
+              <w:pStyle w:val="a9"/>
+              <w:ind w:firstLine="0"/>
+              <w:rPr>
+                <w:lang w:eastAsia="ru-RU"/>
+              </w:rPr>
+            </w:pPr>
+            <w:r>
+              <w:rPr>
+                <w:lang w:eastAsia="ru-RU"/>
+              </w:rPr>
+              <w:t>13</w:t>
+            </w:r>
+          </w:p>
+        </w:tc>
+        <w:tc>
+          <w:tcPr>
+            <w:tcW w:w="8641" w:type="dxa"/>
+          </w:tcPr>
+          <w:p>
+            <w:pPr>
+              <w:pStyle w:val="a9"/>
+              <w:ind w:firstLine="0"/>
+              <w:rPr>
+                <w:lang w:eastAsia="ru-RU"/>
+              </w:rPr>
+            </w:pPr>
+            <w:r>
+              <w:rPr>
+                <w:lang w:eastAsia="ru-RU"/>
+              </w:rPr>
+              <w:t>Офлайн-режим: без сети доступны скачанные дела, инвентарь, блокнот, головоломки и мини-игры</w:t>
+            </w:r>
+            <w:r>
+              <w:rPr>
+                <w:lang w:eastAsia="ru-RU"/>
+              </w:rPr>
+              <w:t xml:space="preserve"> (результаты мини игр сначала хранятся в локальном </w:t>
+            </w:r>
+            <w:r>
+              <w:rPr>
+                <w:lang w:eastAsia="ru-RU"/>
+              </w:rPr>
+              <w:t>хранилище</w:t>
+            </w:r>
+            <w:r>
+              <w:rPr>
+                <w:lang w:eastAsia="ru-RU"/>
+              </w:rPr>
+              <w:t>)</w:t>
+            </w:r>
+          </w:p>
+        </w:tc>
+      </w:tr>
+      <w:tr>
+        <w:tc>
+          <w:tcPr>
+            <w:tcW w:w="704" w:type="dxa"/>
+          </w:tcPr>
+          <w:p>
+            <w:pPr>
+              <w:pStyle w:val="a9"/>
+              <w:ind w:firstLine="0"/>
+              <w:rPr>
+                <w:lang w:eastAsia="ru-RU"/>
+              </w:rPr>
+            </w:pPr>
+            <w:r>
+              <w:rPr>
+                <w:lang w:eastAsia="ru-RU"/>
+              </w:rPr>
+              <w:t>14</w:t>
+            </w:r>
+          </w:p>
+        </w:tc>
+        <w:tc>
+          <w:tcPr>
+            <w:tcW w:w="8641" w:type="dxa"/>
+          </w:tcPr>
+          <w:p>
+            <w:pPr>
+              <w:pStyle w:val="a9"/>
+              <w:ind w:firstLine="0"/>
+              <w:rPr>
+                <w:lang w:eastAsia="ru-RU"/>
+              </w:rPr>
+            </w:pPr>
+            <w:r>
+              <w:rPr>
+                <w:lang w:eastAsia="ru-RU"/>
+              </w:rPr>
+              <w:t>Присутствует лимит запросов к ИИ, при исчерпании лимита игроку об этом сообщается</w:t>
+            </w:r>
+          </w:p>
+        </w:tc>
+      </w:tr>
+      <w:tr>
+        <w:tc>
+          <w:tcPr>
+            <w:tcW w:w="704" w:type="dxa"/>
+          </w:tcPr>
+          <w:p>
+            <w:pPr>
+              <w:pStyle w:val="a9"/>
+              <w:ind w:firstLine="0"/>
+              <w:rPr>
+                <w:lang w:eastAsia="ru-RU"/>
+              </w:rPr>
+            </w:pPr>
+            <w:r>
+              <w:rPr>
+                <w:lang w:eastAsia="ru-RU"/>
+              </w:rPr>
+              <w:t>15</w:t>
+            </w:r>
+          </w:p>
+        </w:tc>
+        <w:tc>
+          <w:tcPr>
+            <w:tcW w:w="8641" w:type="dxa"/>
+          </w:tcPr>
+          <w:p>
+            <w:pPr>
+              <w:pStyle w:val="a9"/>
+              <w:ind w:firstLine="0"/>
+              <w:rPr>
+                <w:lang w:eastAsia="ru-RU"/>
+              </w:rPr>
+            </w:pPr>
+            <w:r>
+              <w:rPr>
+                <w:lang w:eastAsia="ru-RU"/>
+              </w:rPr>
+              <w:t>В игре доступ к уликам</w:t>
+            </w:r>
+            <w:r>
+              <w:rPr>
+                <w:lang w:eastAsia="ru-RU"/>
+              </w:rPr>
+              <w:t xml:space="preserve"> и предметам персонажа должен быть реализован через интерфейс инвентаря</w:t>
+            </w:r>
+          </w:p>
+        </w:tc>
+      </w:tr>
+    </w:tbl>
+    <w:p>
+      <w:pPr>
+        <w:pStyle w:val="a9"/>
+        <w:rPr>
+          <w:lang w:eastAsia="ru-RU"/>
+        </w:rPr>
+      </w:pPr>
+    </w:p>
+    <w:p>
+      <w:pPr>
+        <w:pStyle w:val="a9"/>
+        <w:numPr>
+          <w:ilvl w:val="2"/>
+          <w:numId w:val="30"/>
+        </w:numPr>
+        <w:ind w:left="0" w:firstLine="709"/>
+      </w:pPr>
+      <w:r>
+        <w:t>Нефункциональные требования</w:t>
+      </w:r>
+    </w:p>
+    <w:p>
+      <w:pPr>
+        <w:pStyle w:val="a9"/>
+        <w:rPr>
+          <w:lang w:eastAsia="ru-RU"/>
+        </w:rPr>
+      </w:pPr>
+      <w:r>
+        <w:rPr>
+          <w:lang w:eastAsia="ru-RU"/>
+        </w:rPr>
+        <w:t>Так же для продукта были составлены нефункциональные требования, а именно:</w:t>
+      </w:r>
+    </w:p>
+    <w:p>
+      <w:pPr>
+        <w:pStyle w:val="a9"/>
+        <w:numPr>
+          <w:ilvl w:val="0"/>
+          <w:numId w:val="33"/>
+        </w:numPr>
+        <w:ind w:left="0" w:firstLine="709"/>
+        <w:rPr>
+          <w:lang w:eastAsia="ru-RU"/>
+        </w:rPr>
+      </w:pPr>
+      <w:r>
+        <w:rPr>
+          <w:lang w:eastAsia="ru-RU"/>
+        </w:rPr>
+        <w:t xml:space="preserve">Совместимость: </w:t>
+      </w:r>
+      <w:proofErr w:type="spellStart"/>
+      <w:r>
+        <w:rPr>
+          <w:lang w:eastAsia="ru-RU"/>
+        </w:rPr>
+        <w:t>Android</w:t>
+      </w:r>
+      <w:proofErr w:type="spellEnd"/>
+      <w:r>
+        <w:rPr>
+          <w:lang w:eastAsia="ru-RU"/>
+        </w:rPr>
+        <w:t xml:space="preserve"> 8.0 и выше.</w:t>
+      </w:r>
+    </w:p>
+    <w:p>
+      <w:pPr>
+        <w:pStyle w:val="a9"/>
+        <w:numPr>
+          <w:ilvl w:val="0"/>
+          <w:numId w:val="33"/>
+        </w:numPr>
+        <w:ind w:left="0" w:firstLine="709"/>
+        <w:rPr>
+          <w:lang w:eastAsia="ru-RU"/>
+        </w:rPr>
+      </w:pPr>
+      <w:r>
+        <w:rPr>
+          <w:lang w:eastAsia="ru-RU"/>
+        </w:rPr>
+        <w:t>Производительность: запуск не дольше 3 секунд, ответ персонажа не дольше 10 секунд для большинства запросов.</w:t>
+      </w:r>
+    </w:p>
+    <w:p>
+      <w:pPr>
+        <w:pStyle w:val="a9"/>
+        <w:numPr>
+          <w:ilvl w:val="0"/>
+          <w:numId w:val="33"/>
+        </w:numPr>
+        <w:ind w:left="0" w:firstLine="709"/>
+        <w:rPr>
+          <w:lang w:eastAsia="ru-RU"/>
+        </w:rPr>
+      </w:pPr>
+      <w:r>
+        <w:rPr>
+          <w:lang w:eastAsia="ru-RU"/>
+        </w:rPr>
+        <w:t>Безопасность: ключ языковой модели хранится н</w:t>
+      </w:r>
+      <w:r>
+        <w:rPr>
+          <w:lang w:eastAsia="ru-RU"/>
+        </w:rPr>
+        <w:t>а сервере, в приложении его нет.</w:t>
+      </w:r>
+      <w:r>
+        <w:rPr>
+          <w:lang w:eastAsia="ru-RU"/>
+        </w:rPr>
+        <w:t xml:space="preserve"> Сведения о том, кто виновен, на устройство не передаются до конца дела.</w:t>
+      </w:r>
+    </w:p>
+    <w:p>
+      <w:pPr>
+        <w:pStyle w:val="a9"/>
+        <w:numPr>
+          <w:ilvl w:val="0"/>
+          <w:numId w:val="33"/>
+        </w:numPr>
+        <w:ind w:left="0" w:firstLine="709"/>
+        <w:rPr>
+          <w:lang w:eastAsia="ru-RU"/>
+        </w:rPr>
+      </w:pPr>
+      <w:r>
+        <w:rPr>
+          <w:lang w:eastAsia="ru-RU"/>
+        </w:rPr>
+        <w:t>Приватность: фото улик доступны только их владельцу, личные данные в языковую модель не отправляются.</w:t>
+      </w:r>
+    </w:p>
+    <w:p>
+      <w:pPr>
+        <w:pStyle w:val="a9"/>
+        <w:numPr>
+          <w:ilvl w:val="0"/>
+          <w:numId w:val="33"/>
+        </w:numPr>
+        <w:ind w:left="0" w:firstLine="709"/>
+        <w:rPr>
+          <w:lang w:eastAsia="ru-RU"/>
+        </w:rPr>
+      </w:pPr>
+      <w:r>
+        <w:rPr>
+          <w:lang w:eastAsia="ru-RU"/>
+        </w:rPr>
+        <w:t>Удобство: интерфейс на русском языке, масштабируемый шрифт, достаточная контрастность</w:t>
+      </w:r>
+      <w:r>
+        <w:rPr>
+          <w:lang w:eastAsia="ru-RU"/>
+        </w:rPr>
+        <w:t>, интерфейс приятен глазу, цветовая палитра сочетаемая</w:t>
+      </w:r>
+      <w:r>
+        <w:rPr>
+          <w:lang w:eastAsia="ru-RU"/>
+        </w:rPr>
+        <w:t>.</w:t>
+      </w:r>
+    </w:p>
+    <w:p>
+      <w:pPr>
+        <w:pStyle w:val="a9"/>
+        <w:numPr>
+          <w:ilvl w:val="0"/>
+          <w:numId w:val="33"/>
+        </w:numPr>
+        <w:ind w:left="0" w:firstLine="709"/>
+        <w:rPr>
+          <w:lang w:eastAsia="ru-RU"/>
+        </w:rPr>
+      </w:pPr>
+      <w:r>
+        <w:rPr>
+          <w:lang w:eastAsia="ru-RU"/>
+        </w:rPr>
+        <w:t>Архитектура</w:t>
+      </w:r>
+      <w:r>
+        <w:rPr>
+          <w:lang w:eastAsia="ru-RU"/>
+        </w:rPr>
+        <w:t>: разделение на слои</w:t>
+      </w:r>
+      <w:r>
+        <w:rPr>
+          <w:lang w:eastAsia="ru-RU"/>
+        </w:rPr>
+        <w:t xml:space="preserve"> чистой архитектуры в соответствии с 3 слоями</w:t>
+      </w:r>
+      <w:r>
+        <w:rPr>
+          <w:lang w:eastAsia="ru-RU"/>
+        </w:rPr>
+        <w:t xml:space="preserve">: </w:t>
+      </w:r>
+      <w:r>
+        <w:rPr>
+          <w:lang w:val="en-US" w:eastAsia="ru-RU"/>
+        </w:rPr>
+        <w:t>Domain</w:t>
+      </w:r>
+      <w:r>
+        <w:rPr>
+          <w:lang w:eastAsia="ru-RU"/>
+        </w:rPr>
+        <w:t xml:space="preserve">, </w:t>
+      </w:r>
+      <w:r>
+        <w:rPr>
+          <w:lang w:val="en-US" w:eastAsia="ru-RU"/>
+        </w:rPr>
+        <w:t>Data</w:t>
+      </w:r>
+      <w:r>
+        <w:rPr>
+          <w:lang w:eastAsia="ru-RU"/>
+        </w:rPr>
+        <w:t xml:space="preserve"> </w:t>
+      </w:r>
+      <w:r>
+        <w:rPr>
+          <w:lang w:eastAsia="ru-RU"/>
+        </w:rPr>
+        <w:t>и</w:t>
+      </w:r>
+      <w:r>
+        <w:rPr>
+          <w:lang w:eastAsia="ru-RU"/>
+        </w:rPr>
+        <w:t xml:space="preserve"> </w:t>
+      </w:r>
+      <w:r>
+        <w:rPr>
+          <w:lang w:val="en-US" w:eastAsia="ru-RU"/>
+        </w:rPr>
+        <w:t>Presentation</w:t>
+      </w:r>
+      <w:r>
+        <w:rPr>
+          <w:lang w:eastAsia="ru-RU"/>
+        </w:rPr>
+        <w:t>.</w:t>
+      </w:r>
+    </w:p>
+    <w:p>
+      <w:pPr>
+        <w:pStyle w:val="a9"/>
+        <w:numPr>
+          <w:ilvl w:val="0"/>
+          <w:numId w:val="33"/>
+        </w:numPr>
+        <w:rPr>
+          <w:lang w:eastAsia="ru-RU"/>
+        </w:rPr>
+      </w:pPr>
+      <w:r>
+        <w:rPr>
+          <w:lang w:eastAsia="ru-RU"/>
+        </w:rPr>
+        <w:t>Адаптивность: интерфейс приложения должен подстраиваться под различные форматы экрана (</w:t>
+      </w:r>
+      <w:r>
+        <w:rPr>
+          <w:lang w:eastAsia="ru-RU"/>
+        </w:rPr>
+        <w:t>412 × 91</w:t>
+      </w:r>
+      <w:r>
+        <w:rPr>
+          <w:lang w:eastAsia="ru-RU"/>
+        </w:rPr>
+        <w:t xml:space="preserve">5 </w:t>
+      </w:r>
       <w:bookmarkStart w:id="4" w:name="_GoBack"/>
       <w:bookmarkEnd w:id="4"/>
-    </w:p>
-    <w:p>
-      <w:pPr>
-        <w:pStyle w:val="a9"/>
-        <w:rPr>
-          <w:lang w:eastAsia="ru-RU"/>
-        </w:rPr>
-      </w:pPr>
-    </w:p>
-    <w:p>
-      <w:pPr>
-        <w:pStyle w:val="a9"/>
-        <w:rPr>
-          <w:lang w:eastAsia="ru-RU"/>
-        </w:rPr>
-      </w:pPr>
-    </w:p>
-    <w:p>
-      <w:pPr>
-        <w:pStyle w:val="a9"/>
-        <w:rPr>
-          <w:lang w:eastAsia="ru-RU"/>
-        </w:rPr>
-      </w:pPr>
+      <w:r>
+        <w:rPr>
+          <w:lang w:eastAsia="ru-RU"/>
+        </w:rPr>
+        <w:t>,</w:t>
+      </w:r>
+      <w:r>
+        <w:rPr>
+          <w:lang w:eastAsia="ru-RU"/>
+        </w:rPr>
+        <w:t>800 × 1280</w:t>
+      </w:r>
+      <w:r>
+        <w:rPr>
+          <w:lang w:eastAsia="ru-RU"/>
+        </w:rPr>
+        <w:t>).</w:t>
+      </w:r>
     </w:p>
     <w:p>
       <w:pPr>
@@ -4843,6 +6422,119 @@
     </w:lvl>
   </w:abstractNum>
   <w:abstractNum w:abstractNumId="21" w15:restartNumberingAfterBreak="0">
+    <w:nsid w:val="4FD318BF"/>
+    <w:multiLevelType w:val="hybridMultilevel"/>
+    <w:tmpl w:val="1B1AF7A4"/>
+    <w:lvl w:ilvl="0" w:tplc="7F6028E6">
+      <w:start w:val="1"/>
+      <w:numFmt w:val="bullet"/>
+      <w:lvlText w:val=""/>
+      <w:lvlJc w:val="left"/>
+      <w:pPr>
+        <w:ind w:left="1429" w:hanging="360"/>
+      </w:pPr>
+      <w:rPr>
+        <w:rFonts w:ascii="Symbol" w:hAnsi="Symbol" w:hint="default"/>
+      </w:rPr>
+    </w:lvl>
+    <w:lvl w:ilvl="1" w:tplc="04190003" w:tentative="1">
+      <w:start w:val="1"/>
+      <w:numFmt w:val="bullet"/>
+      <w:lvlText w:val="o"/>
+      <w:lvlJc w:val="left"/>
+      <w:pPr>
+        <w:ind w:left="2149" w:hanging="360"/>
+      </w:pPr>
+      <w:rPr>
+        <w:rFonts w:ascii="Courier New" w:hAnsi="Courier New" w:cs="Courier New" w:hint="default"/>
+      </w:rPr>
+    </w:lvl>
+    <w:lvl w:ilvl="2" w:tplc="04190005" w:tentative="1">
+      <w:start w:val="1"/>
+      <w:numFmt w:val="bullet"/>
+      <w:lvlText w:val=""/>
+      <w:lvlJc w:val="left"/>
+      <w:pPr>
+        <w:ind w:left="2869" w:hanging="360"/>
+      </w:pPr>
+      <w:rPr>
+        <w:rFonts w:ascii="Wingdings" w:hAnsi="Wingdings" w:hint="default"/>
+      </w:rPr>
+    </w:lvl>
+    <w:lvl w:ilvl="3" w:tplc="04190001" w:tentative="1">
+      <w:start w:val="1"/>
+      <w:numFmt w:val="bullet"/>
+      <w:lvlText w:val=""/>
+      <w:lvlJc w:val="left"/>
+      <w:pPr>
+        <w:ind w:left="3589" w:hanging="360"/>
+      </w:pPr>
+      <w:rPr>
+        <w:rFonts w:ascii="Symbol" w:hAnsi="Symbol" w:hint="default"/>
+      </w:rPr>
+    </w:lvl>
+    <w:lvl w:ilvl="4" w:tplc="04190003" w:tentative="1">
+      <w:start w:val="1"/>
+      <w:numFmt w:val="bullet"/>
+      <w:lvlText w:val="o"/>
+      <w:lvlJc w:val="left"/>
+      <w:pPr>
+        <w:ind w:left="4309" w:hanging="360"/>
+      </w:pPr>
+      <w:rPr>
+        <w:rFonts w:ascii="Courier New" w:hAnsi="Courier New" w:cs="Courier New" w:hint="default"/>
+      </w:rPr>
+    </w:lvl>
+    <w:lvl w:ilvl="5" w:tplc="04190005" w:tentative="1">
+      <w:start w:val="1"/>
+      <w:numFmt w:val="bullet"/>
+      <w:lvlText w:val=""/>
+      <w:lvlJc w:val="left"/>
+      <w:pPr>
+        <w:ind w:left="5029" w:hanging="360"/>
+      </w:pPr>
+      <w:rPr>
+        <w:rFonts w:ascii="Wingdings" w:hAnsi="Wingdings" w:hint="default"/>
+      </w:rPr>
+    </w:lvl>
+    <w:lvl w:ilvl="6" w:tplc="04190001" w:tentative="1">
+      <w:start w:val="1"/>
+      <w:numFmt w:val="bullet"/>
+      <w:lvlText w:val=""/>
+      <w:lvlJc w:val="left"/>
+      <w:pPr>
+        <w:ind w:left="5749" w:hanging="360"/>
+      </w:pPr>
+      <w:rPr>
+        <w:rFonts w:ascii="Symbol" w:hAnsi="Symbol" w:hint="default"/>
+      </w:rPr>
+    </w:lvl>
+    <w:lvl w:ilvl="7" w:tplc="04190003" w:tentative="1">
+      <w:start w:val="1"/>
+      <w:numFmt w:val="bullet"/>
+      <w:lvlText w:val="o"/>
+      <w:lvlJc w:val="left"/>
+      <w:pPr>
+        <w:ind w:left="6469" w:hanging="360"/>
+      </w:pPr>
+      <w:rPr>
+        <w:rFonts w:ascii="Courier New" w:hAnsi="Courier New" w:cs="Courier New" w:hint="default"/>
+      </w:rPr>
+    </w:lvl>
+    <w:lvl w:ilvl="8" w:tplc="04190005" w:tentative="1">
+      <w:start w:val="1"/>
+      <w:numFmt w:val="bullet"/>
+      <w:lvlText w:val=""/>
+      <w:lvlJc w:val="left"/>
+      <w:pPr>
+        <w:ind w:left="7189" w:hanging="360"/>
+      </w:pPr>
+      <w:rPr>
+        <w:rFonts w:ascii="Wingdings" w:hAnsi="Wingdings" w:hint="default"/>
+      </w:rPr>
+    </w:lvl>
+  </w:abstractNum>
+  <w:abstractNum w:abstractNumId="22" w15:restartNumberingAfterBreak="0">
     <w:nsid w:val="52E4322B"/>
     <w:multiLevelType w:val="hybridMultilevel"/>
     <w:tmpl w:val="03263EB0"/>
@@ -4931,7 +6623,7 @@
       </w:pPr>
     </w:lvl>
   </w:abstractNum>
-  <w:abstractNum w:abstractNumId="22" w15:restartNumberingAfterBreak="0">
+  <w:abstractNum w:abstractNumId="23" w15:restartNumberingAfterBreak="0">
     <w:nsid w:val="53A80F61"/>
     <w:multiLevelType w:val="hybridMultilevel"/>
     <w:tmpl w:val="67580E76"/>
@@ -5044,7 +6736,93 @@
       </w:rPr>
     </w:lvl>
   </w:abstractNum>
-  <w:abstractNum w:abstractNumId="23" w15:restartNumberingAfterBreak="0">
+  <w:abstractNum w:abstractNumId="24" w15:restartNumberingAfterBreak="0">
+    <w:nsid w:val="552D6126"/>
+    <w:multiLevelType w:val="hybridMultilevel"/>
+    <w:tmpl w:val="9434360E"/>
+    <w:lvl w:ilvl="0" w:tplc="04190011">
+      <w:start w:val="1"/>
+      <w:numFmt w:val="decimal"/>
+      <w:lvlText w:val="%1)"/>
+      <w:lvlJc w:val="left"/>
+      <w:pPr>
+        <w:ind w:left="1429" w:hanging="360"/>
+      </w:pPr>
+    </w:lvl>
+    <w:lvl w:ilvl="1" w:tplc="04190019" w:tentative="1">
+      <w:start w:val="1"/>
+      <w:numFmt w:val="lowerLetter"/>
+      <w:lvlText w:val="%2."/>
+      <w:lvlJc w:val="left"/>
+      <w:pPr>
+        <w:ind w:left="2149" w:hanging="360"/>
+      </w:pPr>
+    </w:lvl>
+    <w:lvl w:ilvl="2" w:tplc="0419001B" w:tentative="1">
+      <w:start w:val="1"/>
+      <w:numFmt w:val="lowerRoman"/>
+      <w:lvlText w:val="%3."/>
+      <w:lvlJc w:val="right"/>
+      <w:pPr>
+        <w:ind w:left="2869" w:hanging="180"/>
+      </w:pPr>
+    </w:lvl>
+    <w:lvl w:ilvl="3" w:tplc="0419000F" w:tentative="1">
+      <w:start w:val="1"/>
+      <w:numFmt w:val="decimal"/>
+      <w:lvlText w:val="%4."/>
+      <w:lvlJc w:val="left"/>
+      <w:pPr>
+        <w:ind w:left="3589" w:hanging="360"/>
+      </w:pPr>
+    </w:lvl>
+    <w:lvl w:ilvl="4" w:tplc="04190019" w:tentative="1">
+      <w:start w:val="1"/>
+      <w:numFmt w:val="lowerLetter"/>
+      <w:lvlText w:val="%5."/>
+      <w:lvlJc w:val="left"/>
+      <w:pPr>
+        <w:ind w:left="4309" w:hanging="360"/>
+      </w:pPr>
+    </w:lvl>
+    <w:lvl w:ilvl="5" w:tplc="0419001B" w:tentative="1">
+      <w:start w:val="1"/>
+      <w:numFmt w:val="lowerRoman"/>
+      <w:lvlText w:val="%6."/>
+      <w:lvlJc w:val="right"/>
+      <w:pPr>
+        <w:ind w:left="5029" w:hanging="180"/>
+      </w:pPr>
+    </w:lvl>
+    <w:lvl w:ilvl="6" w:tplc="0419000F" w:tentative="1">
+      <w:start w:val="1"/>
+      <w:numFmt w:val="decimal"/>
+      <w:lvlText w:val="%7."/>
+      <w:lvlJc w:val="left"/>
+      <w:pPr>
+        <w:ind w:left="5749" w:hanging="360"/>
+      </w:pPr>
+    </w:lvl>
+    <w:lvl w:ilvl="7" w:tplc="04190019" w:tentative="1">
+      <w:start w:val="1"/>
+      <w:numFmt w:val="lowerLetter"/>
+      <w:lvlText w:val="%8."/>
+      <w:lvlJc w:val="left"/>
+      <w:pPr>
+        <w:ind w:left="6469" w:hanging="360"/>
+      </w:pPr>
+    </w:lvl>
+    <w:lvl w:ilvl="8" w:tplc="0419001B" w:tentative="1">
+      <w:start w:val="1"/>
+      <w:numFmt w:val="lowerRoman"/>
+      <w:lvlText w:val="%9."/>
+      <w:lvlJc w:val="right"/>
+      <w:pPr>
+        <w:ind w:left="7189" w:hanging="180"/>
+      </w:pPr>
+    </w:lvl>
+  </w:abstractNum>
+  <w:abstractNum w:abstractNumId="25" w15:restartNumberingAfterBreak="0">
     <w:nsid w:val="5F5D38FF"/>
     <w:multiLevelType w:val="hybridMultilevel"/>
     <w:tmpl w:val="9B2C67EA"/>
@@ -5130,7 +6908,7 @@
       </w:pPr>
     </w:lvl>
   </w:abstractNum>
-  <w:abstractNum w:abstractNumId="24" w15:restartNumberingAfterBreak="0">
+  <w:abstractNum w:abstractNumId="26" w15:restartNumberingAfterBreak="0">
     <w:nsid w:val="682A50F5"/>
     <w:multiLevelType w:val="hybridMultilevel"/>
     <w:tmpl w:val="FBF6B7AE"/>
@@ -5243,7 +7021,7 @@
       </w:rPr>
     </w:lvl>
   </w:abstractNum>
-  <w:abstractNum w:abstractNumId="25" w15:restartNumberingAfterBreak="0">
+  <w:abstractNum w:abstractNumId="27" w15:restartNumberingAfterBreak="0">
     <w:nsid w:val="68420323"/>
     <w:multiLevelType w:val="hybridMultilevel"/>
     <w:tmpl w:val="5C56B8B0"/>
@@ -5334,7 +7112,7 @@
       </w:pPr>
     </w:lvl>
   </w:abstractNum>
-  <w:abstractNum w:abstractNumId="26" w15:restartNumberingAfterBreak="0">
+  <w:abstractNum w:abstractNumId="28" w15:restartNumberingAfterBreak="0">
     <w:nsid w:val="6CB6520D"/>
     <w:multiLevelType w:val="hybridMultilevel"/>
     <w:tmpl w:val="28300484"/>
@@ -5447,7 +7225,7 @@
       </w:rPr>
     </w:lvl>
   </w:abstractNum>
-  <w:abstractNum w:abstractNumId="27" w15:restartNumberingAfterBreak="0">
+  <w:abstractNum w:abstractNumId="29" w15:restartNumberingAfterBreak="0">
     <w:nsid w:val="702F11CF"/>
     <w:multiLevelType w:val="hybridMultilevel"/>
     <w:tmpl w:val="498AAC82"/>
@@ -5536,7 +7314,7 @@
       </w:pPr>
     </w:lvl>
   </w:abstractNum>
-  <w:abstractNum w:abstractNumId="28" w15:restartNumberingAfterBreak="0">
+  <w:abstractNum w:abstractNumId="30" w15:restartNumberingAfterBreak="0">
     <w:nsid w:val="77DD3182"/>
     <w:multiLevelType w:val="hybridMultilevel"/>
     <w:tmpl w:val="1DFA873A"/>
@@ -5649,7 +7427,7 @@
       </w:rPr>
     </w:lvl>
   </w:abstractNum>
-  <w:abstractNum w:abstractNumId="29" w15:restartNumberingAfterBreak="0">
+  <w:abstractNum w:abstractNumId="31" w15:restartNumberingAfterBreak="0">
     <w:nsid w:val="7E3D4818"/>
     <w:multiLevelType w:val="hybridMultilevel"/>
     <w:tmpl w:val="D3AE741A"/>
@@ -5738,7 +7516,7 @@
       </w:pPr>
     </w:lvl>
   </w:abstractNum>
-  <w:abstractNum w:abstractNumId="30" w15:restartNumberingAfterBreak="0">
+  <w:abstractNum w:abstractNumId="32" w15:restartNumberingAfterBreak="0">
     <w:nsid w:val="7F5E120E"/>
     <w:multiLevelType w:val="hybridMultilevel"/>
     <w:tmpl w:val="3A6C99E6"/>
@@ -5832,7 +7610,7 @@
     <w:abstractNumId w:val="8"/>
   </w:num>
   <w:num w:numId="2">
-    <w:abstractNumId w:val="25"/>
+    <w:abstractNumId w:val="27"/>
   </w:num>
   <w:num w:numId="3">
     <w:abstractNumId w:val="5"/>
@@ -5841,13 +7619,13 @@
     <w:abstractNumId w:val="16"/>
   </w:num>
   <w:num w:numId="5">
-    <w:abstractNumId w:val="22"/>
+    <w:abstractNumId w:val="23"/>
   </w:num>
   <w:num w:numId="6">
     <w:abstractNumId w:val="7"/>
   </w:num>
   <w:num w:numId="7">
-    <w:abstractNumId w:val="28"/>
+    <w:abstractNumId w:val="30"/>
   </w:num>
   <w:num w:numId="8">
     <w:abstractNumId w:val="11"/>
@@ -5856,16 +7634,16 @@
     <w:abstractNumId w:val="17"/>
   </w:num>
   <w:num w:numId="10">
-    <w:abstractNumId w:val="26"/>
+    <w:abstractNumId w:val="28"/>
   </w:num>
   <w:num w:numId="11">
-    <w:abstractNumId w:val="24"/>
+    <w:abstractNumId w:val="26"/>
   </w:num>
   <w:num w:numId="12">
     <w:abstractNumId w:val="12"/>
   </w:num>
   <w:num w:numId="13">
-    <w:abstractNumId w:val="21"/>
+    <w:abstractNumId w:val="22"/>
   </w:num>
   <w:num w:numId="14">
     <w:abstractNumId w:val="10"/>
@@ -5877,16 +7655,16 @@
     <w:abstractNumId w:val="0"/>
   </w:num>
   <w:num w:numId="17">
-    <w:abstractNumId w:val="27"/>
+    <w:abstractNumId w:val="29"/>
   </w:num>
   <w:num w:numId="18">
     <w:abstractNumId w:val="3"/>
   </w:num>
   <w:num w:numId="19">
-    <w:abstractNumId w:val="23"/>
+    <w:abstractNumId w:val="25"/>
   </w:num>
   <w:num w:numId="20">
-    <w:abstractNumId w:val="30"/>
+    <w:abstractNumId w:val="32"/>
   </w:num>
   <w:num w:numId="21">
     <w:abstractNumId w:val="4"/>
@@ -5901,7 +7679,7 @@
     <w:abstractNumId w:val="20"/>
   </w:num>
   <w:num w:numId="25">
-    <w:abstractNumId w:val="29"/>
+    <w:abstractNumId w:val="31"/>
   </w:num>
   <w:num w:numId="26">
     <w:abstractNumId w:val="19"/>
@@ -5920,6 +7698,12 @@
   </w:num>
   <w:num w:numId="31">
     <w:abstractNumId w:val="6"/>
+  </w:num>
+  <w:num w:numId="32">
+    <w:abstractNumId w:val="24"/>
+  </w:num>
+  <w:num w:numId="33">
+    <w:abstractNumId w:val="21"/>
   </w:num>
 </w:numbering>
 </file>
@@ -6966,7 +8750,7 @@
 </file>
 
 <file path=customXml/itemProps1.xml><?xml version="1.0" encoding="utf-8"?>
-<ds:datastoreItem xmlns:ds="http://schemas.openxmlformats.org/officeDocument/2006/customXml" ds:itemID="{2572676C-7A9B-4039-9926-244A1976C956}">
+<ds:datastoreItem xmlns:ds="http://schemas.openxmlformats.org/officeDocument/2006/customXml" ds:itemID="{4C839363-4E11-484E-A289-556E1421BD53}">
   <ds:schemaRefs>
     <ds:schemaRef ds:uri="http://schemas.openxmlformats.org/officeDocument/2006/bibliography"/>
   </ds:schemaRefs>

</xml_diff>

<commit_message>
Add:  subsections in this section in 1.2 section: faltures, intenet moscow
</commit_message>
<xml_diff>
--- a/Documentation/титул мамшева.docx
+++ b/Documentation/титул мамшева.docx
@@ -699,7 +699,7 @@
           <w:lang w:eastAsia="ru-RU"/>
         </w:rPr>
       </w:pPr>
-      <w:bookmarkStart w:id="0" w:name="_Toc243247174"/>
+      <w:bookmarkStart w:id="0" w:name="_Toc243258961"/>
       <w:r>
         <w:rPr>
           <w:rFonts w:eastAsia="Times New Roman"/>
@@ -740,7 +740,7 @@
         </w:rPr>
         <w:fldChar w:fldCharType="separate"/>
       </w:r>
-      <w:hyperlink w:anchor="_Toc243247174" w:history="1">
+      <w:hyperlink w:anchor="_Toc243258961" w:history="1">
         <w:r>
           <w:rPr>
             <w:rStyle w:val="a6"/>
@@ -769,7 +769,7 @@
             <w:noProof/>
             <w:webHidden/>
           </w:rPr>
-          <w:instrText xml:space="preserve"> PAGEREF _Toc243247174 \h </w:instrText>
+          <w:instrText xml:space="preserve"> PAGEREF _Toc243258961 \h </w:instrText>
         </w:r>
         <w:r>
           <w:rPr>
@@ -804,6 +804,7 @@
       <w:pPr>
         <w:pStyle w:val="11"/>
         <w:tabs>
+          <w:tab w:val="left" w:pos="440"/>
           <w:tab w:val="right" w:leader="dot" w:pos="9345"/>
         </w:tabs>
         <w:rPr>
@@ -812,7 +813,23 @@
           <w:lang w:eastAsia="ru-RU"/>
         </w:rPr>
       </w:pPr>
-      <w:hyperlink w:anchor="_Toc243247175" w:history="1">
+      <w:hyperlink w:anchor="_Toc243258962" w:history="1">
+        <w:r>
+          <w:rPr>
+            <w:rStyle w:val="a6"/>
+            <w:noProof/>
+            <w:lang w:eastAsia="ru-RU"/>
+          </w:rPr>
+          <w:t>1.</w:t>
+        </w:r>
+        <w:r>
+          <w:rPr>
+            <w:rFonts w:eastAsiaTheme="minorEastAsia"/>
+            <w:noProof/>
+            <w:lang w:eastAsia="ru-RU"/>
+          </w:rPr>
+          <w:tab/>
+        </w:r>
         <w:r>
           <w:rPr>
             <w:rStyle w:val="a6"/>
@@ -840,7 +857,7 @@
             <w:noProof/>
             <w:webHidden/>
           </w:rPr>
-          <w:instrText xml:space="preserve"> PAGEREF _Toc243247175 \h </w:instrText>
+          <w:instrText xml:space="preserve"> PAGEREF _Toc243258962 \h </w:instrText>
         </w:r>
         <w:r>
           <w:rPr>
@@ -879,10 +896,12 @@
           <w:tab w:val="right" w:leader="dot" w:pos="9345"/>
         </w:tabs>
         <w:rPr>
+          <w:rFonts w:eastAsiaTheme="minorEastAsia"/>
           <w:noProof/>
-        </w:rPr>
-      </w:pPr>
-      <w:hyperlink w:anchor="_Toc243247176" w:history="1">
+          <w:lang w:eastAsia="ru-RU"/>
+        </w:rPr>
+      </w:pPr>
+      <w:hyperlink w:anchor="_Toc243258963" w:history="1">
         <w:r>
           <w:rPr>
             <w:rStyle w:val="a6"/>
@@ -894,7 +913,9 @@
         </w:r>
         <w:r>
           <w:rPr>
+            <w:rFonts w:eastAsiaTheme="minorEastAsia"/>
             <w:noProof/>
+            <w:lang w:eastAsia="ru-RU"/>
           </w:rPr>
           <w:tab/>
         </w:r>
@@ -926,7 +947,7 @@
             <w:noProof/>
             <w:webHidden/>
           </w:rPr>
-          <w:instrText xml:space="preserve"> PAGEREF _Toc243247176 \h </w:instrText>
+          <w:instrText xml:space="preserve"> PAGEREF _Toc243258963 \h </w:instrText>
         </w:r>
         <w:r>
           <w:rPr>
@@ -965,10 +986,12 @@
           <w:tab w:val="right" w:leader="dot" w:pos="9345"/>
         </w:tabs>
         <w:rPr>
+          <w:rFonts w:eastAsiaTheme="minorEastAsia"/>
           <w:noProof/>
-        </w:rPr>
-      </w:pPr>
-      <w:hyperlink w:anchor="_Toc243247177" w:history="1">
+          <w:lang w:eastAsia="ru-RU"/>
+        </w:rPr>
+      </w:pPr>
+      <w:hyperlink w:anchor="_Toc243258964" w:history="1">
         <w:r>
           <w:rPr>
             <w:rStyle w:val="a6"/>
@@ -979,7 +1002,9 @@
         </w:r>
         <w:r>
           <w:rPr>
+            <w:rFonts w:eastAsiaTheme="minorEastAsia"/>
             <w:noProof/>
+            <w:lang w:eastAsia="ru-RU"/>
           </w:rPr>
           <w:tab/>
         </w:r>
@@ -989,7 +1014,7 @@
             <w:noProof/>
             <w:lang w:eastAsia="ru-RU"/>
           </w:rPr>
-          <w:t>Выбор идеи проекта</w:t>
+          <w:t>Концепция проекта</w:t>
         </w:r>
         <w:r>
           <w:rPr>
@@ -1010,7 +1035,7 @@
             <w:noProof/>
             <w:webHidden/>
           </w:rPr>
-          <w:instrText xml:space="preserve"> PAGEREF _Toc243247177 \h </w:instrText>
+          <w:instrText xml:space="preserve"> PAGEREF _Toc243258964 \h </w:instrText>
         </w:r>
         <w:r>
           <w:rPr>
@@ -1049,10 +1074,12 @@
           <w:tab w:val="right" w:leader="dot" w:pos="9345"/>
         </w:tabs>
         <w:rPr>
+          <w:rFonts w:eastAsiaTheme="minorEastAsia"/>
           <w:noProof/>
-        </w:rPr>
-      </w:pPr>
-      <w:hyperlink w:anchor="_Toc243247178" w:history="1">
+          <w:lang w:eastAsia="ru-RU"/>
+        </w:rPr>
+      </w:pPr>
+      <w:hyperlink w:anchor="_Toc243258965" w:history="1">
         <w:r>
           <w:rPr>
             <w:rStyle w:val="a6"/>
@@ -1064,7 +1091,9 @@
         </w:r>
         <w:r>
           <w:rPr>
+            <w:rFonts w:eastAsiaTheme="minorEastAsia"/>
             <w:noProof/>
+            <w:lang w:eastAsia="ru-RU"/>
           </w:rPr>
           <w:tab/>
         </w:r>
@@ -1074,7 +1103,7 @@
             <w:noProof/>
             <w:lang w:eastAsia="ru-RU"/>
           </w:rPr>
-          <w:t>Анализ аналогов и выявление преимуществ и недостатков</w:t>
+          <w:t>Проблематика и ценность для пользователя</w:t>
         </w:r>
         <w:r>
           <w:rPr>
@@ -1095,7 +1124,7 @@
             <w:noProof/>
             <w:webHidden/>
           </w:rPr>
-          <w:instrText xml:space="preserve"> PAGEREF _Toc243247178 \h </w:instrText>
+          <w:instrText xml:space="preserve"> PAGEREF _Toc243258965 \h </w:instrText>
         </w:r>
         <w:r>
           <w:rPr>
@@ -1128,6 +1157,478 @@
     </w:p>
     <w:p>
       <w:pPr>
+        <w:pStyle w:val="31"/>
+        <w:tabs>
+          <w:tab w:val="left" w:pos="1320"/>
+          <w:tab w:val="right" w:leader="dot" w:pos="9345"/>
+        </w:tabs>
+        <w:rPr>
+          <w:rFonts w:eastAsiaTheme="minorEastAsia"/>
+          <w:noProof/>
+          <w:lang w:eastAsia="ru-RU"/>
+        </w:rPr>
+      </w:pPr>
+      <w:hyperlink w:anchor="_Toc243258966" w:history="1">
+        <w:r>
+          <w:rPr>
+            <w:rStyle w:val="a6"/>
+            <w:noProof/>
+            <w:lang w:eastAsia="ru-RU"/>
+          </w:rPr>
+          <w:t>1.1.3.</w:t>
+        </w:r>
+        <w:r>
+          <w:rPr>
+            <w:rFonts w:eastAsiaTheme="minorEastAsia"/>
+            <w:noProof/>
+            <w:lang w:eastAsia="ru-RU"/>
+          </w:rPr>
+          <w:tab/>
+        </w:r>
+        <w:r>
+          <w:rPr>
+            <w:rStyle w:val="a6"/>
+            <w:noProof/>
+            <w:lang w:eastAsia="ru-RU"/>
+          </w:rPr>
+          <w:t>Сравнительный анализ аналогов</w:t>
+        </w:r>
+        <w:r>
+          <w:rPr>
+            <w:noProof/>
+            <w:webHidden/>
+          </w:rPr>
+          <w:tab/>
+        </w:r>
+        <w:r>
+          <w:rPr>
+            <w:noProof/>
+            <w:webHidden/>
+          </w:rPr>
+          <w:fldChar w:fldCharType="begin"/>
+        </w:r>
+        <w:r>
+          <w:rPr>
+            <w:noProof/>
+            <w:webHidden/>
+          </w:rPr>
+          <w:instrText xml:space="preserve"> PAGEREF _Toc243258966 \h </w:instrText>
+        </w:r>
+        <w:r>
+          <w:rPr>
+            <w:noProof/>
+            <w:webHidden/>
+          </w:rPr>
+        </w:r>
+        <w:r>
+          <w:rPr>
+            <w:noProof/>
+            <w:webHidden/>
+          </w:rPr>
+          <w:fldChar w:fldCharType="separate"/>
+        </w:r>
+        <w:r>
+          <w:rPr>
+            <w:noProof/>
+            <w:webHidden/>
+          </w:rPr>
+          <w:t>4</w:t>
+        </w:r>
+        <w:r>
+          <w:rPr>
+            <w:noProof/>
+            <w:webHidden/>
+          </w:rPr>
+          <w:fldChar w:fldCharType="end"/>
+        </w:r>
+      </w:hyperlink>
+    </w:p>
+    <w:p>
+      <w:pPr>
+        <w:pStyle w:val="21"/>
+        <w:tabs>
+          <w:tab w:val="left" w:pos="880"/>
+          <w:tab w:val="right" w:leader="dot" w:pos="9345"/>
+        </w:tabs>
+        <w:rPr>
+          <w:rFonts w:eastAsiaTheme="minorEastAsia"/>
+          <w:noProof/>
+          <w:lang w:eastAsia="ru-RU"/>
+        </w:rPr>
+      </w:pPr>
+      <w:hyperlink w:anchor="_Toc243258967" w:history="1">
+        <w:r>
+          <w:rPr>
+            <w:rStyle w:val="a6"/>
+            <w:noProof/>
+            <w:lang w:eastAsia="ru-RU"/>
+          </w:rPr>
+          <w:t>1.2.</w:t>
+        </w:r>
+        <w:r>
+          <w:rPr>
+            <w:rFonts w:eastAsiaTheme="minorEastAsia"/>
+            <w:noProof/>
+            <w:lang w:eastAsia="ru-RU"/>
+          </w:rPr>
+          <w:tab/>
+        </w:r>
+        <w:r>
+          <w:rPr>
+            <w:rStyle w:val="a6"/>
+            <w:noProof/>
+            <w:lang w:eastAsia="ru-RU"/>
+          </w:rPr>
+          <w:t>Составление технического задания</w:t>
+        </w:r>
+        <w:r>
+          <w:rPr>
+            <w:noProof/>
+            <w:webHidden/>
+          </w:rPr>
+          <w:tab/>
+        </w:r>
+        <w:r>
+          <w:rPr>
+            <w:noProof/>
+            <w:webHidden/>
+          </w:rPr>
+          <w:fldChar w:fldCharType="begin"/>
+        </w:r>
+        <w:r>
+          <w:rPr>
+            <w:noProof/>
+            <w:webHidden/>
+          </w:rPr>
+          <w:instrText xml:space="preserve"> PAGEREF _Toc243258967 \h </w:instrText>
+        </w:r>
+        <w:r>
+          <w:rPr>
+            <w:noProof/>
+            <w:webHidden/>
+          </w:rPr>
+        </w:r>
+        <w:r>
+          <w:rPr>
+            <w:noProof/>
+            <w:webHidden/>
+          </w:rPr>
+          <w:fldChar w:fldCharType="separate"/>
+        </w:r>
+        <w:r>
+          <w:rPr>
+            <w:noProof/>
+            <w:webHidden/>
+          </w:rPr>
+          <w:t>6</w:t>
+        </w:r>
+        <w:r>
+          <w:rPr>
+            <w:noProof/>
+            <w:webHidden/>
+          </w:rPr>
+          <w:fldChar w:fldCharType="end"/>
+        </w:r>
+      </w:hyperlink>
+    </w:p>
+    <w:p>
+      <w:pPr>
+        <w:pStyle w:val="31"/>
+        <w:tabs>
+          <w:tab w:val="left" w:pos="1320"/>
+          <w:tab w:val="right" w:leader="dot" w:pos="9345"/>
+        </w:tabs>
+        <w:rPr>
+          <w:rFonts w:eastAsiaTheme="minorEastAsia"/>
+          <w:noProof/>
+          <w:lang w:eastAsia="ru-RU"/>
+        </w:rPr>
+      </w:pPr>
+      <w:hyperlink w:anchor="_Toc243258968" w:history="1">
+        <w:r>
+          <w:rPr>
+            <w:rStyle w:val="a6"/>
+            <w:noProof/>
+            <w:lang w:eastAsia="ru-RU"/>
+          </w:rPr>
+          <w:t>1.2.1.</w:t>
+        </w:r>
+        <w:r>
+          <w:rPr>
+            <w:rFonts w:eastAsiaTheme="minorEastAsia"/>
+            <w:noProof/>
+            <w:lang w:eastAsia="ru-RU"/>
+          </w:rPr>
+          <w:tab/>
+        </w:r>
+        <w:r>
+          <w:rPr>
+            <w:rStyle w:val="a6"/>
+            <w:noProof/>
+            <w:lang w:eastAsia="ru-RU"/>
+          </w:rPr>
+          <w:t>Цели проекта</w:t>
+        </w:r>
+        <w:r>
+          <w:rPr>
+            <w:noProof/>
+            <w:webHidden/>
+          </w:rPr>
+          <w:tab/>
+        </w:r>
+        <w:r>
+          <w:rPr>
+            <w:noProof/>
+            <w:webHidden/>
+          </w:rPr>
+          <w:fldChar w:fldCharType="begin"/>
+        </w:r>
+        <w:r>
+          <w:rPr>
+            <w:noProof/>
+            <w:webHidden/>
+          </w:rPr>
+          <w:instrText xml:space="preserve"> PAGEREF _Toc243258968 \h </w:instrText>
+        </w:r>
+        <w:r>
+          <w:rPr>
+            <w:noProof/>
+            <w:webHidden/>
+          </w:rPr>
+        </w:r>
+        <w:r>
+          <w:rPr>
+            <w:noProof/>
+            <w:webHidden/>
+          </w:rPr>
+          <w:fldChar w:fldCharType="separate"/>
+        </w:r>
+        <w:r>
+          <w:rPr>
+            <w:noProof/>
+            <w:webHidden/>
+          </w:rPr>
+          <w:t>6</w:t>
+        </w:r>
+        <w:r>
+          <w:rPr>
+            <w:noProof/>
+            <w:webHidden/>
+          </w:rPr>
+          <w:fldChar w:fldCharType="end"/>
+        </w:r>
+      </w:hyperlink>
+    </w:p>
+    <w:p>
+      <w:pPr>
+        <w:pStyle w:val="31"/>
+        <w:tabs>
+          <w:tab w:val="left" w:pos="1320"/>
+          <w:tab w:val="right" w:leader="dot" w:pos="9345"/>
+        </w:tabs>
+        <w:rPr>
+          <w:rFonts w:eastAsiaTheme="minorEastAsia"/>
+          <w:noProof/>
+          <w:lang w:eastAsia="ru-RU"/>
+        </w:rPr>
+      </w:pPr>
+      <w:hyperlink w:anchor="_Toc243258969" w:history="1">
+        <w:r>
+          <w:rPr>
+            <w:rStyle w:val="a6"/>
+            <w:noProof/>
+            <w:lang w:eastAsia="ru-RU"/>
+          </w:rPr>
+          <w:t>1.2.2.</w:t>
+        </w:r>
+        <w:r>
+          <w:rPr>
+            <w:rFonts w:eastAsiaTheme="minorEastAsia"/>
+            <w:noProof/>
+            <w:lang w:eastAsia="ru-RU"/>
+          </w:rPr>
+          <w:tab/>
+        </w:r>
+        <w:r>
+          <w:rPr>
+            <w:rStyle w:val="a6"/>
+            <w:noProof/>
+            <w:lang w:eastAsia="ru-RU"/>
+          </w:rPr>
+          <w:t>Функциональные требования</w:t>
+        </w:r>
+        <w:r>
+          <w:rPr>
+            <w:noProof/>
+            <w:webHidden/>
+          </w:rPr>
+          <w:tab/>
+        </w:r>
+        <w:r>
+          <w:rPr>
+            <w:noProof/>
+            <w:webHidden/>
+          </w:rPr>
+          <w:fldChar w:fldCharType="begin"/>
+        </w:r>
+        <w:r>
+          <w:rPr>
+            <w:noProof/>
+            <w:webHidden/>
+          </w:rPr>
+          <w:instrText xml:space="preserve"> PAGEREF _Toc243258969 \h </w:instrText>
+        </w:r>
+        <w:r>
+          <w:rPr>
+            <w:noProof/>
+            <w:webHidden/>
+          </w:rPr>
+        </w:r>
+        <w:r>
+          <w:rPr>
+            <w:noProof/>
+            <w:webHidden/>
+          </w:rPr>
+          <w:fldChar w:fldCharType="separate"/>
+        </w:r>
+        <w:r>
+          <w:rPr>
+            <w:noProof/>
+            <w:webHidden/>
+          </w:rPr>
+          <w:t>6</w:t>
+        </w:r>
+        <w:r>
+          <w:rPr>
+            <w:noProof/>
+            <w:webHidden/>
+          </w:rPr>
+          <w:fldChar w:fldCharType="end"/>
+        </w:r>
+      </w:hyperlink>
+    </w:p>
+    <w:p>
+      <w:pPr>
+        <w:pStyle w:val="31"/>
+        <w:tabs>
+          <w:tab w:val="left" w:pos="1320"/>
+          <w:tab w:val="right" w:leader="dot" w:pos="9345"/>
+        </w:tabs>
+        <w:rPr>
+          <w:rFonts w:eastAsiaTheme="minorEastAsia"/>
+          <w:noProof/>
+          <w:lang w:eastAsia="ru-RU"/>
+        </w:rPr>
+      </w:pPr>
+      <w:hyperlink w:anchor="_Toc243258970" w:history="1">
+        <w:r>
+          <w:rPr>
+            <w:rStyle w:val="a6"/>
+            <w:noProof/>
+            <w:lang w:eastAsia="ru-RU"/>
+          </w:rPr>
+          <w:t>1.2.4.</w:t>
+        </w:r>
+        <w:r>
+          <w:rPr>
+            <w:rFonts w:eastAsiaTheme="minorEastAsia"/>
+            <w:noProof/>
+            <w:lang w:eastAsia="ru-RU"/>
+          </w:rPr>
+          <w:tab/>
+        </w:r>
+        <w:r>
+          <w:rPr>
+            <w:rStyle w:val="a6"/>
+            <w:noProof/>
+            <w:lang w:eastAsia="ru-RU"/>
+          </w:rPr>
+          <w:t xml:space="preserve">Диаграммы использования и описание </w:t>
+        </w:r>
+        <w:r>
+          <w:rPr>
+            <w:rStyle w:val="a6"/>
+            <w:noProof/>
+            <w:lang w:val="en-US" w:eastAsia="ru-RU"/>
+          </w:rPr>
+          <w:t>user</w:t>
+        </w:r>
+        <w:r>
+          <w:rPr>
+            <w:rStyle w:val="a6"/>
+            <w:noProof/>
+            <w:lang w:eastAsia="ru-RU"/>
+          </w:rPr>
+          <w:t xml:space="preserve"> </w:t>
+        </w:r>
+        <w:r>
+          <w:rPr>
+            <w:rStyle w:val="a6"/>
+            <w:noProof/>
+            <w:lang w:val="en-US" w:eastAsia="ru-RU"/>
+          </w:rPr>
+          <w:t>story</w:t>
+        </w:r>
+        <w:r>
+          <w:rPr>
+            <w:rStyle w:val="a6"/>
+            <w:noProof/>
+            <w:lang w:eastAsia="ru-RU"/>
+          </w:rPr>
+          <w:t>.</w:t>
+        </w:r>
+        <w:r>
+          <w:rPr>
+            <w:noProof/>
+            <w:webHidden/>
+          </w:rPr>
+          <w:tab/>
+        </w:r>
+        <w:r>
+          <w:rPr>
+            <w:noProof/>
+            <w:webHidden/>
+          </w:rPr>
+          <w:fldChar w:fldCharType="begin"/>
+        </w:r>
+        <w:r>
+          <w:rPr>
+            <w:noProof/>
+            <w:webHidden/>
+          </w:rPr>
+          <w:instrText xml:space="preserve"> PAGEREF _Toc243258970 \h </w:instrText>
+        </w:r>
+        <w:r>
+          <w:rPr>
+            <w:noProof/>
+            <w:webHidden/>
+          </w:rPr>
+        </w:r>
+        <w:r>
+          <w:rPr>
+            <w:noProof/>
+            <w:webHidden/>
+          </w:rPr>
+          <w:fldChar w:fldCharType="separate"/>
+        </w:r>
+        <w:r>
+          <w:rPr>
+            <w:noProof/>
+            <w:webHidden/>
+          </w:rPr>
+          <w:t>9</w:t>
+        </w:r>
+        <w:r>
+          <w:rPr>
+            <w:noProof/>
+            <w:webHidden/>
+          </w:rPr>
+          <w:fldChar w:fldCharType="end"/>
+        </w:r>
+      </w:hyperlink>
+    </w:p>
+    <w:p>
+      <w:pPr>
         <w:pStyle w:val="a9"/>
         <w:rPr>
           <w:lang w:eastAsia="ru-RU"/>
@@ -1167,11 +1668,15 @@
     <w:p>
       <w:pPr>
         <w:pStyle w:val="1"/>
-        <w:rPr>
-          <w:lang w:eastAsia="ru-RU"/>
-        </w:rPr>
-      </w:pPr>
-      <w:bookmarkStart w:id="1" w:name="_Toc243247175"/>
+        <w:numPr>
+          <w:ilvl w:val="0"/>
+          <w:numId w:val="30"/>
+        </w:numPr>
+        <w:rPr>
+          <w:lang w:eastAsia="ru-RU"/>
+        </w:rPr>
+      </w:pPr>
+      <w:bookmarkStart w:id="1" w:name="_Toc243258962"/>
       <w:r>
         <w:rPr>
           <w:lang w:eastAsia="ru-RU"/>
@@ -1193,7 +1698,7 @@
           <w:lang w:eastAsia="ru-RU"/>
         </w:rPr>
       </w:pPr>
-      <w:bookmarkStart w:id="2" w:name="_Toc243247176"/>
+      <w:bookmarkStart w:id="2" w:name="_Toc243258963"/>
       <w:r>
         <w:rPr>
           <w:rFonts w:eastAsia="Times New Roman"/>
@@ -1215,7 +1720,7 @@
           <w:lang w:eastAsia="ru-RU"/>
         </w:rPr>
       </w:pPr>
-      <w:bookmarkStart w:id="3" w:name="_Toc243247177"/>
+      <w:bookmarkStart w:id="3" w:name="_Toc243258964"/>
       <w:r>
         <w:rPr>
           <w:lang w:eastAsia="ru-RU"/>
@@ -1303,12 +1808,14 @@
           <w:lang w:eastAsia="ru-RU"/>
         </w:rPr>
       </w:pPr>
+      <w:bookmarkStart w:id="4" w:name="_Toc243258965"/>
       <w:r>
         <w:rPr>
           <w:lang w:eastAsia="ru-RU"/>
         </w:rPr>
         <w:t>Проблематика и ценность для пользователя</w:t>
       </w:r>
+      <w:bookmarkEnd w:id="4"/>
     </w:p>
     <w:p>
       <w:pPr>
@@ -1563,12 +2070,14 @@
           <w:lang w:eastAsia="ru-RU"/>
         </w:rPr>
       </w:pPr>
+      <w:bookmarkStart w:id="5" w:name="_Toc243258966"/>
       <w:r>
         <w:rPr>
           <w:lang w:eastAsia="ru-RU"/>
         </w:rPr>
         <w:t>Сравнительный анализ аналогов</w:t>
       </w:r>
+      <w:bookmarkEnd w:id="5"/>
     </w:p>
     <w:p>
       <w:pPr>
@@ -2778,6 +3287,7 @@
           <w:lang w:eastAsia="ru-RU"/>
         </w:rPr>
       </w:pPr>
+      <w:bookmarkStart w:id="6" w:name="_Toc243258967"/>
       <w:r>
         <w:rPr>
           <w:lang w:eastAsia="ru-RU"/>
@@ -2785,6 +3295,7 @@
         <w:lastRenderedPageBreak/>
         <w:t>Составление технического задания</w:t>
       </w:r>
+      <w:bookmarkEnd w:id="6"/>
     </w:p>
     <w:p>
       <w:pPr>
@@ -2798,12 +3309,14 @@
           <w:lang w:eastAsia="ru-RU"/>
         </w:rPr>
       </w:pPr>
+      <w:bookmarkStart w:id="7" w:name="_Toc243258968"/>
       <w:r>
         <w:rPr>
           <w:lang w:eastAsia="ru-RU"/>
         </w:rPr>
         <w:t>Цели проекта</w:t>
       </w:r>
+      <w:bookmarkEnd w:id="7"/>
     </w:p>
     <w:p>
       <w:pPr>
@@ -3045,12 +3558,14 @@
           <w:lang w:eastAsia="ru-RU"/>
         </w:rPr>
       </w:pPr>
+      <w:bookmarkStart w:id="8" w:name="_Toc243258969"/>
       <w:r>
         <w:rPr>
           <w:lang w:eastAsia="ru-RU"/>
         </w:rPr>
         <w:t>Функциональные требования</w:t>
       </w:r>
+      <w:bookmarkEnd w:id="8"/>
     </w:p>
     <w:p>
       <w:pPr>
@@ -4161,6 +4676,7 @@
           <w:ilvl w:val="0"/>
           <w:numId w:val="33"/>
         </w:numPr>
+        <w:ind w:left="0" w:firstLine="709"/>
         <w:rPr>
           <w:lang w:eastAsia="ru-RU"/>
         </w:rPr>
@@ -4181,15 +4697,7 @@
         <w:rPr>
           <w:lang w:eastAsia="ru-RU"/>
         </w:rPr>
-        <w:t xml:space="preserve">5 </w:t>
-      </w:r>
-      <w:bookmarkStart w:id="4" w:name="_GoBack"/>
-      <w:bookmarkEnd w:id="4"/>
-      <w:r>
-        <w:rPr>
-          <w:lang w:eastAsia="ru-RU"/>
-        </w:rPr>
-        <w:t>,</w:t>
+        <w:t>5 ,</w:t>
       </w:r>
       <w:r>
         <w:rPr>
@@ -4203,6 +4711,1238 @@
         </w:rPr>
         <w:t>).</w:t>
       </w:r>
+    </w:p>
+    <w:p>
+      <w:pPr>
+        <w:pStyle w:val="3"/>
+        <w:numPr>
+          <w:ilvl w:val="2"/>
+          <w:numId w:val="30"/>
+        </w:numPr>
+        <w:ind w:left="0" w:firstLine="709"/>
+        <w:rPr>
+          <w:lang w:eastAsia="ru-RU"/>
+        </w:rPr>
+      </w:pPr>
+      <w:bookmarkStart w:id="9" w:name="_Toc243258970"/>
+      <w:r>
+        <w:rPr>
+          <w:lang w:eastAsia="ru-RU"/>
+        </w:rPr>
+        <w:lastRenderedPageBreak/>
+        <w:t>Диаграммы использования</w:t>
+      </w:r>
+      <w:r>
+        <w:rPr>
+          <w:lang w:eastAsia="ru-RU"/>
+        </w:rPr>
+        <w:t xml:space="preserve"> </w:t>
+      </w:r>
+      <w:r>
+        <w:rPr>
+          <w:lang w:eastAsia="ru-RU"/>
+        </w:rPr>
+        <w:t xml:space="preserve">и описание </w:t>
+      </w:r>
+      <w:r>
+        <w:rPr>
+          <w:lang w:val="en-US" w:eastAsia="ru-RU"/>
+        </w:rPr>
+        <w:t>user</w:t>
+      </w:r>
+      <w:r>
+        <w:rPr>
+          <w:lang w:eastAsia="ru-RU"/>
+        </w:rPr>
+        <w:t xml:space="preserve"> </w:t>
+      </w:r>
+      <w:r>
+        <w:rPr>
+          <w:lang w:val="en-US" w:eastAsia="ru-RU"/>
+        </w:rPr>
+        <w:t>story</w:t>
+      </w:r>
+      <w:r>
+        <w:rPr>
+          <w:lang w:eastAsia="ru-RU"/>
+        </w:rPr>
+        <w:t>.</w:t>
+      </w:r>
+      <w:bookmarkEnd w:id="9"/>
+    </w:p>
+    <w:p>
+      <w:pPr>
+        <w:pStyle w:val="a9"/>
+        <w:rPr>
+          <w:lang w:eastAsia="ru-RU"/>
+        </w:rPr>
+      </w:pPr>
+    </w:p>
+    <w:p>
+      <w:pPr>
+        <w:pStyle w:val="a9"/>
+        <w:rPr>
+          <w:lang w:eastAsia="ru-RU"/>
+        </w:rPr>
+      </w:pPr>
+    </w:p>
+    <w:p>
+      <w:pPr>
+        <w:pStyle w:val="a9"/>
+        <w:rPr>
+          <w:lang w:eastAsia="ru-RU"/>
+        </w:rPr>
+      </w:pPr>
+    </w:p>
+    <w:p>
+      <w:pPr>
+        <w:pStyle w:val="3"/>
+        <w:numPr>
+          <w:ilvl w:val="2"/>
+          <w:numId w:val="30"/>
+        </w:numPr>
+        <w:ind w:left="0" w:firstLine="709"/>
+        <w:rPr>
+          <w:lang w:eastAsia="ru-RU"/>
+        </w:rPr>
+      </w:pPr>
+      <w:r>
+        <w:rPr>
+          <w:lang w:eastAsia="ru-RU"/>
+        </w:rPr>
+        <w:t xml:space="preserve">Требования к </w:t>
+      </w:r>
+      <w:r>
+        <w:rPr>
+          <w:lang w:eastAsia="ru-RU"/>
+        </w:rPr>
+        <w:t>обработке ошибок</w:t>
+      </w:r>
+    </w:p>
+    <w:p>
+      <w:pPr>
+        <w:pStyle w:val="a9"/>
+        <w:rPr>
+          <w:lang w:eastAsia="ru-RU"/>
+        </w:rPr>
+      </w:pPr>
+      <w:r>
+        <w:rPr>
+          <w:lang w:eastAsia="ru-RU"/>
+        </w:rPr>
+        <w:t>Приложение должно обрабатывать ошибки так, чтобы игрок не терял прогресс и мог продолжить игру. Сообщения об ошибках простые, без технических</w:t>
+      </w:r>
+      <w:r>
+        <w:rPr>
+          <w:lang w:eastAsia="ru-RU"/>
+        </w:rPr>
+        <w:t xml:space="preserve"> терминов, с понятным действием. </w:t>
+      </w:r>
+      <w:r>
+        <w:rPr>
+          <w:lang w:eastAsia="ru-RU"/>
+        </w:rPr>
+        <w:t>Введённые игроком данные при сбое не теряются. При неожиданной ошибке приложение не закрывается, а показывает экран «Что-то пошло не так» с кнопкой «Повторить».</w:t>
+      </w:r>
+      <w:r>
+        <w:rPr>
+          <w:lang w:eastAsia="ru-RU"/>
+        </w:rPr>
+        <w:t xml:space="preserve"> Так же была составлена таблица, которая описывает ошибку и ожидаемое поведение продукта.</w:t>
+      </w:r>
+    </w:p>
+    <w:p>
+      <w:pPr>
+        <w:pStyle w:val="a9"/>
+        <w:ind w:firstLine="0"/>
+        <w:rPr>
+          <w:lang w:eastAsia="ru-RU"/>
+        </w:rPr>
+      </w:pPr>
+      <w:r>
+        <w:rPr>
+          <w:lang w:eastAsia="ru-RU"/>
+        </w:rPr>
+        <w:t>Таблица 3 – Обработка ошибок.</w:t>
+      </w:r>
+    </w:p>
+    <w:tbl>
+      <w:tblPr>
+        <w:tblStyle w:val="a5"/>
+        <w:tblW w:w="0" w:type="auto"/>
+        <w:tblLook w:val="04A0" w:firstRow="1" w:lastRow="0" w:firstColumn="1" w:lastColumn="0" w:noHBand="0" w:noVBand="1"/>
+      </w:tblPr>
+      <w:tblGrid>
+        <w:gridCol w:w="4672"/>
+        <w:gridCol w:w="4673"/>
+      </w:tblGrid>
+      <w:tr>
+        <w:tc>
+          <w:tcPr>
+            <w:tcW w:w="4672" w:type="dxa"/>
+          </w:tcPr>
+          <w:p>
+            <w:pPr>
+              <w:pStyle w:val="a9"/>
+              <w:ind w:firstLine="0"/>
+              <w:rPr>
+                <w:lang w:eastAsia="ru-RU"/>
+              </w:rPr>
+            </w:pPr>
+            <w:r>
+              <w:rPr>
+                <w:lang w:eastAsia="ru-RU"/>
+              </w:rPr>
+              <w:t>Ошибка</w:t>
+            </w:r>
+          </w:p>
+        </w:tc>
+        <w:tc>
+          <w:tcPr>
+            <w:tcW w:w="4673" w:type="dxa"/>
+          </w:tcPr>
+          <w:p>
+            <w:pPr>
+              <w:pStyle w:val="a9"/>
+              <w:ind w:firstLine="0"/>
+              <w:rPr>
+                <w:lang w:eastAsia="ru-RU"/>
+              </w:rPr>
+            </w:pPr>
+            <w:r>
+              <w:rPr>
+                <w:lang w:eastAsia="ru-RU"/>
+              </w:rPr>
+              <w:t>Поведение приложения</w:t>
+            </w:r>
+          </w:p>
+        </w:tc>
+      </w:tr>
+      <w:tr>
+        <w:tc>
+          <w:tcPr>
+            <w:tcW w:w="4672" w:type="dxa"/>
+          </w:tcPr>
+          <w:p>
+            <w:pPr>
+              <w:pStyle w:val="a9"/>
+              <w:ind w:firstLine="0"/>
+              <w:rPr>
+                <w:lang w:eastAsia="ru-RU"/>
+              </w:rPr>
+            </w:pPr>
+            <w:r>
+              <w:t>Нет интернета при входе</w:t>
+            </w:r>
+          </w:p>
+        </w:tc>
+        <w:tc>
+          <w:tcPr>
+            <w:tcW w:w="4673" w:type="dxa"/>
+          </w:tcPr>
+          <w:p>
+            <w:pPr>
+              <w:pStyle w:val="a9"/>
+              <w:ind w:firstLine="0"/>
+              <w:rPr>
+                <w:lang w:eastAsia="ru-RU"/>
+              </w:rPr>
+            </w:pPr>
+            <w:r>
+              <w:t>Сообщение «Для входа нужен интернет» и кнопка «Повторить»</w:t>
+            </w:r>
+          </w:p>
+        </w:tc>
+      </w:tr>
+      <w:tr>
+        <w:tc>
+          <w:tcPr>
+            <w:tcW w:w="4672" w:type="dxa"/>
+          </w:tcPr>
+          <w:p>
+            <w:pPr>
+              <w:pStyle w:val="a9"/>
+              <w:ind w:firstLine="0"/>
+              <w:rPr>
+                <w:lang w:eastAsia="ru-RU"/>
+              </w:rPr>
+            </w:pPr>
+            <w:r>
+              <w:t>Нет интернета в чате</w:t>
+            </w:r>
+          </w:p>
+        </w:tc>
+        <w:tc>
+          <w:tcPr>
+            <w:tcW w:w="4673" w:type="dxa"/>
+          </w:tcPr>
+          <w:p>
+            <w:pPr>
+              <w:pStyle w:val="a9"/>
+              <w:ind w:firstLine="0"/>
+              <w:rPr>
+                <w:lang w:eastAsia="ru-RU"/>
+              </w:rPr>
+            </w:pPr>
+            <w:r>
+              <w:t>Поле ввода неактивно, история диалога остаётся доступной</w:t>
+            </w:r>
+          </w:p>
+        </w:tc>
+      </w:tr>
+      <w:tr>
+        <w:tc>
+          <w:tcPr>
+            <w:tcW w:w="4672" w:type="dxa"/>
+          </w:tcPr>
+          <w:p>
+            <w:pPr>
+              <w:pStyle w:val="a9"/>
+              <w:ind w:firstLine="0"/>
+              <w:rPr>
+                <w:lang w:eastAsia="ru-RU"/>
+              </w:rPr>
+            </w:pPr>
+            <w:r>
+              <w:t>Обрыв сети при отправке реплики</w:t>
+            </w:r>
+          </w:p>
+        </w:tc>
+        <w:tc>
+          <w:tcPr>
+            <w:tcW w:w="4673" w:type="dxa"/>
+          </w:tcPr>
+          <w:p>
+            <w:pPr>
+              <w:pStyle w:val="a9"/>
+              <w:ind w:firstLine="0"/>
+              <w:rPr>
+                <w:lang w:eastAsia="ru-RU"/>
+              </w:rPr>
+            </w:pPr>
+            <w:r>
+              <w:t>Текст не теряет</w:t>
+            </w:r>
+            <w:r>
+              <w:t>ся, показывается «Не отправлено» и кнопка «Повторить»</w:t>
+            </w:r>
+          </w:p>
+        </w:tc>
+      </w:tr>
+      <w:tr>
+        <w:tc>
+          <w:tcPr>
+            <w:tcW w:w="4672" w:type="dxa"/>
+          </w:tcPr>
+          <w:p>
+            <w:pPr>
+              <w:pStyle w:val="a9"/>
+              <w:ind w:firstLine="0"/>
+              <w:rPr>
+                <w:lang w:eastAsia="ru-RU"/>
+              </w:rPr>
+            </w:pPr>
+            <w:r>
+              <w:t>Сервер недоступен</w:t>
+            </w:r>
+          </w:p>
+        </w:tc>
+        <w:tc>
+          <w:tcPr>
+            <w:tcW w:w="4673" w:type="dxa"/>
+          </w:tcPr>
+          <w:p>
+            <w:pPr>
+              <w:pStyle w:val="a9"/>
+              <w:ind w:firstLine="0"/>
+              <w:rPr>
+                <w:lang w:eastAsia="ru-RU"/>
+              </w:rPr>
+            </w:pPr>
+            <w:r>
+              <w:t>Сообщение о временном сбое; инвентарь, блокнот и мини-игры работают</w:t>
+            </w:r>
+          </w:p>
+        </w:tc>
+      </w:tr>
+      <w:tr>
+        <w:tc>
+          <w:tcPr>
+            <w:tcW w:w="4672" w:type="dxa"/>
+          </w:tcPr>
+          <w:p>
+            <w:pPr>
+              <w:pStyle w:val="a9"/>
+              <w:ind w:firstLine="0"/>
+              <w:rPr>
+                <w:lang w:eastAsia="ru-RU"/>
+              </w:rPr>
+            </w:pPr>
+            <w:r>
+              <w:t>Неверный e-</w:t>
+            </w:r>
+            <w:proofErr w:type="spellStart"/>
+            <w:r>
+              <w:t>mail</w:t>
+            </w:r>
+            <w:proofErr w:type="spellEnd"/>
+            <w:r>
+              <w:t xml:space="preserve"> или пароль</w:t>
+            </w:r>
+            <w:r>
+              <w:t xml:space="preserve"> при авторизации</w:t>
+            </w:r>
+          </w:p>
+        </w:tc>
+        <w:tc>
+          <w:tcPr>
+            <w:tcW w:w="4673" w:type="dxa"/>
+          </w:tcPr>
+          <w:p>
+            <w:pPr>
+              <w:pStyle w:val="a9"/>
+              <w:ind w:firstLine="0"/>
+              <w:rPr>
+                <w:lang w:eastAsia="ru-RU"/>
+              </w:rPr>
+            </w:pPr>
+            <w:r>
+              <w:t>Понятное сообщение, e-</w:t>
+            </w:r>
+            <w:proofErr w:type="spellStart"/>
+            <w:r>
+              <w:t>mail</w:t>
+            </w:r>
+            <w:proofErr w:type="spellEnd"/>
+            <w:r>
+              <w:t xml:space="preserve"> в поле остаётся</w:t>
+            </w:r>
+          </w:p>
+        </w:tc>
+      </w:tr>
+      <w:tr>
+        <w:tc>
+          <w:tcPr>
+            <w:tcW w:w="4672" w:type="dxa"/>
+          </w:tcPr>
+          <w:p>
+            <w:pPr>
+              <w:pStyle w:val="a9"/>
+              <w:ind w:firstLine="0"/>
+              <w:rPr>
+                <w:lang w:eastAsia="ru-RU"/>
+              </w:rPr>
+            </w:pPr>
+            <w:r>
+              <w:t>Таймаут или ошибка ИИ</w:t>
+            </w:r>
+          </w:p>
+        </w:tc>
+        <w:tc>
+          <w:tcPr>
+            <w:tcW w:w="4673" w:type="dxa"/>
+          </w:tcPr>
+          <w:p>
+            <w:pPr>
+              <w:pStyle w:val="a9"/>
+              <w:ind w:firstLine="0"/>
+              <w:rPr>
+                <w:lang w:eastAsia="ru-RU"/>
+              </w:rPr>
+            </w:pPr>
+            <w:r>
+              <w:t>Появляется кнопка «Повторить», а так же выводиться сообщение с пояснением причины недоступности</w:t>
+            </w:r>
+          </w:p>
+        </w:tc>
+      </w:tr>
+      <w:tr>
+        <w:tc>
+          <w:tcPr>
+            <w:tcW w:w="4672" w:type="dxa"/>
+          </w:tcPr>
+          <w:p>
+            <w:pPr>
+              <w:pStyle w:val="a9"/>
+              <w:ind w:firstLine="0"/>
+              <w:rPr>
+                <w:lang w:eastAsia="ru-RU"/>
+              </w:rPr>
+            </w:pPr>
+            <w:r>
+              <w:lastRenderedPageBreak/>
+              <w:t>Исчерпан суточный лимит ИИ</w:t>
+            </w:r>
+          </w:p>
+        </w:tc>
+        <w:tc>
+          <w:tcPr>
+            <w:tcW w:w="4673" w:type="dxa"/>
+          </w:tcPr>
+          <w:p>
+            <w:pPr>
+              <w:pStyle w:val="a9"/>
+              <w:ind w:firstLine="0"/>
+              <w:rPr>
+                <w:lang w:eastAsia="ru-RU"/>
+              </w:rPr>
+            </w:pPr>
+            <w:r>
+              <w:t>Сообщение с временем сброса</w:t>
+            </w:r>
+            <w:r>
+              <w:t xml:space="preserve"> лимита</w:t>
+            </w:r>
+            <w:r>
+              <w:t>; остальные механики работают</w:t>
+            </w:r>
+          </w:p>
+        </w:tc>
+      </w:tr>
+      <w:tr>
+        <w:tc>
+          <w:tcPr>
+            <w:tcW w:w="4672" w:type="dxa"/>
+          </w:tcPr>
+          <w:p>
+            <w:pPr>
+              <w:pStyle w:val="a9"/>
+              <w:ind w:firstLine="0"/>
+              <w:rPr>
+                <w:lang w:eastAsia="ru-RU"/>
+              </w:rPr>
+            </w:pPr>
+            <w:r>
+              <w:t>Нет разрешения на камеру</w:t>
+            </w:r>
+          </w:p>
+        </w:tc>
+        <w:tc>
+          <w:tcPr>
+            <w:tcW w:w="4673" w:type="dxa"/>
+          </w:tcPr>
+          <w:p>
+            <w:pPr>
+              <w:pStyle w:val="a9"/>
+              <w:ind w:firstLine="0"/>
+              <w:rPr>
+                <w:lang w:eastAsia="ru-RU"/>
+              </w:rPr>
+            </w:pPr>
+            <w:r>
+              <w:t>Доступны все мини игры, где не используется камера телефона (возможность изменить это позднее)</w:t>
+            </w:r>
+          </w:p>
+        </w:tc>
+      </w:tr>
+    </w:tbl>
+    <w:p>
+      <w:pPr>
+        <w:pStyle w:val="a9"/>
+        <w:rPr>
+          <w:lang w:eastAsia="ru-RU"/>
+        </w:rPr>
+      </w:pPr>
+    </w:p>
+    <w:p>
+      <w:pPr>
+        <w:pStyle w:val="3"/>
+        <w:numPr>
+          <w:ilvl w:val="2"/>
+          <w:numId w:val="30"/>
+        </w:numPr>
+        <w:ind w:left="0" w:firstLine="709"/>
+        <w:rPr>
+          <w:lang w:eastAsia="ru-RU"/>
+        </w:rPr>
+      </w:pPr>
+      <w:r>
+        <w:rPr>
+          <w:lang w:eastAsia="ru-RU"/>
+        </w:rPr>
+        <w:t>Требования к работе без интернета</w:t>
+      </w:r>
+    </w:p>
+    <w:p>
+      <w:pPr>
+        <w:pStyle w:val="a9"/>
+        <w:rPr>
+          <w:lang w:eastAsia="ru-RU"/>
+        </w:rPr>
+      </w:pPr>
+      <w:r>
+        <w:rPr>
+          <w:lang w:eastAsia="ru-RU"/>
+        </w:rPr>
+        <w:t>Так как проект будет реализован</w:t>
+      </w:r>
+      <w:r>
+        <w:rPr>
+          <w:lang w:eastAsia="ru-RU"/>
+        </w:rPr>
+        <w:t xml:space="preserve"> в виде мобильного приложения, были выявлены требования к работе в офлайн режиме:</w:t>
+      </w:r>
+    </w:p>
+    <w:p>
+      <w:pPr>
+        <w:pStyle w:val="a9"/>
+        <w:numPr>
+          <w:ilvl w:val="0"/>
+          <w:numId w:val="34"/>
+        </w:numPr>
+        <w:ind w:left="0" w:firstLine="709"/>
+        <w:rPr>
+          <w:lang w:eastAsia="ru-RU"/>
+        </w:rPr>
+      </w:pPr>
+      <w:r>
+        <w:rPr>
+          <w:lang w:eastAsia="ru-RU"/>
+        </w:rPr>
+        <w:t>Скачивание дела. При первом открытии дела приложение сохраняет на устройство его описание, персонажей, предметы, улики, сцены, образцы отпечатков и условия головоломок. Дальше дело открывается без интернета.</w:t>
+      </w:r>
+    </w:p>
+    <w:p>
+      <w:pPr>
+        <w:pStyle w:val="a9"/>
+        <w:numPr>
+          <w:ilvl w:val="0"/>
+          <w:numId w:val="34"/>
+        </w:numPr>
+        <w:ind w:left="0" w:firstLine="709"/>
+        <w:rPr>
+          <w:lang w:eastAsia="ru-RU"/>
+        </w:rPr>
+      </w:pPr>
+      <w:r>
+        <w:rPr>
+          <w:lang w:eastAsia="ru-RU"/>
+        </w:rPr>
+        <w:t>Любое действие игрока (найденная улика, решённая головоломка, заметка) сразу записывается на устройство, а не только на сервер. Закрытие приложения или потеря сети не приводят к потере прогресса.</w:t>
+      </w:r>
+    </w:p>
+    <w:p>
+      <w:pPr>
+        <w:pStyle w:val="a9"/>
+        <w:numPr>
+          <w:ilvl w:val="0"/>
+          <w:numId w:val="34"/>
+        </w:numPr>
+        <w:ind w:left="0" w:firstLine="709"/>
+        <w:rPr>
+          <w:lang w:eastAsia="ru-RU"/>
+        </w:rPr>
+      </w:pPr>
+      <w:r>
+        <w:rPr>
+          <w:lang w:eastAsia="ru-RU"/>
+        </w:rPr>
+        <w:t>Изменения, сделанные без сети, помещаются в очередь и отправляются автоматически, когда связь появляется. Если одна и та же запись изменена на двух устройствах, побеждает изменение с более поздним временем.</w:t>
+      </w:r>
+    </w:p>
+    <w:p>
+      <w:pPr>
+        <w:pStyle w:val="a9"/>
+        <w:numPr>
+          <w:ilvl w:val="0"/>
+          <w:numId w:val="34"/>
+        </w:numPr>
+        <w:ind w:left="0" w:firstLine="709"/>
+        <w:rPr>
+          <w:lang w:eastAsia="ru-RU"/>
+        </w:rPr>
+      </w:pPr>
+      <w:r>
+        <w:rPr>
+          <w:lang w:eastAsia="ru-RU"/>
+        </w:rPr>
+        <w:t xml:space="preserve">Фоновая загрузка фото. Фото улик, снятые без сети, сохраняются на устройстве и загружаются в облако позже. </w:t>
+      </w:r>
+    </w:p>
+    <w:p>
+      <w:pPr>
+        <w:pStyle w:val="a9"/>
+        <w:numPr>
+          <w:ilvl w:val="0"/>
+          <w:numId w:val="34"/>
+        </w:numPr>
+        <w:ind w:left="0" w:firstLine="709"/>
+        <w:rPr>
+          <w:lang w:eastAsia="ru-RU"/>
+        </w:rPr>
+      </w:pPr>
+      <w:r>
+        <w:rPr>
+          <w:lang w:eastAsia="ru-RU"/>
+        </w:rPr>
+        <w:t>Понятная индикация. Если сети нет, в приложении виден</w:t>
+      </w:r>
+      <w:r>
+        <w:rPr>
+          <w:lang w:eastAsia="ru-RU"/>
+        </w:rPr>
+        <w:t>о</w:t>
+      </w:r>
+      <w:r>
+        <w:rPr>
+          <w:lang w:eastAsia="ru-RU"/>
+        </w:rPr>
+        <w:t xml:space="preserve"> </w:t>
+      </w:r>
+      <w:r>
+        <w:rPr>
+          <w:lang w:eastAsia="ru-RU"/>
+        </w:rPr>
+        <w:t>сообщение</w:t>
+      </w:r>
+      <w:r>
+        <w:rPr>
+          <w:lang w:eastAsia="ru-RU"/>
+        </w:rPr>
+        <w:t xml:space="preserve"> «Нет подключения». Недоступные функции помечены, а доступные работают как обычно.</w:t>
+      </w:r>
+    </w:p>
+    <w:p>
+      <w:pPr>
+        <w:pStyle w:val="a9"/>
+        <w:numPr>
+          <w:ilvl w:val="0"/>
+          <w:numId w:val="34"/>
+        </w:numPr>
+        <w:ind w:left="0" w:firstLine="709"/>
+        <w:rPr>
+          <w:lang w:eastAsia="ru-RU"/>
+        </w:rPr>
+      </w:pPr>
+      <w:r>
+        <w:rPr>
+          <w:lang w:eastAsia="ru-RU"/>
+        </w:rPr>
+        <w:t>Если сеть пропала во время диалога, введённая реплика не теряется. Игрок видит сообщение «Не отправлено» и кнопку «Повторить».</w:t>
+      </w:r>
+    </w:p>
+    <w:p>
+      <w:pPr>
+        <w:pStyle w:val="a9"/>
+        <w:numPr>
+          <w:ilvl w:val="0"/>
+          <w:numId w:val="34"/>
+        </w:numPr>
+        <w:ind w:left="0" w:firstLine="709"/>
+        <w:rPr>
+          <w:lang w:eastAsia="ru-RU"/>
+        </w:rPr>
+      </w:pPr>
+      <w:r>
+        <w:rPr>
+          <w:lang w:eastAsia="ru-RU"/>
+        </w:rPr>
+        <w:lastRenderedPageBreak/>
+        <w:t>Если сеть пропала во время игры, приложение не закрывается и не выдаёт ошибку, а продолжает работу в офлайн-режиме.</w:t>
+      </w:r>
+    </w:p>
+    <w:p>
+      <w:pPr>
+        <w:pStyle w:val="a9"/>
+        <w:numPr>
+          <w:ilvl w:val="0"/>
+          <w:numId w:val="34"/>
+        </w:numPr>
+        <w:ind w:left="0" w:firstLine="709"/>
+        <w:rPr>
+          <w:lang w:eastAsia="ru-RU"/>
+        </w:rPr>
+      </w:pPr>
+      <w:r>
+        <w:rPr>
+          <w:lang w:eastAsia="ru-RU"/>
+        </w:rPr>
+        <w:t>Когда сеть появляется, приложение само запускает синхронизацию и загрузку фото, и игроку не нужно ничего нажимать.</w:t>
+      </w:r>
+    </w:p>
+    <w:p>
+      <w:pPr>
+        <w:pStyle w:val="3"/>
+        <w:numPr>
+          <w:ilvl w:val="2"/>
+          <w:numId w:val="30"/>
+        </w:numPr>
+        <w:ind w:left="0" w:firstLine="709"/>
+        <w:rPr>
+          <w:lang w:eastAsia="ru-RU"/>
+        </w:rPr>
+      </w:pPr>
+      <w:r>
+        <w:rPr>
+          <w:lang w:eastAsia="ru-RU"/>
+        </w:rPr>
+        <w:t xml:space="preserve">Приоритизация </w:t>
+      </w:r>
+      <w:proofErr w:type="spellStart"/>
+      <w:r>
+        <w:rPr>
+          <w:lang w:eastAsia="ru-RU"/>
+        </w:rPr>
+        <w:t>MoSCoW</w:t>
+      </w:r>
+      <w:proofErr w:type="spellEnd"/>
+    </w:p>
+    <w:p>
+      <w:pPr>
+        <w:pStyle w:val="a9"/>
+        <w:rPr>
+          <w:lang w:eastAsia="ru-RU"/>
+        </w:rPr>
+      </w:pPr>
+      <w:r>
+        <w:rPr>
+          <w:lang w:eastAsia="ru-RU"/>
+        </w:rPr>
+        <w:t xml:space="preserve">Требования сгруппированы по методу </w:t>
+      </w:r>
+      <w:proofErr w:type="spellStart"/>
+      <w:r>
+        <w:rPr>
+          <w:lang w:eastAsia="ru-RU"/>
+        </w:rPr>
+        <w:t>MoSCoW</w:t>
+      </w:r>
+      <w:proofErr w:type="spellEnd"/>
+      <w:r>
+        <w:rPr>
+          <w:lang w:eastAsia="ru-RU"/>
+        </w:rPr>
+        <w:t>. Он помогает определить, что должно быть сделано обязательно, а чем можно пожертвовать при нехватке времени.</w:t>
+      </w:r>
+    </w:p>
+    <w:p>
+      <w:pPr>
+        <w:pStyle w:val="a9"/>
+        <w:rPr>
+          <w:lang w:eastAsia="ru-RU"/>
+        </w:rPr>
+      </w:pPr>
+      <w:proofErr w:type="spellStart"/>
+      <w:r>
+        <w:rPr>
+          <w:lang w:eastAsia="ru-RU"/>
+        </w:rPr>
+        <w:t>Must</w:t>
+      </w:r>
+      <w:proofErr w:type="spellEnd"/>
+      <w:r>
+        <w:rPr>
+          <w:lang w:eastAsia="ru-RU"/>
+        </w:rPr>
+        <w:t xml:space="preserve"> (обязательно) </w:t>
+      </w:r>
+      <w:r>
+        <w:rPr>
+          <w:lang w:eastAsia="ru-RU"/>
+        </w:rPr>
+        <w:t xml:space="preserve">- 15 основных требований функциональных, нефункциональных, требования к ошибкам и отсутствию сети. </w:t>
+      </w:r>
+      <w:r>
+        <w:rPr>
+          <w:lang w:eastAsia="ru-RU"/>
+        </w:rPr>
+        <w:t>Бе</w:t>
+      </w:r>
+      <w:bookmarkStart w:id="10" w:name="_GoBack"/>
+      <w:bookmarkEnd w:id="10"/>
+      <w:r>
+        <w:rPr>
+          <w:lang w:eastAsia="ru-RU"/>
+        </w:rPr>
+        <w:t>з них приложени</w:t>
+      </w:r>
+      <w:r>
+        <w:rPr>
+          <w:lang w:eastAsia="ru-RU"/>
+        </w:rPr>
+        <w:t>е не выполняет своё назначение:</w:t>
+      </w:r>
+    </w:p>
+    <w:p>
+      <w:pPr>
+        <w:pStyle w:val="a9"/>
+        <w:rPr>
+          <w:lang w:eastAsia="ru-RU"/>
+        </w:rPr>
+      </w:pPr>
+      <w:proofErr w:type="spellStart"/>
+      <w:r>
+        <w:rPr>
+          <w:lang w:eastAsia="ru-RU"/>
+        </w:rPr>
+        <w:t>Should</w:t>
+      </w:r>
+      <w:proofErr w:type="spellEnd"/>
+      <w:r>
+        <w:rPr>
+          <w:lang w:eastAsia="ru-RU"/>
+        </w:rPr>
+        <w:t xml:space="preserve"> (желательно) </w:t>
+      </w:r>
+      <w:r>
+        <w:rPr>
+          <w:lang w:eastAsia="ru-RU"/>
+        </w:rPr>
+        <w:t>-</w:t>
+      </w:r>
+      <w:r>
+        <w:rPr>
+          <w:lang w:eastAsia="ru-RU"/>
+        </w:rPr>
+        <w:t xml:space="preserve"> важны, но без них игра работает. Реализуются</w:t>
+      </w:r>
+      <w:r>
+        <w:rPr>
+          <w:lang w:eastAsia="ru-RU"/>
+        </w:rPr>
+        <w:t xml:space="preserve"> после обязательных требований:</w:t>
+      </w:r>
+    </w:p>
+    <w:p>
+      <w:pPr>
+        <w:pStyle w:val="a9"/>
+        <w:numPr>
+          <w:ilvl w:val="0"/>
+          <w:numId w:val="35"/>
+        </w:numPr>
+        <w:ind w:left="0" w:firstLine="709"/>
+        <w:rPr>
+          <w:lang w:eastAsia="ru-RU"/>
+        </w:rPr>
+      </w:pPr>
+      <w:r>
+        <w:rPr>
+          <w:lang w:eastAsia="ru-RU"/>
+        </w:rPr>
+        <w:t>сопоставление отпечатков</w:t>
+      </w:r>
+    </w:p>
+    <w:p>
+      <w:pPr>
+        <w:pStyle w:val="a9"/>
+        <w:numPr>
+          <w:ilvl w:val="0"/>
+          <w:numId w:val="35"/>
+        </w:numPr>
+        <w:ind w:left="0" w:firstLine="709"/>
+        <w:rPr>
+          <w:lang w:eastAsia="ru-RU"/>
+        </w:rPr>
+      </w:pPr>
+      <w:r>
+        <w:rPr>
+          <w:lang w:eastAsia="ru-RU"/>
+        </w:rPr>
+        <w:t xml:space="preserve">осмотр предмета с </w:t>
+      </w:r>
+      <w:r>
+        <w:rPr>
+          <w:lang w:eastAsia="ru-RU"/>
+        </w:rPr>
+        <w:t>увеличением и скрытыми деталями</w:t>
+      </w:r>
+    </w:p>
+    <w:p>
+      <w:pPr>
+        <w:pStyle w:val="a9"/>
+        <w:numPr>
+          <w:ilvl w:val="0"/>
+          <w:numId w:val="35"/>
+        </w:numPr>
+        <w:ind w:left="0" w:firstLine="709"/>
+        <w:rPr>
+          <w:lang w:eastAsia="ru-RU"/>
+        </w:rPr>
+      </w:pPr>
+      <w:r>
+        <w:rPr>
+          <w:lang w:eastAsia="ru-RU"/>
+        </w:rPr>
+        <w:t xml:space="preserve">система подсказок </w:t>
+      </w:r>
+    </w:p>
+    <w:p>
+      <w:pPr>
+        <w:pStyle w:val="a9"/>
+        <w:numPr>
+          <w:ilvl w:val="0"/>
+          <w:numId w:val="35"/>
+        </w:numPr>
+        <w:ind w:left="0" w:firstLine="709"/>
+        <w:rPr>
+          <w:lang w:eastAsia="ru-RU"/>
+        </w:rPr>
+      </w:pPr>
+      <w:r>
+        <w:rPr>
+          <w:lang w:eastAsia="ru-RU"/>
+        </w:rPr>
+        <w:t>режим поиска улик без камеры и датчиков, для устройств без ну</w:t>
+      </w:r>
+      <w:r>
+        <w:rPr>
+          <w:lang w:eastAsia="ru-RU"/>
+        </w:rPr>
+        <w:t>жных датчиков и для доступности</w:t>
+      </w:r>
+    </w:p>
+    <w:p>
+      <w:pPr>
+        <w:pStyle w:val="a9"/>
+        <w:numPr>
+          <w:ilvl w:val="0"/>
+          <w:numId w:val="35"/>
+        </w:numPr>
+        <w:ind w:left="0" w:firstLine="709"/>
+        <w:rPr>
+          <w:lang w:eastAsia="ru-RU"/>
+        </w:rPr>
+      </w:pPr>
+      <w:r>
+        <w:rPr>
+          <w:lang w:eastAsia="ru-RU"/>
+        </w:rPr>
+        <w:t>восстановление пароля по e-</w:t>
+      </w:r>
+      <w:proofErr w:type="spellStart"/>
+      <w:r>
+        <w:rPr>
+          <w:lang w:eastAsia="ru-RU"/>
+        </w:rPr>
+        <w:t>mail</w:t>
+      </w:r>
+      <w:proofErr w:type="spellEnd"/>
+      <w:r>
+        <w:rPr>
+          <w:lang w:eastAsia="ru-RU"/>
+        </w:rPr>
+        <w:t>.</w:t>
+      </w:r>
+    </w:p>
+    <w:p>
+      <w:pPr>
+        <w:pStyle w:val="a9"/>
+        <w:rPr>
+          <w:lang w:eastAsia="ru-RU"/>
+        </w:rPr>
+      </w:pPr>
+      <w:proofErr w:type="spellStart"/>
+      <w:r>
+        <w:rPr>
+          <w:lang w:eastAsia="ru-RU"/>
+        </w:rPr>
+        <w:t>Could</w:t>
+      </w:r>
+      <w:proofErr w:type="spellEnd"/>
+      <w:r>
+        <w:rPr>
+          <w:lang w:eastAsia="ru-RU"/>
+        </w:rPr>
+        <w:t xml:space="preserve"> (если останется время)</w:t>
+      </w:r>
+      <w:r>
+        <w:rPr>
+          <w:lang w:eastAsia="ru-RU"/>
+        </w:rPr>
+        <w:t>:</w:t>
+      </w:r>
+    </w:p>
+    <w:p>
+      <w:pPr>
+        <w:pStyle w:val="a9"/>
+        <w:numPr>
+          <w:ilvl w:val="0"/>
+          <w:numId w:val="35"/>
+        </w:numPr>
+        <w:ind w:left="0" w:firstLine="709"/>
+        <w:rPr>
+          <w:lang w:eastAsia="ru-RU"/>
+        </w:rPr>
+      </w:pPr>
+      <w:r>
+        <w:rPr>
+          <w:lang w:eastAsia="ru-RU"/>
+        </w:rPr>
+        <w:t>профиль и статистика игрока (количество пр</w:t>
+      </w:r>
+      <w:r>
+        <w:rPr>
+          <w:lang w:eastAsia="ru-RU"/>
+        </w:rPr>
+        <w:t>ойденных дел, время, подсказки)</w:t>
+      </w:r>
+    </w:p>
+    <w:p>
+      <w:pPr>
+        <w:pStyle w:val="a9"/>
+        <w:numPr>
+          <w:ilvl w:val="0"/>
+          <w:numId w:val="35"/>
+        </w:numPr>
+        <w:ind w:left="0" w:firstLine="709"/>
+        <w:rPr>
+          <w:lang w:eastAsia="ru-RU"/>
+        </w:rPr>
+      </w:pPr>
+      <w:r>
+        <w:rPr>
+          <w:lang w:eastAsia="ru-RU"/>
+        </w:rPr>
+        <w:t>озвучка реплик персонажей встро</w:t>
+      </w:r>
+      <w:r>
+        <w:rPr>
+          <w:lang w:eastAsia="ru-RU"/>
+        </w:rPr>
+        <w:t xml:space="preserve">енным синтезатором речи </w:t>
+      </w:r>
+      <w:proofErr w:type="spellStart"/>
+      <w:r>
+        <w:rPr>
+          <w:lang w:eastAsia="ru-RU"/>
+        </w:rPr>
+        <w:t>Android</w:t>
+      </w:r>
+      <w:proofErr w:type="spellEnd"/>
+    </w:p>
+    <w:p>
+      <w:pPr>
+        <w:pStyle w:val="a9"/>
+        <w:rPr>
+          <w:lang w:eastAsia="ru-RU"/>
+        </w:rPr>
+      </w:pPr>
+      <w:proofErr w:type="spellStart"/>
+      <w:r>
+        <w:rPr>
+          <w:lang w:eastAsia="ru-RU"/>
+        </w:rPr>
+        <w:t>Won’t</w:t>
+      </w:r>
+      <w:proofErr w:type="spellEnd"/>
+      <w:r>
+        <w:rPr>
+          <w:lang w:eastAsia="ru-RU"/>
+        </w:rPr>
+        <w:t xml:space="preserve"> (в этой версии не </w:t>
+      </w:r>
+      <w:r>
+        <w:rPr>
+          <w:lang w:eastAsia="ru-RU"/>
+        </w:rPr>
+        <w:t>делаем) — сознательно отложено:</w:t>
+      </w:r>
+    </w:p>
+    <w:p>
+      <w:pPr>
+        <w:pStyle w:val="a9"/>
+        <w:numPr>
+          <w:ilvl w:val="0"/>
+          <w:numId w:val="36"/>
+        </w:numPr>
+        <w:ind w:left="0" w:firstLine="709"/>
+        <w:rPr>
+          <w:lang w:eastAsia="ru-RU"/>
+        </w:rPr>
+      </w:pPr>
+      <w:proofErr w:type="spellStart"/>
+      <w:r>
+        <w:rPr>
+          <w:lang w:eastAsia="ru-RU"/>
+        </w:rPr>
+        <w:t>мультип</w:t>
+      </w:r>
+      <w:r>
+        <w:rPr>
+          <w:lang w:eastAsia="ru-RU"/>
+        </w:rPr>
+        <w:t>леер</w:t>
+      </w:r>
+      <w:proofErr w:type="spellEnd"/>
+      <w:r>
+        <w:rPr>
+          <w:lang w:eastAsia="ru-RU"/>
+        </w:rPr>
+        <w:t xml:space="preserve"> и совместное расследование</w:t>
+      </w:r>
+    </w:p>
+    <w:p>
+      <w:pPr>
+        <w:pStyle w:val="a9"/>
+        <w:numPr>
+          <w:ilvl w:val="0"/>
+          <w:numId w:val="36"/>
+        </w:numPr>
+        <w:ind w:left="0" w:firstLine="709"/>
+        <w:rPr>
+          <w:lang w:eastAsia="ru-RU"/>
+        </w:rPr>
+      </w:pPr>
+      <w:r>
+        <w:rPr>
+          <w:lang w:eastAsia="ru-RU"/>
+        </w:rPr>
+        <w:t>режим мафии</w:t>
+      </w:r>
+    </w:p>
+    <w:p>
+      <w:pPr>
+        <w:pStyle w:val="a9"/>
+        <w:numPr>
+          <w:ilvl w:val="0"/>
+          <w:numId w:val="36"/>
+        </w:numPr>
+        <w:ind w:left="0" w:firstLine="709"/>
+        <w:rPr>
+          <w:lang w:eastAsia="ru-RU"/>
+        </w:rPr>
+      </w:pPr>
+      <w:proofErr w:type="spellStart"/>
+      <w:r>
+        <w:rPr>
+          <w:lang w:eastAsia="ru-RU"/>
+        </w:rPr>
+        <w:t>push</w:t>
+      </w:r>
+      <w:proofErr w:type="spellEnd"/>
+      <w:r>
+        <w:rPr>
+          <w:lang w:eastAsia="ru-RU"/>
+        </w:rPr>
+        <w:t>-уведомления</w:t>
+      </w:r>
+    </w:p>
+    <w:p>
+      <w:pPr>
+        <w:pStyle w:val="a9"/>
+        <w:numPr>
+          <w:ilvl w:val="0"/>
+          <w:numId w:val="36"/>
+        </w:numPr>
+        <w:ind w:left="0" w:firstLine="709"/>
+        <w:rPr>
+          <w:lang w:eastAsia="ru-RU"/>
+        </w:rPr>
+      </w:pPr>
+      <w:r>
+        <w:rPr>
+          <w:lang w:eastAsia="ru-RU"/>
+        </w:rPr>
+        <w:t>генерация сюжета дела языковой моделью прямо в игре</w:t>
+      </w:r>
+    </w:p>
+    <w:p>
+      <w:pPr>
+        <w:pStyle w:val="a9"/>
+        <w:rPr>
+          <w:lang w:eastAsia="ru-RU"/>
+        </w:rPr>
+      </w:pPr>
     </w:p>
     <w:p>
       <w:pPr>
@@ -4734,6 +6474,119 @@
     </w:lvl>
   </w:abstractNum>
   <w:abstractNum w:abstractNumId="5" w15:restartNumberingAfterBreak="0">
+    <w:nsid w:val="131F4DD3"/>
+    <w:multiLevelType w:val="hybridMultilevel"/>
+    <w:tmpl w:val="9E582B84"/>
+    <w:lvl w:ilvl="0" w:tplc="7F6028E6">
+      <w:start w:val="1"/>
+      <w:numFmt w:val="bullet"/>
+      <w:lvlText w:val=""/>
+      <w:lvlJc w:val="left"/>
+      <w:pPr>
+        <w:ind w:left="1429" w:hanging="360"/>
+      </w:pPr>
+      <w:rPr>
+        <w:rFonts w:ascii="Symbol" w:hAnsi="Symbol" w:hint="default"/>
+      </w:rPr>
+    </w:lvl>
+    <w:lvl w:ilvl="1" w:tplc="04190003" w:tentative="1">
+      <w:start w:val="1"/>
+      <w:numFmt w:val="bullet"/>
+      <w:lvlText w:val="o"/>
+      <w:lvlJc w:val="left"/>
+      <w:pPr>
+        <w:ind w:left="2149" w:hanging="360"/>
+      </w:pPr>
+      <w:rPr>
+        <w:rFonts w:ascii="Courier New" w:hAnsi="Courier New" w:cs="Courier New" w:hint="default"/>
+      </w:rPr>
+    </w:lvl>
+    <w:lvl w:ilvl="2" w:tplc="04190005" w:tentative="1">
+      <w:start w:val="1"/>
+      <w:numFmt w:val="bullet"/>
+      <w:lvlText w:val=""/>
+      <w:lvlJc w:val="left"/>
+      <w:pPr>
+        <w:ind w:left="2869" w:hanging="360"/>
+      </w:pPr>
+      <w:rPr>
+        <w:rFonts w:ascii="Wingdings" w:hAnsi="Wingdings" w:hint="default"/>
+      </w:rPr>
+    </w:lvl>
+    <w:lvl w:ilvl="3" w:tplc="04190001" w:tentative="1">
+      <w:start w:val="1"/>
+      <w:numFmt w:val="bullet"/>
+      <w:lvlText w:val=""/>
+      <w:lvlJc w:val="left"/>
+      <w:pPr>
+        <w:ind w:left="3589" w:hanging="360"/>
+      </w:pPr>
+      <w:rPr>
+        <w:rFonts w:ascii="Symbol" w:hAnsi="Symbol" w:hint="default"/>
+      </w:rPr>
+    </w:lvl>
+    <w:lvl w:ilvl="4" w:tplc="04190003" w:tentative="1">
+      <w:start w:val="1"/>
+      <w:numFmt w:val="bullet"/>
+      <w:lvlText w:val="o"/>
+      <w:lvlJc w:val="left"/>
+      <w:pPr>
+        <w:ind w:left="4309" w:hanging="360"/>
+      </w:pPr>
+      <w:rPr>
+        <w:rFonts w:ascii="Courier New" w:hAnsi="Courier New" w:cs="Courier New" w:hint="default"/>
+      </w:rPr>
+    </w:lvl>
+    <w:lvl w:ilvl="5" w:tplc="04190005" w:tentative="1">
+      <w:start w:val="1"/>
+      <w:numFmt w:val="bullet"/>
+      <w:lvlText w:val=""/>
+      <w:lvlJc w:val="left"/>
+      <w:pPr>
+        <w:ind w:left="5029" w:hanging="360"/>
+      </w:pPr>
+      <w:rPr>
+        <w:rFonts w:ascii="Wingdings" w:hAnsi="Wingdings" w:hint="default"/>
+      </w:rPr>
+    </w:lvl>
+    <w:lvl w:ilvl="6" w:tplc="04190001" w:tentative="1">
+      <w:start w:val="1"/>
+      <w:numFmt w:val="bullet"/>
+      <w:lvlText w:val=""/>
+      <w:lvlJc w:val="left"/>
+      <w:pPr>
+        <w:ind w:left="5749" w:hanging="360"/>
+      </w:pPr>
+      <w:rPr>
+        <w:rFonts w:ascii="Symbol" w:hAnsi="Symbol" w:hint="default"/>
+      </w:rPr>
+    </w:lvl>
+    <w:lvl w:ilvl="7" w:tplc="04190003" w:tentative="1">
+      <w:start w:val="1"/>
+      <w:numFmt w:val="bullet"/>
+      <w:lvlText w:val="o"/>
+      <w:lvlJc w:val="left"/>
+      <w:pPr>
+        <w:ind w:left="6469" w:hanging="360"/>
+      </w:pPr>
+      <w:rPr>
+        <w:rFonts w:ascii="Courier New" w:hAnsi="Courier New" w:cs="Courier New" w:hint="default"/>
+      </w:rPr>
+    </w:lvl>
+    <w:lvl w:ilvl="8" w:tplc="04190005" w:tentative="1">
+      <w:start w:val="1"/>
+      <w:numFmt w:val="bullet"/>
+      <w:lvlText w:val=""/>
+      <w:lvlJc w:val="left"/>
+      <w:pPr>
+        <w:ind w:left="7189" w:hanging="360"/>
+      </w:pPr>
+      <w:rPr>
+        <w:rFonts w:ascii="Wingdings" w:hAnsi="Wingdings" w:hint="default"/>
+      </w:rPr>
+    </w:lvl>
+  </w:abstractNum>
+  <w:abstractNum w:abstractNumId="6" w15:restartNumberingAfterBreak="0">
     <w:nsid w:val="16DF2642"/>
     <w:multiLevelType w:val="hybridMultilevel"/>
     <w:tmpl w:val="89C84962"/>
@@ -4846,7 +6699,7 @@
       </w:rPr>
     </w:lvl>
   </w:abstractNum>
-  <w:abstractNum w:abstractNumId="6" w15:restartNumberingAfterBreak="0">
+  <w:abstractNum w:abstractNumId="7" w15:restartNumberingAfterBreak="0">
     <w:nsid w:val="17AA1874"/>
     <w:multiLevelType w:val="hybridMultilevel"/>
     <w:tmpl w:val="5366FA26"/>
@@ -4959,7 +6812,7 @@
       </w:rPr>
     </w:lvl>
   </w:abstractNum>
-  <w:abstractNum w:abstractNumId="7" w15:restartNumberingAfterBreak="0">
+  <w:abstractNum w:abstractNumId="8" w15:restartNumberingAfterBreak="0">
     <w:nsid w:val="1BC46186"/>
     <w:multiLevelType w:val="hybridMultilevel"/>
     <w:tmpl w:val="567C6E24"/>
@@ -5072,7 +6925,7 @@
       </w:rPr>
     </w:lvl>
   </w:abstractNum>
-  <w:abstractNum w:abstractNumId="8" w15:restartNumberingAfterBreak="0">
+  <w:abstractNum w:abstractNumId="9" w15:restartNumberingAfterBreak="0">
     <w:nsid w:val="1F5703E2"/>
     <w:multiLevelType w:val="hybridMultilevel"/>
     <w:tmpl w:val="8A14B6F0"/>
@@ -5161,7 +7014,7 @@
       </w:pPr>
     </w:lvl>
   </w:abstractNum>
-  <w:abstractNum w:abstractNumId="9" w15:restartNumberingAfterBreak="0">
+  <w:abstractNum w:abstractNumId="10" w15:restartNumberingAfterBreak="0">
     <w:nsid w:val="244B1859"/>
     <w:multiLevelType w:val="hybridMultilevel"/>
     <w:tmpl w:val="5120B764"/>
@@ -5274,7 +7127,7 @@
       </w:rPr>
     </w:lvl>
   </w:abstractNum>
-  <w:abstractNum w:abstractNumId="10" w15:restartNumberingAfterBreak="0">
+  <w:abstractNum w:abstractNumId="11" w15:restartNumberingAfterBreak="0">
     <w:nsid w:val="24825868"/>
     <w:multiLevelType w:val="hybridMultilevel"/>
     <w:tmpl w:val="90F8E2D4"/>
@@ -5387,7 +7240,7 @@
       </w:rPr>
     </w:lvl>
   </w:abstractNum>
-  <w:abstractNum w:abstractNumId="11" w15:restartNumberingAfterBreak="0">
+  <w:abstractNum w:abstractNumId="12" w15:restartNumberingAfterBreak="0">
     <w:nsid w:val="2BFB6CF4"/>
     <w:multiLevelType w:val="hybridMultilevel"/>
     <w:tmpl w:val="213A2ABE"/>
@@ -5500,7 +7353,7 @@
       </w:rPr>
     </w:lvl>
   </w:abstractNum>
-  <w:abstractNum w:abstractNumId="12" w15:restartNumberingAfterBreak="0">
+  <w:abstractNum w:abstractNumId="13" w15:restartNumberingAfterBreak="0">
     <w:nsid w:val="2E896BDD"/>
     <w:multiLevelType w:val="hybridMultilevel"/>
     <w:tmpl w:val="B3AA244A"/>
@@ -5589,7 +7442,7 @@
       </w:pPr>
     </w:lvl>
   </w:abstractNum>
-  <w:abstractNum w:abstractNumId="13" w15:restartNumberingAfterBreak="0">
+  <w:abstractNum w:abstractNumId="14" w15:restartNumberingAfterBreak="0">
     <w:nsid w:val="311A70D7"/>
     <w:multiLevelType w:val="hybridMultilevel"/>
     <w:tmpl w:val="2FF88FFA"/>
@@ -5702,7 +7555,7 @@
       </w:rPr>
     </w:lvl>
   </w:abstractNum>
-  <w:abstractNum w:abstractNumId="14" w15:restartNumberingAfterBreak="0">
+  <w:abstractNum w:abstractNumId="15" w15:restartNumberingAfterBreak="0">
     <w:nsid w:val="385A11DC"/>
     <w:multiLevelType w:val="hybridMultilevel"/>
     <w:tmpl w:val="85B85062"/>
@@ -5791,7 +7644,7 @@
       </w:pPr>
     </w:lvl>
   </w:abstractNum>
-  <w:abstractNum w:abstractNumId="15" w15:restartNumberingAfterBreak="0">
+  <w:abstractNum w:abstractNumId="16" w15:restartNumberingAfterBreak="0">
     <w:nsid w:val="3B4801BB"/>
     <w:multiLevelType w:val="hybridMultilevel"/>
     <w:tmpl w:val="5672B1AA"/>
@@ -5880,7 +7733,7 @@
       </w:pPr>
     </w:lvl>
   </w:abstractNum>
-  <w:abstractNum w:abstractNumId="16" w15:restartNumberingAfterBreak="0">
+  <w:abstractNum w:abstractNumId="17" w15:restartNumberingAfterBreak="0">
     <w:nsid w:val="3D57064D"/>
     <w:multiLevelType w:val="hybridMultilevel"/>
     <w:tmpl w:val="DADE03B4"/>
@@ -5993,7 +7846,7 @@
       </w:rPr>
     </w:lvl>
   </w:abstractNum>
-  <w:abstractNum w:abstractNumId="17" w15:restartNumberingAfterBreak="0">
+  <w:abstractNum w:abstractNumId="18" w15:restartNumberingAfterBreak="0">
     <w:nsid w:val="3FF1551E"/>
     <w:multiLevelType w:val="hybridMultilevel"/>
     <w:tmpl w:val="7174EA8A"/>
@@ -6106,7 +7959,7 @@
       </w:rPr>
     </w:lvl>
   </w:abstractNum>
-  <w:abstractNum w:abstractNumId="18" w15:restartNumberingAfterBreak="0">
+  <w:abstractNum w:abstractNumId="19" w15:restartNumberingAfterBreak="0">
     <w:nsid w:val="3FFF562D"/>
     <w:multiLevelType w:val="multilevel"/>
     <w:tmpl w:val="9822CC4A"/>
@@ -6219,7 +8072,7 @@
       </w:rPr>
     </w:lvl>
   </w:abstractNum>
-  <w:abstractNum w:abstractNumId="19" w15:restartNumberingAfterBreak="0">
+  <w:abstractNum w:abstractNumId="20" w15:restartNumberingAfterBreak="0">
     <w:nsid w:val="4566225B"/>
     <w:multiLevelType w:val="hybridMultilevel"/>
     <w:tmpl w:val="8C62F07A"/>
@@ -6332,7 +8185,7 @@
       </w:rPr>
     </w:lvl>
   </w:abstractNum>
-  <w:abstractNum w:abstractNumId="20" w15:restartNumberingAfterBreak="0">
+  <w:abstractNum w:abstractNumId="21" w15:restartNumberingAfterBreak="0">
     <w:nsid w:val="4BF24ABC"/>
     <w:multiLevelType w:val="hybridMultilevel"/>
     <w:tmpl w:val="D3AE741A"/>
@@ -6421,7 +8274,7 @@
       </w:pPr>
     </w:lvl>
   </w:abstractNum>
-  <w:abstractNum w:abstractNumId="21" w15:restartNumberingAfterBreak="0">
+  <w:abstractNum w:abstractNumId="22" w15:restartNumberingAfterBreak="0">
     <w:nsid w:val="4FD318BF"/>
     <w:multiLevelType w:val="hybridMultilevel"/>
     <w:tmpl w:val="1B1AF7A4"/>
@@ -6534,7 +8387,120 @@
       </w:rPr>
     </w:lvl>
   </w:abstractNum>
-  <w:abstractNum w:abstractNumId="22" w15:restartNumberingAfterBreak="0">
+  <w:abstractNum w:abstractNumId="23" w15:restartNumberingAfterBreak="0">
+    <w:nsid w:val="50517234"/>
+    <w:multiLevelType w:val="hybridMultilevel"/>
+    <w:tmpl w:val="FC921BF0"/>
+    <w:lvl w:ilvl="0" w:tplc="7F6028E6">
+      <w:start w:val="1"/>
+      <w:numFmt w:val="bullet"/>
+      <w:lvlText w:val=""/>
+      <w:lvlJc w:val="left"/>
+      <w:pPr>
+        <w:ind w:left="1429" w:hanging="360"/>
+      </w:pPr>
+      <w:rPr>
+        <w:rFonts w:ascii="Symbol" w:hAnsi="Symbol" w:hint="default"/>
+      </w:rPr>
+    </w:lvl>
+    <w:lvl w:ilvl="1" w:tplc="04190003" w:tentative="1">
+      <w:start w:val="1"/>
+      <w:numFmt w:val="bullet"/>
+      <w:lvlText w:val="o"/>
+      <w:lvlJc w:val="left"/>
+      <w:pPr>
+        <w:ind w:left="2149" w:hanging="360"/>
+      </w:pPr>
+      <w:rPr>
+        <w:rFonts w:ascii="Courier New" w:hAnsi="Courier New" w:cs="Courier New" w:hint="default"/>
+      </w:rPr>
+    </w:lvl>
+    <w:lvl w:ilvl="2" w:tplc="04190005" w:tentative="1">
+      <w:start w:val="1"/>
+      <w:numFmt w:val="bullet"/>
+      <w:lvlText w:val=""/>
+      <w:lvlJc w:val="left"/>
+      <w:pPr>
+        <w:ind w:left="2869" w:hanging="360"/>
+      </w:pPr>
+      <w:rPr>
+        <w:rFonts w:ascii="Wingdings" w:hAnsi="Wingdings" w:hint="default"/>
+      </w:rPr>
+    </w:lvl>
+    <w:lvl w:ilvl="3" w:tplc="04190001" w:tentative="1">
+      <w:start w:val="1"/>
+      <w:numFmt w:val="bullet"/>
+      <w:lvlText w:val=""/>
+      <w:lvlJc w:val="left"/>
+      <w:pPr>
+        <w:ind w:left="3589" w:hanging="360"/>
+      </w:pPr>
+      <w:rPr>
+        <w:rFonts w:ascii="Symbol" w:hAnsi="Symbol" w:hint="default"/>
+      </w:rPr>
+    </w:lvl>
+    <w:lvl w:ilvl="4" w:tplc="04190003" w:tentative="1">
+      <w:start w:val="1"/>
+      <w:numFmt w:val="bullet"/>
+      <w:lvlText w:val="o"/>
+      <w:lvlJc w:val="left"/>
+      <w:pPr>
+        <w:ind w:left="4309" w:hanging="360"/>
+      </w:pPr>
+      <w:rPr>
+        <w:rFonts w:ascii="Courier New" w:hAnsi="Courier New" w:cs="Courier New" w:hint="default"/>
+      </w:rPr>
+    </w:lvl>
+    <w:lvl w:ilvl="5" w:tplc="04190005" w:tentative="1">
+      <w:start w:val="1"/>
+      <w:numFmt w:val="bullet"/>
+      <w:lvlText w:val=""/>
+      <w:lvlJc w:val="left"/>
+      <w:pPr>
+        <w:ind w:left="5029" w:hanging="360"/>
+      </w:pPr>
+      <w:rPr>
+        <w:rFonts w:ascii="Wingdings" w:hAnsi="Wingdings" w:hint="default"/>
+      </w:rPr>
+    </w:lvl>
+    <w:lvl w:ilvl="6" w:tplc="04190001" w:tentative="1">
+      <w:start w:val="1"/>
+      <w:numFmt w:val="bullet"/>
+      <w:lvlText w:val=""/>
+      <w:lvlJc w:val="left"/>
+      <w:pPr>
+        <w:ind w:left="5749" w:hanging="360"/>
+      </w:pPr>
+      <w:rPr>
+        <w:rFonts w:ascii="Symbol" w:hAnsi="Symbol" w:hint="default"/>
+      </w:rPr>
+    </w:lvl>
+    <w:lvl w:ilvl="7" w:tplc="04190003" w:tentative="1">
+      <w:start w:val="1"/>
+      <w:numFmt w:val="bullet"/>
+      <w:lvlText w:val="o"/>
+      <w:lvlJc w:val="left"/>
+      <w:pPr>
+        <w:ind w:left="6469" w:hanging="360"/>
+      </w:pPr>
+      <w:rPr>
+        <w:rFonts w:ascii="Courier New" w:hAnsi="Courier New" w:cs="Courier New" w:hint="default"/>
+      </w:rPr>
+    </w:lvl>
+    <w:lvl w:ilvl="8" w:tplc="04190005" w:tentative="1">
+      <w:start w:val="1"/>
+      <w:numFmt w:val="bullet"/>
+      <w:lvlText w:val=""/>
+      <w:lvlJc w:val="left"/>
+      <w:pPr>
+        <w:ind w:left="7189" w:hanging="360"/>
+      </w:pPr>
+      <w:rPr>
+        <w:rFonts w:ascii="Wingdings" w:hAnsi="Wingdings" w:hint="default"/>
+      </w:rPr>
+    </w:lvl>
+  </w:abstractNum>
+  <w:abstractNum w:abstractNumId="24" w15:restartNumberingAfterBreak="0">
     <w:nsid w:val="52E4322B"/>
     <w:multiLevelType w:val="hybridMultilevel"/>
     <w:tmpl w:val="03263EB0"/>
@@ -6623,7 +8589,7 @@
       </w:pPr>
     </w:lvl>
   </w:abstractNum>
-  <w:abstractNum w:abstractNumId="23" w15:restartNumberingAfterBreak="0">
+  <w:abstractNum w:abstractNumId="25" w15:restartNumberingAfterBreak="0">
     <w:nsid w:val="53A80F61"/>
     <w:multiLevelType w:val="hybridMultilevel"/>
     <w:tmpl w:val="67580E76"/>
@@ -6736,7 +8702,7 @@
       </w:rPr>
     </w:lvl>
   </w:abstractNum>
-  <w:abstractNum w:abstractNumId="24" w15:restartNumberingAfterBreak="0">
+  <w:abstractNum w:abstractNumId="26" w15:restartNumberingAfterBreak="0">
     <w:nsid w:val="552D6126"/>
     <w:multiLevelType w:val="hybridMultilevel"/>
     <w:tmpl w:val="9434360E"/>
@@ -6822,7 +8788,7 @@
       </w:pPr>
     </w:lvl>
   </w:abstractNum>
-  <w:abstractNum w:abstractNumId="25" w15:restartNumberingAfterBreak="0">
+  <w:abstractNum w:abstractNumId="27" w15:restartNumberingAfterBreak="0">
     <w:nsid w:val="5F5D38FF"/>
     <w:multiLevelType w:val="hybridMultilevel"/>
     <w:tmpl w:val="9B2C67EA"/>
@@ -6908,7 +8874,7 @@
       </w:pPr>
     </w:lvl>
   </w:abstractNum>
-  <w:abstractNum w:abstractNumId="26" w15:restartNumberingAfterBreak="0">
+  <w:abstractNum w:abstractNumId="28" w15:restartNumberingAfterBreak="0">
     <w:nsid w:val="682A50F5"/>
     <w:multiLevelType w:val="hybridMultilevel"/>
     <w:tmpl w:val="FBF6B7AE"/>
@@ -7021,7 +8987,7 @@
       </w:rPr>
     </w:lvl>
   </w:abstractNum>
-  <w:abstractNum w:abstractNumId="27" w15:restartNumberingAfterBreak="0">
+  <w:abstractNum w:abstractNumId="29" w15:restartNumberingAfterBreak="0">
     <w:nsid w:val="68420323"/>
     <w:multiLevelType w:val="hybridMultilevel"/>
     <w:tmpl w:val="5C56B8B0"/>
@@ -7112,7 +9078,7 @@
       </w:pPr>
     </w:lvl>
   </w:abstractNum>
-  <w:abstractNum w:abstractNumId="28" w15:restartNumberingAfterBreak="0">
+  <w:abstractNum w:abstractNumId="30" w15:restartNumberingAfterBreak="0">
     <w:nsid w:val="6CB6520D"/>
     <w:multiLevelType w:val="hybridMultilevel"/>
     <w:tmpl w:val="28300484"/>
@@ -7225,7 +9191,7 @@
       </w:rPr>
     </w:lvl>
   </w:abstractNum>
-  <w:abstractNum w:abstractNumId="29" w15:restartNumberingAfterBreak="0">
+  <w:abstractNum w:abstractNumId="31" w15:restartNumberingAfterBreak="0">
     <w:nsid w:val="702F11CF"/>
     <w:multiLevelType w:val="hybridMultilevel"/>
     <w:tmpl w:val="498AAC82"/>
@@ -7314,7 +9280,120 @@
       </w:pPr>
     </w:lvl>
   </w:abstractNum>
-  <w:abstractNum w:abstractNumId="30" w15:restartNumberingAfterBreak="0">
+  <w:abstractNum w:abstractNumId="32" w15:restartNumberingAfterBreak="0">
+    <w:nsid w:val="76E15ECA"/>
+    <w:multiLevelType w:val="hybridMultilevel"/>
+    <w:tmpl w:val="19F8A95A"/>
+    <w:lvl w:ilvl="0" w:tplc="7F6028E6">
+      <w:start w:val="1"/>
+      <w:numFmt w:val="bullet"/>
+      <w:lvlText w:val=""/>
+      <w:lvlJc w:val="left"/>
+      <w:pPr>
+        <w:ind w:left="1429" w:hanging="360"/>
+      </w:pPr>
+      <w:rPr>
+        <w:rFonts w:ascii="Symbol" w:hAnsi="Symbol" w:hint="default"/>
+      </w:rPr>
+    </w:lvl>
+    <w:lvl w:ilvl="1" w:tplc="04190003" w:tentative="1">
+      <w:start w:val="1"/>
+      <w:numFmt w:val="bullet"/>
+      <w:lvlText w:val="o"/>
+      <w:lvlJc w:val="left"/>
+      <w:pPr>
+        <w:ind w:left="2149" w:hanging="360"/>
+      </w:pPr>
+      <w:rPr>
+        <w:rFonts w:ascii="Courier New" w:hAnsi="Courier New" w:cs="Courier New" w:hint="default"/>
+      </w:rPr>
+    </w:lvl>
+    <w:lvl w:ilvl="2" w:tplc="04190005" w:tentative="1">
+      <w:start w:val="1"/>
+      <w:numFmt w:val="bullet"/>
+      <w:lvlText w:val=""/>
+      <w:lvlJc w:val="left"/>
+      <w:pPr>
+        <w:ind w:left="2869" w:hanging="360"/>
+      </w:pPr>
+      <w:rPr>
+        <w:rFonts w:ascii="Wingdings" w:hAnsi="Wingdings" w:hint="default"/>
+      </w:rPr>
+    </w:lvl>
+    <w:lvl w:ilvl="3" w:tplc="04190001" w:tentative="1">
+      <w:start w:val="1"/>
+      <w:numFmt w:val="bullet"/>
+      <w:lvlText w:val=""/>
+      <w:lvlJc w:val="left"/>
+      <w:pPr>
+        <w:ind w:left="3589" w:hanging="360"/>
+      </w:pPr>
+      <w:rPr>
+        <w:rFonts w:ascii="Symbol" w:hAnsi="Symbol" w:hint="default"/>
+      </w:rPr>
+    </w:lvl>
+    <w:lvl w:ilvl="4" w:tplc="04190003" w:tentative="1">
+      <w:start w:val="1"/>
+      <w:numFmt w:val="bullet"/>
+      <w:lvlText w:val="o"/>
+      <w:lvlJc w:val="left"/>
+      <w:pPr>
+        <w:ind w:left="4309" w:hanging="360"/>
+      </w:pPr>
+      <w:rPr>
+        <w:rFonts w:ascii="Courier New" w:hAnsi="Courier New" w:cs="Courier New" w:hint="default"/>
+      </w:rPr>
+    </w:lvl>
+    <w:lvl w:ilvl="5" w:tplc="04190005" w:tentative="1">
+      <w:start w:val="1"/>
+      <w:numFmt w:val="bullet"/>
+      <w:lvlText w:val=""/>
+      <w:lvlJc w:val="left"/>
+      <w:pPr>
+        <w:ind w:left="5029" w:hanging="360"/>
+      </w:pPr>
+      <w:rPr>
+        <w:rFonts w:ascii="Wingdings" w:hAnsi="Wingdings" w:hint="default"/>
+      </w:rPr>
+    </w:lvl>
+    <w:lvl w:ilvl="6" w:tplc="04190001" w:tentative="1">
+      <w:start w:val="1"/>
+      <w:numFmt w:val="bullet"/>
+      <w:lvlText w:val=""/>
+      <w:lvlJc w:val="left"/>
+      <w:pPr>
+        <w:ind w:left="5749" w:hanging="360"/>
+      </w:pPr>
+      <w:rPr>
+        <w:rFonts w:ascii="Symbol" w:hAnsi="Symbol" w:hint="default"/>
+      </w:rPr>
+    </w:lvl>
+    <w:lvl w:ilvl="7" w:tplc="04190003" w:tentative="1">
+      <w:start w:val="1"/>
+      <w:numFmt w:val="bullet"/>
+      <w:lvlText w:val="o"/>
+      <w:lvlJc w:val="left"/>
+      <w:pPr>
+        <w:ind w:left="6469" w:hanging="360"/>
+      </w:pPr>
+      <w:rPr>
+        <w:rFonts w:ascii="Courier New" w:hAnsi="Courier New" w:cs="Courier New" w:hint="default"/>
+      </w:rPr>
+    </w:lvl>
+    <w:lvl w:ilvl="8" w:tplc="04190005" w:tentative="1">
+      <w:start w:val="1"/>
+      <w:numFmt w:val="bullet"/>
+      <w:lvlText w:val=""/>
+      <w:lvlJc w:val="left"/>
+      <w:pPr>
+        <w:ind w:left="7189" w:hanging="360"/>
+      </w:pPr>
+      <w:rPr>
+        <w:rFonts w:ascii="Wingdings" w:hAnsi="Wingdings" w:hint="default"/>
+      </w:rPr>
+    </w:lvl>
+  </w:abstractNum>
+  <w:abstractNum w:abstractNumId="33" w15:restartNumberingAfterBreak="0">
     <w:nsid w:val="77DD3182"/>
     <w:multiLevelType w:val="hybridMultilevel"/>
     <w:tmpl w:val="1DFA873A"/>
@@ -7427,7 +9506,7 @@
       </w:rPr>
     </w:lvl>
   </w:abstractNum>
-  <w:abstractNum w:abstractNumId="31" w15:restartNumberingAfterBreak="0">
+  <w:abstractNum w:abstractNumId="34" w15:restartNumberingAfterBreak="0">
     <w:nsid w:val="7E3D4818"/>
     <w:multiLevelType w:val="hybridMultilevel"/>
     <w:tmpl w:val="D3AE741A"/>
@@ -7516,7 +9595,7 @@
       </w:pPr>
     </w:lvl>
   </w:abstractNum>
-  <w:abstractNum w:abstractNumId="32" w15:restartNumberingAfterBreak="0">
+  <w:abstractNum w:abstractNumId="35" w15:restartNumberingAfterBreak="0">
     <w:nsid w:val="7F5E120E"/>
     <w:multiLevelType w:val="hybridMultilevel"/>
     <w:tmpl w:val="3A6C99E6"/>
@@ -7607,46 +9686,46 @@
     </w:lvl>
   </w:abstractNum>
   <w:num w:numId="1">
+    <w:abstractNumId w:val="9"/>
+  </w:num>
+  <w:num w:numId="2">
+    <w:abstractNumId w:val="29"/>
+  </w:num>
+  <w:num w:numId="3">
+    <w:abstractNumId w:val="6"/>
+  </w:num>
+  <w:num w:numId="4">
+    <w:abstractNumId w:val="17"/>
+  </w:num>
+  <w:num w:numId="5">
+    <w:abstractNumId w:val="25"/>
+  </w:num>
+  <w:num w:numId="6">
     <w:abstractNumId w:val="8"/>
   </w:num>
-  <w:num w:numId="2">
-    <w:abstractNumId w:val="27"/>
+  <w:num w:numId="7">
+    <w:abstractNumId w:val="33"/>
   </w:num>
-  <w:num w:numId="3">
-    <w:abstractNumId w:val="5"/>
+  <w:num w:numId="8">
+    <w:abstractNumId w:val="12"/>
   </w:num>
-  <w:num w:numId="4">
-    <w:abstractNumId w:val="16"/>
+  <w:num w:numId="9">
+    <w:abstractNumId w:val="18"/>
   </w:num>
-  <w:num w:numId="5">
-    <w:abstractNumId w:val="23"/>
-  </w:num>
-  <w:num w:numId="6">
-    <w:abstractNumId w:val="7"/>
-  </w:num>
-  <w:num w:numId="7">
+  <w:num w:numId="10">
     <w:abstractNumId w:val="30"/>
   </w:num>
-  <w:num w:numId="8">
-    <w:abstractNumId w:val="11"/>
-  </w:num>
-  <w:num w:numId="9">
-    <w:abstractNumId w:val="17"/>
-  </w:num>
-  <w:num w:numId="10">
+  <w:num w:numId="11">
     <w:abstractNumId w:val="28"/>
   </w:num>
-  <w:num w:numId="11">
-    <w:abstractNumId w:val="26"/>
-  </w:num>
   <w:num w:numId="12">
-    <w:abstractNumId w:val="12"/>
+    <w:abstractNumId w:val="13"/>
   </w:num>
   <w:num w:numId="13">
-    <w:abstractNumId w:val="22"/>
+    <w:abstractNumId w:val="24"/>
   </w:num>
   <w:num w:numId="14">
-    <w:abstractNumId w:val="10"/>
+    <w:abstractNumId w:val="11"/>
   </w:num>
   <w:num w:numId="15">
     <w:abstractNumId w:val="1"/>
@@ -7655,16 +9734,16 @@
     <w:abstractNumId w:val="0"/>
   </w:num>
   <w:num w:numId="17">
-    <w:abstractNumId w:val="29"/>
+    <w:abstractNumId w:val="31"/>
   </w:num>
   <w:num w:numId="18">
     <w:abstractNumId w:val="3"/>
   </w:num>
   <w:num w:numId="19">
-    <w:abstractNumId w:val="25"/>
+    <w:abstractNumId w:val="27"/>
   </w:num>
   <w:num w:numId="20">
-    <w:abstractNumId w:val="32"/>
+    <w:abstractNumId w:val="35"/>
   </w:num>
   <w:num w:numId="21">
     <w:abstractNumId w:val="4"/>
@@ -7673,37 +9752,46 @@
     <w:abstractNumId w:val="2"/>
   </w:num>
   <w:num w:numId="23">
+    <w:abstractNumId w:val="16"/>
+  </w:num>
+  <w:num w:numId="24">
+    <w:abstractNumId w:val="21"/>
+  </w:num>
+  <w:num w:numId="25">
+    <w:abstractNumId w:val="34"/>
+  </w:num>
+  <w:num w:numId="26">
+    <w:abstractNumId w:val="20"/>
+  </w:num>
+  <w:num w:numId="27">
     <w:abstractNumId w:val="15"/>
   </w:num>
-  <w:num w:numId="24">
-    <w:abstractNumId w:val="20"/>
+  <w:num w:numId="28">
+    <w:abstractNumId w:val="10"/>
   </w:num>
-  <w:num w:numId="25">
-    <w:abstractNumId w:val="31"/>
+  <w:num w:numId="29">
+    <w:abstractNumId w:val="14"/>
   </w:num>
-  <w:num w:numId="26">
+  <w:num w:numId="30">
     <w:abstractNumId w:val="19"/>
   </w:num>
-  <w:num w:numId="27">
-    <w:abstractNumId w:val="14"/>
-  </w:num>
-  <w:num w:numId="28">
-    <w:abstractNumId w:val="9"/>
-  </w:num>
-  <w:num w:numId="29">
-    <w:abstractNumId w:val="13"/>
-  </w:num>
-  <w:num w:numId="30">
-    <w:abstractNumId w:val="18"/>
-  </w:num>
   <w:num w:numId="31">
-    <w:abstractNumId w:val="6"/>
+    <w:abstractNumId w:val="7"/>
   </w:num>
   <w:num w:numId="32">
-    <w:abstractNumId w:val="24"/>
+    <w:abstractNumId w:val="26"/>
   </w:num>
   <w:num w:numId="33">
-    <w:abstractNumId w:val="21"/>
+    <w:abstractNumId w:val="22"/>
+  </w:num>
+  <w:num w:numId="34">
+    <w:abstractNumId w:val="23"/>
+  </w:num>
+  <w:num w:numId="35">
+    <w:abstractNumId w:val="32"/>
+  </w:num>
+  <w:num w:numId="36">
+    <w:abstractNumId w:val="5"/>
   </w:num>
 </w:numbering>
 </file>
@@ -8750,7 +10838,7 @@
 </file>
 
 <file path=customXml/itemProps1.xml><?xml version="1.0" encoding="utf-8"?>
-<ds:datastoreItem xmlns:ds="http://schemas.openxmlformats.org/officeDocument/2006/customXml" ds:itemID="{4C839363-4E11-484E-A289-556E1421BD53}">
+<ds:datastoreItem xmlns:ds="http://schemas.openxmlformats.org/officeDocument/2006/customXml" ds:itemID="{D704E59D-195F-4E13-BCE8-27C8C610A4B7}">
   <ds:schemaRefs>
     <ds:schemaRef ds:uri="http://schemas.openxmlformats.org/officeDocument/2006/bibliography"/>
   </ds:schemaRefs>

</xml_diff>

<commit_message>
Add: add subclause with description user stories
</commit_message>
<xml_diff>
--- a/Documentation/титул мамшева.docx
+++ b/Documentation/титул мамшева.docx
@@ -699,7 +699,7 @@
           <w:lang w:eastAsia="ru-RU"/>
         </w:rPr>
       </w:pPr>
-      <w:bookmarkStart w:id="0" w:name="_Toc243258961"/>
+      <w:bookmarkStart w:id="0" w:name="_Toc243263521"/>
       <w:r>
         <w:rPr>
           <w:rFonts w:eastAsia="Times New Roman"/>
@@ -710,6 +710,8 @@
       </w:r>
       <w:bookmarkEnd w:id="0"/>
     </w:p>
+    <w:bookmarkStart w:id="1" w:name="_GoBack"/>
+    <w:bookmarkEnd w:id="1"/>
     <w:p>
       <w:pPr>
         <w:pStyle w:val="11"/>
@@ -740,7 +742,7 @@
         </w:rPr>
         <w:fldChar w:fldCharType="separate"/>
       </w:r>
-      <w:hyperlink w:anchor="_Toc243258961" w:history="1">
+      <w:hyperlink w:anchor="_Toc243263521" w:history="1">
         <w:r>
           <w:rPr>
             <w:rStyle w:val="a6"/>
@@ -769,7 +771,7 @@
             <w:noProof/>
             <w:webHidden/>
           </w:rPr>
-          <w:instrText xml:space="preserve"> PAGEREF _Toc243258961 \h </w:instrText>
+          <w:instrText xml:space="preserve"> PAGEREF _Toc243263521 \h </w:instrText>
         </w:r>
         <w:r>
           <w:rPr>
@@ -813,7 +815,7 @@
           <w:lang w:eastAsia="ru-RU"/>
         </w:rPr>
       </w:pPr>
-      <w:hyperlink w:anchor="_Toc243258962" w:history="1">
+      <w:hyperlink w:anchor="_Toc243263522" w:history="1">
         <w:r>
           <w:rPr>
             <w:rStyle w:val="a6"/>
@@ -857,7 +859,7 @@
             <w:noProof/>
             <w:webHidden/>
           </w:rPr>
-          <w:instrText xml:space="preserve"> PAGEREF _Toc243258962 \h </w:instrText>
+          <w:instrText xml:space="preserve"> PAGEREF _Toc243263522 \h </w:instrText>
         </w:r>
         <w:r>
           <w:rPr>
@@ -901,7 +903,7 @@
           <w:lang w:eastAsia="ru-RU"/>
         </w:rPr>
       </w:pPr>
-      <w:hyperlink w:anchor="_Toc243258963" w:history="1">
+      <w:hyperlink w:anchor="_Toc243263523" w:history="1">
         <w:r>
           <w:rPr>
             <w:rStyle w:val="a6"/>
@@ -947,7 +949,7 @@
             <w:noProof/>
             <w:webHidden/>
           </w:rPr>
-          <w:instrText xml:space="preserve"> PAGEREF _Toc243258963 \h </w:instrText>
+          <w:instrText xml:space="preserve"> PAGEREF _Toc243263523 \h </w:instrText>
         </w:r>
         <w:r>
           <w:rPr>
@@ -991,7 +993,7 @@
           <w:lang w:eastAsia="ru-RU"/>
         </w:rPr>
       </w:pPr>
-      <w:hyperlink w:anchor="_Toc243258964" w:history="1">
+      <w:hyperlink w:anchor="_Toc243263524" w:history="1">
         <w:r>
           <w:rPr>
             <w:rStyle w:val="a6"/>
@@ -1035,7 +1037,7 @@
             <w:noProof/>
             <w:webHidden/>
           </w:rPr>
-          <w:instrText xml:space="preserve"> PAGEREF _Toc243258964 \h </w:instrText>
+          <w:instrText xml:space="preserve"> PAGEREF _Toc243263524 \h </w:instrText>
         </w:r>
         <w:r>
           <w:rPr>
@@ -1079,7 +1081,7 @@
           <w:lang w:eastAsia="ru-RU"/>
         </w:rPr>
       </w:pPr>
-      <w:hyperlink w:anchor="_Toc243258965" w:history="1">
+      <w:hyperlink w:anchor="_Toc243263525" w:history="1">
         <w:r>
           <w:rPr>
             <w:rStyle w:val="a6"/>
@@ -1124,7 +1126,7 @@
             <w:noProof/>
             <w:webHidden/>
           </w:rPr>
-          <w:instrText xml:space="preserve"> PAGEREF _Toc243258965 \h </w:instrText>
+          <w:instrText xml:space="preserve"> PAGEREF _Toc243263525 \h </w:instrText>
         </w:r>
         <w:r>
           <w:rPr>
@@ -1168,7 +1170,7 @@
           <w:lang w:eastAsia="ru-RU"/>
         </w:rPr>
       </w:pPr>
-      <w:hyperlink w:anchor="_Toc243258966" w:history="1">
+      <w:hyperlink w:anchor="_Toc243263526" w:history="1">
         <w:r>
           <w:rPr>
             <w:rStyle w:val="a6"/>
@@ -1212,7 +1214,7 @@
             <w:noProof/>
             <w:webHidden/>
           </w:rPr>
-          <w:instrText xml:space="preserve"> PAGEREF _Toc243258966 \h </w:instrText>
+          <w:instrText xml:space="preserve"> PAGEREF _Toc243263526 \h </w:instrText>
         </w:r>
         <w:r>
           <w:rPr>
@@ -1256,7 +1258,7 @@
           <w:lang w:eastAsia="ru-RU"/>
         </w:rPr>
       </w:pPr>
-      <w:hyperlink w:anchor="_Toc243258967" w:history="1">
+      <w:hyperlink w:anchor="_Toc243263527" w:history="1">
         <w:r>
           <w:rPr>
             <w:rStyle w:val="a6"/>
@@ -1300,7 +1302,7 @@
             <w:noProof/>
             <w:webHidden/>
           </w:rPr>
-          <w:instrText xml:space="preserve"> PAGEREF _Toc243258967 \h </w:instrText>
+          <w:instrText xml:space="preserve"> PAGEREF _Toc243263527 \h </w:instrText>
         </w:r>
         <w:r>
           <w:rPr>
@@ -1344,7 +1346,7 @@
           <w:lang w:eastAsia="ru-RU"/>
         </w:rPr>
       </w:pPr>
-      <w:hyperlink w:anchor="_Toc243258968" w:history="1">
+      <w:hyperlink w:anchor="_Toc243263528" w:history="1">
         <w:r>
           <w:rPr>
             <w:rStyle w:val="a6"/>
@@ -1388,7 +1390,7 @@
             <w:noProof/>
             <w:webHidden/>
           </w:rPr>
-          <w:instrText xml:space="preserve"> PAGEREF _Toc243258968 \h </w:instrText>
+          <w:instrText xml:space="preserve"> PAGEREF _Toc243263528 \h </w:instrText>
         </w:r>
         <w:r>
           <w:rPr>
@@ -1432,7 +1434,7 @@
           <w:lang w:eastAsia="ru-RU"/>
         </w:rPr>
       </w:pPr>
-      <w:hyperlink w:anchor="_Toc243258969" w:history="1">
+      <w:hyperlink w:anchor="_Toc243263529" w:history="1">
         <w:r>
           <w:rPr>
             <w:rStyle w:val="a6"/>
@@ -1476,7 +1478,7 @@
             <w:noProof/>
             <w:webHidden/>
           </w:rPr>
-          <w:instrText xml:space="preserve"> PAGEREF _Toc243258969 \h </w:instrText>
+          <w:instrText xml:space="preserve"> PAGEREF _Toc243263529 \h </w:instrText>
         </w:r>
         <w:r>
           <w:rPr>
@@ -1520,7 +1522,7 @@
           <w:lang w:eastAsia="ru-RU"/>
         </w:rPr>
       </w:pPr>
-      <w:hyperlink w:anchor="_Toc243258970" w:history="1">
+      <w:hyperlink w:anchor="_Toc243263530" w:history="1">
         <w:r>
           <w:rPr>
             <w:rStyle w:val="a6"/>
@@ -1596,7 +1598,7 @@
             <w:noProof/>
             <w:webHidden/>
           </w:rPr>
-          <w:instrText xml:space="preserve"> PAGEREF _Toc243258970 \h </w:instrText>
+          <w:instrText xml:space="preserve"> PAGEREF _Toc243263530 \h </w:instrText>
         </w:r>
         <w:r>
           <w:rPr>
@@ -1617,6 +1619,270 @@
             <w:webHidden/>
           </w:rPr>
           <w:t>9</w:t>
+        </w:r>
+        <w:r>
+          <w:rPr>
+            <w:noProof/>
+            <w:webHidden/>
+          </w:rPr>
+          <w:fldChar w:fldCharType="end"/>
+        </w:r>
+      </w:hyperlink>
+    </w:p>
+    <w:p>
+      <w:pPr>
+        <w:pStyle w:val="31"/>
+        <w:tabs>
+          <w:tab w:val="left" w:pos="1320"/>
+          <w:tab w:val="right" w:leader="dot" w:pos="9345"/>
+        </w:tabs>
+        <w:rPr>
+          <w:rFonts w:eastAsiaTheme="minorEastAsia"/>
+          <w:noProof/>
+          <w:lang w:eastAsia="ru-RU"/>
+        </w:rPr>
+      </w:pPr>
+      <w:hyperlink w:anchor="_Toc243263531" w:history="1">
+        <w:r>
+          <w:rPr>
+            <w:rStyle w:val="a6"/>
+            <w:noProof/>
+            <w:lang w:eastAsia="ru-RU"/>
+          </w:rPr>
+          <w:t>1.2.5.</w:t>
+        </w:r>
+        <w:r>
+          <w:rPr>
+            <w:rFonts w:eastAsiaTheme="minorEastAsia"/>
+            <w:noProof/>
+            <w:lang w:eastAsia="ru-RU"/>
+          </w:rPr>
+          <w:tab/>
+        </w:r>
+        <w:r>
+          <w:rPr>
+            <w:rStyle w:val="a6"/>
+            <w:noProof/>
+            <w:lang w:eastAsia="ru-RU"/>
+          </w:rPr>
+          <w:t>Требования к обработке ошибок</w:t>
+        </w:r>
+        <w:r>
+          <w:rPr>
+            <w:noProof/>
+            <w:webHidden/>
+          </w:rPr>
+          <w:tab/>
+        </w:r>
+        <w:r>
+          <w:rPr>
+            <w:noProof/>
+            <w:webHidden/>
+          </w:rPr>
+          <w:fldChar w:fldCharType="begin"/>
+        </w:r>
+        <w:r>
+          <w:rPr>
+            <w:noProof/>
+            <w:webHidden/>
+          </w:rPr>
+          <w:instrText xml:space="preserve"> PAGEREF _Toc243263531 \h </w:instrText>
+        </w:r>
+        <w:r>
+          <w:rPr>
+            <w:noProof/>
+            <w:webHidden/>
+          </w:rPr>
+        </w:r>
+        <w:r>
+          <w:rPr>
+            <w:noProof/>
+            <w:webHidden/>
+          </w:rPr>
+          <w:fldChar w:fldCharType="separate"/>
+        </w:r>
+        <w:r>
+          <w:rPr>
+            <w:noProof/>
+            <w:webHidden/>
+          </w:rPr>
+          <w:t>11</w:t>
+        </w:r>
+        <w:r>
+          <w:rPr>
+            <w:noProof/>
+            <w:webHidden/>
+          </w:rPr>
+          <w:fldChar w:fldCharType="end"/>
+        </w:r>
+      </w:hyperlink>
+    </w:p>
+    <w:p>
+      <w:pPr>
+        <w:pStyle w:val="31"/>
+        <w:tabs>
+          <w:tab w:val="left" w:pos="1320"/>
+          <w:tab w:val="right" w:leader="dot" w:pos="9345"/>
+        </w:tabs>
+        <w:rPr>
+          <w:rFonts w:eastAsiaTheme="minorEastAsia"/>
+          <w:noProof/>
+          <w:lang w:eastAsia="ru-RU"/>
+        </w:rPr>
+      </w:pPr>
+      <w:hyperlink w:anchor="_Toc243263532" w:history="1">
+        <w:r>
+          <w:rPr>
+            <w:rStyle w:val="a6"/>
+            <w:noProof/>
+            <w:lang w:eastAsia="ru-RU"/>
+          </w:rPr>
+          <w:t>1.2.6.</w:t>
+        </w:r>
+        <w:r>
+          <w:rPr>
+            <w:rFonts w:eastAsiaTheme="minorEastAsia"/>
+            <w:noProof/>
+            <w:lang w:eastAsia="ru-RU"/>
+          </w:rPr>
+          <w:tab/>
+        </w:r>
+        <w:r>
+          <w:rPr>
+            <w:rStyle w:val="a6"/>
+            <w:noProof/>
+            <w:lang w:eastAsia="ru-RU"/>
+          </w:rPr>
+          <w:t>Требования к работе без интернета</w:t>
+        </w:r>
+        <w:r>
+          <w:rPr>
+            <w:noProof/>
+            <w:webHidden/>
+          </w:rPr>
+          <w:tab/>
+        </w:r>
+        <w:r>
+          <w:rPr>
+            <w:noProof/>
+            <w:webHidden/>
+          </w:rPr>
+          <w:fldChar w:fldCharType="begin"/>
+        </w:r>
+        <w:r>
+          <w:rPr>
+            <w:noProof/>
+            <w:webHidden/>
+          </w:rPr>
+          <w:instrText xml:space="preserve"> PAGEREF _Toc243263532 \h </w:instrText>
+        </w:r>
+        <w:r>
+          <w:rPr>
+            <w:noProof/>
+            <w:webHidden/>
+          </w:rPr>
+        </w:r>
+        <w:r>
+          <w:rPr>
+            <w:noProof/>
+            <w:webHidden/>
+          </w:rPr>
+          <w:fldChar w:fldCharType="separate"/>
+        </w:r>
+        <w:r>
+          <w:rPr>
+            <w:noProof/>
+            <w:webHidden/>
+          </w:rPr>
+          <w:t>12</w:t>
+        </w:r>
+        <w:r>
+          <w:rPr>
+            <w:noProof/>
+            <w:webHidden/>
+          </w:rPr>
+          <w:fldChar w:fldCharType="end"/>
+        </w:r>
+      </w:hyperlink>
+    </w:p>
+    <w:p>
+      <w:pPr>
+        <w:pStyle w:val="31"/>
+        <w:tabs>
+          <w:tab w:val="left" w:pos="1320"/>
+          <w:tab w:val="right" w:leader="dot" w:pos="9345"/>
+        </w:tabs>
+        <w:rPr>
+          <w:rFonts w:eastAsiaTheme="minorEastAsia"/>
+          <w:noProof/>
+          <w:lang w:eastAsia="ru-RU"/>
+        </w:rPr>
+      </w:pPr>
+      <w:hyperlink w:anchor="_Toc243263533" w:history="1">
+        <w:r>
+          <w:rPr>
+            <w:rStyle w:val="a6"/>
+            <w:noProof/>
+            <w:lang w:eastAsia="ru-RU"/>
+          </w:rPr>
+          <w:t>1.2.7.</w:t>
+        </w:r>
+        <w:r>
+          <w:rPr>
+            <w:rFonts w:eastAsiaTheme="minorEastAsia"/>
+            <w:noProof/>
+            <w:lang w:eastAsia="ru-RU"/>
+          </w:rPr>
+          <w:tab/>
+        </w:r>
+        <w:r>
+          <w:rPr>
+            <w:rStyle w:val="a6"/>
+            <w:noProof/>
+            <w:lang w:eastAsia="ru-RU"/>
+          </w:rPr>
+          <w:t>Приоритизация MoSCoW</w:t>
+        </w:r>
+        <w:r>
+          <w:rPr>
+            <w:noProof/>
+            <w:webHidden/>
+          </w:rPr>
+          <w:tab/>
+        </w:r>
+        <w:r>
+          <w:rPr>
+            <w:noProof/>
+            <w:webHidden/>
+          </w:rPr>
+          <w:fldChar w:fldCharType="begin"/>
+        </w:r>
+        <w:r>
+          <w:rPr>
+            <w:noProof/>
+            <w:webHidden/>
+          </w:rPr>
+          <w:instrText xml:space="preserve"> PAGEREF _Toc243263533 \h </w:instrText>
+        </w:r>
+        <w:r>
+          <w:rPr>
+            <w:noProof/>
+            <w:webHidden/>
+          </w:rPr>
+        </w:r>
+        <w:r>
+          <w:rPr>
+            <w:noProof/>
+            <w:webHidden/>
+          </w:rPr>
+          <w:fldChar w:fldCharType="separate"/>
+        </w:r>
+        <w:r>
+          <w:rPr>
+            <w:noProof/>
+            <w:webHidden/>
+          </w:rPr>
+          <w:t>13</w:t>
         </w:r>
         <w:r>
           <w:rPr>
@@ -1676,7 +1942,7 @@
           <w:lang w:eastAsia="ru-RU"/>
         </w:rPr>
       </w:pPr>
-      <w:bookmarkStart w:id="1" w:name="_Toc243258962"/>
+      <w:bookmarkStart w:id="2" w:name="_Toc243263522"/>
       <w:r>
         <w:rPr>
           <w:lang w:eastAsia="ru-RU"/>
@@ -1684,7 +1950,7 @@
         <w:lastRenderedPageBreak/>
         <w:t>Анализ предметной области</w:t>
       </w:r>
-      <w:bookmarkEnd w:id="1"/>
+      <w:bookmarkEnd w:id="2"/>
     </w:p>
     <w:p>
       <w:pPr>
@@ -1698,7 +1964,7 @@
           <w:lang w:eastAsia="ru-RU"/>
         </w:rPr>
       </w:pPr>
-      <w:bookmarkStart w:id="2" w:name="_Toc243258963"/>
+      <w:bookmarkStart w:id="3" w:name="_Toc243263523"/>
       <w:r>
         <w:rPr>
           <w:rFonts w:eastAsia="Times New Roman"/>
@@ -1706,7 +1972,7 @@
         </w:rPr>
         <w:t>Анализ идеи и выявление потребностей.</w:t>
       </w:r>
-      <w:bookmarkEnd w:id="2"/>
+      <w:bookmarkEnd w:id="3"/>
     </w:p>
     <w:p>
       <w:pPr>
@@ -1720,7 +1986,7 @@
           <w:lang w:eastAsia="ru-RU"/>
         </w:rPr>
       </w:pPr>
-      <w:bookmarkStart w:id="3" w:name="_Toc243258964"/>
+      <w:bookmarkStart w:id="4" w:name="_Toc243263524"/>
       <w:r>
         <w:rPr>
           <w:lang w:eastAsia="ru-RU"/>
@@ -1733,7 +1999,7 @@
         </w:rPr>
         <w:t>проекта</w:t>
       </w:r>
-      <w:bookmarkEnd w:id="3"/>
+      <w:bookmarkEnd w:id="4"/>
     </w:p>
     <w:p>
       <w:pPr>
@@ -1808,14 +2074,14 @@
           <w:lang w:eastAsia="ru-RU"/>
         </w:rPr>
       </w:pPr>
-      <w:bookmarkStart w:id="4" w:name="_Toc243258965"/>
+      <w:bookmarkStart w:id="5" w:name="_Toc243263525"/>
       <w:r>
         <w:rPr>
           <w:lang w:eastAsia="ru-RU"/>
         </w:rPr>
         <w:t>Проблематика и ценность для пользователя</w:t>
       </w:r>
-      <w:bookmarkEnd w:id="4"/>
+      <w:bookmarkEnd w:id="5"/>
     </w:p>
     <w:p>
       <w:pPr>
@@ -2070,14 +2336,14 @@
           <w:lang w:eastAsia="ru-RU"/>
         </w:rPr>
       </w:pPr>
-      <w:bookmarkStart w:id="5" w:name="_Toc243258966"/>
+      <w:bookmarkStart w:id="6" w:name="_Toc243263526"/>
       <w:r>
         <w:rPr>
           <w:lang w:eastAsia="ru-RU"/>
         </w:rPr>
         <w:t>Сравнительный анализ аналогов</w:t>
       </w:r>
-      <w:bookmarkEnd w:id="5"/>
+      <w:bookmarkEnd w:id="6"/>
     </w:p>
     <w:p>
       <w:pPr>
@@ -3287,7 +3553,7 @@
           <w:lang w:eastAsia="ru-RU"/>
         </w:rPr>
       </w:pPr>
-      <w:bookmarkStart w:id="6" w:name="_Toc243258967"/>
+      <w:bookmarkStart w:id="7" w:name="_Toc243263527"/>
       <w:r>
         <w:rPr>
           <w:lang w:eastAsia="ru-RU"/>
@@ -3295,7 +3561,7 @@
         <w:lastRenderedPageBreak/>
         <w:t>Составление технического задания</w:t>
       </w:r>
-      <w:bookmarkEnd w:id="6"/>
+      <w:bookmarkEnd w:id="7"/>
     </w:p>
     <w:p>
       <w:pPr>
@@ -3309,14 +3575,14 @@
           <w:lang w:eastAsia="ru-RU"/>
         </w:rPr>
       </w:pPr>
-      <w:bookmarkStart w:id="7" w:name="_Toc243258968"/>
+      <w:bookmarkStart w:id="8" w:name="_Toc243263528"/>
       <w:r>
         <w:rPr>
           <w:lang w:eastAsia="ru-RU"/>
         </w:rPr>
         <w:t>Цели проекта</w:t>
       </w:r>
-      <w:bookmarkEnd w:id="7"/>
+      <w:bookmarkEnd w:id="8"/>
     </w:p>
     <w:p>
       <w:pPr>
@@ -3558,14 +3824,14 @@
           <w:lang w:eastAsia="ru-RU"/>
         </w:rPr>
       </w:pPr>
-      <w:bookmarkStart w:id="8" w:name="_Toc243258969"/>
+      <w:bookmarkStart w:id="9" w:name="_Toc243263529"/>
       <w:r>
         <w:rPr>
           <w:lang w:eastAsia="ru-RU"/>
         </w:rPr>
         <w:t>Функциональные требования</w:t>
       </w:r>
-      <w:bookmarkEnd w:id="8"/>
+      <w:bookmarkEnd w:id="9"/>
     </w:p>
     <w:p>
       <w:pPr>
@@ -4724,7 +4990,7 @@
           <w:lang w:eastAsia="ru-RU"/>
         </w:rPr>
       </w:pPr>
-      <w:bookmarkStart w:id="9" w:name="_Toc243258970"/>
+      <w:bookmarkStart w:id="10" w:name="_Toc243263530"/>
       <w:r>
         <w:rPr>
           <w:lang w:eastAsia="ru-RU"/>
@@ -4768,7 +5034,7 @@
         </w:rPr>
         <w:t>.</w:t>
       </w:r>
-      <w:bookmarkEnd w:id="9"/>
+      <w:bookmarkEnd w:id="10"/>
     </w:p>
     <w:p>
       <w:pPr>
@@ -4777,22 +5043,831 @@
           <w:lang w:eastAsia="ru-RU"/>
         </w:rPr>
       </w:pPr>
+      <w:r>
+        <w:rPr>
+          <w:lang w:eastAsia="ru-RU"/>
+        </w:rPr>
+        <w:t>Для проекта была разработанная диаграмма использования.</w:t>
+      </w:r>
     </w:p>
     <w:p>
       <w:pPr>
         <w:pStyle w:val="a9"/>
-        <w:rPr>
-          <w:lang w:eastAsia="ru-RU"/>
-        </w:rPr>
-      </w:pPr>
+        <w:ind w:firstLine="0"/>
+        <w:jc w:val="center"/>
+        <w:rPr>
+          <w:lang w:eastAsia="ru-RU"/>
+        </w:rPr>
+      </w:pPr>
+      <w:r>
+        <w:rPr>
+          <w:lang w:eastAsia="ru-RU"/>
+        </w:rPr>
+        <w:drawing>
+          <wp:inline distT="0" distB="0" distL="0" distR="0" wp14:anchorId="21BF5E37" wp14:editId="08ABF7EA">
+            <wp:extent cx="5940425" cy="5461000"/>
+            <wp:effectExtent l="0" t="0" r="3175" b="6350"/>
+            <wp:docPr id="1" name="Рисунок 1"/>
+            <wp:cNvGraphicFramePr>
+              <a:graphicFrameLocks xmlns:a="http://schemas.openxmlformats.org/drawingml/2006/main" noChangeAspect="1"/>
+            </wp:cNvGraphicFramePr>
+            <a:graphic xmlns:a="http://schemas.openxmlformats.org/drawingml/2006/main">
+              <a:graphicData uri="http://schemas.openxmlformats.org/drawingml/2006/picture">
+                <pic:pic xmlns:pic="http://schemas.openxmlformats.org/drawingml/2006/picture">
+                  <pic:nvPicPr>
+                    <pic:cNvPr id="1" name=""/>
+                    <pic:cNvPicPr/>
+                  </pic:nvPicPr>
+                  <pic:blipFill>
+                    <a:blip r:embed="rId6"/>
+                    <a:stretch>
+                      <a:fillRect/>
+                    </a:stretch>
+                  </pic:blipFill>
+                  <pic:spPr>
+                    <a:xfrm>
+                      <a:off x="0" y="0"/>
+                      <a:ext cx="5940425" cy="5461000"/>
+                    </a:xfrm>
+                    <a:prstGeom prst="rect">
+                      <a:avLst/>
+                    </a:prstGeom>
+                  </pic:spPr>
+                </pic:pic>
+              </a:graphicData>
+            </a:graphic>
+          </wp:inline>
+        </w:drawing>
+      </w:r>
     </w:p>
     <w:p>
       <w:pPr>
         <w:pStyle w:val="a9"/>
-        <w:rPr>
-          <w:lang w:eastAsia="ru-RU"/>
-        </w:rPr>
-      </w:pPr>
+        <w:ind w:firstLine="0"/>
+        <w:jc w:val="center"/>
+        <w:rPr>
+          <w:lang w:eastAsia="ru-RU"/>
+        </w:rPr>
+      </w:pPr>
+      <w:r>
+        <w:rPr>
+          <w:lang w:eastAsia="ru-RU"/>
+        </w:rPr>
+        <w:t>Рисунок 1 – Диаграмма использования.</w:t>
+      </w:r>
+    </w:p>
+    <w:p>
+      <w:pPr>
+        <w:pStyle w:val="a9"/>
+        <w:rPr>
+          <w:lang w:eastAsia="ru-RU"/>
+        </w:rPr>
+      </w:pPr>
+      <w:r>
+        <w:rPr>
+          <w:lang w:eastAsia="ru-RU"/>
+        </w:rPr>
+        <w:t xml:space="preserve">Так же были разработаны основные </w:t>
+      </w:r>
+      <w:r>
+        <w:rPr>
+          <w:lang w:val="en-US" w:eastAsia="ru-RU"/>
+        </w:rPr>
+        <w:t>user</w:t>
+      </w:r>
+      <w:r>
+        <w:rPr>
+          <w:lang w:eastAsia="ru-RU"/>
+        </w:rPr>
+        <w:t>-</w:t>
+      </w:r>
+      <w:r>
+        <w:rPr>
+          <w:lang w:val="en-US" w:eastAsia="ru-RU"/>
+        </w:rPr>
+        <w:t>stories</w:t>
+      </w:r>
+      <w:r>
+        <w:rPr>
+          <w:lang w:eastAsia="ru-RU"/>
+        </w:rPr>
+        <w:t>:</w:t>
+      </w:r>
+    </w:p>
+    <w:p>
+      <w:pPr>
+        <w:pStyle w:val="a9"/>
+        <w:numPr>
+          <w:ilvl w:val="0"/>
+          <w:numId w:val="37"/>
+        </w:numPr>
+        <w:ind w:left="0" w:firstLine="709"/>
+        <w:rPr>
+          <w:lang w:eastAsia="ru-RU"/>
+        </w:rPr>
+      </w:pPr>
+      <w:r>
+        <w:rPr>
+          <w:lang w:eastAsia="ru-RU"/>
+        </w:rPr>
+        <w:t>Вход. Как игрок, я хочу войти в аккаунт, чтобы мой прогресс сохранялся.</w:t>
+      </w:r>
+    </w:p>
+    <w:p>
+      <w:pPr>
+        <w:pStyle w:val="a9"/>
+        <w:numPr>
+          <w:ilvl w:val="0"/>
+          <w:numId w:val="39"/>
+        </w:numPr>
+        <w:ind w:left="0" w:firstLine="709"/>
+        <w:rPr>
+          <w:lang w:eastAsia="ru-RU"/>
+        </w:rPr>
+      </w:pPr>
+      <w:r>
+        <w:rPr>
+          <w:lang w:eastAsia="ru-RU"/>
+        </w:rPr>
+        <w:t>При верных данных открывается список дел</w:t>
+      </w:r>
+      <w:r>
+        <w:rPr>
+          <w:lang w:eastAsia="ru-RU"/>
+        </w:rPr>
+        <w:t xml:space="preserve"> </w:t>
+      </w:r>
+      <w:r>
+        <w:rPr>
+          <w:lang w:eastAsia="ru-RU"/>
+        </w:rPr>
+        <w:t>и активных игр</w:t>
+      </w:r>
+    </w:p>
+    <w:p>
+      <w:pPr>
+        <w:pStyle w:val="a9"/>
+        <w:numPr>
+          <w:ilvl w:val="0"/>
+          <w:numId w:val="39"/>
+        </w:numPr>
+        <w:ind w:left="0" w:firstLine="709"/>
+        <w:rPr>
+          <w:lang w:eastAsia="ru-RU"/>
+        </w:rPr>
+      </w:pPr>
+      <w:r>
+        <w:rPr>
+          <w:lang w:eastAsia="ru-RU"/>
+        </w:rPr>
+        <w:t xml:space="preserve">При неверном пароле </w:t>
+      </w:r>
+      <w:r>
+        <w:rPr>
+          <w:lang w:eastAsia="ru-RU"/>
+        </w:rPr>
+        <w:t>показывается понятное сообщение</w:t>
+      </w:r>
+    </w:p>
+    <w:p>
+      <w:pPr>
+        <w:pStyle w:val="a9"/>
+        <w:numPr>
+          <w:ilvl w:val="0"/>
+          <w:numId w:val="39"/>
+        </w:numPr>
+        <w:ind w:left="0" w:firstLine="709"/>
+        <w:rPr>
+          <w:lang w:eastAsia="ru-RU"/>
+        </w:rPr>
+      </w:pPr>
+      <w:r>
+        <w:rPr>
+          <w:lang w:eastAsia="ru-RU"/>
+        </w:rPr>
+        <w:t>При повторном запуске</w:t>
+      </w:r>
+      <w:r>
+        <w:rPr>
+          <w:lang w:eastAsia="ru-RU"/>
+        </w:rPr>
+        <w:t xml:space="preserve"> приложения</w:t>
+      </w:r>
+      <w:r>
+        <w:rPr>
+          <w:lang w:eastAsia="ru-RU"/>
+        </w:rPr>
+        <w:t xml:space="preserve"> вход выполняется автоматически</w:t>
+      </w:r>
+      <w:r>
+        <w:rPr>
+          <w:lang w:eastAsia="ru-RU"/>
+        </w:rPr>
+        <w:t>, если ранее пользователь произвел успешную авторизацию</w:t>
+      </w:r>
+    </w:p>
+    <w:p>
+      <w:pPr>
+        <w:pStyle w:val="a9"/>
+        <w:numPr>
+          <w:ilvl w:val="0"/>
+          <w:numId w:val="37"/>
+        </w:numPr>
+        <w:ind w:left="0" w:firstLine="709"/>
+        <w:rPr>
+          <w:lang w:eastAsia="ru-RU"/>
+        </w:rPr>
+      </w:pPr>
+      <w:r>
+        <w:rPr>
+          <w:lang w:eastAsia="ru-RU"/>
+        </w:rPr>
+        <w:lastRenderedPageBreak/>
+        <w:t>Начало дела. Как игрок, я хочу прочитать описание дела и цель, чтобы понимать, что нужно расследовать.</w:t>
+      </w:r>
+    </w:p>
+    <w:p>
+      <w:pPr>
+        <w:pStyle w:val="a9"/>
+        <w:numPr>
+          <w:ilvl w:val="0"/>
+          <w:numId w:val="40"/>
+        </w:numPr>
+        <w:ind w:left="0" w:firstLine="709"/>
+        <w:rPr>
+          <w:lang w:eastAsia="ru-RU"/>
+        </w:rPr>
+      </w:pPr>
+      <w:r>
+        <w:rPr>
+          <w:lang w:eastAsia="ru-RU"/>
+        </w:rPr>
+        <w:t>Экран показывает название, вступле</w:t>
+      </w:r>
+      <w:r>
+        <w:rPr>
+          <w:lang w:eastAsia="ru-RU"/>
+        </w:rPr>
+        <w:t xml:space="preserve">ние, цель, </w:t>
+      </w:r>
+      <w:r>
+        <w:rPr>
+          <w:lang w:eastAsia="ru-RU"/>
+        </w:rPr>
+        <w:t>персонажей</w:t>
+      </w:r>
+      <w:r>
+        <w:rPr>
+          <w:lang w:eastAsia="ru-RU"/>
+        </w:rPr>
+        <w:t xml:space="preserve"> и их краткое описание</w:t>
+      </w:r>
+    </w:p>
+    <w:p>
+      <w:pPr>
+        <w:pStyle w:val="a9"/>
+        <w:numPr>
+          <w:ilvl w:val="0"/>
+          <w:numId w:val="40"/>
+        </w:numPr>
+        <w:ind w:left="0" w:firstLine="709"/>
+        <w:rPr>
+          <w:lang w:eastAsia="ru-RU"/>
+        </w:rPr>
+      </w:pPr>
+      <w:r>
+        <w:rPr>
+          <w:lang w:eastAsia="ru-RU"/>
+        </w:rPr>
+        <w:t>При выходе из приложения прогресс сохраняется, а при повторном входе игра продолжается там же, где и закончилась</w:t>
+      </w:r>
+    </w:p>
+    <w:p>
+      <w:pPr>
+        <w:pStyle w:val="a9"/>
+        <w:numPr>
+          <w:ilvl w:val="0"/>
+          <w:numId w:val="37"/>
+        </w:numPr>
+        <w:ind w:left="0" w:firstLine="709"/>
+        <w:rPr>
+          <w:lang w:eastAsia="ru-RU"/>
+        </w:rPr>
+      </w:pPr>
+      <w:r>
+        <w:rPr>
+          <w:lang w:eastAsia="ru-RU"/>
+        </w:rPr>
+        <w:t>Как игрок, я хочу задавать подозреваемому свои вопросы, чтобы выяснять детали.</w:t>
+      </w:r>
+    </w:p>
+    <w:p>
+      <w:pPr>
+        <w:pStyle w:val="a9"/>
+        <w:numPr>
+          <w:ilvl w:val="0"/>
+          <w:numId w:val="41"/>
+        </w:numPr>
+        <w:ind w:left="0" w:firstLine="709"/>
+        <w:rPr>
+          <w:lang w:eastAsia="ru-RU"/>
+        </w:rPr>
+      </w:pPr>
+      <w:r>
+        <w:rPr>
+          <w:lang w:eastAsia="ru-RU"/>
+        </w:rPr>
+        <w:t xml:space="preserve">Игрок вводит произвольный </w:t>
+      </w:r>
+      <w:r>
+        <w:rPr>
+          <w:lang w:eastAsia="ru-RU"/>
+        </w:rPr>
+        <w:t>вопрос, ответ появляется в чате</w:t>
+      </w:r>
+    </w:p>
+    <w:p>
+      <w:pPr>
+        <w:pStyle w:val="a9"/>
+        <w:numPr>
+          <w:ilvl w:val="0"/>
+          <w:numId w:val="41"/>
+        </w:numPr>
+        <w:ind w:left="0" w:firstLine="709"/>
+        <w:rPr>
+          <w:lang w:eastAsia="ru-RU"/>
+        </w:rPr>
+      </w:pPr>
+      <w:r>
+        <w:rPr>
+          <w:lang w:eastAsia="ru-RU"/>
+        </w:rPr>
+        <w:t xml:space="preserve">Персонаж ссылается на ранее </w:t>
+      </w:r>
+      <w:r>
+        <w:rPr>
+          <w:lang w:eastAsia="ru-RU"/>
+        </w:rPr>
+        <w:t>заданные вопросы</w:t>
+      </w:r>
+    </w:p>
+    <w:p>
+      <w:pPr>
+        <w:pStyle w:val="a9"/>
+        <w:numPr>
+          <w:ilvl w:val="0"/>
+          <w:numId w:val="41"/>
+        </w:numPr>
+        <w:ind w:left="0" w:firstLine="709"/>
+        <w:rPr>
+          <w:lang w:eastAsia="ru-RU"/>
+        </w:rPr>
+      </w:pPr>
+      <w:r>
+        <w:rPr>
+          <w:lang w:eastAsia="ru-RU"/>
+        </w:rPr>
+        <w:t xml:space="preserve">Если ответ не пришёл за 10 секунд, </w:t>
+      </w:r>
+      <w:r>
+        <w:rPr>
+          <w:lang w:eastAsia="ru-RU"/>
+        </w:rPr>
+        <w:t>показывается кнопка «Повторить»</w:t>
+      </w:r>
+    </w:p>
+    <w:p>
+      <w:pPr>
+        <w:pStyle w:val="a9"/>
+        <w:numPr>
+          <w:ilvl w:val="0"/>
+          <w:numId w:val="37"/>
+        </w:numPr>
+        <w:ind w:left="0" w:firstLine="709"/>
+        <w:rPr>
+          <w:lang w:eastAsia="ru-RU"/>
+        </w:rPr>
+      </w:pPr>
+      <w:r>
+        <w:rPr>
+          <w:lang w:eastAsia="ru-RU"/>
+        </w:rPr>
+        <w:t>Поиск улик камерой. Как игрок, я хочу искать улики, поворачиваясь с камерой</w:t>
+      </w:r>
+      <w:r>
+        <w:rPr>
+          <w:lang w:eastAsia="ru-RU"/>
+        </w:rPr>
+        <w:t xml:space="preserve"> в комнате</w:t>
+      </w:r>
+      <w:r>
+        <w:rPr>
+          <w:lang w:eastAsia="ru-RU"/>
+        </w:rPr>
+        <w:t>, чтобы расследование происходило в реальном пространстве</w:t>
+      </w:r>
+      <w:r>
+        <w:rPr>
+          <w:lang w:eastAsia="ru-RU"/>
+        </w:rPr>
+        <w:t xml:space="preserve"> и погрузиться в атмосферу расследования</w:t>
+      </w:r>
+      <w:r>
+        <w:rPr>
+          <w:lang w:eastAsia="ru-RU"/>
+        </w:rPr>
+        <w:t>.</w:t>
+      </w:r>
+    </w:p>
+    <w:p>
+      <w:pPr>
+        <w:pStyle w:val="a9"/>
+        <w:numPr>
+          <w:ilvl w:val="0"/>
+          <w:numId w:val="42"/>
+        </w:numPr>
+        <w:ind w:left="0" w:firstLine="709"/>
+        <w:rPr>
+          <w:lang w:eastAsia="ru-RU"/>
+        </w:rPr>
+      </w:pPr>
+      <w:r>
+        <w:rPr>
+          <w:lang w:eastAsia="ru-RU"/>
+        </w:rPr>
+        <w:t xml:space="preserve">При наведении на нужную сторону света появляется </w:t>
+      </w:r>
+      <w:r>
+        <w:rPr>
+          <w:lang w:eastAsia="ru-RU"/>
+        </w:rPr>
+        <w:t>улика</w:t>
+      </w:r>
+    </w:p>
+    <w:p>
+      <w:pPr>
+        <w:pStyle w:val="a9"/>
+        <w:numPr>
+          <w:ilvl w:val="0"/>
+          <w:numId w:val="42"/>
+        </w:numPr>
+        <w:ind w:left="0" w:firstLine="709"/>
+        <w:rPr>
+          <w:lang w:eastAsia="ru-RU"/>
+        </w:rPr>
+      </w:pPr>
+      <w:r>
+        <w:rPr>
+          <w:lang w:eastAsia="ru-RU"/>
+        </w:rPr>
+        <w:t>Улика засчитывается после прохождения зад</w:t>
+      </w:r>
+      <w:r>
+        <w:rPr>
+          <w:lang w:eastAsia="ru-RU"/>
+        </w:rPr>
+        <w:t>анного числа шагов и фотографии</w:t>
+      </w:r>
+    </w:p>
+    <w:p>
+      <w:pPr>
+        <w:pStyle w:val="a9"/>
+        <w:numPr>
+          <w:ilvl w:val="0"/>
+          <w:numId w:val="42"/>
+        </w:numPr>
+        <w:ind w:left="0" w:firstLine="709"/>
+        <w:rPr>
+          <w:lang w:eastAsia="ru-RU"/>
+        </w:rPr>
+      </w:pPr>
+      <w:r>
+        <w:rPr>
+          <w:lang w:eastAsia="ru-RU"/>
+        </w:rPr>
+        <w:t>Найденн</w:t>
+      </w:r>
+      <w:r>
+        <w:rPr>
+          <w:lang w:eastAsia="ru-RU"/>
+        </w:rPr>
+        <w:t>ая улика появляется в инвентаре</w:t>
+      </w:r>
+    </w:p>
+    <w:p>
+      <w:pPr>
+        <w:pStyle w:val="a9"/>
+        <w:numPr>
+          <w:ilvl w:val="0"/>
+          <w:numId w:val="37"/>
+        </w:numPr>
+        <w:ind w:left="0" w:firstLine="709"/>
+        <w:rPr>
+          <w:lang w:eastAsia="ru-RU"/>
+        </w:rPr>
+      </w:pPr>
+      <w:r>
+        <w:rPr>
+          <w:lang w:eastAsia="ru-RU"/>
+        </w:rPr>
+        <w:t xml:space="preserve">Расшифровка Морзе. Как игрок, я хочу расшифровывать сигналы вибрации, чтобы получать </w:t>
+      </w:r>
+      <w:r>
+        <w:rPr>
+          <w:lang w:eastAsia="ru-RU"/>
+        </w:rPr>
+        <w:t>улики и дальше расследовать дело</w:t>
+      </w:r>
+      <w:r>
+        <w:rPr>
+          <w:lang w:eastAsia="ru-RU"/>
+        </w:rPr>
+        <w:t>.</w:t>
+      </w:r>
+    </w:p>
+    <w:p>
+      <w:pPr>
+        <w:pStyle w:val="a9"/>
+        <w:numPr>
+          <w:ilvl w:val="0"/>
+          <w:numId w:val="43"/>
+        </w:numPr>
+        <w:ind w:left="0" w:firstLine="709"/>
+        <w:rPr>
+          <w:lang w:eastAsia="ru-RU"/>
+        </w:rPr>
+      </w:pPr>
+      <w:r>
+        <w:rPr>
+          <w:lang w:eastAsia="ru-RU"/>
+        </w:rPr>
+        <w:t>Кнопка «</w:t>
+      </w:r>
+      <w:r>
+        <w:rPr>
+          <w:lang w:eastAsia="ru-RU"/>
+        </w:rPr>
+        <w:t>Запустить</w:t>
+      </w:r>
+      <w:r>
+        <w:rPr>
+          <w:lang w:eastAsia="ru-RU"/>
+        </w:rPr>
+        <w:t>» запускает вибрацию точками и тире, её можно повторять.</w:t>
+      </w:r>
+    </w:p>
+    <w:p>
+      <w:pPr>
+        <w:pStyle w:val="a9"/>
+        <w:numPr>
+          <w:ilvl w:val="0"/>
+          <w:numId w:val="43"/>
+        </w:numPr>
+        <w:ind w:left="0" w:firstLine="709"/>
+        <w:rPr>
+          <w:lang w:eastAsia="ru-RU"/>
+        </w:rPr>
+      </w:pPr>
+      <w:r>
+        <w:rPr>
+          <w:lang w:eastAsia="ru-RU"/>
+        </w:rPr>
+        <w:t xml:space="preserve">При верном ответе игрок получает награду, при неверном </w:t>
+      </w:r>
+      <w:r>
+        <w:rPr>
+          <w:lang w:eastAsia="ru-RU"/>
+        </w:rPr>
+        <w:t>–</w:t>
+      </w:r>
+      <w:r>
+        <w:rPr>
+          <w:lang w:eastAsia="ru-RU"/>
+        </w:rPr>
+        <w:t xml:space="preserve"> сообщение</w:t>
+      </w:r>
+      <w:r>
+        <w:rPr>
+          <w:lang w:eastAsia="ru-RU"/>
+        </w:rPr>
+        <w:t xml:space="preserve"> с оповещением об ошибочном выводе</w:t>
+      </w:r>
+      <w:r>
+        <w:rPr>
+          <w:lang w:eastAsia="ru-RU"/>
+        </w:rPr>
+        <w:t>.</w:t>
+      </w:r>
+    </w:p>
+    <w:p>
+      <w:pPr>
+        <w:pStyle w:val="a9"/>
+        <w:numPr>
+          <w:ilvl w:val="0"/>
+          <w:numId w:val="37"/>
+        </w:numPr>
+        <w:ind w:left="0" w:firstLine="709"/>
+        <w:rPr>
+          <w:lang w:eastAsia="ru-RU"/>
+        </w:rPr>
+      </w:pPr>
+      <w:r>
+        <w:rPr>
+          <w:lang w:eastAsia="ru-RU"/>
+        </w:rPr>
+        <w:t>Инвентарь. Как игрок, я хочу открыть инвентарь, чтобы увидеть, какие предметы и улики у меня есть.</w:t>
+      </w:r>
+    </w:p>
+    <w:p>
+      <w:pPr>
+        <w:pStyle w:val="a9"/>
+        <w:numPr>
+          <w:ilvl w:val="0"/>
+          <w:numId w:val="44"/>
+        </w:numPr>
+        <w:ind w:left="0" w:firstLine="709"/>
+        <w:rPr>
+          <w:lang w:eastAsia="ru-RU"/>
+        </w:rPr>
+      </w:pPr>
+      <w:r>
+        <w:rPr>
+          <w:lang w:eastAsia="ru-RU"/>
+        </w:rPr>
+        <w:t>Инвентарь открывается с любого игрового экрана и содержит вкладки «Предметы» и «Улики».</w:t>
+      </w:r>
+    </w:p>
+    <w:p>
+      <w:pPr>
+        <w:pStyle w:val="a9"/>
+        <w:numPr>
+          <w:ilvl w:val="0"/>
+          <w:numId w:val="44"/>
+        </w:numPr>
+        <w:ind w:left="0" w:firstLine="709"/>
+        <w:rPr>
+          <w:lang w:eastAsia="ru-RU"/>
+        </w:rPr>
+      </w:pPr>
+      <w:r>
+        <w:rPr>
+          <w:lang w:eastAsia="ru-RU"/>
+        </w:rPr>
+        <w:t>Касание предмета открывает карточку с описанием.</w:t>
+      </w:r>
+    </w:p>
+    <w:p>
+      <w:pPr>
+        <w:pStyle w:val="a9"/>
+        <w:numPr>
+          <w:ilvl w:val="0"/>
+          <w:numId w:val="44"/>
+        </w:numPr>
+        <w:ind w:left="0" w:firstLine="709"/>
+        <w:rPr>
+          <w:lang w:eastAsia="ru-RU"/>
+        </w:rPr>
+      </w:pPr>
+      <w:r>
+        <w:rPr>
+          <w:lang w:eastAsia="ru-RU"/>
+        </w:rPr>
+        <w:lastRenderedPageBreak/>
+        <w:t>Инвентарь доступен без интернета.</w:t>
+      </w:r>
+    </w:p>
+    <w:p>
+      <w:pPr>
+        <w:pStyle w:val="a9"/>
+        <w:numPr>
+          <w:ilvl w:val="0"/>
+          <w:numId w:val="37"/>
+        </w:numPr>
+        <w:ind w:left="0" w:firstLine="709"/>
+        <w:rPr>
+          <w:lang w:eastAsia="ru-RU"/>
+        </w:rPr>
+      </w:pPr>
+      <w:r>
+        <w:rPr>
+          <w:lang w:eastAsia="ru-RU"/>
+        </w:rPr>
+        <w:t>Осмотр места происшествия. Как игрок, я хочу осмотреть сцену, чтобы заметить мелкие детали.</w:t>
+      </w:r>
+    </w:p>
+    <w:p>
+      <w:pPr>
+        <w:pStyle w:val="a9"/>
+        <w:numPr>
+          <w:ilvl w:val="0"/>
+          <w:numId w:val="45"/>
+        </w:numPr>
+        <w:ind w:left="0" w:firstLine="709"/>
+        <w:rPr>
+          <w:lang w:eastAsia="ru-RU"/>
+        </w:rPr>
+      </w:pPr>
+      <w:r>
+        <w:rPr>
+          <w:lang w:eastAsia="ru-RU"/>
+        </w:rPr>
+        <w:t>Касание подозрительной зоны открывает деталь, виден счётчик найденного.</w:t>
+      </w:r>
+    </w:p>
+    <w:p>
+      <w:pPr>
+        <w:pStyle w:val="a9"/>
+        <w:numPr>
+          <w:ilvl w:val="0"/>
+          <w:numId w:val="45"/>
+        </w:numPr>
+        <w:ind w:left="0" w:firstLine="709"/>
+        <w:rPr>
+          <w:lang w:eastAsia="ru-RU"/>
+        </w:rPr>
+      </w:pPr>
+      <w:r>
+        <w:rPr>
+          <w:lang w:eastAsia="ru-RU"/>
+        </w:rPr>
+        <w:t>Найденная улика попадает в инвентарь.</w:t>
+      </w:r>
+    </w:p>
+    <w:p>
+      <w:pPr>
+        <w:pStyle w:val="a9"/>
+        <w:numPr>
+          <w:ilvl w:val="0"/>
+          <w:numId w:val="37"/>
+        </w:numPr>
+        <w:ind w:left="0" w:firstLine="709"/>
+        <w:rPr>
+          <w:lang w:eastAsia="ru-RU"/>
+        </w:rPr>
+      </w:pPr>
+      <w:r>
+        <w:rPr>
+          <w:lang w:eastAsia="ru-RU"/>
+        </w:rPr>
+        <w:t>Обвинение. Как игрок, я хочу обвинить подозреваемого и увидеть, прав ли я, чтобы завершить расследование.</w:t>
+      </w:r>
+    </w:p>
+    <w:p>
+      <w:pPr>
+        <w:pStyle w:val="a9"/>
+        <w:numPr>
+          <w:ilvl w:val="0"/>
+          <w:numId w:val="46"/>
+        </w:numPr>
+        <w:ind w:left="0" w:firstLine="709"/>
+        <w:rPr>
+          <w:lang w:eastAsia="ru-RU"/>
+        </w:rPr>
+      </w:pPr>
+      <w:r>
+        <w:rPr>
+          <w:lang w:eastAsia="ru-RU"/>
+        </w:rPr>
+        <w:t>Игрок выбирает подозреваемого и улики из инвентаря.</w:t>
+      </w:r>
+    </w:p>
+    <w:p>
+      <w:pPr>
+        <w:pStyle w:val="a9"/>
+        <w:numPr>
+          <w:ilvl w:val="0"/>
+          <w:numId w:val="46"/>
+        </w:numPr>
+        <w:ind w:left="0" w:firstLine="709"/>
+        <w:rPr>
+          <w:lang w:eastAsia="ru-RU"/>
+        </w:rPr>
+      </w:pPr>
+      <w:r>
+        <w:rPr>
+          <w:lang w:eastAsia="ru-RU"/>
+        </w:rPr>
+        <w:t>Результат приходит с сервера, при верном ответе показывается разбор дела.</w:t>
+      </w:r>
+    </w:p>
+    <w:p>
+      <w:pPr>
+        <w:pStyle w:val="a9"/>
+        <w:numPr>
+          <w:ilvl w:val="0"/>
+          <w:numId w:val="46"/>
+        </w:numPr>
+        <w:ind w:left="0" w:firstLine="709"/>
+        <w:rPr>
+          <w:lang w:eastAsia="ru-RU"/>
+        </w:rPr>
+      </w:pPr>
+      <w:r>
+        <w:rPr>
+          <w:lang w:eastAsia="ru-RU"/>
+        </w:rPr>
+        <w:t>При неверном обвинении можно продолжить (не более 3 попыток).</w:t>
+      </w:r>
     </w:p>
     <w:p>
       <w:pPr>
@@ -4806,6 +5881,7 @@
           <w:lang w:eastAsia="ru-RU"/>
         </w:rPr>
       </w:pPr>
+      <w:bookmarkStart w:id="11" w:name="_Toc243263531"/>
       <w:r>
         <w:rPr>
           <w:lang w:eastAsia="ru-RU"/>
@@ -4818,6 +5894,7 @@
         </w:rPr>
         <w:t>обработке ошибок</w:t>
       </w:r>
+      <w:bookmarkEnd w:id="11"/>
     </w:p>
     <w:p>
       <w:pPr>
@@ -5043,6 +6120,7 @@
               </w:rPr>
             </w:pPr>
             <w:r>
+              <w:lastRenderedPageBreak/>
               <w:t>Сервер недоступен</w:t>
             </w:r>
           </w:p>
@@ -5170,7 +6248,6 @@
               </w:rPr>
             </w:pPr>
             <w:r>
-              <w:lastRenderedPageBreak/>
               <w:t>Исчерпан суточный лимит ИИ</w:t>
             </w:r>
           </w:p>
@@ -5256,12 +6333,14 @@
           <w:lang w:eastAsia="ru-RU"/>
         </w:rPr>
       </w:pPr>
+      <w:bookmarkStart w:id="12" w:name="_Toc243263532"/>
       <w:r>
         <w:rPr>
           <w:lang w:eastAsia="ru-RU"/>
         </w:rPr>
         <w:t>Требования к работе без интернета</w:t>
       </w:r>
+      <w:bookmarkEnd w:id="12"/>
     </w:p>
     <w:p>
       <w:pPr>
@@ -5356,6 +6435,7 @@
         <w:rPr>
           <w:lang w:eastAsia="ru-RU"/>
         </w:rPr>
+        <w:lastRenderedPageBreak/>
         <w:t xml:space="preserve">Фоновая загрузка фото. Фото улик, снятые без сети, сохраняются на устройстве и загружаются в облако позже. </w:t>
       </w:r>
     </w:p>
@@ -5437,7 +6517,6 @@
         <w:rPr>
           <w:lang w:eastAsia="ru-RU"/>
         </w:rPr>
-        <w:lastRenderedPageBreak/>
         <w:t>Если сеть пропала во время игры, приложение не закрывается и не выдаёт ошибку, а продолжает работу в офлайн-режиме.</w:t>
       </w:r>
     </w:p>
@@ -5472,6 +6551,7 @@
           <w:lang w:eastAsia="ru-RU"/>
         </w:rPr>
       </w:pPr>
+      <w:bookmarkStart w:id="13" w:name="_Toc243263533"/>
       <w:r>
         <w:rPr>
           <w:lang w:eastAsia="ru-RU"/>
@@ -5485,6 +6565,7 @@
         </w:rPr>
         <w:t>MoSCoW</w:t>
       </w:r>
+      <w:bookmarkEnd w:id="13"/>
       <w:proofErr w:type="spellEnd"/>
     </w:p>
     <w:p>
@@ -5546,15 +6627,7 @@
         <w:rPr>
           <w:lang w:eastAsia="ru-RU"/>
         </w:rPr>
-        <w:t>Бе</w:t>
-      </w:r>
-      <w:bookmarkStart w:id="10" w:name="_GoBack"/>
-      <w:bookmarkEnd w:id="10"/>
-      <w:r>
-        <w:rPr>
-          <w:lang w:eastAsia="ru-RU"/>
-        </w:rPr>
-        <w:t>з них приложени</w:t>
+        <w:t>Без них приложени</w:t>
       </w:r>
       <w:r>
         <w:rPr>
@@ -5793,6 +6866,7 @@
         <w:rPr>
           <w:lang w:eastAsia="ru-RU"/>
         </w:rPr>
+        <w:lastRenderedPageBreak/>
         <w:t>озвучка реплик персонажей встро</w:t>
       </w:r>
       <w:r>
@@ -6005,6 +7079,119 @@
 <file path=word/numbering.xml><?xml version="1.0" encoding="utf-8"?>
 <w:numbering xmlns:wpc="http://schemas.microsoft.com/office/word/2010/wordprocessingCanvas" xmlns:cx="http://schemas.microsoft.com/office/drawing/2014/chartex" xmlns:mc="http://schemas.openxmlformats.org/markup-compatibility/2006" xmlns:o="urn:schemas-microsoft-com:office:office" xmlns:r="http://schemas.openxmlformats.org/officeDocument/2006/relationships" xmlns:m="http://schemas.openxmlformats.org/officeDocument/2006/math" xmlns:v="urn:schemas-microsoft-com:vml" xmlns:wp14="http://schemas.microsoft.com/office/word/2010/wordprocessingDrawing" xmlns:wp="http://schemas.openxmlformats.org/drawingml/2006/wordprocessingDrawing" xmlns:w10="urn:schemas-microsoft-com:office:word" xmlns:w="http://schemas.openxmlformats.org/wordprocessingml/2006/main" xmlns:w14="http://schemas.microsoft.com/office/word/2010/wordml" xmlns:w15="http://schemas.microsoft.com/office/word/2012/wordml" xmlns:w16se="http://schemas.microsoft.com/office/word/2015/wordml/symex" xmlns:wpg="http://schemas.microsoft.com/office/word/2010/wordprocessingGroup" xmlns:wpi="http://schemas.microsoft.com/office/word/2010/wordprocessingInk" xmlns:wne="http://schemas.microsoft.com/office/word/2006/wordml" xmlns:wps="http://schemas.microsoft.com/office/word/2010/wordprocessingShape" mc:Ignorable="w14 w15 w16se wp14">
   <w:abstractNum w:abstractNumId="0" w15:restartNumberingAfterBreak="0">
+    <w:nsid w:val="055B267E"/>
+    <w:multiLevelType w:val="hybridMultilevel"/>
+    <w:tmpl w:val="BF6E7DC6"/>
+    <w:lvl w:ilvl="0" w:tplc="7F6028E6">
+      <w:start w:val="1"/>
+      <w:numFmt w:val="bullet"/>
+      <w:lvlText w:val=""/>
+      <w:lvlJc w:val="left"/>
+      <w:pPr>
+        <w:ind w:left="1429" w:hanging="360"/>
+      </w:pPr>
+      <w:rPr>
+        <w:rFonts w:ascii="Symbol" w:hAnsi="Symbol" w:hint="default"/>
+      </w:rPr>
+    </w:lvl>
+    <w:lvl w:ilvl="1" w:tplc="04190003" w:tentative="1">
+      <w:start w:val="1"/>
+      <w:numFmt w:val="bullet"/>
+      <w:lvlText w:val="o"/>
+      <w:lvlJc w:val="left"/>
+      <w:pPr>
+        <w:ind w:left="2149" w:hanging="360"/>
+      </w:pPr>
+      <w:rPr>
+        <w:rFonts w:ascii="Courier New" w:hAnsi="Courier New" w:cs="Courier New" w:hint="default"/>
+      </w:rPr>
+    </w:lvl>
+    <w:lvl w:ilvl="2" w:tplc="04190005" w:tentative="1">
+      <w:start w:val="1"/>
+      <w:numFmt w:val="bullet"/>
+      <w:lvlText w:val=""/>
+      <w:lvlJc w:val="left"/>
+      <w:pPr>
+        <w:ind w:left="2869" w:hanging="360"/>
+      </w:pPr>
+      <w:rPr>
+        <w:rFonts w:ascii="Wingdings" w:hAnsi="Wingdings" w:hint="default"/>
+      </w:rPr>
+    </w:lvl>
+    <w:lvl w:ilvl="3" w:tplc="04190001" w:tentative="1">
+      <w:start w:val="1"/>
+      <w:numFmt w:val="bullet"/>
+      <w:lvlText w:val=""/>
+      <w:lvlJc w:val="left"/>
+      <w:pPr>
+        <w:ind w:left="3589" w:hanging="360"/>
+      </w:pPr>
+      <w:rPr>
+        <w:rFonts w:ascii="Symbol" w:hAnsi="Symbol" w:hint="default"/>
+      </w:rPr>
+    </w:lvl>
+    <w:lvl w:ilvl="4" w:tplc="04190003" w:tentative="1">
+      <w:start w:val="1"/>
+      <w:numFmt w:val="bullet"/>
+      <w:lvlText w:val="o"/>
+      <w:lvlJc w:val="left"/>
+      <w:pPr>
+        <w:ind w:left="4309" w:hanging="360"/>
+      </w:pPr>
+      <w:rPr>
+        <w:rFonts w:ascii="Courier New" w:hAnsi="Courier New" w:cs="Courier New" w:hint="default"/>
+      </w:rPr>
+    </w:lvl>
+    <w:lvl w:ilvl="5" w:tplc="04190005" w:tentative="1">
+      <w:start w:val="1"/>
+      <w:numFmt w:val="bullet"/>
+      <w:lvlText w:val=""/>
+      <w:lvlJc w:val="left"/>
+      <w:pPr>
+        <w:ind w:left="5029" w:hanging="360"/>
+      </w:pPr>
+      <w:rPr>
+        <w:rFonts w:ascii="Wingdings" w:hAnsi="Wingdings" w:hint="default"/>
+      </w:rPr>
+    </w:lvl>
+    <w:lvl w:ilvl="6" w:tplc="04190001" w:tentative="1">
+      <w:start w:val="1"/>
+      <w:numFmt w:val="bullet"/>
+      <w:lvlText w:val=""/>
+      <w:lvlJc w:val="left"/>
+      <w:pPr>
+        <w:ind w:left="5749" w:hanging="360"/>
+      </w:pPr>
+      <w:rPr>
+        <w:rFonts w:ascii="Symbol" w:hAnsi="Symbol" w:hint="default"/>
+      </w:rPr>
+    </w:lvl>
+    <w:lvl w:ilvl="7" w:tplc="04190003" w:tentative="1">
+      <w:start w:val="1"/>
+      <w:numFmt w:val="bullet"/>
+      <w:lvlText w:val="o"/>
+      <w:lvlJc w:val="left"/>
+      <w:pPr>
+        <w:ind w:left="6469" w:hanging="360"/>
+      </w:pPr>
+      <w:rPr>
+        <w:rFonts w:ascii="Courier New" w:hAnsi="Courier New" w:cs="Courier New" w:hint="default"/>
+      </w:rPr>
+    </w:lvl>
+    <w:lvl w:ilvl="8" w:tplc="04190005" w:tentative="1">
+      <w:start w:val="1"/>
+      <w:numFmt w:val="bullet"/>
+      <w:lvlText w:val=""/>
+      <w:lvlJc w:val="left"/>
+      <w:pPr>
+        <w:ind w:left="7189" w:hanging="360"/>
+      </w:pPr>
+      <w:rPr>
+        <w:rFonts w:ascii="Wingdings" w:hAnsi="Wingdings" w:hint="default"/>
+      </w:rPr>
+    </w:lvl>
+  </w:abstractNum>
+  <w:abstractNum w:abstractNumId="1" w15:restartNumberingAfterBreak="0">
     <w:nsid w:val="06353D4F"/>
     <w:multiLevelType w:val="hybridMultilevel"/>
     <w:tmpl w:val="BDB4379E"/>
@@ -6093,7 +7280,7 @@
       </w:pPr>
     </w:lvl>
   </w:abstractNum>
-  <w:abstractNum w:abstractNumId="1" w15:restartNumberingAfterBreak="0">
+  <w:abstractNum w:abstractNumId="2" w15:restartNumberingAfterBreak="0">
     <w:nsid w:val="07991F38"/>
     <w:multiLevelType w:val="hybridMultilevel"/>
     <w:tmpl w:val="C8086BE6"/>
@@ -6182,7 +7369,7 @@
       </w:pPr>
     </w:lvl>
   </w:abstractNum>
-  <w:abstractNum w:abstractNumId="2" w15:restartNumberingAfterBreak="0">
+  <w:abstractNum w:abstractNumId="3" w15:restartNumberingAfterBreak="0">
     <w:nsid w:val="08DF05E0"/>
     <w:multiLevelType w:val="hybridMultilevel"/>
     <w:tmpl w:val="91088800"/>
@@ -6271,7 +7458,7 @@
       </w:pPr>
     </w:lvl>
   </w:abstractNum>
-  <w:abstractNum w:abstractNumId="3" w15:restartNumberingAfterBreak="0">
+  <w:abstractNum w:abstractNumId="4" w15:restartNumberingAfterBreak="0">
     <w:nsid w:val="0A8A6F1A"/>
     <w:multiLevelType w:val="hybridMultilevel"/>
     <w:tmpl w:val="0B6C8238"/>
@@ -6384,7 +7571,7 @@
       </w:rPr>
     </w:lvl>
   </w:abstractNum>
-  <w:abstractNum w:abstractNumId="4" w15:restartNumberingAfterBreak="0">
+  <w:abstractNum w:abstractNumId="5" w15:restartNumberingAfterBreak="0">
     <w:nsid w:val="125A3D0D"/>
     <w:multiLevelType w:val="hybridMultilevel"/>
     <w:tmpl w:val="738E6D20"/>
@@ -6473,7 +7660,7 @@
       </w:pPr>
     </w:lvl>
   </w:abstractNum>
-  <w:abstractNum w:abstractNumId="5" w15:restartNumberingAfterBreak="0">
+  <w:abstractNum w:abstractNumId="6" w15:restartNumberingAfterBreak="0">
     <w:nsid w:val="131F4DD3"/>
     <w:multiLevelType w:val="hybridMultilevel"/>
     <w:tmpl w:val="9E582B84"/>
@@ -6586,7 +7773,7 @@
       </w:rPr>
     </w:lvl>
   </w:abstractNum>
-  <w:abstractNum w:abstractNumId="6" w15:restartNumberingAfterBreak="0">
+  <w:abstractNum w:abstractNumId="7" w15:restartNumberingAfterBreak="0">
     <w:nsid w:val="16DF2642"/>
     <w:multiLevelType w:val="hybridMultilevel"/>
     <w:tmpl w:val="89C84962"/>
@@ -6699,7 +7886,7 @@
       </w:rPr>
     </w:lvl>
   </w:abstractNum>
-  <w:abstractNum w:abstractNumId="7" w15:restartNumberingAfterBreak="0">
+  <w:abstractNum w:abstractNumId="8" w15:restartNumberingAfterBreak="0">
     <w:nsid w:val="17AA1874"/>
     <w:multiLevelType w:val="hybridMultilevel"/>
     <w:tmpl w:val="5366FA26"/>
@@ -6812,7 +7999,7 @@
       </w:rPr>
     </w:lvl>
   </w:abstractNum>
-  <w:abstractNum w:abstractNumId="8" w15:restartNumberingAfterBreak="0">
+  <w:abstractNum w:abstractNumId="9" w15:restartNumberingAfterBreak="0">
     <w:nsid w:val="1BC46186"/>
     <w:multiLevelType w:val="hybridMultilevel"/>
     <w:tmpl w:val="567C6E24"/>
@@ -6925,7 +8112,7 @@
       </w:rPr>
     </w:lvl>
   </w:abstractNum>
-  <w:abstractNum w:abstractNumId="9" w15:restartNumberingAfterBreak="0">
+  <w:abstractNum w:abstractNumId="10" w15:restartNumberingAfterBreak="0">
     <w:nsid w:val="1F5703E2"/>
     <w:multiLevelType w:val="hybridMultilevel"/>
     <w:tmpl w:val="8A14B6F0"/>
@@ -7014,7 +8201,7 @@
       </w:pPr>
     </w:lvl>
   </w:abstractNum>
-  <w:abstractNum w:abstractNumId="10" w15:restartNumberingAfterBreak="0">
+  <w:abstractNum w:abstractNumId="11" w15:restartNumberingAfterBreak="0">
     <w:nsid w:val="244B1859"/>
     <w:multiLevelType w:val="hybridMultilevel"/>
     <w:tmpl w:val="5120B764"/>
@@ -7127,7 +8314,7 @@
       </w:rPr>
     </w:lvl>
   </w:abstractNum>
-  <w:abstractNum w:abstractNumId="11" w15:restartNumberingAfterBreak="0">
+  <w:abstractNum w:abstractNumId="12" w15:restartNumberingAfterBreak="0">
     <w:nsid w:val="24825868"/>
     <w:multiLevelType w:val="hybridMultilevel"/>
     <w:tmpl w:val="90F8E2D4"/>
@@ -7240,7 +8427,7 @@
       </w:rPr>
     </w:lvl>
   </w:abstractNum>
-  <w:abstractNum w:abstractNumId="12" w15:restartNumberingAfterBreak="0">
+  <w:abstractNum w:abstractNumId="13" w15:restartNumberingAfterBreak="0">
     <w:nsid w:val="2BFB6CF4"/>
     <w:multiLevelType w:val="hybridMultilevel"/>
     <w:tmpl w:val="213A2ABE"/>
@@ -7353,7 +8540,7 @@
       </w:rPr>
     </w:lvl>
   </w:abstractNum>
-  <w:abstractNum w:abstractNumId="13" w15:restartNumberingAfterBreak="0">
+  <w:abstractNum w:abstractNumId="14" w15:restartNumberingAfterBreak="0">
     <w:nsid w:val="2E896BDD"/>
     <w:multiLevelType w:val="hybridMultilevel"/>
     <w:tmpl w:val="B3AA244A"/>
@@ -7442,7 +8629,7 @@
       </w:pPr>
     </w:lvl>
   </w:abstractNum>
-  <w:abstractNum w:abstractNumId="14" w15:restartNumberingAfterBreak="0">
+  <w:abstractNum w:abstractNumId="15" w15:restartNumberingAfterBreak="0">
     <w:nsid w:val="311A70D7"/>
     <w:multiLevelType w:val="hybridMultilevel"/>
     <w:tmpl w:val="2FF88FFA"/>
@@ -7555,7 +8742,7 @@
       </w:rPr>
     </w:lvl>
   </w:abstractNum>
-  <w:abstractNum w:abstractNumId="15" w15:restartNumberingAfterBreak="0">
+  <w:abstractNum w:abstractNumId="16" w15:restartNumberingAfterBreak="0">
     <w:nsid w:val="385A11DC"/>
     <w:multiLevelType w:val="hybridMultilevel"/>
     <w:tmpl w:val="85B85062"/>
@@ -7644,7 +8831,7 @@
       </w:pPr>
     </w:lvl>
   </w:abstractNum>
-  <w:abstractNum w:abstractNumId="16" w15:restartNumberingAfterBreak="0">
+  <w:abstractNum w:abstractNumId="17" w15:restartNumberingAfterBreak="0">
     <w:nsid w:val="3B4801BB"/>
     <w:multiLevelType w:val="hybridMultilevel"/>
     <w:tmpl w:val="5672B1AA"/>
@@ -7733,7 +8920,7 @@
       </w:pPr>
     </w:lvl>
   </w:abstractNum>
-  <w:abstractNum w:abstractNumId="17" w15:restartNumberingAfterBreak="0">
+  <w:abstractNum w:abstractNumId="18" w15:restartNumberingAfterBreak="0">
     <w:nsid w:val="3D57064D"/>
     <w:multiLevelType w:val="hybridMultilevel"/>
     <w:tmpl w:val="DADE03B4"/>
@@ -7846,7 +9033,7 @@
       </w:rPr>
     </w:lvl>
   </w:abstractNum>
-  <w:abstractNum w:abstractNumId="18" w15:restartNumberingAfterBreak="0">
+  <w:abstractNum w:abstractNumId="19" w15:restartNumberingAfterBreak="0">
     <w:nsid w:val="3FF1551E"/>
     <w:multiLevelType w:val="hybridMultilevel"/>
     <w:tmpl w:val="7174EA8A"/>
@@ -7959,7 +9146,7 @@
       </w:rPr>
     </w:lvl>
   </w:abstractNum>
-  <w:abstractNum w:abstractNumId="19" w15:restartNumberingAfterBreak="0">
+  <w:abstractNum w:abstractNumId="20" w15:restartNumberingAfterBreak="0">
     <w:nsid w:val="3FFF562D"/>
     <w:multiLevelType w:val="multilevel"/>
     <w:tmpl w:val="9822CC4A"/>
@@ -8072,7 +9259,233 @@
       </w:rPr>
     </w:lvl>
   </w:abstractNum>
-  <w:abstractNum w:abstractNumId="20" w15:restartNumberingAfterBreak="0">
+  <w:abstractNum w:abstractNumId="21" w15:restartNumberingAfterBreak="0">
+    <w:nsid w:val="43CF2D1E"/>
+    <w:multiLevelType w:val="hybridMultilevel"/>
+    <w:tmpl w:val="053E72CA"/>
+    <w:lvl w:ilvl="0" w:tplc="04190001">
+      <w:start w:val="1"/>
+      <w:numFmt w:val="bullet"/>
+      <w:lvlText w:val=""/>
+      <w:lvlJc w:val="left"/>
+      <w:pPr>
+        <w:ind w:left="1429" w:hanging="360"/>
+      </w:pPr>
+      <w:rPr>
+        <w:rFonts w:ascii="Symbol" w:hAnsi="Symbol" w:hint="default"/>
+      </w:rPr>
+    </w:lvl>
+    <w:lvl w:ilvl="1" w:tplc="04190003" w:tentative="1">
+      <w:start w:val="1"/>
+      <w:numFmt w:val="bullet"/>
+      <w:lvlText w:val="o"/>
+      <w:lvlJc w:val="left"/>
+      <w:pPr>
+        <w:ind w:left="2149" w:hanging="360"/>
+      </w:pPr>
+      <w:rPr>
+        <w:rFonts w:ascii="Courier New" w:hAnsi="Courier New" w:cs="Courier New" w:hint="default"/>
+      </w:rPr>
+    </w:lvl>
+    <w:lvl w:ilvl="2" w:tplc="04190005" w:tentative="1">
+      <w:start w:val="1"/>
+      <w:numFmt w:val="bullet"/>
+      <w:lvlText w:val=""/>
+      <w:lvlJc w:val="left"/>
+      <w:pPr>
+        <w:ind w:left="2869" w:hanging="360"/>
+      </w:pPr>
+      <w:rPr>
+        <w:rFonts w:ascii="Wingdings" w:hAnsi="Wingdings" w:hint="default"/>
+      </w:rPr>
+    </w:lvl>
+    <w:lvl w:ilvl="3" w:tplc="04190001" w:tentative="1">
+      <w:start w:val="1"/>
+      <w:numFmt w:val="bullet"/>
+      <w:lvlText w:val=""/>
+      <w:lvlJc w:val="left"/>
+      <w:pPr>
+        <w:ind w:left="3589" w:hanging="360"/>
+      </w:pPr>
+      <w:rPr>
+        <w:rFonts w:ascii="Symbol" w:hAnsi="Symbol" w:hint="default"/>
+      </w:rPr>
+    </w:lvl>
+    <w:lvl w:ilvl="4" w:tplc="04190003" w:tentative="1">
+      <w:start w:val="1"/>
+      <w:numFmt w:val="bullet"/>
+      <w:lvlText w:val="o"/>
+      <w:lvlJc w:val="left"/>
+      <w:pPr>
+        <w:ind w:left="4309" w:hanging="360"/>
+      </w:pPr>
+      <w:rPr>
+        <w:rFonts w:ascii="Courier New" w:hAnsi="Courier New" w:cs="Courier New" w:hint="default"/>
+      </w:rPr>
+    </w:lvl>
+    <w:lvl w:ilvl="5" w:tplc="04190005" w:tentative="1">
+      <w:start w:val="1"/>
+      <w:numFmt w:val="bullet"/>
+      <w:lvlText w:val=""/>
+      <w:lvlJc w:val="left"/>
+      <w:pPr>
+        <w:ind w:left="5029" w:hanging="360"/>
+      </w:pPr>
+      <w:rPr>
+        <w:rFonts w:ascii="Wingdings" w:hAnsi="Wingdings" w:hint="default"/>
+      </w:rPr>
+    </w:lvl>
+    <w:lvl w:ilvl="6" w:tplc="04190001" w:tentative="1">
+      <w:start w:val="1"/>
+      <w:numFmt w:val="bullet"/>
+      <w:lvlText w:val=""/>
+      <w:lvlJc w:val="left"/>
+      <w:pPr>
+        <w:ind w:left="5749" w:hanging="360"/>
+      </w:pPr>
+      <w:rPr>
+        <w:rFonts w:ascii="Symbol" w:hAnsi="Symbol" w:hint="default"/>
+      </w:rPr>
+    </w:lvl>
+    <w:lvl w:ilvl="7" w:tplc="04190003" w:tentative="1">
+      <w:start w:val="1"/>
+      <w:numFmt w:val="bullet"/>
+      <w:lvlText w:val="o"/>
+      <w:lvlJc w:val="left"/>
+      <w:pPr>
+        <w:ind w:left="6469" w:hanging="360"/>
+      </w:pPr>
+      <w:rPr>
+        <w:rFonts w:ascii="Courier New" w:hAnsi="Courier New" w:cs="Courier New" w:hint="default"/>
+      </w:rPr>
+    </w:lvl>
+    <w:lvl w:ilvl="8" w:tplc="04190005" w:tentative="1">
+      <w:start w:val="1"/>
+      <w:numFmt w:val="bullet"/>
+      <w:lvlText w:val=""/>
+      <w:lvlJc w:val="left"/>
+      <w:pPr>
+        <w:ind w:left="7189" w:hanging="360"/>
+      </w:pPr>
+      <w:rPr>
+        <w:rFonts w:ascii="Wingdings" w:hAnsi="Wingdings" w:hint="default"/>
+      </w:rPr>
+    </w:lvl>
+  </w:abstractNum>
+  <w:abstractNum w:abstractNumId="22" w15:restartNumberingAfterBreak="0">
+    <w:nsid w:val="44F22ECF"/>
+    <w:multiLevelType w:val="hybridMultilevel"/>
+    <w:tmpl w:val="10029DFC"/>
+    <w:lvl w:ilvl="0" w:tplc="7F6028E6">
+      <w:start w:val="1"/>
+      <w:numFmt w:val="bullet"/>
+      <w:lvlText w:val=""/>
+      <w:lvlJc w:val="left"/>
+      <w:pPr>
+        <w:ind w:left="1429" w:hanging="360"/>
+      </w:pPr>
+      <w:rPr>
+        <w:rFonts w:ascii="Symbol" w:hAnsi="Symbol" w:hint="default"/>
+      </w:rPr>
+    </w:lvl>
+    <w:lvl w:ilvl="1" w:tplc="04190003" w:tentative="1">
+      <w:start w:val="1"/>
+      <w:numFmt w:val="bullet"/>
+      <w:lvlText w:val="o"/>
+      <w:lvlJc w:val="left"/>
+      <w:pPr>
+        <w:ind w:left="2149" w:hanging="360"/>
+      </w:pPr>
+      <w:rPr>
+        <w:rFonts w:ascii="Courier New" w:hAnsi="Courier New" w:cs="Courier New" w:hint="default"/>
+      </w:rPr>
+    </w:lvl>
+    <w:lvl w:ilvl="2" w:tplc="04190005" w:tentative="1">
+      <w:start w:val="1"/>
+      <w:numFmt w:val="bullet"/>
+      <w:lvlText w:val=""/>
+      <w:lvlJc w:val="left"/>
+      <w:pPr>
+        <w:ind w:left="2869" w:hanging="360"/>
+      </w:pPr>
+      <w:rPr>
+        <w:rFonts w:ascii="Wingdings" w:hAnsi="Wingdings" w:hint="default"/>
+      </w:rPr>
+    </w:lvl>
+    <w:lvl w:ilvl="3" w:tplc="04190001" w:tentative="1">
+      <w:start w:val="1"/>
+      <w:numFmt w:val="bullet"/>
+      <w:lvlText w:val=""/>
+      <w:lvlJc w:val="left"/>
+      <w:pPr>
+        <w:ind w:left="3589" w:hanging="360"/>
+      </w:pPr>
+      <w:rPr>
+        <w:rFonts w:ascii="Symbol" w:hAnsi="Symbol" w:hint="default"/>
+      </w:rPr>
+    </w:lvl>
+    <w:lvl w:ilvl="4" w:tplc="04190003" w:tentative="1">
+      <w:start w:val="1"/>
+      <w:numFmt w:val="bullet"/>
+      <w:lvlText w:val="o"/>
+      <w:lvlJc w:val="left"/>
+      <w:pPr>
+        <w:ind w:left="4309" w:hanging="360"/>
+      </w:pPr>
+      <w:rPr>
+        <w:rFonts w:ascii="Courier New" w:hAnsi="Courier New" w:cs="Courier New" w:hint="default"/>
+      </w:rPr>
+    </w:lvl>
+    <w:lvl w:ilvl="5" w:tplc="04190005" w:tentative="1">
+      <w:start w:val="1"/>
+      <w:numFmt w:val="bullet"/>
+      <w:lvlText w:val=""/>
+      <w:lvlJc w:val="left"/>
+      <w:pPr>
+        <w:ind w:left="5029" w:hanging="360"/>
+      </w:pPr>
+      <w:rPr>
+        <w:rFonts w:ascii="Wingdings" w:hAnsi="Wingdings" w:hint="default"/>
+      </w:rPr>
+    </w:lvl>
+    <w:lvl w:ilvl="6" w:tplc="04190001" w:tentative="1">
+      <w:start w:val="1"/>
+      <w:numFmt w:val="bullet"/>
+      <w:lvlText w:val=""/>
+      <w:lvlJc w:val="left"/>
+      <w:pPr>
+        <w:ind w:left="5749" w:hanging="360"/>
+      </w:pPr>
+      <w:rPr>
+        <w:rFonts w:ascii="Symbol" w:hAnsi="Symbol" w:hint="default"/>
+      </w:rPr>
+    </w:lvl>
+    <w:lvl w:ilvl="7" w:tplc="04190003" w:tentative="1">
+      <w:start w:val="1"/>
+      <w:numFmt w:val="bullet"/>
+      <w:lvlText w:val="o"/>
+      <w:lvlJc w:val="left"/>
+      <w:pPr>
+        <w:ind w:left="6469" w:hanging="360"/>
+      </w:pPr>
+      <w:rPr>
+        <w:rFonts w:ascii="Courier New" w:hAnsi="Courier New" w:cs="Courier New" w:hint="default"/>
+      </w:rPr>
+    </w:lvl>
+    <w:lvl w:ilvl="8" w:tplc="04190005" w:tentative="1">
+      <w:start w:val="1"/>
+      <w:numFmt w:val="bullet"/>
+      <w:lvlText w:val=""/>
+      <w:lvlJc w:val="left"/>
+      <w:pPr>
+        <w:ind w:left="7189" w:hanging="360"/>
+      </w:pPr>
+      <w:rPr>
+        <w:rFonts w:ascii="Wingdings" w:hAnsi="Wingdings" w:hint="default"/>
+      </w:rPr>
+    </w:lvl>
+  </w:abstractNum>
+  <w:abstractNum w:abstractNumId="23" w15:restartNumberingAfterBreak="0">
     <w:nsid w:val="4566225B"/>
     <w:multiLevelType w:val="hybridMultilevel"/>
     <w:tmpl w:val="8C62F07A"/>
@@ -8185,7 +9598,120 @@
       </w:rPr>
     </w:lvl>
   </w:abstractNum>
-  <w:abstractNum w:abstractNumId="21" w15:restartNumberingAfterBreak="0">
+  <w:abstractNum w:abstractNumId="24" w15:restartNumberingAfterBreak="0">
+    <w:nsid w:val="497271AE"/>
+    <w:multiLevelType w:val="hybridMultilevel"/>
+    <w:tmpl w:val="C370258E"/>
+    <w:lvl w:ilvl="0" w:tplc="7F6028E6">
+      <w:start w:val="1"/>
+      <w:numFmt w:val="bullet"/>
+      <w:lvlText w:val=""/>
+      <w:lvlJc w:val="left"/>
+      <w:pPr>
+        <w:ind w:left="1429" w:hanging="360"/>
+      </w:pPr>
+      <w:rPr>
+        <w:rFonts w:ascii="Symbol" w:hAnsi="Symbol" w:hint="default"/>
+      </w:rPr>
+    </w:lvl>
+    <w:lvl w:ilvl="1" w:tplc="04190003" w:tentative="1">
+      <w:start w:val="1"/>
+      <w:numFmt w:val="bullet"/>
+      <w:lvlText w:val="o"/>
+      <w:lvlJc w:val="left"/>
+      <w:pPr>
+        <w:ind w:left="2149" w:hanging="360"/>
+      </w:pPr>
+      <w:rPr>
+        <w:rFonts w:ascii="Courier New" w:hAnsi="Courier New" w:cs="Courier New" w:hint="default"/>
+      </w:rPr>
+    </w:lvl>
+    <w:lvl w:ilvl="2" w:tplc="04190005" w:tentative="1">
+      <w:start w:val="1"/>
+      <w:numFmt w:val="bullet"/>
+      <w:lvlText w:val=""/>
+      <w:lvlJc w:val="left"/>
+      <w:pPr>
+        <w:ind w:left="2869" w:hanging="360"/>
+      </w:pPr>
+      <w:rPr>
+        <w:rFonts w:ascii="Wingdings" w:hAnsi="Wingdings" w:hint="default"/>
+      </w:rPr>
+    </w:lvl>
+    <w:lvl w:ilvl="3" w:tplc="04190001" w:tentative="1">
+      <w:start w:val="1"/>
+      <w:numFmt w:val="bullet"/>
+      <w:lvlText w:val=""/>
+      <w:lvlJc w:val="left"/>
+      <w:pPr>
+        <w:ind w:left="3589" w:hanging="360"/>
+      </w:pPr>
+      <w:rPr>
+        <w:rFonts w:ascii="Symbol" w:hAnsi="Symbol" w:hint="default"/>
+      </w:rPr>
+    </w:lvl>
+    <w:lvl w:ilvl="4" w:tplc="04190003" w:tentative="1">
+      <w:start w:val="1"/>
+      <w:numFmt w:val="bullet"/>
+      <w:lvlText w:val="o"/>
+      <w:lvlJc w:val="left"/>
+      <w:pPr>
+        <w:ind w:left="4309" w:hanging="360"/>
+      </w:pPr>
+      <w:rPr>
+        <w:rFonts w:ascii="Courier New" w:hAnsi="Courier New" w:cs="Courier New" w:hint="default"/>
+      </w:rPr>
+    </w:lvl>
+    <w:lvl w:ilvl="5" w:tplc="04190005" w:tentative="1">
+      <w:start w:val="1"/>
+      <w:numFmt w:val="bullet"/>
+      <w:lvlText w:val=""/>
+      <w:lvlJc w:val="left"/>
+      <w:pPr>
+        <w:ind w:left="5029" w:hanging="360"/>
+      </w:pPr>
+      <w:rPr>
+        <w:rFonts w:ascii="Wingdings" w:hAnsi="Wingdings" w:hint="default"/>
+      </w:rPr>
+    </w:lvl>
+    <w:lvl w:ilvl="6" w:tplc="04190001" w:tentative="1">
+      <w:start w:val="1"/>
+      <w:numFmt w:val="bullet"/>
+      <w:lvlText w:val=""/>
+      <w:lvlJc w:val="left"/>
+      <w:pPr>
+        <w:ind w:left="5749" w:hanging="360"/>
+      </w:pPr>
+      <w:rPr>
+        <w:rFonts w:ascii="Symbol" w:hAnsi="Symbol" w:hint="default"/>
+      </w:rPr>
+    </w:lvl>
+    <w:lvl w:ilvl="7" w:tplc="04190003" w:tentative="1">
+      <w:start w:val="1"/>
+      <w:numFmt w:val="bullet"/>
+      <w:lvlText w:val="o"/>
+      <w:lvlJc w:val="left"/>
+      <w:pPr>
+        <w:ind w:left="6469" w:hanging="360"/>
+      </w:pPr>
+      <w:rPr>
+        <w:rFonts w:ascii="Courier New" w:hAnsi="Courier New" w:cs="Courier New" w:hint="default"/>
+      </w:rPr>
+    </w:lvl>
+    <w:lvl w:ilvl="8" w:tplc="04190005" w:tentative="1">
+      <w:start w:val="1"/>
+      <w:numFmt w:val="bullet"/>
+      <w:lvlText w:val=""/>
+      <w:lvlJc w:val="left"/>
+      <w:pPr>
+        <w:ind w:left="7189" w:hanging="360"/>
+      </w:pPr>
+      <w:rPr>
+        <w:rFonts w:ascii="Wingdings" w:hAnsi="Wingdings" w:hint="default"/>
+      </w:rPr>
+    </w:lvl>
+  </w:abstractNum>
+  <w:abstractNum w:abstractNumId="25" w15:restartNumberingAfterBreak="0">
     <w:nsid w:val="4BF24ABC"/>
     <w:multiLevelType w:val="hybridMultilevel"/>
     <w:tmpl w:val="D3AE741A"/>
@@ -8274,7 +9800,7 @@
       </w:pPr>
     </w:lvl>
   </w:abstractNum>
-  <w:abstractNum w:abstractNumId="22" w15:restartNumberingAfterBreak="0">
+  <w:abstractNum w:abstractNumId="26" w15:restartNumberingAfterBreak="0">
     <w:nsid w:val="4FD318BF"/>
     <w:multiLevelType w:val="hybridMultilevel"/>
     <w:tmpl w:val="1B1AF7A4"/>
@@ -8387,7 +9913,7 @@
       </w:rPr>
     </w:lvl>
   </w:abstractNum>
-  <w:abstractNum w:abstractNumId="23" w15:restartNumberingAfterBreak="0">
+  <w:abstractNum w:abstractNumId="27" w15:restartNumberingAfterBreak="0">
     <w:nsid w:val="50517234"/>
     <w:multiLevelType w:val="hybridMultilevel"/>
     <w:tmpl w:val="FC921BF0"/>
@@ -8500,7 +10026,7 @@
       </w:rPr>
     </w:lvl>
   </w:abstractNum>
-  <w:abstractNum w:abstractNumId="24" w15:restartNumberingAfterBreak="0">
+  <w:abstractNum w:abstractNumId="28" w15:restartNumberingAfterBreak="0">
     <w:nsid w:val="52E4322B"/>
     <w:multiLevelType w:val="hybridMultilevel"/>
     <w:tmpl w:val="03263EB0"/>
@@ -8589,7 +10115,7 @@
       </w:pPr>
     </w:lvl>
   </w:abstractNum>
-  <w:abstractNum w:abstractNumId="25" w15:restartNumberingAfterBreak="0">
+  <w:abstractNum w:abstractNumId="29" w15:restartNumberingAfterBreak="0">
     <w:nsid w:val="53A80F61"/>
     <w:multiLevelType w:val="hybridMultilevel"/>
     <w:tmpl w:val="67580E76"/>
@@ -8702,7 +10228,93 @@
       </w:rPr>
     </w:lvl>
   </w:abstractNum>
-  <w:abstractNum w:abstractNumId="26" w15:restartNumberingAfterBreak="0">
+  <w:abstractNum w:abstractNumId="30" w15:restartNumberingAfterBreak="0">
+    <w:nsid w:val="546622A5"/>
+    <w:multiLevelType w:val="hybridMultilevel"/>
+    <w:tmpl w:val="60A892C2"/>
+    <w:lvl w:ilvl="0" w:tplc="04190011">
+      <w:start w:val="1"/>
+      <w:numFmt w:val="decimal"/>
+      <w:lvlText w:val="%1)"/>
+      <w:lvlJc w:val="left"/>
+      <w:pPr>
+        <w:ind w:left="1429" w:hanging="360"/>
+      </w:pPr>
+    </w:lvl>
+    <w:lvl w:ilvl="1" w:tplc="04190019" w:tentative="1">
+      <w:start w:val="1"/>
+      <w:numFmt w:val="lowerLetter"/>
+      <w:lvlText w:val="%2."/>
+      <w:lvlJc w:val="left"/>
+      <w:pPr>
+        <w:ind w:left="2149" w:hanging="360"/>
+      </w:pPr>
+    </w:lvl>
+    <w:lvl w:ilvl="2" w:tplc="0419001B" w:tentative="1">
+      <w:start w:val="1"/>
+      <w:numFmt w:val="lowerRoman"/>
+      <w:lvlText w:val="%3."/>
+      <w:lvlJc w:val="right"/>
+      <w:pPr>
+        <w:ind w:left="2869" w:hanging="180"/>
+      </w:pPr>
+    </w:lvl>
+    <w:lvl w:ilvl="3" w:tplc="0419000F" w:tentative="1">
+      <w:start w:val="1"/>
+      <w:numFmt w:val="decimal"/>
+      <w:lvlText w:val="%4."/>
+      <w:lvlJc w:val="left"/>
+      <w:pPr>
+        <w:ind w:left="3589" w:hanging="360"/>
+      </w:pPr>
+    </w:lvl>
+    <w:lvl w:ilvl="4" w:tplc="04190019" w:tentative="1">
+      <w:start w:val="1"/>
+      <w:numFmt w:val="lowerLetter"/>
+      <w:lvlText w:val="%5."/>
+      <w:lvlJc w:val="left"/>
+      <w:pPr>
+        <w:ind w:left="4309" w:hanging="360"/>
+      </w:pPr>
+    </w:lvl>
+    <w:lvl w:ilvl="5" w:tplc="0419001B" w:tentative="1">
+      <w:start w:val="1"/>
+      <w:numFmt w:val="lowerRoman"/>
+      <w:lvlText w:val="%6."/>
+      <w:lvlJc w:val="right"/>
+      <w:pPr>
+        <w:ind w:left="5029" w:hanging="180"/>
+      </w:pPr>
+    </w:lvl>
+    <w:lvl w:ilvl="6" w:tplc="0419000F" w:tentative="1">
+      <w:start w:val="1"/>
+      <w:numFmt w:val="decimal"/>
+      <w:lvlText w:val="%7."/>
+      <w:lvlJc w:val="left"/>
+      <w:pPr>
+        <w:ind w:left="5749" w:hanging="360"/>
+      </w:pPr>
+    </w:lvl>
+    <w:lvl w:ilvl="7" w:tplc="04190019" w:tentative="1">
+      <w:start w:val="1"/>
+      <w:numFmt w:val="lowerLetter"/>
+      <w:lvlText w:val="%8."/>
+      <w:lvlJc w:val="left"/>
+      <w:pPr>
+        <w:ind w:left="6469" w:hanging="360"/>
+      </w:pPr>
+    </w:lvl>
+    <w:lvl w:ilvl="8" w:tplc="0419001B" w:tentative="1">
+      <w:start w:val="1"/>
+      <w:numFmt w:val="lowerRoman"/>
+      <w:lvlText w:val="%9."/>
+      <w:lvlJc w:val="right"/>
+      <w:pPr>
+        <w:ind w:left="7189" w:hanging="180"/>
+      </w:pPr>
+    </w:lvl>
+  </w:abstractNum>
+  <w:abstractNum w:abstractNumId="31" w15:restartNumberingAfterBreak="0">
     <w:nsid w:val="552D6126"/>
     <w:multiLevelType w:val="hybridMultilevel"/>
     <w:tmpl w:val="9434360E"/>
@@ -8788,7 +10400,120 @@
       </w:pPr>
     </w:lvl>
   </w:abstractNum>
-  <w:abstractNum w:abstractNumId="27" w15:restartNumberingAfterBreak="0">
+  <w:abstractNum w:abstractNumId="32" w15:restartNumberingAfterBreak="0">
+    <w:nsid w:val="5D0A221A"/>
+    <w:multiLevelType w:val="hybridMultilevel"/>
+    <w:tmpl w:val="D07CC9A0"/>
+    <w:lvl w:ilvl="0" w:tplc="7F6028E6">
+      <w:start w:val="1"/>
+      <w:numFmt w:val="bullet"/>
+      <w:lvlText w:val=""/>
+      <w:lvlJc w:val="left"/>
+      <w:pPr>
+        <w:ind w:left="1429" w:hanging="360"/>
+      </w:pPr>
+      <w:rPr>
+        <w:rFonts w:ascii="Symbol" w:hAnsi="Symbol" w:hint="default"/>
+      </w:rPr>
+    </w:lvl>
+    <w:lvl w:ilvl="1" w:tplc="04190003" w:tentative="1">
+      <w:start w:val="1"/>
+      <w:numFmt w:val="bullet"/>
+      <w:lvlText w:val="o"/>
+      <w:lvlJc w:val="left"/>
+      <w:pPr>
+        <w:ind w:left="2149" w:hanging="360"/>
+      </w:pPr>
+      <w:rPr>
+        <w:rFonts w:ascii="Courier New" w:hAnsi="Courier New" w:cs="Courier New" w:hint="default"/>
+      </w:rPr>
+    </w:lvl>
+    <w:lvl w:ilvl="2" w:tplc="04190005" w:tentative="1">
+      <w:start w:val="1"/>
+      <w:numFmt w:val="bullet"/>
+      <w:lvlText w:val=""/>
+      <w:lvlJc w:val="left"/>
+      <w:pPr>
+        <w:ind w:left="2869" w:hanging="360"/>
+      </w:pPr>
+      <w:rPr>
+        <w:rFonts w:ascii="Wingdings" w:hAnsi="Wingdings" w:hint="default"/>
+      </w:rPr>
+    </w:lvl>
+    <w:lvl w:ilvl="3" w:tplc="04190001" w:tentative="1">
+      <w:start w:val="1"/>
+      <w:numFmt w:val="bullet"/>
+      <w:lvlText w:val=""/>
+      <w:lvlJc w:val="left"/>
+      <w:pPr>
+        <w:ind w:left="3589" w:hanging="360"/>
+      </w:pPr>
+      <w:rPr>
+        <w:rFonts w:ascii="Symbol" w:hAnsi="Symbol" w:hint="default"/>
+      </w:rPr>
+    </w:lvl>
+    <w:lvl w:ilvl="4" w:tplc="04190003" w:tentative="1">
+      <w:start w:val="1"/>
+      <w:numFmt w:val="bullet"/>
+      <w:lvlText w:val="o"/>
+      <w:lvlJc w:val="left"/>
+      <w:pPr>
+        <w:ind w:left="4309" w:hanging="360"/>
+      </w:pPr>
+      <w:rPr>
+        <w:rFonts w:ascii="Courier New" w:hAnsi="Courier New" w:cs="Courier New" w:hint="default"/>
+      </w:rPr>
+    </w:lvl>
+    <w:lvl w:ilvl="5" w:tplc="04190005" w:tentative="1">
+      <w:start w:val="1"/>
+      <w:numFmt w:val="bullet"/>
+      <w:lvlText w:val=""/>
+      <w:lvlJc w:val="left"/>
+      <w:pPr>
+        <w:ind w:left="5029" w:hanging="360"/>
+      </w:pPr>
+      <w:rPr>
+        <w:rFonts w:ascii="Wingdings" w:hAnsi="Wingdings" w:hint="default"/>
+      </w:rPr>
+    </w:lvl>
+    <w:lvl w:ilvl="6" w:tplc="04190001" w:tentative="1">
+      <w:start w:val="1"/>
+      <w:numFmt w:val="bullet"/>
+      <w:lvlText w:val=""/>
+      <w:lvlJc w:val="left"/>
+      <w:pPr>
+        <w:ind w:left="5749" w:hanging="360"/>
+      </w:pPr>
+      <w:rPr>
+        <w:rFonts w:ascii="Symbol" w:hAnsi="Symbol" w:hint="default"/>
+      </w:rPr>
+    </w:lvl>
+    <w:lvl w:ilvl="7" w:tplc="04190003" w:tentative="1">
+      <w:start w:val="1"/>
+      <w:numFmt w:val="bullet"/>
+      <w:lvlText w:val="o"/>
+      <w:lvlJc w:val="left"/>
+      <w:pPr>
+        <w:ind w:left="6469" w:hanging="360"/>
+      </w:pPr>
+      <w:rPr>
+        <w:rFonts w:ascii="Courier New" w:hAnsi="Courier New" w:cs="Courier New" w:hint="default"/>
+      </w:rPr>
+    </w:lvl>
+    <w:lvl w:ilvl="8" w:tplc="04190005" w:tentative="1">
+      <w:start w:val="1"/>
+      <w:numFmt w:val="bullet"/>
+      <w:lvlText w:val=""/>
+      <w:lvlJc w:val="left"/>
+      <w:pPr>
+        <w:ind w:left="7189" w:hanging="360"/>
+      </w:pPr>
+      <w:rPr>
+        <w:rFonts w:ascii="Wingdings" w:hAnsi="Wingdings" w:hint="default"/>
+      </w:rPr>
+    </w:lvl>
+  </w:abstractNum>
+  <w:abstractNum w:abstractNumId="33" w15:restartNumberingAfterBreak="0">
     <w:nsid w:val="5F5D38FF"/>
     <w:multiLevelType w:val="hybridMultilevel"/>
     <w:tmpl w:val="9B2C67EA"/>
@@ -8874,7 +10599,346 @@
       </w:pPr>
     </w:lvl>
   </w:abstractNum>
-  <w:abstractNum w:abstractNumId="28" w15:restartNumberingAfterBreak="0">
+  <w:abstractNum w:abstractNumId="34" w15:restartNumberingAfterBreak="0">
+    <w:nsid w:val="62005D86"/>
+    <w:multiLevelType w:val="hybridMultilevel"/>
+    <w:tmpl w:val="6E14702E"/>
+    <w:lvl w:ilvl="0" w:tplc="7F6028E6">
+      <w:start w:val="1"/>
+      <w:numFmt w:val="bullet"/>
+      <w:lvlText w:val=""/>
+      <w:lvlJc w:val="left"/>
+      <w:pPr>
+        <w:ind w:left="1429" w:hanging="360"/>
+      </w:pPr>
+      <w:rPr>
+        <w:rFonts w:ascii="Symbol" w:hAnsi="Symbol" w:hint="default"/>
+      </w:rPr>
+    </w:lvl>
+    <w:lvl w:ilvl="1" w:tplc="04190003" w:tentative="1">
+      <w:start w:val="1"/>
+      <w:numFmt w:val="bullet"/>
+      <w:lvlText w:val="o"/>
+      <w:lvlJc w:val="left"/>
+      <w:pPr>
+        <w:ind w:left="2149" w:hanging="360"/>
+      </w:pPr>
+      <w:rPr>
+        <w:rFonts w:ascii="Courier New" w:hAnsi="Courier New" w:cs="Courier New" w:hint="default"/>
+      </w:rPr>
+    </w:lvl>
+    <w:lvl w:ilvl="2" w:tplc="04190005" w:tentative="1">
+      <w:start w:val="1"/>
+      <w:numFmt w:val="bullet"/>
+      <w:lvlText w:val=""/>
+      <w:lvlJc w:val="left"/>
+      <w:pPr>
+        <w:ind w:left="2869" w:hanging="360"/>
+      </w:pPr>
+      <w:rPr>
+        <w:rFonts w:ascii="Wingdings" w:hAnsi="Wingdings" w:hint="default"/>
+      </w:rPr>
+    </w:lvl>
+    <w:lvl w:ilvl="3" w:tplc="04190001" w:tentative="1">
+      <w:start w:val="1"/>
+      <w:numFmt w:val="bullet"/>
+      <w:lvlText w:val=""/>
+      <w:lvlJc w:val="left"/>
+      <w:pPr>
+        <w:ind w:left="3589" w:hanging="360"/>
+      </w:pPr>
+      <w:rPr>
+        <w:rFonts w:ascii="Symbol" w:hAnsi="Symbol" w:hint="default"/>
+      </w:rPr>
+    </w:lvl>
+    <w:lvl w:ilvl="4" w:tplc="04190003" w:tentative="1">
+      <w:start w:val="1"/>
+      <w:numFmt w:val="bullet"/>
+      <w:lvlText w:val="o"/>
+      <w:lvlJc w:val="left"/>
+      <w:pPr>
+        <w:ind w:left="4309" w:hanging="360"/>
+      </w:pPr>
+      <w:rPr>
+        <w:rFonts w:ascii="Courier New" w:hAnsi="Courier New" w:cs="Courier New" w:hint="default"/>
+      </w:rPr>
+    </w:lvl>
+    <w:lvl w:ilvl="5" w:tplc="04190005" w:tentative="1">
+      <w:start w:val="1"/>
+      <w:numFmt w:val="bullet"/>
+      <w:lvlText w:val=""/>
+      <w:lvlJc w:val="left"/>
+      <w:pPr>
+        <w:ind w:left="5029" w:hanging="360"/>
+      </w:pPr>
+      <w:rPr>
+        <w:rFonts w:ascii="Wingdings" w:hAnsi="Wingdings" w:hint="default"/>
+      </w:rPr>
+    </w:lvl>
+    <w:lvl w:ilvl="6" w:tplc="04190001" w:tentative="1">
+      <w:start w:val="1"/>
+      <w:numFmt w:val="bullet"/>
+      <w:lvlText w:val=""/>
+      <w:lvlJc w:val="left"/>
+      <w:pPr>
+        <w:ind w:left="5749" w:hanging="360"/>
+      </w:pPr>
+      <w:rPr>
+        <w:rFonts w:ascii="Symbol" w:hAnsi="Symbol" w:hint="default"/>
+      </w:rPr>
+    </w:lvl>
+    <w:lvl w:ilvl="7" w:tplc="04190003" w:tentative="1">
+      <w:start w:val="1"/>
+      <w:numFmt w:val="bullet"/>
+      <w:lvlText w:val="o"/>
+      <w:lvlJc w:val="left"/>
+      <w:pPr>
+        <w:ind w:left="6469" w:hanging="360"/>
+      </w:pPr>
+      <w:rPr>
+        <w:rFonts w:ascii="Courier New" w:hAnsi="Courier New" w:cs="Courier New" w:hint="default"/>
+      </w:rPr>
+    </w:lvl>
+    <w:lvl w:ilvl="8" w:tplc="04190005" w:tentative="1">
+      <w:start w:val="1"/>
+      <w:numFmt w:val="bullet"/>
+      <w:lvlText w:val=""/>
+      <w:lvlJc w:val="left"/>
+      <w:pPr>
+        <w:ind w:left="7189" w:hanging="360"/>
+      </w:pPr>
+      <w:rPr>
+        <w:rFonts w:ascii="Wingdings" w:hAnsi="Wingdings" w:hint="default"/>
+      </w:rPr>
+    </w:lvl>
+  </w:abstractNum>
+  <w:abstractNum w:abstractNumId="35" w15:restartNumberingAfterBreak="0">
+    <w:nsid w:val="62603B02"/>
+    <w:multiLevelType w:val="hybridMultilevel"/>
+    <w:tmpl w:val="EC10A5F6"/>
+    <w:lvl w:ilvl="0" w:tplc="7F6028E6">
+      <w:start w:val="1"/>
+      <w:numFmt w:val="bullet"/>
+      <w:lvlText w:val=""/>
+      <w:lvlJc w:val="left"/>
+      <w:pPr>
+        <w:ind w:left="1429" w:hanging="360"/>
+      </w:pPr>
+      <w:rPr>
+        <w:rFonts w:ascii="Symbol" w:hAnsi="Symbol" w:hint="default"/>
+      </w:rPr>
+    </w:lvl>
+    <w:lvl w:ilvl="1" w:tplc="04190003" w:tentative="1">
+      <w:start w:val="1"/>
+      <w:numFmt w:val="bullet"/>
+      <w:lvlText w:val="o"/>
+      <w:lvlJc w:val="left"/>
+      <w:pPr>
+        <w:ind w:left="2149" w:hanging="360"/>
+      </w:pPr>
+      <w:rPr>
+        <w:rFonts w:ascii="Courier New" w:hAnsi="Courier New" w:cs="Courier New" w:hint="default"/>
+      </w:rPr>
+    </w:lvl>
+    <w:lvl w:ilvl="2" w:tplc="04190005" w:tentative="1">
+      <w:start w:val="1"/>
+      <w:numFmt w:val="bullet"/>
+      <w:lvlText w:val=""/>
+      <w:lvlJc w:val="left"/>
+      <w:pPr>
+        <w:ind w:left="2869" w:hanging="360"/>
+      </w:pPr>
+      <w:rPr>
+        <w:rFonts w:ascii="Wingdings" w:hAnsi="Wingdings" w:hint="default"/>
+      </w:rPr>
+    </w:lvl>
+    <w:lvl w:ilvl="3" w:tplc="04190001" w:tentative="1">
+      <w:start w:val="1"/>
+      <w:numFmt w:val="bullet"/>
+      <w:lvlText w:val=""/>
+      <w:lvlJc w:val="left"/>
+      <w:pPr>
+        <w:ind w:left="3589" w:hanging="360"/>
+      </w:pPr>
+      <w:rPr>
+        <w:rFonts w:ascii="Symbol" w:hAnsi="Symbol" w:hint="default"/>
+      </w:rPr>
+    </w:lvl>
+    <w:lvl w:ilvl="4" w:tplc="04190003" w:tentative="1">
+      <w:start w:val="1"/>
+      <w:numFmt w:val="bullet"/>
+      <w:lvlText w:val="o"/>
+      <w:lvlJc w:val="left"/>
+      <w:pPr>
+        <w:ind w:left="4309" w:hanging="360"/>
+      </w:pPr>
+      <w:rPr>
+        <w:rFonts w:ascii="Courier New" w:hAnsi="Courier New" w:cs="Courier New" w:hint="default"/>
+      </w:rPr>
+    </w:lvl>
+    <w:lvl w:ilvl="5" w:tplc="04190005" w:tentative="1">
+      <w:start w:val="1"/>
+      <w:numFmt w:val="bullet"/>
+      <w:lvlText w:val=""/>
+      <w:lvlJc w:val="left"/>
+      <w:pPr>
+        <w:ind w:left="5029" w:hanging="360"/>
+      </w:pPr>
+      <w:rPr>
+        <w:rFonts w:ascii="Wingdings" w:hAnsi="Wingdings" w:hint="default"/>
+      </w:rPr>
+    </w:lvl>
+    <w:lvl w:ilvl="6" w:tplc="04190001" w:tentative="1">
+      <w:start w:val="1"/>
+      <w:numFmt w:val="bullet"/>
+      <w:lvlText w:val=""/>
+      <w:lvlJc w:val="left"/>
+      <w:pPr>
+        <w:ind w:left="5749" w:hanging="360"/>
+      </w:pPr>
+      <w:rPr>
+        <w:rFonts w:ascii="Symbol" w:hAnsi="Symbol" w:hint="default"/>
+      </w:rPr>
+    </w:lvl>
+    <w:lvl w:ilvl="7" w:tplc="04190003" w:tentative="1">
+      <w:start w:val="1"/>
+      <w:numFmt w:val="bullet"/>
+      <w:lvlText w:val="o"/>
+      <w:lvlJc w:val="left"/>
+      <w:pPr>
+        <w:ind w:left="6469" w:hanging="360"/>
+      </w:pPr>
+      <w:rPr>
+        <w:rFonts w:ascii="Courier New" w:hAnsi="Courier New" w:cs="Courier New" w:hint="default"/>
+      </w:rPr>
+    </w:lvl>
+    <w:lvl w:ilvl="8" w:tplc="04190005" w:tentative="1">
+      <w:start w:val="1"/>
+      <w:numFmt w:val="bullet"/>
+      <w:lvlText w:val=""/>
+      <w:lvlJc w:val="left"/>
+      <w:pPr>
+        <w:ind w:left="7189" w:hanging="360"/>
+      </w:pPr>
+      <w:rPr>
+        <w:rFonts w:ascii="Wingdings" w:hAnsi="Wingdings" w:hint="default"/>
+      </w:rPr>
+    </w:lvl>
+  </w:abstractNum>
+  <w:abstractNum w:abstractNumId="36" w15:restartNumberingAfterBreak="0">
+    <w:nsid w:val="63D40C2F"/>
+    <w:multiLevelType w:val="hybridMultilevel"/>
+    <w:tmpl w:val="4DBCA470"/>
+    <w:lvl w:ilvl="0" w:tplc="7F6028E6">
+      <w:start w:val="1"/>
+      <w:numFmt w:val="bullet"/>
+      <w:lvlText w:val=""/>
+      <w:lvlJc w:val="left"/>
+      <w:pPr>
+        <w:ind w:left="1429" w:hanging="360"/>
+      </w:pPr>
+      <w:rPr>
+        <w:rFonts w:ascii="Symbol" w:hAnsi="Symbol" w:hint="default"/>
+      </w:rPr>
+    </w:lvl>
+    <w:lvl w:ilvl="1" w:tplc="04190003" w:tentative="1">
+      <w:start w:val="1"/>
+      <w:numFmt w:val="bullet"/>
+      <w:lvlText w:val="o"/>
+      <w:lvlJc w:val="left"/>
+      <w:pPr>
+        <w:ind w:left="2149" w:hanging="360"/>
+      </w:pPr>
+      <w:rPr>
+        <w:rFonts w:ascii="Courier New" w:hAnsi="Courier New" w:cs="Courier New" w:hint="default"/>
+      </w:rPr>
+    </w:lvl>
+    <w:lvl w:ilvl="2" w:tplc="04190005" w:tentative="1">
+      <w:start w:val="1"/>
+      <w:numFmt w:val="bullet"/>
+      <w:lvlText w:val=""/>
+      <w:lvlJc w:val="left"/>
+      <w:pPr>
+        <w:ind w:left="2869" w:hanging="360"/>
+      </w:pPr>
+      <w:rPr>
+        <w:rFonts w:ascii="Wingdings" w:hAnsi="Wingdings" w:hint="default"/>
+      </w:rPr>
+    </w:lvl>
+    <w:lvl w:ilvl="3" w:tplc="04190001" w:tentative="1">
+      <w:start w:val="1"/>
+      <w:numFmt w:val="bullet"/>
+      <w:lvlText w:val=""/>
+      <w:lvlJc w:val="left"/>
+      <w:pPr>
+        <w:ind w:left="3589" w:hanging="360"/>
+      </w:pPr>
+      <w:rPr>
+        <w:rFonts w:ascii="Symbol" w:hAnsi="Symbol" w:hint="default"/>
+      </w:rPr>
+    </w:lvl>
+    <w:lvl w:ilvl="4" w:tplc="04190003" w:tentative="1">
+      <w:start w:val="1"/>
+      <w:numFmt w:val="bullet"/>
+      <w:lvlText w:val="o"/>
+      <w:lvlJc w:val="left"/>
+      <w:pPr>
+        <w:ind w:left="4309" w:hanging="360"/>
+      </w:pPr>
+      <w:rPr>
+        <w:rFonts w:ascii="Courier New" w:hAnsi="Courier New" w:cs="Courier New" w:hint="default"/>
+      </w:rPr>
+    </w:lvl>
+    <w:lvl w:ilvl="5" w:tplc="04190005" w:tentative="1">
+      <w:start w:val="1"/>
+      <w:numFmt w:val="bullet"/>
+      <w:lvlText w:val=""/>
+      <w:lvlJc w:val="left"/>
+      <w:pPr>
+        <w:ind w:left="5029" w:hanging="360"/>
+      </w:pPr>
+      <w:rPr>
+        <w:rFonts w:ascii="Wingdings" w:hAnsi="Wingdings" w:hint="default"/>
+      </w:rPr>
+    </w:lvl>
+    <w:lvl w:ilvl="6" w:tplc="04190001" w:tentative="1">
+      <w:start w:val="1"/>
+      <w:numFmt w:val="bullet"/>
+      <w:lvlText w:val=""/>
+      <w:lvlJc w:val="left"/>
+      <w:pPr>
+        <w:ind w:left="5749" w:hanging="360"/>
+      </w:pPr>
+      <w:rPr>
+        <w:rFonts w:ascii="Symbol" w:hAnsi="Symbol" w:hint="default"/>
+      </w:rPr>
+    </w:lvl>
+    <w:lvl w:ilvl="7" w:tplc="04190003" w:tentative="1">
+      <w:start w:val="1"/>
+      <w:numFmt w:val="bullet"/>
+      <w:lvlText w:val="o"/>
+      <w:lvlJc w:val="left"/>
+      <w:pPr>
+        <w:ind w:left="6469" w:hanging="360"/>
+      </w:pPr>
+      <w:rPr>
+        <w:rFonts w:ascii="Courier New" w:hAnsi="Courier New" w:cs="Courier New" w:hint="default"/>
+      </w:rPr>
+    </w:lvl>
+    <w:lvl w:ilvl="8" w:tplc="04190005" w:tentative="1">
+      <w:start w:val="1"/>
+      <w:numFmt w:val="bullet"/>
+      <w:lvlText w:val=""/>
+      <w:lvlJc w:val="left"/>
+      <w:pPr>
+        <w:ind w:left="7189" w:hanging="360"/>
+      </w:pPr>
+      <w:rPr>
+        <w:rFonts w:ascii="Wingdings" w:hAnsi="Wingdings" w:hint="default"/>
+      </w:rPr>
+    </w:lvl>
+  </w:abstractNum>
+  <w:abstractNum w:abstractNumId="37" w15:restartNumberingAfterBreak="0">
     <w:nsid w:val="682A50F5"/>
     <w:multiLevelType w:val="hybridMultilevel"/>
     <w:tmpl w:val="FBF6B7AE"/>
@@ -8987,7 +11051,7 @@
       </w:rPr>
     </w:lvl>
   </w:abstractNum>
-  <w:abstractNum w:abstractNumId="29" w15:restartNumberingAfterBreak="0">
+  <w:abstractNum w:abstractNumId="38" w15:restartNumberingAfterBreak="0">
     <w:nsid w:val="68420323"/>
     <w:multiLevelType w:val="hybridMultilevel"/>
     <w:tmpl w:val="5C56B8B0"/>
@@ -9078,7 +11142,7 @@
       </w:pPr>
     </w:lvl>
   </w:abstractNum>
-  <w:abstractNum w:abstractNumId="30" w15:restartNumberingAfterBreak="0">
+  <w:abstractNum w:abstractNumId="39" w15:restartNumberingAfterBreak="0">
     <w:nsid w:val="6CB6520D"/>
     <w:multiLevelType w:val="hybridMultilevel"/>
     <w:tmpl w:val="28300484"/>
@@ -9191,7 +11255,7 @@
       </w:rPr>
     </w:lvl>
   </w:abstractNum>
-  <w:abstractNum w:abstractNumId="31" w15:restartNumberingAfterBreak="0">
+  <w:abstractNum w:abstractNumId="40" w15:restartNumberingAfterBreak="0">
     <w:nsid w:val="702F11CF"/>
     <w:multiLevelType w:val="hybridMultilevel"/>
     <w:tmpl w:val="498AAC82"/>
@@ -9280,7 +11344,7 @@
       </w:pPr>
     </w:lvl>
   </w:abstractNum>
-  <w:abstractNum w:abstractNumId="32" w15:restartNumberingAfterBreak="0">
+  <w:abstractNum w:abstractNumId="41" w15:restartNumberingAfterBreak="0">
     <w:nsid w:val="76E15ECA"/>
     <w:multiLevelType w:val="hybridMultilevel"/>
     <w:tmpl w:val="19F8A95A"/>
@@ -9393,7 +11457,7 @@
       </w:rPr>
     </w:lvl>
   </w:abstractNum>
-  <w:abstractNum w:abstractNumId="33" w15:restartNumberingAfterBreak="0">
+  <w:abstractNum w:abstractNumId="42" w15:restartNumberingAfterBreak="0">
     <w:nsid w:val="77DD3182"/>
     <w:multiLevelType w:val="hybridMultilevel"/>
     <w:tmpl w:val="1DFA873A"/>
@@ -9506,7 +11570,7 @@
       </w:rPr>
     </w:lvl>
   </w:abstractNum>
-  <w:abstractNum w:abstractNumId="34" w15:restartNumberingAfterBreak="0">
+  <w:abstractNum w:abstractNumId="43" w15:restartNumberingAfterBreak="0">
     <w:nsid w:val="7E3D4818"/>
     <w:multiLevelType w:val="hybridMultilevel"/>
     <w:tmpl w:val="D3AE741A"/>
@@ -9595,7 +11659,120 @@
       </w:pPr>
     </w:lvl>
   </w:abstractNum>
-  <w:abstractNum w:abstractNumId="35" w15:restartNumberingAfterBreak="0">
+  <w:abstractNum w:abstractNumId="44" w15:restartNumberingAfterBreak="0">
+    <w:nsid w:val="7E5441D8"/>
+    <w:multiLevelType w:val="hybridMultilevel"/>
+    <w:tmpl w:val="9BC449AC"/>
+    <w:lvl w:ilvl="0" w:tplc="7F6028E6">
+      <w:start w:val="1"/>
+      <w:numFmt w:val="bullet"/>
+      <w:lvlText w:val=""/>
+      <w:lvlJc w:val="left"/>
+      <w:pPr>
+        <w:ind w:left="1429" w:hanging="360"/>
+      </w:pPr>
+      <w:rPr>
+        <w:rFonts w:ascii="Symbol" w:hAnsi="Symbol" w:hint="default"/>
+      </w:rPr>
+    </w:lvl>
+    <w:lvl w:ilvl="1" w:tplc="04190003" w:tentative="1">
+      <w:start w:val="1"/>
+      <w:numFmt w:val="bullet"/>
+      <w:lvlText w:val="o"/>
+      <w:lvlJc w:val="left"/>
+      <w:pPr>
+        <w:ind w:left="2149" w:hanging="360"/>
+      </w:pPr>
+      <w:rPr>
+        <w:rFonts w:ascii="Courier New" w:hAnsi="Courier New" w:cs="Courier New" w:hint="default"/>
+      </w:rPr>
+    </w:lvl>
+    <w:lvl w:ilvl="2" w:tplc="04190005" w:tentative="1">
+      <w:start w:val="1"/>
+      <w:numFmt w:val="bullet"/>
+      <w:lvlText w:val=""/>
+      <w:lvlJc w:val="left"/>
+      <w:pPr>
+        <w:ind w:left="2869" w:hanging="360"/>
+      </w:pPr>
+      <w:rPr>
+        <w:rFonts w:ascii="Wingdings" w:hAnsi="Wingdings" w:hint="default"/>
+      </w:rPr>
+    </w:lvl>
+    <w:lvl w:ilvl="3" w:tplc="04190001" w:tentative="1">
+      <w:start w:val="1"/>
+      <w:numFmt w:val="bullet"/>
+      <w:lvlText w:val=""/>
+      <w:lvlJc w:val="left"/>
+      <w:pPr>
+        <w:ind w:left="3589" w:hanging="360"/>
+      </w:pPr>
+      <w:rPr>
+        <w:rFonts w:ascii="Symbol" w:hAnsi="Symbol" w:hint="default"/>
+      </w:rPr>
+    </w:lvl>
+    <w:lvl w:ilvl="4" w:tplc="04190003" w:tentative="1">
+      <w:start w:val="1"/>
+      <w:numFmt w:val="bullet"/>
+      <w:lvlText w:val="o"/>
+      <w:lvlJc w:val="left"/>
+      <w:pPr>
+        <w:ind w:left="4309" w:hanging="360"/>
+      </w:pPr>
+      <w:rPr>
+        <w:rFonts w:ascii="Courier New" w:hAnsi="Courier New" w:cs="Courier New" w:hint="default"/>
+      </w:rPr>
+    </w:lvl>
+    <w:lvl w:ilvl="5" w:tplc="04190005" w:tentative="1">
+      <w:start w:val="1"/>
+      <w:numFmt w:val="bullet"/>
+      <w:lvlText w:val=""/>
+      <w:lvlJc w:val="left"/>
+      <w:pPr>
+        <w:ind w:left="5029" w:hanging="360"/>
+      </w:pPr>
+      <w:rPr>
+        <w:rFonts w:ascii="Wingdings" w:hAnsi="Wingdings" w:hint="default"/>
+      </w:rPr>
+    </w:lvl>
+    <w:lvl w:ilvl="6" w:tplc="04190001" w:tentative="1">
+      <w:start w:val="1"/>
+      <w:numFmt w:val="bullet"/>
+      <w:lvlText w:val=""/>
+      <w:lvlJc w:val="left"/>
+      <w:pPr>
+        <w:ind w:left="5749" w:hanging="360"/>
+      </w:pPr>
+      <w:rPr>
+        <w:rFonts w:ascii="Symbol" w:hAnsi="Symbol" w:hint="default"/>
+      </w:rPr>
+    </w:lvl>
+    <w:lvl w:ilvl="7" w:tplc="04190003" w:tentative="1">
+      <w:start w:val="1"/>
+      <w:numFmt w:val="bullet"/>
+      <w:lvlText w:val="o"/>
+      <w:lvlJc w:val="left"/>
+      <w:pPr>
+        <w:ind w:left="6469" w:hanging="360"/>
+      </w:pPr>
+      <w:rPr>
+        <w:rFonts w:ascii="Courier New" w:hAnsi="Courier New" w:cs="Courier New" w:hint="default"/>
+      </w:rPr>
+    </w:lvl>
+    <w:lvl w:ilvl="8" w:tplc="04190005" w:tentative="1">
+      <w:start w:val="1"/>
+      <w:numFmt w:val="bullet"/>
+      <w:lvlText w:val=""/>
+      <w:lvlJc w:val="left"/>
+      <w:pPr>
+        <w:ind w:left="7189" w:hanging="360"/>
+      </w:pPr>
+      <w:rPr>
+        <w:rFonts w:ascii="Wingdings" w:hAnsi="Wingdings" w:hint="default"/>
+      </w:rPr>
+    </w:lvl>
+  </w:abstractNum>
+  <w:abstractNum w:abstractNumId="45" w15:restartNumberingAfterBreak="0">
     <w:nsid w:val="7F5E120E"/>
     <w:multiLevelType w:val="hybridMultilevel"/>
     <w:tmpl w:val="3A6C99E6"/>
@@ -9686,112 +11863,142 @@
     </w:lvl>
   </w:abstractNum>
   <w:num w:numId="1">
+    <w:abstractNumId w:val="10"/>
+  </w:num>
+  <w:num w:numId="2">
+    <w:abstractNumId w:val="38"/>
+  </w:num>
+  <w:num w:numId="3">
+    <w:abstractNumId w:val="7"/>
+  </w:num>
+  <w:num w:numId="4">
+    <w:abstractNumId w:val="18"/>
+  </w:num>
+  <w:num w:numId="5">
+    <w:abstractNumId w:val="29"/>
+  </w:num>
+  <w:num w:numId="6">
     <w:abstractNumId w:val="9"/>
   </w:num>
-  <w:num w:numId="2">
-    <w:abstractNumId w:val="29"/>
+  <w:num w:numId="7">
+    <w:abstractNumId w:val="42"/>
   </w:num>
-  <w:num w:numId="3">
+  <w:num w:numId="8">
+    <w:abstractNumId w:val="13"/>
+  </w:num>
+  <w:num w:numId="9">
+    <w:abstractNumId w:val="19"/>
+  </w:num>
+  <w:num w:numId="10">
+    <w:abstractNumId w:val="39"/>
+  </w:num>
+  <w:num w:numId="11">
+    <w:abstractNumId w:val="37"/>
+  </w:num>
+  <w:num w:numId="12">
+    <w:abstractNumId w:val="14"/>
+  </w:num>
+  <w:num w:numId="13">
+    <w:abstractNumId w:val="28"/>
+  </w:num>
+  <w:num w:numId="14">
+    <w:abstractNumId w:val="12"/>
+  </w:num>
+  <w:num w:numId="15">
+    <w:abstractNumId w:val="2"/>
+  </w:num>
+  <w:num w:numId="16">
+    <w:abstractNumId w:val="1"/>
+  </w:num>
+  <w:num w:numId="17">
+    <w:abstractNumId w:val="40"/>
+  </w:num>
+  <w:num w:numId="18">
+    <w:abstractNumId w:val="4"/>
+  </w:num>
+  <w:num w:numId="19">
+    <w:abstractNumId w:val="33"/>
+  </w:num>
+  <w:num w:numId="20">
+    <w:abstractNumId w:val="45"/>
+  </w:num>
+  <w:num w:numId="21">
+    <w:abstractNumId w:val="5"/>
+  </w:num>
+  <w:num w:numId="22">
+    <w:abstractNumId w:val="3"/>
+  </w:num>
+  <w:num w:numId="23">
+    <w:abstractNumId w:val="17"/>
+  </w:num>
+  <w:num w:numId="24">
+    <w:abstractNumId w:val="25"/>
+  </w:num>
+  <w:num w:numId="25">
+    <w:abstractNumId w:val="43"/>
+  </w:num>
+  <w:num w:numId="26">
+    <w:abstractNumId w:val="23"/>
+  </w:num>
+  <w:num w:numId="27">
+    <w:abstractNumId w:val="16"/>
+  </w:num>
+  <w:num w:numId="28">
+    <w:abstractNumId w:val="11"/>
+  </w:num>
+  <w:num w:numId="29">
+    <w:abstractNumId w:val="15"/>
+  </w:num>
+  <w:num w:numId="30">
+    <w:abstractNumId w:val="20"/>
+  </w:num>
+  <w:num w:numId="31">
+    <w:abstractNumId w:val="8"/>
+  </w:num>
+  <w:num w:numId="32">
+    <w:abstractNumId w:val="31"/>
+  </w:num>
+  <w:num w:numId="33">
+    <w:abstractNumId w:val="26"/>
+  </w:num>
+  <w:num w:numId="34">
+    <w:abstractNumId w:val="27"/>
+  </w:num>
+  <w:num w:numId="35">
+    <w:abstractNumId w:val="41"/>
+  </w:num>
+  <w:num w:numId="36">
     <w:abstractNumId w:val="6"/>
   </w:num>
-  <w:num w:numId="4">
-    <w:abstractNumId w:val="17"/>
-  </w:num>
-  <w:num w:numId="5">
-    <w:abstractNumId w:val="25"/>
-  </w:num>
-  <w:num w:numId="6">
-    <w:abstractNumId w:val="8"/>
-  </w:num>
-  <w:num w:numId="7">
-    <w:abstractNumId w:val="33"/>
-  </w:num>
-  <w:num w:numId="8">
-    <w:abstractNumId w:val="12"/>
-  </w:num>
-  <w:num w:numId="9">
-    <w:abstractNumId w:val="18"/>
-  </w:num>
-  <w:num w:numId="10">
+  <w:num w:numId="37">
     <w:abstractNumId w:val="30"/>
   </w:num>
-  <w:num w:numId="11">
-    <w:abstractNumId w:val="28"/>
+  <w:num w:numId="38">
+    <w:abstractNumId w:val="21"/>
   </w:num>
-  <w:num w:numId="12">
-    <w:abstractNumId w:val="13"/>
+  <w:num w:numId="39">
+    <w:abstractNumId w:val="34"/>
   </w:num>
-  <w:num w:numId="13">
+  <w:num w:numId="40">
     <w:abstractNumId w:val="24"/>
   </w:num>
-  <w:num w:numId="14">
-    <w:abstractNumId w:val="11"/>
+  <w:num w:numId="41">
+    <w:abstractNumId w:val="44"/>
   </w:num>
-  <w:num w:numId="15">
-    <w:abstractNumId w:val="1"/>
+  <w:num w:numId="42">
+    <w:abstractNumId w:val="35"/>
   </w:num>
-  <w:num w:numId="16">
+  <w:num w:numId="43">
     <w:abstractNumId w:val="0"/>
   </w:num>
-  <w:num w:numId="17">
-    <w:abstractNumId w:val="31"/>
-  </w:num>
-  <w:num w:numId="18">
-    <w:abstractNumId w:val="3"/>
-  </w:num>
-  <w:num w:numId="19">
-    <w:abstractNumId w:val="27"/>
-  </w:num>
-  <w:num w:numId="20">
-    <w:abstractNumId w:val="35"/>
-  </w:num>
-  <w:num w:numId="21">
-    <w:abstractNumId w:val="4"/>
-  </w:num>
-  <w:num w:numId="22">
-    <w:abstractNumId w:val="2"/>
-  </w:num>
-  <w:num w:numId="23">
-    <w:abstractNumId w:val="16"/>
-  </w:num>
-  <w:num w:numId="24">
-    <w:abstractNumId w:val="21"/>
-  </w:num>
-  <w:num w:numId="25">
-    <w:abstractNumId w:val="34"/>
-  </w:num>
-  <w:num w:numId="26">
-    <w:abstractNumId w:val="20"/>
-  </w:num>
-  <w:num w:numId="27">
-    <w:abstractNumId w:val="15"/>
-  </w:num>
-  <w:num w:numId="28">
-    <w:abstractNumId w:val="10"/>
-  </w:num>
-  <w:num w:numId="29">
-    <w:abstractNumId w:val="14"/>
-  </w:num>
-  <w:num w:numId="30">
-    <w:abstractNumId w:val="19"/>
-  </w:num>
-  <w:num w:numId="31">
-    <w:abstractNumId w:val="7"/>
-  </w:num>
-  <w:num w:numId="32">
-    <w:abstractNumId w:val="26"/>
-  </w:num>
-  <w:num w:numId="33">
+  <w:num w:numId="44">
     <w:abstractNumId w:val="22"/>
   </w:num>
-  <w:num w:numId="34">
-    <w:abstractNumId w:val="23"/>
-  </w:num>
-  <w:num w:numId="35">
+  <w:num w:numId="45">
     <w:abstractNumId w:val="32"/>
   </w:num>
-  <w:num w:numId="36">
-    <w:abstractNumId w:val="5"/>
+  <w:num w:numId="46">
+    <w:abstractNumId w:val="36"/>
   </w:num>
 </w:numbering>
 </file>
@@ -10838,7 +13045,7 @@
 </file>
 
 <file path=customXml/itemProps1.xml><?xml version="1.0" encoding="utf-8"?>
-<ds:datastoreItem xmlns:ds="http://schemas.openxmlformats.org/officeDocument/2006/customXml" ds:itemID="{D704E59D-195F-4E13-BCE8-27C8C610A4B7}">
+<ds:datastoreItem xmlns:ds="http://schemas.openxmlformats.org/officeDocument/2006/customXml" ds:itemID="{DF60C205-D794-46B1-9251-B8F06AB55508}">
   <ds:schemaRefs>
     <ds:schemaRef ds:uri="http://schemas.openxmlformats.org/officeDocument/2006/bibliography"/>
   </ds:schemaRefs>

</xml_diff>